<commit_message>
Submission report reduced to introduction, Part 1 and Part 2; diagram as separate PDF
Co-Authored-By: Claude Opus 5.5 <noreply@anthropic.com>
</commit_message>
<xml_diff>
--- a/docs/MarketLab_Project_Description.docx
+++ b/docs/MarketLab_Project_Description.docx
@@ -389,13 +389,13 @@
     </w:p>
     <w:p>
       <w:pPr>
-        <w:pStyle w:val="Heading1"/>
+        <w:spacing w:after="120" w:line="276"/>
       </w:pPr>
       <w:r>
         <w:rPr>
           <w:rFonts w:ascii="Calibri" w:cs="Calibri" w:eastAsia="Calibri" w:hAnsi="Calibri"/>
         </w:rPr>
-        <w:t xml:space="preserve">1. Overview</w:t>
+        <w:t xml:space="preserve">MarketLab is an online marketplace on which many independent sellers offer goods side by side. Products are described once in a shared catalogue, and each seller publishes its own priced listing for a specific variant. Sellers keep stock in shared warehouses, so one customer order can involve several sellers and warehouses: stock is reserved from the exact seller–variant–warehouse position, and the order is split into one fulfilment per seller and warehouse, which is shipped with a carrier service and delivered by a courier. Delivered items can be returned and refunded.</w:t>
       </w:r>
     </w:p>
     <w:p>
@@ -406,7 +406,18 @@
         <w:rPr>
           <w:rFonts w:ascii="Calibri" w:cs="Calibri" w:eastAsia="Calibri" w:hAnsi="Calibri"/>
         </w:rPr>
-        <w:t xml:space="preserve">MarketLab is the database behind an online marketplace where many independent sellers offer their goods side by side. Products are described once in a shared catalogue; each seller then publishes its own priced listing for a specific variant of a product. Sellers keep stock in shared fulfilment warehouses, buy from their own suppliers, and are paid out by the marketplace after commission.</w:t>
+        <w:t xml:space="preserve">The design has 71 entity sets and 103 relationship sets, plus one ISA hierarchy, all connected in a single ER diagram (submitted as MarketLab_ER_Diagram.pdf). It includes weak entities, an ISA hierarchy, a ternary relationship and an aggregation. Part 1 defines every entity set and Part 2 every relationship set.</w:t>
+      </w:r>
+    </w:p>
+    <w:p>
+      <w:pPr>
+        <w:pStyle w:val="Heading1"/>
+      </w:pPr>
+      <w:r>
+        <w:rPr>
+          <w:rFonts w:ascii="Calibri" w:cs="Calibri" w:eastAsia="Calibri" w:hAnsi="Calibri"/>
+        </w:rPr>
+        <w:t xml:space="preserve">Part 1 – Entities</w:t>
       </w:r>
     </w:p>
     <w:p>
@@ -417,1348 +428,7 @@
         <w:rPr>
           <w:rFonts w:ascii="Calibri" w:cs="Calibri" w:eastAsia="Calibri" w:hAnsi="Calibri"/>
         </w:rPr>
-        <w:t xml:space="preserve">A single customer order can therefore involve several sellers and several warehouses. At checkout, stock is reserved from the exact seller–variant–warehouse position that will ship it, and the order is split into one fulfilment per seller and warehouse. Each fulfilment is packed, handed to a carrier service and delivered by a courier, either to the customer's address or to a pickup point. After delivery the customer can return items, which are inspected before any refund.</w:t>
-      </w:r>
-    </w:p>
-    <w:p>
-      <w:pPr>
-        <w:spacing w:after="120" w:line="276"/>
-      </w:pPr>
-      <w:r>
-        <w:rPr>
-          <w:rFonts w:ascii="Calibri" w:cs="Calibri" w:eastAsia="Calibri" w:hAnsi="Calibri"/>
-          <w:b/>
-          <w:bCs/>
-        </w:rPr>
-        <w:t xml:space="preserve">Example. </w:t>
-      </w:r>
-      <w:r>
-        <w:rPr>
-          <w:rFonts w:ascii="Calibri" w:cs="Calibri" w:eastAsia="Calibri" w:hAnsi="Calibri"/>
-        </w:rPr>
-        <w:t xml:space="preserve">A customer buys two headphones from Nova Teknoloji (stocked in Istanbul) and a notebook set from Ev &amp; Yaşam (stocked in Ankara). This is one order with two order lines, two stock reservations and two fulfilments, each with its own package and shipment. If one headphone arrives damaged, the return refers to the original order line, so the refund uses the price paid at checkout.</w:t>
-      </w:r>
-    </w:p>
-    <w:p>
-      <w:pPr>
-        <w:spacing w:after="120" w:line="276"/>
-      </w:pPr>
-      <w:r>
-        <w:rPr>
-          <w:rFonts w:ascii="Calibri" w:cs="Calibri" w:eastAsia="Calibri" w:hAnsi="Calibri"/>
-        </w:rPr>
-        <w:t xml:space="preserve">The design contains 71 entity sets and 103 relationship sets, plus one ISA hierarchy, and they form a single connected ER diagram (Figure A1 in Appendix A).</w:t>
-      </w:r>
-    </w:p>
-    <w:p>
-      <w:pPr>
-        <w:pStyle w:val="Heading1"/>
-      </w:pPr>
-      <w:r>
-        <w:rPr>
-          <w:rFonts w:ascii="Calibri" w:cs="Calibri" w:eastAsia="Calibri" w:hAnsi="Calibri"/>
-        </w:rPr>
-        <w:t xml:space="preserve">2. How the design meets the guidelines</w:t>
-      </w:r>
-    </w:p>
-    <w:p>
-      <w:pPr>
-        <w:keepNext/>
-        <w:spacing w:after="60" w:before="120"/>
-      </w:pPr>
-      <w:r>
-        <w:rPr>
-          <w:rFonts w:ascii="Calibri" w:cs="Calibri" w:eastAsia="Calibri" w:hAnsi="Calibri"/>
-          <w:b/>
-          <w:bCs/>
-          <w:color w:val="52606D"/>
-          <w:sz w:val="18"/>
-          <w:szCs w:val="18"/>
-        </w:rPr>
-        <w:t xml:space="preserve">Table 1. </w:t>
-      </w:r>
-      <w:r>
-        <w:rPr>
-          <w:rFonts w:ascii="Calibri" w:cs="Calibri" w:eastAsia="Calibri" w:hAnsi="Calibri"/>
-          <w:color w:val="52606D"/>
-          <w:sz w:val="18"/>
-          <w:szCs w:val="18"/>
-        </w:rPr>
-        <w:t xml:space="preserve">Project guidelines and where each one is satisfied.</w:t>
-      </w:r>
-    </w:p>
-    <w:tbl>
-      <w:tblPr>
-        <w:tblW w:type="dxa" w:w="9638"/>
-        <w:tblBorders>
-          <w:top w:val="single" w:color="auto" w:sz="4"/>
-          <w:left w:val="single" w:color="auto" w:sz="4"/>
-          <w:bottom w:val="single" w:color="auto" w:sz="4"/>
-          <w:right w:val="single" w:color="auto" w:sz="4"/>
-          <w:insideH w:val="single" w:color="auto" w:sz="4"/>
-          <w:insideV w:val="single" w:color="auto" w:sz="4"/>
-        </w:tblBorders>
-      </w:tblPr>
-      <w:tblGrid>
-        <w:gridCol w:w="3000"/>
-        <w:gridCol w:w="6638"/>
-      </w:tblGrid>
-      <w:tr>
-        <w:trPr>
-          <w:cantSplit/>
-          <w:tblHeader/>
-        </w:trPr>
-        <w:tc>
-          <w:tcPr>
-            <w:tcW w:type="dxa" w:w="3000"/>
-            <w:tcBorders>
-              <w:top w:val="single" w:color="BCC5CF" w:sz="4"/>
-              <w:left w:val="single" w:color="BCC5CF" w:sz="4"/>
-              <w:bottom w:val="single" w:color="BCC5CF" w:sz="4"/>
-              <w:right w:val="single" w:color="BCC5CF" w:sz="4"/>
-            </w:tcBorders>
-            <w:shd w:fill="2F4A6D" w:color="auto" w:val="clear"/>
-            <w:tcMar>
-              <w:top w:type="dxa" w:w="50"/>
-              <w:left w:type="dxa" w:w="90"/>
-              <w:bottom w:type="dxa" w:w="50"/>
-              <w:right w:type="dxa" w:w="90"/>
-            </w:tcMar>
-          </w:tcPr>
-          <w:p>
-            <w:pPr>
-              <w:spacing w:after="20"/>
-            </w:pPr>
-            <w:r>
-              <w:rPr>
-                <w:rFonts w:ascii="Calibri" w:cs="Calibri" w:eastAsia="Calibri" w:hAnsi="Calibri"/>
-                <w:b/>
-                <w:bCs/>
-                <w:color w:val="FFFFFF"/>
-                <w:sz w:val="18"/>
-                <w:szCs w:val="18"/>
-              </w:rPr>
-              <w:t xml:space="preserve">Guideline</w:t>
-            </w:r>
-          </w:p>
-        </w:tc>
-        <w:tc>
-          <w:tcPr>
-            <w:tcW w:type="dxa" w:w="6638"/>
-            <w:tcBorders>
-              <w:top w:val="single" w:color="BCC5CF" w:sz="4"/>
-              <w:left w:val="single" w:color="BCC5CF" w:sz="4"/>
-              <w:bottom w:val="single" w:color="BCC5CF" w:sz="4"/>
-              <w:right w:val="single" w:color="BCC5CF" w:sz="4"/>
-            </w:tcBorders>
-            <w:shd w:fill="2F4A6D" w:color="auto" w:val="clear"/>
-            <w:tcMar>
-              <w:top w:type="dxa" w:w="50"/>
-              <w:left w:type="dxa" w:w="90"/>
-              <w:bottom w:type="dxa" w:w="50"/>
-              <w:right w:type="dxa" w:w="90"/>
-            </w:tcMar>
-          </w:tcPr>
-          <w:p>
-            <w:pPr>
-              <w:spacing w:after="20"/>
-            </w:pPr>
-            <w:r>
-              <w:rPr>
-                <w:rFonts w:ascii="Calibri" w:cs="Calibri" w:eastAsia="Calibri" w:hAnsi="Calibri"/>
-                <w:b/>
-                <w:bCs/>
-                <w:color w:val="FFFFFF"/>
-                <w:sz w:val="18"/>
-                <w:szCs w:val="18"/>
-              </w:rPr>
-              <w:t xml:space="preserve">In this design</w:t>
-            </w:r>
-          </w:p>
-        </w:tc>
-      </w:tr>
-      <w:tr>
-        <w:trPr>
-          <w:cantSplit/>
-        </w:trPr>
-        <w:tc>
-          <w:tcPr>
-            <w:tcW w:type="dxa" w:w="3000"/>
-            <w:tcBorders>
-              <w:top w:val="single" w:color="BCC5CF" w:sz="4"/>
-              <w:left w:val="single" w:color="BCC5CF" w:sz="4"/>
-              <w:bottom w:val="single" w:color="BCC5CF" w:sz="4"/>
-              <w:right w:val="single" w:color="BCC5CF" w:sz="4"/>
-            </w:tcBorders>
-            <w:tcMar>
-              <w:top w:type="dxa" w:w="50"/>
-              <w:left w:type="dxa" w:w="90"/>
-              <w:bottom w:type="dxa" w:w="50"/>
-              <w:right w:type="dxa" w:w="90"/>
-            </w:tcMar>
-          </w:tcPr>
-          <w:p>
-            <w:pPr>
-              <w:spacing w:after="20"/>
-            </w:pPr>
-            <w:r>
-              <w:rPr>
-                <w:rFonts w:ascii="Calibri" w:cs="Calibri" w:eastAsia="Calibri" w:hAnsi="Calibri"/>
-                <w:sz w:val="18"/>
-                <w:szCs w:val="18"/>
-              </w:rPr>
-              <w:t xml:space="preserve">At least 50 entities (two-person project)</w:t>
-            </w:r>
-          </w:p>
-        </w:tc>
-        <w:tc>
-          <w:tcPr>
-            <w:tcW w:type="dxa" w:w="6638"/>
-            <w:tcBorders>
-              <w:top w:val="single" w:color="BCC5CF" w:sz="4"/>
-              <w:left w:val="single" w:color="BCC5CF" w:sz="4"/>
-              <w:bottom w:val="single" w:color="BCC5CF" w:sz="4"/>
-              <w:right w:val="single" w:color="BCC5CF" w:sz="4"/>
-            </w:tcBorders>
-            <w:tcMar>
-              <w:top w:type="dxa" w:w="50"/>
-              <w:left w:type="dxa" w:w="90"/>
-              <w:bottom w:type="dxa" w:w="50"/>
-              <w:right w:type="dxa" w:w="90"/>
-            </w:tcMar>
-          </w:tcPr>
-          <w:p>
-            <w:pPr>
-              <w:spacing w:after="20"/>
-            </w:pPr>
-            <w:r>
-              <w:rPr>
-                <w:rFonts w:ascii="Calibri" w:cs="Calibri" w:eastAsia="Calibri" w:hAnsi="Calibri"/>
-                <w:sz w:val="18"/>
-                <w:szCs w:val="18"/>
-              </w:rPr>
-              <w:t xml:space="preserve">71 entity sets, defined one by one in Part 1 (Section 5). Relationship sets are not counted, even where they have their own table.</w:t>
-            </w:r>
-          </w:p>
-        </w:tc>
-      </w:tr>
-      <w:tr>
-        <w:trPr>
-          <w:cantSplit/>
-        </w:trPr>
-        <w:tc>
-          <w:tcPr>
-            <w:tcW w:type="dxa" w:w="3000"/>
-            <w:tcBorders>
-              <w:top w:val="single" w:color="BCC5CF" w:sz="4"/>
-              <w:left w:val="single" w:color="BCC5CF" w:sz="4"/>
-              <w:bottom w:val="single" w:color="BCC5CF" w:sz="4"/>
-              <w:right w:val="single" w:color="BCC5CF" w:sz="4"/>
-            </w:tcBorders>
-            <w:shd w:fill="F4F6F8" w:color="auto" w:val="clear"/>
-            <w:tcMar>
-              <w:top w:type="dxa" w:w="50"/>
-              <w:left w:type="dxa" w:w="90"/>
-              <w:bottom w:type="dxa" w:w="50"/>
-              <w:right w:type="dxa" w:w="90"/>
-            </w:tcMar>
-          </w:tcPr>
-          <w:p>
-            <w:pPr>
-              <w:spacing w:after="20"/>
-            </w:pPr>
-            <w:r>
-              <w:rPr>
-                <w:rFonts w:ascii="Calibri" w:cs="Calibri" w:eastAsia="Calibri" w:hAnsi="Calibri"/>
-                <w:sz w:val="18"/>
-                <w:szCs w:val="18"/>
-              </w:rPr>
-              <w:t xml:space="preserve">One connected ER design</w:t>
-            </w:r>
-          </w:p>
-        </w:tc>
-        <w:tc>
-          <w:tcPr>
-            <w:tcW w:type="dxa" w:w="6638"/>
-            <w:tcBorders>
-              <w:top w:val="single" w:color="BCC5CF" w:sz="4"/>
-              <w:left w:val="single" w:color="BCC5CF" w:sz="4"/>
-              <w:bottom w:val="single" w:color="BCC5CF" w:sz="4"/>
-              <w:right w:val="single" w:color="BCC5CF" w:sz="4"/>
-            </w:tcBorders>
-            <w:shd w:fill="F4F6F8" w:color="auto" w:val="clear"/>
-            <w:tcMar>
-              <w:top w:type="dxa" w:w="50"/>
-              <w:left w:type="dxa" w:w="90"/>
-              <w:bottom w:type="dxa" w:w="50"/>
-              <w:right w:type="dxa" w:w="90"/>
-            </w:tcMar>
-          </w:tcPr>
-          <w:p>
-            <w:pPr>
-              <w:spacing w:after="20"/>
-            </w:pPr>
-            <w:r>
-              <w:rPr>
-                <w:rFonts w:ascii="Calibri" w:cs="Calibri" w:eastAsia="Calibri" w:hAnsi="Calibri"/>
-                <w:sz w:val="18"/>
-                <w:szCs w:val="18"/>
-              </w:rPr>
-              <w:t xml:space="preserve">All 71 entity sets are linked through the 103 relationship sets and the ISA hierarchy; no entity or group is isolated. The complete diagram is Figure A1.</w:t>
-            </w:r>
-          </w:p>
-        </w:tc>
-      </w:tr>
-      <w:tr>
-        <w:trPr>
-          <w:cantSplit/>
-        </w:trPr>
-        <w:tc>
-          <w:tcPr>
-            <w:tcW w:type="dxa" w:w="3000"/>
-            <w:tcBorders>
-              <w:top w:val="single" w:color="BCC5CF" w:sz="4"/>
-              <w:left w:val="single" w:color="BCC5CF" w:sz="4"/>
-              <w:bottom w:val="single" w:color="BCC5CF" w:sz="4"/>
-              <w:right w:val="single" w:color="BCC5CF" w:sz="4"/>
-            </w:tcBorders>
-            <w:tcMar>
-              <w:top w:type="dxa" w:w="50"/>
-              <w:left w:type="dxa" w:w="90"/>
-              <w:bottom w:type="dxa" w:w="50"/>
-              <w:right w:type="dxa" w:w="90"/>
-            </w:tcMar>
-          </w:tcPr>
-          <w:p>
-            <w:pPr>
-              <w:spacing w:after="20"/>
-            </w:pPr>
-            <w:r>
-              <w:rPr>
-                <w:rFonts w:ascii="Calibri" w:cs="Calibri" w:eastAsia="Calibri" w:hAnsi="Calibri"/>
-                <w:sz w:val="18"/>
-                <w:szCs w:val="18"/>
-              </w:rPr>
-              <w:t xml:space="preserve">Weak entity</w:t>
-            </w:r>
-          </w:p>
-        </w:tc>
-        <w:tc>
-          <w:tcPr>
-            <w:tcW w:type="dxa" w:w="6638"/>
-            <w:tcBorders>
-              <w:top w:val="single" w:color="BCC5CF" w:sz="4"/>
-              <w:left w:val="single" w:color="BCC5CF" w:sz="4"/>
-              <w:bottom w:val="single" w:color="BCC5CF" w:sz="4"/>
-              <w:right w:val="single" w:color="BCC5CF" w:sz="4"/>
-            </w:tcBorders>
-            <w:tcMar>
-              <w:top w:type="dxa" w:w="50"/>
-              <w:left w:type="dxa" w:w="90"/>
-              <w:bottom w:type="dxa" w:w="50"/>
-              <w:right w:type="dxa" w:w="90"/>
-            </w:tcMar>
-          </w:tcPr>
-          <w:p>
-            <w:pPr>
-              <w:spacing w:after="20"/>
-            </w:pPr>
-            <w:r>
-              <w:rPr>
-                <w:rFonts w:ascii="Calibri" w:cs="Calibri" w:eastAsia="Calibri" w:hAnsi="Calibri"/>
-                <w:sz w:val="18"/>
-                <w:szCs w:val="18"/>
-              </w:rPr>
-              <w:t xml:space="preserve">Purchase_Order_Lines, Order_Lines, Invoice_Lines, Carrier_Services (Section 4.1).</w:t>
-            </w:r>
-          </w:p>
-        </w:tc>
-      </w:tr>
-      <w:tr>
-        <w:trPr>
-          <w:cantSplit/>
-        </w:trPr>
-        <w:tc>
-          <w:tcPr>
-            <w:tcW w:type="dxa" w:w="3000"/>
-            <w:tcBorders>
-              <w:top w:val="single" w:color="BCC5CF" w:sz="4"/>
-              <w:left w:val="single" w:color="BCC5CF" w:sz="4"/>
-              <w:bottom w:val="single" w:color="BCC5CF" w:sz="4"/>
-              <w:right w:val="single" w:color="BCC5CF" w:sz="4"/>
-            </w:tcBorders>
-            <w:shd w:fill="F4F6F8" w:color="auto" w:val="clear"/>
-            <w:tcMar>
-              <w:top w:type="dxa" w:w="50"/>
-              <w:left w:type="dxa" w:w="90"/>
-              <w:bottom w:type="dxa" w:w="50"/>
-              <w:right w:type="dxa" w:w="90"/>
-            </w:tcMar>
-          </w:tcPr>
-          <w:p>
-            <w:pPr>
-              <w:spacing w:after="20"/>
-            </w:pPr>
-            <w:r>
-              <w:rPr>
-                <w:rFonts w:ascii="Calibri" w:cs="Calibri" w:eastAsia="Calibri" w:hAnsi="Calibri"/>
-                <w:sz w:val="18"/>
-                <w:szCs w:val="18"/>
-              </w:rPr>
-              <w:t xml:space="preserve">ISA hierarchy</w:t>
-            </w:r>
-          </w:p>
-        </w:tc>
-        <w:tc>
-          <w:tcPr>
-            <w:tcW w:type="dxa" w:w="6638"/>
-            <w:tcBorders>
-              <w:top w:val="single" w:color="BCC5CF" w:sz="4"/>
-              <w:left w:val="single" w:color="BCC5CF" w:sz="4"/>
-              <w:bottom w:val="single" w:color="BCC5CF" w:sz="4"/>
-              <w:right w:val="single" w:color="BCC5CF" w:sz="4"/>
-            </w:tcBorders>
-            <w:shd w:fill="F4F6F8" w:color="auto" w:val="clear"/>
-            <w:tcMar>
-              <w:top w:type="dxa" w:w="50"/>
-              <w:left w:type="dxa" w:w="90"/>
-              <w:bottom w:type="dxa" w:w="50"/>
-              <w:right w:type="dxa" w:w="90"/>
-            </w:tcMar>
-          </w:tcPr>
-          <w:p>
-            <w:pPr>
-              <w:spacing w:after="20"/>
-            </w:pPr>
-            <w:r>
-              <w:rPr>
-                <w:rFonts w:ascii="Calibri" w:cs="Calibri" w:eastAsia="Calibri" w:hAnsi="Calibri"/>
-                <w:sz w:val="18"/>
-                <w:szCs w:val="18"/>
-              </w:rPr>
-              <w:t xml:space="preserve">Accounts ISA Customers, Staff, Couriers; overlap not allowed, covering holds (Section 4.2).</w:t>
-            </w:r>
-          </w:p>
-        </w:tc>
-      </w:tr>
-      <w:tr>
-        <w:trPr>
-          <w:cantSplit/>
-        </w:trPr>
-        <w:tc>
-          <w:tcPr>
-            <w:tcW w:type="dxa" w:w="3000"/>
-            <w:tcBorders>
-              <w:top w:val="single" w:color="BCC5CF" w:sz="4"/>
-              <w:left w:val="single" w:color="BCC5CF" w:sz="4"/>
-              <w:bottom w:val="single" w:color="BCC5CF" w:sz="4"/>
-              <w:right w:val="single" w:color="BCC5CF" w:sz="4"/>
-            </w:tcBorders>
-            <w:tcMar>
-              <w:top w:type="dxa" w:w="50"/>
-              <w:left w:type="dxa" w:w="90"/>
-              <w:bottom w:type="dxa" w:w="50"/>
-              <w:right w:type="dxa" w:w="90"/>
-            </w:tcMar>
-          </w:tcPr>
-          <w:p>
-            <w:pPr>
-              <w:spacing w:after="20"/>
-            </w:pPr>
-            <w:r>
-              <w:rPr>
-                <w:rFonts w:ascii="Calibri" w:cs="Calibri" w:eastAsia="Calibri" w:hAnsi="Calibri"/>
-                <w:sz w:val="18"/>
-                <w:szCs w:val="18"/>
-              </w:rPr>
-              <w:t xml:space="preserve">Ternary relationship</w:t>
-            </w:r>
-          </w:p>
-        </w:tc>
-        <w:tc>
-          <w:tcPr>
-            <w:tcW w:type="dxa" w:w="6638"/>
-            <w:tcBorders>
-              <w:top w:val="single" w:color="BCC5CF" w:sz="4"/>
-              <w:left w:val="single" w:color="BCC5CF" w:sz="4"/>
-              <w:bottom w:val="single" w:color="BCC5CF" w:sz="4"/>
-              <w:right w:val="single" w:color="BCC5CF" w:sz="4"/>
-            </w:tcBorders>
-            <w:tcMar>
-              <w:top w:type="dxa" w:w="50"/>
-              <w:left w:type="dxa" w:w="90"/>
-              <w:bottom w:type="dxa" w:w="50"/>
-              <w:right w:type="dxa" w:w="90"/>
-            </w:tcMar>
-          </w:tcPr>
-          <w:p>
-            <w:pPr>
-              <w:spacing w:after="20"/>
-            </w:pPr>
-            <w:r>
-              <w:rPr>
-                <w:rFonts w:ascii="Calibri" w:cs="Calibri" w:eastAsia="Calibri" w:hAnsi="Calibri"/>
-                <w:sz w:val="18"/>
-                <w:szCs w:val="18"/>
-              </w:rPr>
-              <w:t xml:space="preserve">Stocks between Seller_Organizations, Variants and Warehouses (Section 4.3).</w:t>
-            </w:r>
-          </w:p>
-        </w:tc>
-      </w:tr>
-      <w:tr>
-        <w:trPr>
-          <w:cantSplit/>
-        </w:trPr>
-        <w:tc>
-          <w:tcPr>
-            <w:tcW w:type="dxa" w:w="3000"/>
-            <w:tcBorders>
-              <w:top w:val="single" w:color="BCC5CF" w:sz="4"/>
-              <w:left w:val="single" w:color="BCC5CF" w:sz="4"/>
-              <w:bottom w:val="single" w:color="BCC5CF" w:sz="4"/>
-              <w:right w:val="single" w:color="BCC5CF" w:sz="4"/>
-            </w:tcBorders>
-            <w:shd w:fill="F4F6F8" w:color="auto" w:val="clear"/>
-            <w:tcMar>
-              <w:top w:type="dxa" w:w="50"/>
-              <w:left w:type="dxa" w:w="90"/>
-              <w:bottom w:type="dxa" w:w="50"/>
-              <w:right w:type="dxa" w:w="90"/>
-            </w:tcMar>
-          </w:tcPr>
-          <w:p>
-            <w:pPr>
-              <w:spacing w:after="20"/>
-            </w:pPr>
-            <w:r>
-              <w:rPr>
-                <w:rFonts w:ascii="Calibri" w:cs="Calibri" w:eastAsia="Calibri" w:hAnsi="Calibri"/>
-                <w:sz w:val="18"/>
-                <w:szCs w:val="18"/>
-              </w:rPr>
-              <w:t xml:space="preserve">Aggregation</w:t>
-            </w:r>
-          </w:p>
-        </w:tc>
-        <w:tc>
-          <w:tcPr>
-            <w:tcW w:type="dxa" w:w="6638"/>
-            <w:tcBorders>
-              <w:top w:val="single" w:color="BCC5CF" w:sz="4"/>
-              <w:left w:val="single" w:color="BCC5CF" w:sz="4"/>
-              <w:bottom w:val="single" w:color="BCC5CF" w:sz="4"/>
-              <w:right w:val="single" w:color="BCC5CF" w:sz="4"/>
-            </w:tcBorders>
-            <w:shd w:fill="F4F6F8" w:color="auto" w:val="clear"/>
-            <w:tcMar>
-              <w:top w:type="dxa" w:w="50"/>
-              <w:left w:type="dxa" w:w="90"/>
-              <w:bottom w:type="dxa" w:w="50"/>
-              <w:right w:type="dxa" w:w="90"/>
-            </w:tcMar>
-          </w:tcPr>
-          <w:p>
-            <w:pPr>
-              <w:spacing w:after="20"/>
-            </w:pPr>
-            <w:r>
-              <w:rPr>
-                <w:rFonts w:ascii="Calibri" w:cs="Calibri" w:eastAsia="Calibri" w:hAnsi="Calibri"/>
-                <w:sz w:val="18"/>
-                <w:szCs w:val="18"/>
-              </w:rPr>
-              <w:t xml:space="preserve">Stocks is aggregated and used by Batch_Of and Reserves (Section 4.4).</w:t>
-            </w:r>
-          </w:p>
-        </w:tc>
-      </w:tr>
-      <w:tr>
-        <w:trPr>
-          <w:cantSplit/>
-        </w:trPr>
-        <w:tc>
-          <w:tcPr>
-            <w:tcW w:type="dxa" w:w="3000"/>
-            <w:tcBorders>
-              <w:top w:val="single" w:color="BCC5CF" w:sz="4"/>
-              <w:left w:val="single" w:color="BCC5CF" w:sz="4"/>
-              <w:bottom w:val="single" w:color="BCC5CF" w:sz="4"/>
-              <w:right w:val="single" w:color="BCC5CF" w:sz="4"/>
-            </w:tcBorders>
-            <w:tcMar>
-              <w:top w:type="dxa" w:w="50"/>
-              <w:left w:type="dxa" w:w="90"/>
-              <w:bottom w:type="dxa" w:w="50"/>
-              <w:right w:type="dxa" w:w="90"/>
-            </w:tcMar>
-          </w:tcPr>
-          <w:p>
-            <w:pPr>
-              <w:spacing w:after="20"/>
-            </w:pPr>
-            <w:r>
-              <w:rPr>
-                <w:rFonts w:ascii="Calibri" w:cs="Calibri" w:eastAsia="Calibri" w:hAnsi="Calibri"/>
-                <w:sz w:val="18"/>
-                <w:szCs w:val="18"/>
-              </w:rPr>
-              <w:t xml:space="preserve">A clear key for every entity</w:t>
-            </w:r>
-          </w:p>
-        </w:tc>
-        <w:tc>
-          <w:tcPr>
-            <w:tcW w:type="dxa" w:w="6638"/>
-            <w:tcBorders>
-              <w:top w:val="single" w:color="BCC5CF" w:sz="4"/>
-              <w:left w:val="single" w:color="BCC5CF" w:sz="4"/>
-              <w:bottom w:val="single" w:color="BCC5CF" w:sz="4"/>
-              <w:right w:val="single" w:color="BCC5CF" w:sz="4"/>
-            </w:tcBorders>
-            <w:tcMar>
-              <w:top w:type="dxa" w:w="50"/>
-              <w:left w:type="dxa" w:w="90"/>
-              <w:bottom w:type="dxa" w:w="50"/>
-              <w:right w:type="dxa" w:w="90"/>
-            </w:tcMar>
-          </w:tcPr>
-          <w:p>
-            <w:pPr>
-              <w:spacing w:after="20"/>
-            </w:pPr>
-            <w:r>
-              <w:rPr>
-                <w:rFonts w:ascii="Calibri" w:cs="Calibri" w:eastAsia="Calibri" w:hAnsi="Calibri"/>
-                <w:sz w:val="18"/>
-                <w:szCs w:val="18"/>
-              </w:rPr>
-              <w:t xml:space="preserve">Given in the Key column of Part 1: an own key for strong entity sets, partial key plus owner key for weak ones, and the inherited key for ISA subclasses.</w:t>
-            </w:r>
-          </w:p>
-        </w:tc>
-      </w:tr>
-      <w:tr>
-        <w:trPr>
-          <w:cantSplit/>
-        </w:trPr>
-        <w:tc>
-          <w:tcPr>
-            <w:tcW w:type="dxa" w:w="3000"/>
-            <w:tcBorders>
-              <w:top w:val="single" w:color="BCC5CF" w:sz="4"/>
-              <w:left w:val="single" w:color="BCC5CF" w:sz="4"/>
-              <w:bottom w:val="single" w:color="BCC5CF" w:sz="4"/>
-              <w:right w:val="single" w:color="BCC5CF" w:sz="4"/>
-            </w:tcBorders>
-            <w:shd w:fill="F4F6F8" w:color="auto" w:val="clear"/>
-            <w:tcMar>
-              <w:top w:type="dxa" w:w="50"/>
-              <w:left w:type="dxa" w:w="90"/>
-              <w:bottom w:type="dxa" w:w="50"/>
-              <w:right w:type="dxa" w:w="90"/>
-            </w:tcMar>
-          </w:tcPr>
-          <w:p>
-            <w:pPr>
-              <w:spacing w:after="20"/>
-            </w:pPr>
-            <w:r>
-              <w:rPr>
-                <w:rFonts w:ascii="Calibri" w:cs="Calibri" w:eastAsia="Calibri" w:hAnsi="Calibri"/>
-                <w:sz w:val="18"/>
-                <w:szCs w:val="18"/>
-              </w:rPr>
-              <w:t xml:space="preserve">Report in two parts</w:t>
-            </w:r>
-          </w:p>
-        </w:tc>
-        <w:tc>
-          <w:tcPr>
-            <w:tcW w:type="dxa" w:w="6638"/>
-            <w:tcBorders>
-              <w:top w:val="single" w:color="BCC5CF" w:sz="4"/>
-              <w:left w:val="single" w:color="BCC5CF" w:sz="4"/>
-              <w:bottom w:val="single" w:color="BCC5CF" w:sz="4"/>
-              <w:right w:val="single" w:color="BCC5CF" w:sz="4"/>
-            </w:tcBorders>
-            <w:shd w:fill="F4F6F8" w:color="auto" w:val="clear"/>
-            <w:tcMar>
-              <w:top w:type="dxa" w:w="50"/>
-              <w:left w:type="dxa" w:w="90"/>
-              <w:bottom w:type="dxa" w:w="50"/>
-              <w:right w:type="dxa" w:w="90"/>
-            </w:tcMar>
-          </w:tcPr>
-          <w:p>
-            <w:pPr>
-              <w:spacing w:after="20"/>
-            </w:pPr>
-            <w:r>
-              <w:rPr>
-                <w:rFonts w:ascii="Calibri" w:cs="Calibri" w:eastAsia="Calibri" w:hAnsi="Calibri"/>
-                <w:sz w:val="18"/>
-                <w:szCs w:val="18"/>
-              </w:rPr>
-              <w:t xml:space="preserve">Part 1 – Entities (Section 5) and Part 2 – Relationships (Section 6).</w:t>
-            </w:r>
-          </w:p>
-        </w:tc>
-      </w:tr>
-    </w:tbl>
-    <w:p>
-      <w:pPr>
-        <w:pStyle w:val="Heading1"/>
-      </w:pPr>
-      <w:r>
-        <w:rPr>
-          <w:rFonts w:ascii="Calibri" w:cs="Calibri" w:eastAsia="Calibri" w:hAnsi="Calibri"/>
-        </w:rPr>
-        <w:t xml:space="preserve">3. Notation</w:t>
-      </w:r>
-    </w:p>
-    <w:p>
-      <w:pPr>
-        <w:spacing w:after="120" w:line="276"/>
-      </w:pPr>
-      <w:r>
-        <w:rPr>
-          <w:rFonts w:ascii="Calibri" w:cs="Calibri" w:eastAsia="Calibri" w:hAnsi="Calibri"/>
-        </w:rPr>
-        <w:t xml:space="preserve">The diagrams use the notation of the course slides (Ramakrishnan &amp; Gehrke, Chapter 2). Entity sets are rectangles and their attributes are ovals; the key attribute is underlined. Relationship sets are diamonds, and descriptive attributes of a relationship hang from its diamond. Foreign keys are not drawn as attributes: a reference to another entity is a relationship, and the foreign key only appears when the design is mapped to tables.</w:t>
-      </w:r>
-    </w:p>
-    <w:p>
-      <w:pPr>
-        <w:keepNext/>
-        <w:spacing w:after="60" w:before="120"/>
-        <w:jc w:val="center"/>
-      </w:pPr>
-      <w:r>
-        <w:drawing>
-          <wp:inline distT="0" distB="0" distL="0" distR="0">
-            <wp:extent cx="3609975" cy="3933825"/>
-            <wp:effectExtent t="0" r="0" b="0" l="0"/>
-            <wp:docPr id="1" name="" descr="" title=""/>
-            <wp:cNvGraphicFramePr>
-              <a:graphicFrameLocks xmlns:a="http://schemas.openxmlformats.org/drawingml/2006/main" noChangeAspect="1"/>
-            </wp:cNvGraphicFramePr>
-            <a:graphic xmlns:a="http://schemas.openxmlformats.org/drawingml/2006/main">
-              <a:graphicData uri="http://schemas.openxmlformats.org/drawingml/2006/picture">
-                <pic:pic xmlns:pic="http://schemas.openxmlformats.org/drawingml/2006/picture">
-                  <pic:nvPicPr>
-                    <pic:cNvPr id="0" name="" descr=""/>
-                    <pic:cNvPicPr>
-                      <a:picLocks noChangeAspect="1" noChangeArrowheads="1"/>
-                    </pic:cNvPicPr>
-                  </pic:nvPicPr>
-                  <pic:blipFill>
-                    <a:blip r:embed="rId9" cstate="none"/>
-                    <a:srcRect/>
-                    <a:stretch>
-                      <a:fillRect/>
-                    </a:stretch>
-                  </pic:blipFill>
-                  <pic:spPr bwMode="auto">
-                    <a:xfrm>
-                      <a:off x="0" y="0"/>
-                      <a:ext cx="3609975" cy="3933825"/>
-                    </a:xfrm>
-                    <a:prstGeom prst="rect">
-                      <a:avLst/>
-                    </a:prstGeom>
-                  </pic:spPr>
-                </pic:pic>
-              </a:graphicData>
-            </a:graphic>
-          </wp:inline>
-        </w:drawing>
-      </w:r>
-    </w:p>
-    <w:p>
-      <w:pPr>
-        <w:spacing w:after="200"/>
-        <w:jc w:val="center"/>
-      </w:pPr>
-      <w:r>
-        <w:rPr>
-          <w:rFonts w:ascii="Calibri" w:cs="Calibri" w:eastAsia="Calibri" w:hAnsi="Calibri"/>
-          <w:b/>
-          <w:bCs/>
-          <w:color w:val="52606D"/>
-          <w:sz w:val="18"/>
-          <w:szCs w:val="18"/>
-        </w:rPr>
-        <w:t xml:space="preserve">Figure 1. </w:t>
-      </w:r>
-      <w:r>
-        <w:rPr>
-          <w:rFonts w:ascii="Calibri" w:cs="Calibri" w:eastAsia="Calibri" w:hAnsi="Calibri"/>
-          <w:color w:val="52606D"/>
-          <w:sz w:val="18"/>
-          <w:szCs w:val="18"/>
-        </w:rPr>
-        <w:t xml:space="preserve">Symbols used in all diagrams.</w:t>
-      </w:r>
-    </w:p>
-    <w:p>
-      <w:pPr>
-        <w:spacing w:after="120" w:line="276"/>
-      </w:pPr>
-      <w:r>
-        <w:rPr>
-          <w:rFonts w:ascii="Calibri" w:cs="Calibri" w:eastAsia="Calibri" w:hAnsi="Calibri"/>
-        </w:rPr>
-        <w:t xml:space="preserve">Part 2 states the constraints of every relationship in words. The words correspond to the symbols as follows:</w:t>
-      </w:r>
-    </w:p>
-    <w:p>
-      <w:pPr>
-        <w:keepNext/>
-        <w:spacing w:after="60" w:before="120"/>
-      </w:pPr>
-      <w:r>
-        <w:rPr>
-          <w:rFonts w:ascii="Calibri" w:cs="Calibri" w:eastAsia="Calibri" w:hAnsi="Calibri"/>
-          <w:b/>
-          <w:bCs/>
-          <w:color w:val="52606D"/>
-          <w:sz w:val="18"/>
-          <w:szCs w:val="18"/>
-        </w:rPr>
-        <w:t xml:space="preserve">Table 2. </w:t>
-      </w:r>
-      <w:r>
-        <w:rPr>
-          <w:rFonts w:ascii="Calibri" w:cs="Calibri" w:eastAsia="Calibri" w:hAnsi="Calibri"/>
-          <w:color w:val="52606D"/>
-          <w:sz w:val="18"/>
-          <w:szCs w:val="18"/>
-        </w:rPr>
-        <w:t xml:space="preserve">Constraint wording used in Part 2.</w:t>
-      </w:r>
-    </w:p>
-    <w:tbl>
-      <w:tblPr>
-        <w:tblW w:type="dxa" w:w="9638"/>
-        <w:tblBorders>
-          <w:top w:val="single" w:color="auto" w:sz="4"/>
-          <w:left w:val="single" w:color="auto" w:sz="4"/>
-          <w:bottom w:val="single" w:color="auto" w:sz="4"/>
-          <w:right w:val="single" w:color="auto" w:sz="4"/>
-          <w:insideH w:val="single" w:color="auto" w:sz="4"/>
-          <w:insideV w:val="single" w:color="auto" w:sz="4"/>
-        </w:tblBorders>
-      </w:tblPr>
-      <w:tblGrid>
-        <w:gridCol w:w="2200"/>
-        <w:gridCol w:w="4238"/>
-        <w:gridCol w:w="3200"/>
-      </w:tblGrid>
-      <w:tr>
-        <w:trPr>
-          <w:cantSplit/>
-          <w:tblHeader/>
-        </w:trPr>
-        <w:tc>
-          <w:tcPr>
-            <w:tcW w:type="dxa" w:w="2200"/>
-            <w:tcBorders>
-              <w:top w:val="single" w:color="BCC5CF" w:sz="4"/>
-              <w:left w:val="single" w:color="BCC5CF" w:sz="4"/>
-              <w:bottom w:val="single" w:color="BCC5CF" w:sz="4"/>
-              <w:right w:val="single" w:color="BCC5CF" w:sz="4"/>
-            </w:tcBorders>
-            <w:shd w:fill="2F4A6D" w:color="auto" w:val="clear"/>
-            <w:tcMar>
-              <w:top w:type="dxa" w:w="50"/>
-              <w:left w:type="dxa" w:w="90"/>
-              <w:bottom w:type="dxa" w:w="50"/>
-              <w:right w:type="dxa" w:w="90"/>
-            </w:tcMar>
-          </w:tcPr>
-          <w:p>
-            <w:pPr>
-              <w:spacing w:after="20"/>
-            </w:pPr>
-            <w:r>
-              <w:rPr>
-                <w:rFonts w:ascii="Calibri" w:cs="Calibri" w:eastAsia="Calibri" w:hAnsi="Calibri"/>
-                <w:b/>
-                <w:bCs/>
-                <w:color w:val="FFFFFF"/>
-                <w:sz w:val="18"/>
-                <w:szCs w:val="18"/>
-              </w:rPr>
-              <w:t xml:space="preserve">Wording</w:t>
-            </w:r>
-          </w:p>
-        </w:tc>
-        <w:tc>
-          <w:tcPr>
-            <w:tcW w:type="dxa" w:w="4238"/>
-            <w:tcBorders>
-              <w:top w:val="single" w:color="BCC5CF" w:sz="4"/>
-              <w:left w:val="single" w:color="BCC5CF" w:sz="4"/>
-              <w:bottom w:val="single" w:color="BCC5CF" w:sz="4"/>
-              <w:right w:val="single" w:color="BCC5CF" w:sz="4"/>
-            </w:tcBorders>
-            <w:shd w:fill="2F4A6D" w:color="auto" w:val="clear"/>
-            <w:tcMar>
-              <w:top w:type="dxa" w:w="50"/>
-              <w:left w:type="dxa" w:w="90"/>
-              <w:bottom w:type="dxa" w:w="50"/>
-              <w:right w:type="dxa" w:w="90"/>
-            </w:tcMar>
-          </w:tcPr>
-          <w:p>
-            <w:pPr>
-              <w:spacing w:after="20"/>
-            </w:pPr>
-            <w:r>
-              <w:rPr>
-                <w:rFonts w:ascii="Calibri" w:cs="Calibri" w:eastAsia="Calibri" w:hAnsi="Calibri"/>
-                <w:b/>
-                <w:bCs/>
-                <w:color w:val="FFFFFF"/>
-                <w:sz w:val="18"/>
-                <w:szCs w:val="18"/>
-              </w:rPr>
-              <w:t xml:space="preserve">Meaning for each entity of that set</w:t>
-            </w:r>
-          </w:p>
-        </w:tc>
-        <w:tc>
-          <w:tcPr>
-            <w:tcW w:type="dxa" w:w="3200"/>
-            <w:tcBorders>
-              <w:top w:val="single" w:color="BCC5CF" w:sz="4"/>
-              <w:left w:val="single" w:color="BCC5CF" w:sz="4"/>
-              <w:bottom w:val="single" w:color="BCC5CF" w:sz="4"/>
-              <w:right w:val="single" w:color="BCC5CF" w:sz="4"/>
-            </w:tcBorders>
-            <w:shd w:fill="2F4A6D" w:color="auto" w:val="clear"/>
-            <w:tcMar>
-              <w:top w:type="dxa" w:w="50"/>
-              <w:left w:type="dxa" w:w="90"/>
-              <w:bottom w:type="dxa" w:w="50"/>
-              <w:right w:type="dxa" w:w="90"/>
-            </w:tcMar>
-          </w:tcPr>
-          <w:p>
-            <w:pPr>
-              <w:spacing w:after="20"/>
-            </w:pPr>
-            <w:r>
-              <w:rPr>
-                <w:rFonts w:ascii="Calibri" w:cs="Calibri" w:eastAsia="Calibri" w:hAnsi="Calibri"/>
-                <w:b/>
-                <w:bCs/>
-                <w:color w:val="FFFFFF"/>
-                <w:sz w:val="18"/>
-                <w:szCs w:val="18"/>
-              </w:rPr>
-              <w:t xml:space="preserve">Symbol</w:t>
-            </w:r>
-          </w:p>
-        </w:tc>
-      </w:tr>
-      <w:tr>
-        <w:trPr>
-          <w:cantSplit/>
-        </w:trPr>
-        <w:tc>
-          <w:tcPr>
-            <w:tcW w:type="dxa" w:w="2200"/>
-            <w:tcBorders>
-              <w:top w:val="single" w:color="BCC5CF" w:sz="4"/>
-              <w:left w:val="single" w:color="BCC5CF" w:sz="4"/>
-              <w:bottom w:val="single" w:color="BCC5CF" w:sz="4"/>
-              <w:right w:val="single" w:color="BCC5CF" w:sz="4"/>
-            </w:tcBorders>
-            <w:tcMar>
-              <w:top w:type="dxa" w:w="50"/>
-              <w:left w:type="dxa" w:w="90"/>
-              <w:bottom w:type="dxa" w:w="50"/>
-              <w:right w:type="dxa" w:w="90"/>
-            </w:tcMar>
-          </w:tcPr>
-          <w:p>
-            <w:pPr>
-              <w:spacing w:after="20"/>
-            </w:pPr>
-            <w:r>
-              <w:rPr>
-                <w:rFonts w:ascii="Calibri" w:cs="Calibri" w:eastAsia="Calibri" w:hAnsi="Calibri"/>
-                <w:sz w:val="18"/>
-                <w:szCs w:val="18"/>
-              </w:rPr>
-              <w:t xml:space="preserve">exactly one</w:t>
-            </w:r>
-          </w:p>
-        </w:tc>
-        <w:tc>
-          <w:tcPr>
-            <w:tcW w:type="dxa" w:w="4238"/>
-            <w:tcBorders>
-              <w:top w:val="single" w:color="BCC5CF" w:sz="4"/>
-              <w:left w:val="single" w:color="BCC5CF" w:sz="4"/>
-              <w:bottom w:val="single" w:color="BCC5CF" w:sz="4"/>
-              <w:right w:val="single" w:color="BCC5CF" w:sz="4"/>
-            </w:tcBorders>
-            <w:tcMar>
-              <w:top w:type="dxa" w:w="50"/>
-              <w:left w:type="dxa" w:w="90"/>
-              <w:bottom w:type="dxa" w:w="50"/>
-              <w:right w:type="dxa" w:w="90"/>
-            </w:tcMar>
-          </w:tcPr>
-          <w:p>
-            <w:pPr>
-              <w:spacing w:after="20"/>
-            </w:pPr>
-            <w:r>
-              <w:rPr>
-                <w:rFonts w:ascii="Calibri" w:cs="Calibri" w:eastAsia="Calibri" w:hAnsi="Calibri"/>
-                <w:sz w:val="18"/>
-                <w:szCs w:val="18"/>
-              </w:rPr>
-              <w:t xml:space="preserve">takes part in exactly one relationship (key constraint and total participation)</w:t>
-            </w:r>
-          </w:p>
-        </w:tc>
-        <w:tc>
-          <w:tcPr>
-            <w:tcW w:type="dxa" w:w="3200"/>
-            <w:tcBorders>
-              <w:top w:val="single" w:color="BCC5CF" w:sz="4"/>
-              <w:left w:val="single" w:color="BCC5CF" w:sz="4"/>
-              <w:bottom w:val="single" w:color="BCC5CF" w:sz="4"/>
-              <w:right w:val="single" w:color="BCC5CF" w:sz="4"/>
-            </w:tcBorders>
-            <w:tcMar>
-              <w:top w:type="dxa" w:w="50"/>
-              <w:left w:type="dxa" w:w="90"/>
-              <w:bottom w:type="dxa" w:w="50"/>
-              <w:right w:type="dxa" w:w="90"/>
-            </w:tcMar>
-          </w:tcPr>
-          <w:p>
-            <w:pPr>
-              <w:spacing w:after="20"/>
-            </w:pPr>
-            <w:r>
-              <w:rPr>
-                <w:rFonts w:ascii="Calibri" w:cs="Calibri" w:eastAsia="Calibri" w:hAnsi="Calibri"/>
-                <w:sz w:val="18"/>
-                <w:szCs w:val="18"/>
-              </w:rPr>
-              <w:t xml:space="preserve">bold arrow into the diamond</w:t>
-            </w:r>
-          </w:p>
-        </w:tc>
-      </w:tr>
-      <w:tr>
-        <w:trPr>
-          <w:cantSplit/>
-        </w:trPr>
-        <w:tc>
-          <w:tcPr>
-            <w:tcW w:type="dxa" w:w="2200"/>
-            <w:tcBorders>
-              <w:top w:val="single" w:color="BCC5CF" w:sz="4"/>
-              <w:left w:val="single" w:color="BCC5CF" w:sz="4"/>
-              <w:bottom w:val="single" w:color="BCC5CF" w:sz="4"/>
-              <w:right w:val="single" w:color="BCC5CF" w:sz="4"/>
-            </w:tcBorders>
-            <w:shd w:fill="F4F6F8" w:color="auto" w:val="clear"/>
-            <w:tcMar>
-              <w:top w:type="dxa" w:w="50"/>
-              <w:left w:type="dxa" w:w="90"/>
-              <w:bottom w:type="dxa" w:w="50"/>
-              <w:right w:type="dxa" w:w="90"/>
-            </w:tcMar>
-          </w:tcPr>
-          <w:p>
-            <w:pPr>
-              <w:spacing w:after="20"/>
-            </w:pPr>
-            <w:r>
-              <w:rPr>
-                <w:rFonts w:ascii="Calibri" w:cs="Calibri" w:eastAsia="Calibri" w:hAnsi="Calibri"/>
-                <w:sz w:val="18"/>
-                <w:szCs w:val="18"/>
-              </w:rPr>
-              <w:t xml:space="preserve">at most one</w:t>
-            </w:r>
-          </w:p>
-        </w:tc>
-        <w:tc>
-          <w:tcPr>
-            <w:tcW w:type="dxa" w:w="4238"/>
-            <w:tcBorders>
-              <w:top w:val="single" w:color="BCC5CF" w:sz="4"/>
-              <w:left w:val="single" w:color="BCC5CF" w:sz="4"/>
-              <w:bottom w:val="single" w:color="BCC5CF" w:sz="4"/>
-              <w:right w:val="single" w:color="BCC5CF" w:sz="4"/>
-            </w:tcBorders>
-            <w:shd w:fill="F4F6F8" w:color="auto" w:val="clear"/>
-            <w:tcMar>
-              <w:top w:type="dxa" w:w="50"/>
-              <w:left w:type="dxa" w:w="90"/>
-              <w:bottom w:type="dxa" w:w="50"/>
-              <w:right w:type="dxa" w:w="90"/>
-            </w:tcMar>
-          </w:tcPr>
-          <w:p>
-            <w:pPr>
-              <w:spacing w:after="20"/>
-            </w:pPr>
-            <w:r>
-              <w:rPr>
-                <w:rFonts w:ascii="Calibri" w:cs="Calibri" w:eastAsia="Calibri" w:hAnsi="Calibri"/>
-                <w:sz w:val="18"/>
-                <w:szCs w:val="18"/>
-              </w:rPr>
-              <w:t xml:space="preserve">takes part in zero or one relationship (key constraint)</w:t>
-            </w:r>
-          </w:p>
-        </w:tc>
-        <w:tc>
-          <w:tcPr>
-            <w:tcW w:type="dxa" w:w="3200"/>
-            <w:tcBorders>
-              <w:top w:val="single" w:color="BCC5CF" w:sz="4"/>
-              <w:left w:val="single" w:color="BCC5CF" w:sz="4"/>
-              <w:bottom w:val="single" w:color="BCC5CF" w:sz="4"/>
-              <w:right w:val="single" w:color="BCC5CF" w:sz="4"/>
-            </w:tcBorders>
-            <w:shd w:fill="F4F6F8" w:color="auto" w:val="clear"/>
-            <w:tcMar>
-              <w:top w:type="dxa" w:w="50"/>
-              <w:left w:type="dxa" w:w="90"/>
-              <w:bottom w:type="dxa" w:w="50"/>
-              <w:right w:type="dxa" w:w="90"/>
-            </w:tcMar>
-          </w:tcPr>
-          <w:p>
-            <w:pPr>
-              <w:spacing w:after="20"/>
-            </w:pPr>
-            <w:r>
-              <w:rPr>
-                <w:rFonts w:ascii="Calibri" w:cs="Calibri" w:eastAsia="Calibri" w:hAnsi="Calibri"/>
-                <w:sz w:val="18"/>
-                <w:szCs w:val="18"/>
-              </w:rPr>
-              <w:t xml:space="preserve">thin arrow into the diamond</w:t>
-            </w:r>
-          </w:p>
-        </w:tc>
-      </w:tr>
-      <w:tr>
-        <w:trPr>
-          <w:cantSplit/>
-        </w:trPr>
-        <w:tc>
-          <w:tcPr>
-            <w:tcW w:type="dxa" w:w="2200"/>
-            <w:tcBorders>
-              <w:top w:val="single" w:color="BCC5CF" w:sz="4"/>
-              <w:left w:val="single" w:color="BCC5CF" w:sz="4"/>
-              <w:bottom w:val="single" w:color="BCC5CF" w:sz="4"/>
-              <w:right w:val="single" w:color="BCC5CF" w:sz="4"/>
-            </w:tcBorders>
-            <w:tcMar>
-              <w:top w:type="dxa" w:w="50"/>
-              <w:left w:type="dxa" w:w="90"/>
-              <w:bottom w:type="dxa" w:w="50"/>
-              <w:right w:type="dxa" w:w="90"/>
-            </w:tcMar>
-          </w:tcPr>
-          <w:p>
-            <w:pPr>
-              <w:spacing w:after="20"/>
-            </w:pPr>
-            <w:r>
-              <w:rPr>
-                <w:rFonts w:ascii="Calibri" w:cs="Calibri" w:eastAsia="Calibri" w:hAnsi="Calibri"/>
-                <w:sz w:val="18"/>
-                <w:szCs w:val="18"/>
-              </w:rPr>
-              <w:t xml:space="preserve">at least one</w:t>
-            </w:r>
-          </w:p>
-        </w:tc>
-        <w:tc>
-          <w:tcPr>
-            <w:tcW w:type="dxa" w:w="4238"/>
-            <w:tcBorders>
-              <w:top w:val="single" w:color="BCC5CF" w:sz="4"/>
-              <w:left w:val="single" w:color="BCC5CF" w:sz="4"/>
-              <w:bottom w:val="single" w:color="BCC5CF" w:sz="4"/>
-              <w:right w:val="single" w:color="BCC5CF" w:sz="4"/>
-            </w:tcBorders>
-            <w:tcMar>
-              <w:top w:type="dxa" w:w="50"/>
-              <w:left w:type="dxa" w:w="90"/>
-              <w:bottom w:type="dxa" w:w="50"/>
-              <w:right w:type="dxa" w:w="90"/>
-            </w:tcMar>
-          </w:tcPr>
-          <w:p>
-            <w:pPr>
-              <w:spacing w:after="20"/>
-            </w:pPr>
-            <w:r>
-              <w:rPr>
-                <w:rFonts w:ascii="Calibri" w:cs="Calibri" w:eastAsia="Calibri" w:hAnsi="Calibri"/>
-                <w:sz w:val="18"/>
-                <w:szCs w:val="18"/>
-              </w:rPr>
-              <w:t xml:space="preserve">takes part in one or more relationships (total participation)</w:t>
-            </w:r>
-          </w:p>
-        </w:tc>
-        <w:tc>
-          <w:tcPr>
-            <w:tcW w:type="dxa" w:w="3200"/>
-            <w:tcBorders>
-              <w:top w:val="single" w:color="BCC5CF" w:sz="4"/>
-              <w:left w:val="single" w:color="BCC5CF" w:sz="4"/>
-              <w:bottom w:val="single" w:color="BCC5CF" w:sz="4"/>
-              <w:right w:val="single" w:color="BCC5CF" w:sz="4"/>
-            </w:tcBorders>
-            <w:tcMar>
-              <w:top w:type="dxa" w:w="50"/>
-              <w:left w:type="dxa" w:w="90"/>
-              <w:bottom w:type="dxa" w:w="50"/>
-              <w:right w:type="dxa" w:w="90"/>
-            </w:tcMar>
-          </w:tcPr>
-          <w:p>
-            <w:pPr>
-              <w:spacing w:after="20"/>
-            </w:pPr>
-            <w:r>
-              <w:rPr>
-                <w:rFonts w:ascii="Calibri" w:cs="Calibri" w:eastAsia="Calibri" w:hAnsi="Calibri"/>
-                <w:sz w:val="18"/>
-                <w:szCs w:val="18"/>
-              </w:rPr>
-              <w:t xml:space="preserve">bold line</w:t>
-            </w:r>
-          </w:p>
-        </w:tc>
-      </w:tr>
-      <w:tr>
-        <w:trPr>
-          <w:cantSplit/>
-        </w:trPr>
-        <w:tc>
-          <w:tcPr>
-            <w:tcW w:type="dxa" w:w="2200"/>
-            <w:tcBorders>
-              <w:top w:val="single" w:color="BCC5CF" w:sz="4"/>
-              <w:left w:val="single" w:color="BCC5CF" w:sz="4"/>
-              <w:bottom w:val="single" w:color="BCC5CF" w:sz="4"/>
-              <w:right w:val="single" w:color="BCC5CF" w:sz="4"/>
-            </w:tcBorders>
-            <w:shd w:fill="F4F6F8" w:color="auto" w:val="clear"/>
-            <w:tcMar>
-              <w:top w:type="dxa" w:w="50"/>
-              <w:left w:type="dxa" w:w="90"/>
-              <w:bottom w:type="dxa" w:w="50"/>
-              <w:right w:type="dxa" w:w="90"/>
-            </w:tcMar>
-          </w:tcPr>
-          <w:p>
-            <w:pPr>
-              <w:spacing w:after="20"/>
-            </w:pPr>
-            <w:r>
-              <w:rPr>
-                <w:rFonts w:ascii="Calibri" w:cs="Calibri" w:eastAsia="Calibri" w:hAnsi="Calibri"/>
-                <w:sz w:val="18"/>
-                <w:szCs w:val="18"/>
-              </w:rPr>
-              <w:t xml:space="preserve">any number</w:t>
-            </w:r>
-          </w:p>
-        </w:tc>
-        <w:tc>
-          <w:tcPr>
-            <w:tcW w:type="dxa" w:w="4238"/>
-            <w:tcBorders>
-              <w:top w:val="single" w:color="BCC5CF" w:sz="4"/>
-              <w:left w:val="single" w:color="BCC5CF" w:sz="4"/>
-              <w:bottom w:val="single" w:color="BCC5CF" w:sz="4"/>
-              <w:right w:val="single" w:color="BCC5CF" w:sz="4"/>
-            </w:tcBorders>
-            <w:shd w:fill="F4F6F8" w:color="auto" w:val="clear"/>
-            <w:tcMar>
-              <w:top w:type="dxa" w:w="50"/>
-              <w:left w:type="dxa" w:w="90"/>
-              <w:bottom w:type="dxa" w:w="50"/>
-              <w:right w:type="dxa" w:w="90"/>
-            </w:tcMar>
-          </w:tcPr>
-          <w:p>
-            <w:pPr>
-              <w:spacing w:after="20"/>
-            </w:pPr>
-            <w:r>
-              <w:rPr>
-                <w:rFonts w:ascii="Calibri" w:cs="Calibri" w:eastAsia="Calibri" w:hAnsi="Calibri"/>
-                <w:sz w:val="18"/>
-                <w:szCs w:val="18"/>
-              </w:rPr>
-              <w:t xml:space="preserve">no constraint</w:t>
-            </w:r>
-          </w:p>
-        </w:tc>
-        <w:tc>
-          <w:tcPr>
-            <w:tcW w:type="dxa" w:w="3200"/>
-            <w:tcBorders>
-              <w:top w:val="single" w:color="BCC5CF" w:sz="4"/>
-              <w:left w:val="single" w:color="BCC5CF" w:sz="4"/>
-              <w:bottom w:val="single" w:color="BCC5CF" w:sz="4"/>
-              <w:right w:val="single" w:color="BCC5CF" w:sz="4"/>
-            </w:tcBorders>
-            <w:shd w:fill="F4F6F8" w:color="auto" w:val="clear"/>
-            <w:tcMar>
-              <w:top w:type="dxa" w:w="50"/>
-              <w:left w:type="dxa" w:w="90"/>
-              <w:bottom w:type="dxa" w:w="50"/>
-              <w:right w:type="dxa" w:w="90"/>
-            </w:tcMar>
-          </w:tcPr>
-          <w:p>
-            <w:pPr>
-              <w:spacing w:after="20"/>
-            </w:pPr>
-            <w:r>
-              <w:rPr>
-                <w:rFonts w:ascii="Calibri" w:cs="Calibri" w:eastAsia="Calibri" w:hAnsi="Calibri"/>
-                <w:sz w:val="18"/>
-                <w:szCs w:val="18"/>
-              </w:rPr>
-              <w:t xml:space="preserve">thin line</w:t>
-            </w:r>
-          </w:p>
-        </w:tc>
-      </w:tr>
-    </w:tbl>
-    <w:p>
-      <w:pPr>
-        <w:pStyle w:val="Heading1"/>
-      </w:pPr>
-      <w:r>
-        <w:rPr>
-          <w:rFonts w:ascii="Calibri" w:cs="Calibri" w:eastAsia="Calibri" w:hAnsi="Calibri"/>
-        </w:rPr>
-        <w:t xml:space="preserve">4. Required ER constructs</w:t>
+        <w:t xml:space="preserve">Entity sets are grouped by business area. For each one we give its meaning, its key and its own attributes. The key is underlined. A weak entity is identified by its partial key (dashed underline) together with the key of its owner, and the subclasses of Accounts inherit the Accounts key. Attributes that point to another entity are not listed, because such links are relationships (Part 2).</w:t>
       </w:r>
     </w:p>
     <w:p>
@@ -1769,646 +439,7 @@
         <w:rPr>
           <w:rFonts w:ascii="Calibri" w:cs="Calibri" w:eastAsia="Calibri" w:hAnsi="Calibri"/>
         </w:rPr>
-        <w:t xml:space="preserve">4.1 Weak entities</w:t>
-      </w:r>
-    </w:p>
-    <w:p>
-      <w:pPr>
-        <w:spacing w:after="120" w:line="276"/>
-      </w:pPr>
-      <w:r>
-        <w:rPr>
-          <w:rFonts w:ascii="Calibri" w:cs="Calibri" w:eastAsia="Calibri" w:hAnsi="Calibri"/>
-        </w:rPr>
-        <w:t xml:space="preserve">A weak entity has no key of its own. It is identified by its owner's key together with a partial key, and it exists only as part of its owner. Following the slides, each weak entity set takes part in its identifying relationship with a key constraint and total participation (bold arrow), and the owner can have many weak entities.</w:t>
-      </w:r>
-    </w:p>
-    <w:p>
-      <w:pPr>
-        <w:pStyle w:val="ListParagraph"/>
-        <w:numPr>
-          <w:ilvl w:val="0"/>
-          <w:numId w:val="2"/>
-        </w:numPr>
-        <w:spacing w:after="60"/>
-      </w:pPr>
-      <w:r>
-        <w:rPr>
-          <w:rFonts w:ascii="Calibri" w:cs="Calibri" w:eastAsia="Calibri" w:hAnsi="Calibri"/>
-          <w:b/>
-          <w:bCs/>
-        </w:rPr>
-        <w:t xml:space="preserve">Purchase_Order_Lines: </w:t>
-      </w:r>
-      <w:r>
-        <w:rPr>
-          <w:rFonts w:ascii="Calibri" w:cs="Calibri" w:eastAsia="Calibri" w:hAnsi="Calibri"/>
-        </w:rPr>
-        <w:t xml:space="preserve">owner Purchase_Orders, partial key </w:t>
-      </w:r>
-      <w:r>
-        <w:rPr>
-          <w:rFonts w:ascii="Calibri" w:cs="Calibri" w:eastAsia="Calibri" w:hAnsi="Calibri"/>
-          <w:u w:val="dash"/>
-        </w:rPr>
-        <w:t xml:space="preserve">line_no</w:t>
-      </w:r>
-      <w:r>
-        <w:rPr>
-          <w:rFonts w:ascii="Calibri" w:cs="Calibri" w:eastAsia="Calibri" w:hAnsi="Calibri"/>
-        </w:rPr>
-        <w:t xml:space="preserve">, full key (purchase_order_id, line_no). </w:t>
-      </w:r>
-      <w:r>
-        <w:rPr>
-          <w:rFonts w:ascii="Calibri" w:cs="Calibri" w:eastAsia="Calibri" w:hAnsi="Calibri"/>
-        </w:rPr>
-        <w:t xml:space="preserve">One line of a purchase order: which variant, how many and at what unit cost. Numbered within its purchase order.</w:t>
-      </w:r>
-    </w:p>
-    <w:p>
-      <w:pPr>
-        <w:pStyle w:val="ListParagraph"/>
-        <w:numPr>
-          <w:ilvl w:val="0"/>
-          <w:numId w:val="2"/>
-        </w:numPr>
-        <w:spacing w:after="60"/>
-      </w:pPr>
-      <w:r>
-        <w:rPr>
-          <w:rFonts w:ascii="Calibri" w:cs="Calibri" w:eastAsia="Calibri" w:hAnsi="Calibri"/>
-          <w:b/>
-          <w:bCs/>
-        </w:rPr>
-        <w:t xml:space="preserve">Order_Lines: </w:t>
-      </w:r>
-      <w:r>
-        <w:rPr>
-          <w:rFonts w:ascii="Calibri" w:cs="Calibri" w:eastAsia="Calibri" w:hAnsi="Calibri"/>
-        </w:rPr>
-        <w:t xml:space="preserve">owner Orders, partial key </w:t>
-      </w:r>
-      <w:r>
-        <w:rPr>
-          <w:rFonts w:ascii="Calibri" w:cs="Calibri" w:eastAsia="Calibri" w:hAnsi="Calibri"/>
-          <w:u w:val="dash"/>
-        </w:rPr>
-        <w:t xml:space="preserve">line_no</w:t>
-      </w:r>
-      <w:r>
-        <w:rPr>
-          <w:rFonts w:ascii="Calibri" w:cs="Calibri" w:eastAsia="Calibri" w:hAnsi="Calibri"/>
-        </w:rPr>
-        <w:t xml:space="preserve">, full key (order_id, line_no). </w:t>
-      </w:r>
-      <w:r>
-        <w:rPr>
-          <w:rFonts w:ascii="Calibri" w:cs="Calibri" w:eastAsia="Calibri" w:hAnsi="Calibri"/>
-        </w:rPr>
-        <w:t xml:space="preserve">One line of an order: which listing, how many and the unit price at checkout. Numbered within its order.</w:t>
-      </w:r>
-    </w:p>
-    <w:p>
-      <w:pPr>
-        <w:pStyle w:val="ListParagraph"/>
-        <w:numPr>
-          <w:ilvl w:val="0"/>
-          <w:numId w:val="2"/>
-        </w:numPr>
-        <w:spacing w:after="60"/>
-      </w:pPr>
-      <w:r>
-        <w:rPr>
-          <w:rFonts w:ascii="Calibri" w:cs="Calibri" w:eastAsia="Calibri" w:hAnsi="Calibri"/>
-          <w:b/>
-          <w:bCs/>
-        </w:rPr>
-        <w:t xml:space="preserve">Invoice_Lines: </w:t>
-      </w:r>
-      <w:r>
-        <w:rPr>
-          <w:rFonts w:ascii="Calibri" w:cs="Calibri" w:eastAsia="Calibri" w:hAnsi="Calibri"/>
-        </w:rPr>
-        <w:t xml:space="preserve">owner Invoices, partial key </w:t>
-      </w:r>
-      <w:r>
-        <w:rPr>
-          <w:rFonts w:ascii="Calibri" w:cs="Calibri" w:eastAsia="Calibri" w:hAnsi="Calibri"/>
-          <w:u w:val="dash"/>
-        </w:rPr>
-        <w:t xml:space="preserve">line_no</w:t>
-      </w:r>
-      <w:r>
-        <w:rPr>
-          <w:rFonts w:ascii="Calibri" w:cs="Calibri" w:eastAsia="Calibri" w:hAnsi="Calibri"/>
-        </w:rPr>
-        <w:t xml:space="preserve">, full key (invoice_id, line_no). </w:t>
-      </w:r>
-      <w:r>
-        <w:rPr>
-          <w:rFonts w:ascii="Calibri" w:cs="Calibri" w:eastAsia="Calibri" w:hAnsi="Calibri"/>
-        </w:rPr>
-        <w:t xml:space="preserve">One line of an invoice: the billed amount for one order line and the tax rate applied. Numbered within its invoice.</w:t>
-      </w:r>
-    </w:p>
-    <w:p>
-      <w:pPr>
-        <w:pStyle w:val="ListParagraph"/>
-        <w:numPr>
-          <w:ilvl w:val="0"/>
-          <w:numId w:val="2"/>
-        </w:numPr>
-        <w:spacing w:after="60"/>
-      </w:pPr>
-      <w:r>
-        <w:rPr>
-          <w:rFonts w:ascii="Calibri" w:cs="Calibri" w:eastAsia="Calibri" w:hAnsi="Calibri"/>
-          <w:b/>
-          <w:bCs/>
-        </w:rPr>
-        <w:t xml:space="preserve">Carrier_Services: </w:t>
-      </w:r>
-      <w:r>
-        <w:rPr>
-          <w:rFonts w:ascii="Calibri" w:cs="Calibri" w:eastAsia="Calibri" w:hAnsi="Calibri"/>
-        </w:rPr>
-        <w:t xml:space="preserve">owner Carriers, partial key </w:t>
-      </w:r>
-      <w:r>
-        <w:rPr>
-          <w:rFonts w:ascii="Calibri" w:cs="Calibri" w:eastAsia="Calibri" w:hAnsi="Calibri"/>
-          <w:u w:val="dash"/>
-        </w:rPr>
-        <w:t xml:space="preserve">service_code</w:t>
-      </w:r>
-      <w:r>
-        <w:rPr>
-          <w:rFonts w:ascii="Calibri" w:cs="Calibri" w:eastAsia="Calibri" w:hAnsi="Calibri"/>
-        </w:rPr>
-        <w:t xml:space="preserve">, full key (carrier_id, service_code). </w:t>
-      </w:r>
-      <w:r>
-        <w:rPr>
-          <w:rFonts w:ascii="Calibri" w:cs="Calibri" w:eastAsia="Calibri" w:hAnsi="Calibri"/>
-        </w:rPr>
-        <w:t xml:space="preserve">A delivery service offered by a carrier (Standard, Express) with its maximum delivery time. The service code is only unique within its carrier.</w:t>
-      </w:r>
-    </w:p>
-    <w:p>
-      <w:pPr>
-        <w:keepNext/>
-        <w:spacing w:after="60" w:before="120"/>
-        <w:jc w:val="center"/>
-      </w:pPr>
-      <w:r>
-        <w:drawing>
-          <wp:inline distT="0" distB="0" distL="0" distR="0">
-            <wp:extent cx="4000500" cy="3305175"/>
-            <wp:effectExtent t="0" r="0" b="0" l="0"/>
-            <wp:docPr id="1" name="" descr="" title=""/>
-            <wp:cNvGraphicFramePr>
-              <a:graphicFrameLocks xmlns:a="http://schemas.openxmlformats.org/drawingml/2006/main" noChangeAspect="1"/>
-            </wp:cNvGraphicFramePr>
-            <a:graphic xmlns:a="http://schemas.openxmlformats.org/drawingml/2006/main">
-              <a:graphicData uri="http://schemas.openxmlformats.org/drawingml/2006/picture">
-                <pic:pic xmlns:pic="http://schemas.openxmlformats.org/drawingml/2006/picture">
-                  <pic:nvPicPr>
-                    <pic:cNvPr id="0" name="" descr=""/>
-                    <pic:cNvPicPr>
-                      <a:picLocks noChangeAspect="1" noChangeArrowheads="1"/>
-                    </pic:cNvPicPr>
-                  </pic:nvPicPr>
-                  <pic:blipFill>
-                    <a:blip r:embed="rId10" cstate="none"/>
-                    <a:srcRect/>
-                    <a:stretch>
-                      <a:fillRect/>
-                    </a:stretch>
-                  </pic:blipFill>
-                  <pic:spPr bwMode="auto">
-                    <a:xfrm>
-                      <a:off x="0" y="0"/>
-                      <a:ext cx="4000500" cy="3305175"/>
-                    </a:xfrm>
-                    <a:prstGeom prst="rect">
-                      <a:avLst/>
-                    </a:prstGeom>
-                  </pic:spPr>
-                </pic:pic>
-              </a:graphicData>
-            </a:graphic>
-          </wp:inline>
-        </w:drawing>
-      </w:r>
-    </w:p>
-    <w:p>
-      <w:pPr>
-        <w:spacing w:after="200"/>
-        <w:jc w:val="center"/>
-      </w:pPr>
-      <w:r>
-        <w:rPr>
-          <w:rFonts w:ascii="Calibri" w:cs="Calibri" w:eastAsia="Calibri" w:hAnsi="Calibri"/>
-          <w:b/>
-          <w:bCs/>
-          <w:color w:val="52606D"/>
-          <w:sz w:val="18"/>
-          <w:szCs w:val="18"/>
-        </w:rPr>
-        <w:t xml:space="preserve">Figure 2. </w:t>
-      </w:r>
-      <w:r>
-        <w:rPr>
-          <w:rFonts w:ascii="Calibri" w:cs="Calibri" w:eastAsia="Calibri" w:hAnsi="Calibri"/>
-          <w:color w:val="52606D"/>
-          <w:sz w:val="18"/>
-          <w:szCs w:val="18"/>
-        </w:rPr>
-        <w:t xml:space="preserve">Two of the weak entity sets with their identifying relationships.</w:t>
-      </w:r>
-    </w:p>
-    <w:p>
-      <w:pPr>
-        <w:pStyle w:val="Heading2"/>
-      </w:pPr>
-      <w:r>
-        <w:rPr>
-          <w:rFonts w:ascii="Calibri" w:cs="Calibri" w:eastAsia="Calibri" w:hAnsi="Calibri"/>
-        </w:rPr>
-        <w:t xml:space="preserve">4.2 ISA hierarchy</w:t>
-      </w:r>
-    </w:p>
-    <w:p>
-      <w:pPr>
-        <w:spacing w:after="120" w:line="276"/>
-      </w:pPr>
-      <w:r>
-        <w:rPr>
-          <w:rFonts w:ascii="Calibri" w:cs="Calibri" w:eastAsia="Calibri" w:hAnsi="Calibri"/>
-        </w:rPr>
-        <w:t xml:space="preserve">Accounts is specialised into Customers, Staff, Couriers. The subclasses inherit the attributes of an account and its key, and each adds its own attributes and its own relationships: only customers place orders, only staff members work in departments, and only couriers drive vehicles and attempt deliveries.</w:t>
-      </w:r>
-    </w:p>
-    <w:p>
-      <w:pPr>
-        <w:pStyle w:val="ListParagraph"/>
-        <w:numPr>
-          <w:ilvl w:val="0"/>
-          <w:numId w:val="2"/>
-        </w:numPr>
-        <w:spacing w:after="60"/>
-      </w:pPr>
-      <w:r>
-        <w:rPr>
-          <w:rFonts w:ascii="Calibri" w:cs="Calibri" w:eastAsia="Calibri" w:hAnsi="Calibri"/>
-          <w:b/>
-          <w:bCs/>
-        </w:rPr>
-        <w:t xml:space="preserve">Overlap: not allowed. </w:t>
-      </w:r>
-      <w:r>
-        <w:rPr>
-          <w:rFonts w:ascii="Calibri" w:cs="Calibri" w:eastAsia="Calibri" w:hAnsi="Calibri"/>
-        </w:rPr>
-        <w:t xml:space="preserve">An account has exactly one role, and a subclass entity must match the role recorded on its account.</w:t>
-      </w:r>
-    </w:p>
-    <w:p>
-      <w:pPr>
-        <w:pStyle w:val="ListParagraph"/>
-        <w:numPr>
-          <w:ilvl w:val="0"/>
-          <w:numId w:val="2"/>
-        </w:numPr>
-        <w:spacing w:after="60"/>
-      </w:pPr>
-      <w:r>
-        <w:rPr>
-          <w:rFonts w:ascii="Calibri" w:cs="Calibri" w:eastAsia="Calibri" w:hAnsi="Calibri"/>
-          <w:b/>
-          <w:bCs/>
-        </w:rPr>
-        <w:t xml:space="preserve">Covering: yes. </w:t>
-      </w:r>
-      <w:r>
-        <w:rPr>
-          <w:rFonts w:ascii="Calibri" w:cs="Calibri" w:eastAsia="Calibri" w:hAnsi="Calibri"/>
-        </w:rPr>
-        <w:t xml:space="preserve">The role is mandatory, so every account belongs to one of the three subclasses.</w:t>
-      </w:r>
-    </w:p>
-    <w:p>
-      <w:pPr>
-        <w:keepNext/>
-        <w:spacing w:after="60" w:before="120"/>
-        <w:jc w:val="center"/>
-      </w:pPr>
-      <w:r>
-        <w:drawing>
-          <wp:inline distT="0" distB="0" distL="0" distR="0">
-            <wp:extent cx="4400550" cy="2924175"/>
-            <wp:effectExtent t="0" r="0" b="0" l="0"/>
-            <wp:docPr id="1" name="" descr="" title=""/>
-            <wp:cNvGraphicFramePr>
-              <a:graphicFrameLocks xmlns:a="http://schemas.openxmlformats.org/drawingml/2006/main" noChangeAspect="1"/>
-            </wp:cNvGraphicFramePr>
-            <a:graphic xmlns:a="http://schemas.openxmlformats.org/drawingml/2006/main">
-              <a:graphicData uri="http://schemas.openxmlformats.org/drawingml/2006/picture">
-                <pic:pic xmlns:pic="http://schemas.openxmlformats.org/drawingml/2006/picture">
-                  <pic:nvPicPr>
-                    <pic:cNvPr id="0" name="" descr=""/>
-                    <pic:cNvPicPr>
-                      <a:picLocks noChangeAspect="1" noChangeArrowheads="1"/>
-                    </pic:cNvPicPr>
-                  </pic:nvPicPr>
-                  <pic:blipFill>
-                    <a:blip r:embed="rId11" cstate="none"/>
-                    <a:srcRect/>
-                    <a:stretch>
-                      <a:fillRect/>
-                    </a:stretch>
-                  </pic:blipFill>
-                  <pic:spPr bwMode="auto">
-                    <a:xfrm>
-                      <a:off x="0" y="0"/>
-                      <a:ext cx="4400550" cy="2924175"/>
-                    </a:xfrm>
-                    <a:prstGeom prst="rect">
-                      <a:avLst/>
-                    </a:prstGeom>
-                  </pic:spPr>
-                </pic:pic>
-              </a:graphicData>
-            </a:graphic>
-          </wp:inline>
-        </w:drawing>
-      </w:r>
-    </w:p>
-    <w:p>
-      <w:pPr>
-        <w:spacing w:after="200"/>
-        <w:jc w:val="center"/>
-      </w:pPr>
-      <w:r>
-        <w:rPr>
-          <w:rFonts w:ascii="Calibri" w:cs="Calibri" w:eastAsia="Calibri" w:hAnsi="Calibri"/>
-          <w:b/>
-          <w:bCs/>
-          <w:color w:val="52606D"/>
-          <w:sz w:val="18"/>
-          <w:szCs w:val="18"/>
-        </w:rPr>
-        <w:t xml:space="preserve">Figure 3. </w:t>
-      </w:r>
-      <w:r>
-        <w:rPr>
-          <w:rFonts w:ascii="Calibri" w:cs="Calibri" w:eastAsia="Calibri" w:hAnsi="Calibri"/>
-          <w:color w:val="52606D"/>
-          <w:sz w:val="18"/>
-          <w:szCs w:val="18"/>
-        </w:rPr>
-        <w:t xml:space="preserve">ISA hierarchy of accounts.</w:t>
-      </w:r>
-    </w:p>
-    <w:p>
-      <w:pPr>
-        <w:pStyle w:val="Heading2"/>
-      </w:pPr>
-      <w:r>
-        <w:rPr>
-          <w:rFonts w:ascii="Calibri" w:cs="Calibri" w:eastAsia="Calibri" w:hAnsi="Calibri"/>
-        </w:rPr>
-        <w:t xml:space="preserve">4.3 Ternary relationship</w:t>
-      </w:r>
-    </w:p>
-    <w:p>
-      <w:pPr>
-        <w:spacing w:after="120" w:line="276"/>
-      </w:pPr>
-      <w:r>
-        <w:rPr>
-          <w:rFonts w:ascii="Calibri" w:cs="Calibri" w:eastAsia="Calibri" w:hAnsi="Calibri"/>
-        </w:rPr>
-        <w:t xml:space="preserve">Stocks relates Seller_Organizations, Variants and Warehouses and carries the available quantity and the reorder point. The quantity belongs to the combination of all three. Three binary relationships (seller sells variant, seller uses warehouse, warehouse holds variant) would not say how many units of a particular seller's variant lie in a particular warehouse, which is the same argument the slides make with the Contracts example.</w:t>
-      </w:r>
-    </w:p>
-    <w:p>
-      <w:pPr>
-        <w:pStyle w:val="Heading2"/>
-      </w:pPr>
-      <w:r>
-        <w:rPr>
-          <w:rFonts w:ascii="Calibri" w:cs="Calibri" w:eastAsia="Calibri" w:hAnsi="Calibri"/>
-        </w:rPr>
-        <w:t xml:space="preserve">4.4 Aggregation</w:t>
-      </w:r>
-    </w:p>
-    <w:p>
-      <w:pPr>
-        <w:spacing w:after="120" w:line="276"/>
-      </w:pPr>
-      <w:r>
-        <w:rPr>
-          <w:rFonts w:ascii="Calibri" w:cs="Calibri" w:eastAsia="Calibri" w:hAnsi="Calibri"/>
-        </w:rPr>
-        <w:t xml:space="preserve">Stocks is enclosed together with its three entity sets in a dashed box, so that the relationship can itself take part in other relationships. Two relationships connect to the box:</w:t>
-      </w:r>
-    </w:p>
-    <w:p>
-      <w:pPr>
-        <w:pStyle w:val="ListParagraph"/>
-        <w:numPr>
-          <w:ilvl w:val="0"/>
-          <w:numId w:val="2"/>
-        </w:numPr>
-        <w:spacing w:after="60"/>
-      </w:pPr>
-      <w:r>
-        <w:rPr>
-          <w:rFonts w:ascii="Calibri" w:cs="Calibri" w:eastAsia="Calibri" w:hAnsi="Calibri"/>
-          <w:b/>
-          <w:bCs/>
-        </w:rPr>
-        <w:t xml:space="preserve">Batch_Of: </w:t>
-      </w:r>
-      <w:r>
-        <w:rPr>
-          <w:rFonts w:ascii="Calibri" w:cs="Calibri" w:eastAsia="Calibri" w:hAnsi="Calibri"/>
-        </w:rPr>
-        <w:t xml:space="preserve">Each batch belongs to exactly one stock position, that is, to one Stocks relationship (aggregation). A stock position consists of many batches.</w:t>
-      </w:r>
-    </w:p>
-    <w:p>
-      <w:pPr>
-        <w:pStyle w:val="ListParagraph"/>
-        <w:numPr>
-          <w:ilvl w:val="0"/>
-          <w:numId w:val="2"/>
-        </w:numPr>
-        <w:spacing w:after="60"/>
-      </w:pPr>
-      <w:r>
-        <w:rPr>
-          <w:rFonts w:ascii="Calibri" w:cs="Calibri" w:eastAsia="Calibri" w:hAnsi="Calibri"/>
-          <w:b/>
-          <w:bCs/>
-        </w:rPr>
-        <w:t xml:space="preserve">Reserves: </w:t>
-      </w:r>
-      <w:r>
-        <w:rPr>
-          <w:rFonts w:ascii="Calibri" w:cs="Calibri" w:eastAsia="Calibri" w:hAnsi="Calibri"/>
-        </w:rPr>
-        <w:t xml:space="preserve">An order line reserves a quantity from a stock position, that is, from a Stocks relationship (seller, variant, warehouse) treated as one object. One line may be served from several warehouses.</w:t>
-      </w:r>
-    </w:p>
-    <w:p>
-      <w:pPr>
-        <w:spacing w:after="120" w:line="276"/>
-      </w:pPr>
-      <w:r>
-        <w:rPr>
-          <w:rFonts w:ascii="Calibri" w:cs="Calibri" w:eastAsia="Calibri" w:hAnsi="Calibri"/>
-        </w:rPr>
-        <w:t xml:space="preserve">We chose aggregation over a larger n-ary relationship because a reservation or a batch must refer to a stock position that already exists, because Reserves has its own attribute (quantity), and because the constraints differ: a batch belongs to exactly one stock position, whereas an order line may be served from several.</w:t>
-      </w:r>
-    </w:p>
-    <w:p>
-      <w:pPr>
-        <w:keepNext/>
-        <w:spacing w:after="60" w:before="120"/>
-        <w:jc w:val="center"/>
-      </w:pPr>
-      <w:r>
-        <w:drawing>
-          <wp:inline distT="0" distB="0" distL="0" distR="0">
-            <wp:extent cx="6124575" cy="2543175"/>
-            <wp:effectExtent t="0" r="0" b="0" l="0"/>
-            <wp:docPr id="1" name="" descr="" title=""/>
-            <wp:cNvGraphicFramePr>
-              <a:graphicFrameLocks xmlns:a="http://schemas.openxmlformats.org/drawingml/2006/main" noChangeAspect="1"/>
-            </wp:cNvGraphicFramePr>
-            <a:graphic xmlns:a="http://schemas.openxmlformats.org/drawingml/2006/main">
-              <a:graphicData uri="http://schemas.openxmlformats.org/drawingml/2006/picture">
-                <pic:pic xmlns:pic="http://schemas.openxmlformats.org/drawingml/2006/picture">
-                  <pic:nvPicPr>
-                    <pic:cNvPr id="0" name="" descr=""/>
-                    <pic:cNvPicPr>
-                      <a:picLocks noChangeAspect="1" noChangeArrowheads="1"/>
-                    </pic:cNvPicPr>
-                  </pic:nvPicPr>
-                  <pic:blipFill>
-                    <a:blip r:embed="rId12" cstate="none"/>
-                    <a:srcRect/>
-                    <a:stretch>
-                      <a:fillRect/>
-                    </a:stretch>
-                  </pic:blipFill>
-                  <pic:spPr bwMode="auto">
-                    <a:xfrm>
-                      <a:off x="0" y="0"/>
-                      <a:ext cx="6124575" cy="2543175"/>
-                    </a:xfrm>
-                    <a:prstGeom prst="rect">
-                      <a:avLst/>
-                    </a:prstGeom>
-                  </pic:spPr>
-                </pic:pic>
-              </a:graphicData>
-            </a:graphic>
-          </wp:inline>
-        </w:drawing>
-      </w:r>
-    </w:p>
-    <w:p>
-      <w:pPr>
-        <w:spacing w:after="200"/>
-        <w:jc w:val="center"/>
-      </w:pPr>
-      <w:r>
-        <w:rPr>
-          <w:rFonts w:ascii="Calibri" w:cs="Calibri" w:eastAsia="Calibri" w:hAnsi="Calibri"/>
-          <w:b/>
-          <w:bCs/>
-          <w:color w:val="52606D"/>
-          <w:sz w:val="18"/>
-          <w:szCs w:val="18"/>
-        </w:rPr>
-        <w:t xml:space="preserve">Figure 4. </w:t>
-      </w:r>
-      <w:r>
-        <w:rPr>
-          <w:rFonts w:ascii="Calibri" w:cs="Calibri" w:eastAsia="Calibri" w:hAnsi="Calibri"/>
-          <w:color w:val="52606D"/>
-          <w:sz w:val="18"/>
-          <w:szCs w:val="18"/>
-        </w:rPr>
-        <w:t xml:space="preserve">Stocks as a ternary relationship, aggregated and used by Batch_Of and Reserves.</w:t>
-      </w:r>
-    </w:p>
-    <w:p>
-      <w:r>
-        <w:br w:type="page"/>
-      </w:r>
-    </w:p>
-    <w:p>
-      <w:pPr>
-        <w:pStyle w:val="Heading1"/>
-      </w:pPr>
-      <w:r>
-        <w:rPr>
-          <w:rFonts w:ascii="Calibri" w:cs="Calibri" w:eastAsia="Calibri" w:hAnsi="Calibri"/>
-        </w:rPr>
-        <w:t xml:space="preserve">5. Part 1 – Entities</w:t>
-      </w:r>
-    </w:p>
-    <w:p>
-      <w:pPr>
-        <w:spacing w:after="120" w:line="276"/>
-      </w:pPr>
-      <w:r>
-        <w:rPr>
-          <w:rFonts w:ascii="Calibri" w:cs="Calibri" w:eastAsia="Calibri" w:hAnsi="Calibri"/>
-        </w:rPr>
-        <w:t xml:space="preserve">The entity sets are grouped by business area. For each one we give its meaning, its key and its own attributes. Attributes that refer to another entity are left out on purpose; those links are the relationships of Part 2. Optional attributes may be empty, and unique attributes are alternative keys.</w:t>
-      </w:r>
-    </w:p>
-    <w:p>
-      <w:pPr>
-        <w:pStyle w:val="Heading2"/>
-      </w:pPr>
-      <w:r>
-        <w:rPr>
-          <w:rFonts w:ascii="Calibri" w:cs="Calibri" w:eastAsia="Calibri" w:hAnsi="Calibri"/>
-        </w:rPr>
-        <w:t xml:space="preserve">5.1 People and accounts</w:t>
-      </w:r>
-    </w:p>
-    <w:p>
-      <w:pPr>
-        <w:keepNext/>
-        <w:spacing w:after="60" w:before="120"/>
-      </w:pPr>
-      <w:r>
-        <w:rPr>
-          <w:rFonts w:ascii="Calibri" w:cs="Calibri" w:eastAsia="Calibri" w:hAnsi="Calibri"/>
-          <w:b/>
-          <w:bCs/>
-          <w:color w:val="52606D"/>
-          <w:sz w:val="18"/>
-          <w:szCs w:val="18"/>
-        </w:rPr>
-        <w:t xml:space="preserve">Table 3. </w:t>
-      </w:r>
-      <w:r>
-        <w:rPr>
-          <w:rFonts w:ascii="Calibri" w:cs="Calibri" w:eastAsia="Calibri" w:hAnsi="Calibri"/>
-          <w:color w:val="52606D"/>
-          <w:sz w:val="18"/>
-          <w:szCs w:val="18"/>
-        </w:rPr>
-        <w:t xml:space="preserve">People and accounts: 8 entity sets.</w:t>
+        <w:t xml:space="preserve">1.1 People and accounts</w:t>
       </w:r>
     </w:p>
     <w:tbl>
@@ -4059,150 +2090,127 @@
               <w:t xml:space="preserve">A message sent to a customer (order shipped, price dropped) together with when it was read.</w:t>
             </w:r>
           </w:p>
-        </w:tc>
-        <w:tc>
-          <w:tcPr>
-            <w:tcW w:type="dxa" w:w="1700"/>
-            <w:tcBorders>
-              <w:top w:val="single" w:color="BCC5CF" w:sz="4"/>
-              <w:left w:val="single" w:color="BCC5CF" w:sz="4"/>
-              <w:bottom w:val="single" w:color="BCC5CF" w:sz="4"/>
-              <w:right w:val="single" w:color="BCC5CF" w:sz="4"/>
-            </w:tcBorders>
-            <w:shd w:fill="F4F6F8" w:color="auto" w:val="clear"/>
-            <w:tcMar>
-              <w:top w:type="dxa" w:w="50"/>
-              <w:left w:type="dxa" w:w="90"/>
-              <w:bottom w:type="dxa" w:w="50"/>
-              <w:right w:type="dxa" w:w="90"/>
-            </w:tcMar>
-          </w:tcPr>
-          <w:p>
-            <w:pPr>
-              <w:spacing w:after="20"/>
-            </w:pPr>
-            <w:r>
-              <w:rPr>
-                <w:rFonts w:ascii="Calibri" w:cs="Calibri" w:eastAsia="Calibri" w:hAnsi="Calibri"/>
-                <w:u w:val="single"/>
-              </w:rPr>
-              <w:t xml:space="preserve">notification_id</w:t>
-            </w:r>
-          </w:p>
-        </w:tc>
-        <w:tc>
-          <w:tcPr>
-            <w:tcW w:type="dxa" w:w="2200"/>
-            <w:tcBorders>
-              <w:top w:val="single" w:color="BCC5CF" w:sz="4"/>
-              <w:left w:val="single" w:color="BCC5CF" w:sz="4"/>
-              <w:bottom w:val="single" w:color="BCC5CF" w:sz="4"/>
-              <w:right w:val="single" w:color="BCC5CF" w:sz="4"/>
-            </w:tcBorders>
-            <w:shd w:fill="F4F6F8" w:color="auto" w:val="clear"/>
-            <w:tcMar>
-              <w:top w:type="dxa" w:w="50"/>
-              <w:left w:type="dxa" w:w="90"/>
-              <w:bottom w:type="dxa" w:w="50"/>
-              <w:right w:type="dxa" w:w="90"/>
-            </w:tcMar>
-          </w:tcPr>
-          <w:p>
-            <w:pPr>
-              <w:spacing w:after="20"/>
-            </w:pPr>
-            <w:r>
-              <w:rPr>
-                <w:rFonts w:ascii="Calibri" w:cs="Calibri" w:eastAsia="Calibri" w:hAnsi="Calibri"/>
-                <w:sz w:val="18"/>
-                <w:szCs w:val="18"/>
-              </w:rPr>
-              <w:t xml:space="preserve">message</w:t>
-            </w:r>
-            <w:r>
-              <w:rPr>
-                <w:rFonts w:ascii="Calibri" w:cs="Calibri" w:eastAsia="Calibri" w:hAnsi="Calibri"/>
-                <w:sz w:val="18"/>
-                <w:szCs w:val="18"/>
-              </w:rPr>
-              <w:t xml:space="preserve">, </w:t>
-            </w:r>
-            <w:r>
-              <w:rPr>
-                <w:rFonts w:ascii="Calibri" w:cs="Calibri" w:eastAsia="Calibri" w:hAnsi="Calibri"/>
-                <w:sz w:val="18"/>
-                <w:szCs w:val="18"/>
-              </w:rPr>
-              <w:t xml:space="preserve">created_at</w:t>
-            </w:r>
-            <w:r>
-              <w:rPr>
-                <w:rFonts w:ascii="Calibri" w:cs="Calibri" w:eastAsia="Calibri" w:hAnsi="Calibri"/>
-                <w:sz w:val="18"/>
-                <w:szCs w:val="18"/>
-              </w:rPr>
-              <w:t xml:space="preserve">, </w:t>
-            </w:r>
-            <w:r>
-              <w:rPr>
-                <w:rFonts w:ascii="Calibri" w:cs="Calibri" w:eastAsia="Calibri" w:hAnsi="Calibri"/>
-                <w:sz w:val="18"/>
-                <w:szCs w:val="18"/>
-              </w:rPr>
-              <w:t xml:space="preserve">read_at</w:t>
-            </w:r>
-            <w:r>
-              <w:rPr>
-                <w:rFonts w:ascii="Calibri" w:cs="Calibri" w:eastAsia="Calibri" w:hAnsi="Calibri"/>
+          <w:p>
+            <w:pPr>
+              <w:spacing w:after="20"/>
+            </w:pPr>
+            <w:r>
+              <w:rPr>
+                <w:rFonts w:ascii="Calibri" w:cs="Calibri" w:eastAsia="Calibri" w:hAnsi="Calibri"/>
+                <w:i/>
+                <w:iCs/>
                 <w:color w:val="52606D"/>
                 <w:sz w:val="16"/>
                 <w:szCs w:val="16"/>
               </w:rPr>
+              <w:t xml:space="preserve">A customer receives many notifications, each with its own read time.</w:t>
+            </w:r>
+          </w:p>
+        </w:tc>
+        <w:tc>
+          <w:tcPr>
+            <w:tcW w:type="dxa" w:w="1700"/>
+            <w:tcBorders>
+              <w:top w:val="single" w:color="BCC5CF" w:sz="4"/>
+              <w:left w:val="single" w:color="BCC5CF" w:sz="4"/>
+              <w:bottom w:val="single" w:color="BCC5CF" w:sz="4"/>
+              <w:right w:val="single" w:color="BCC5CF" w:sz="4"/>
+            </w:tcBorders>
+            <w:shd w:fill="F4F6F8" w:color="auto" w:val="clear"/>
+            <w:tcMar>
+              <w:top w:type="dxa" w:w="50"/>
+              <w:left w:type="dxa" w:w="90"/>
+              <w:bottom w:type="dxa" w:w="50"/>
+              <w:right w:type="dxa" w:w="90"/>
+            </w:tcMar>
+          </w:tcPr>
+          <w:p>
+            <w:pPr>
+              <w:spacing w:after="20"/>
+            </w:pPr>
+            <w:r>
+              <w:rPr>
+                <w:rFonts w:ascii="Calibri" w:cs="Calibri" w:eastAsia="Calibri" w:hAnsi="Calibri"/>
+                <w:u w:val="single"/>
+              </w:rPr>
+              <w:t xml:space="preserve">notification_id</w:t>
+            </w:r>
+          </w:p>
+        </w:tc>
+        <w:tc>
+          <w:tcPr>
+            <w:tcW w:type="dxa" w:w="2200"/>
+            <w:tcBorders>
+              <w:top w:val="single" w:color="BCC5CF" w:sz="4"/>
+              <w:left w:val="single" w:color="BCC5CF" w:sz="4"/>
+              <w:bottom w:val="single" w:color="BCC5CF" w:sz="4"/>
+              <w:right w:val="single" w:color="BCC5CF" w:sz="4"/>
+            </w:tcBorders>
+            <w:shd w:fill="F4F6F8" w:color="auto" w:val="clear"/>
+            <w:tcMar>
+              <w:top w:type="dxa" w:w="50"/>
+              <w:left w:type="dxa" w:w="90"/>
+              <w:bottom w:type="dxa" w:w="50"/>
+              <w:right w:type="dxa" w:w="90"/>
+            </w:tcMar>
+          </w:tcPr>
+          <w:p>
+            <w:pPr>
+              <w:spacing w:after="20"/>
+            </w:pPr>
+            <w:r>
+              <w:rPr>
+                <w:rFonts w:ascii="Calibri" w:cs="Calibri" w:eastAsia="Calibri" w:hAnsi="Calibri"/>
+                <w:sz w:val="18"/>
+                <w:szCs w:val="18"/>
+              </w:rPr>
+              <w:t xml:space="preserve">message</w:t>
+            </w:r>
+            <w:r>
+              <w:rPr>
+                <w:rFonts w:ascii="Calibri" w:cs="Calibri" w:eastAsia="Calibri" w:hAnsi="Calibri"/>
+                <w:sz w:val="18"/>
+                <w:szCs w:val="18"/>
+              </w:rPr>
+              <w:t xml:space="preserve">, </w:t>
+            </w:r>
+            <w:r>
+              <w:rPr>
+                <w:rFonts w:ascii="Calibri" w:cs="Calibri" w:eastAsia="Calibri" w:hAnsi="Calibri"/>
+                <w:sz w:val="18"/>
+                <w:szCs w:val="18"/>
+              </w:rPr>
+              <w:t xml:space="preserve">created_at</w:t>
+            </w:r>
+            <w:r>
+              <w:rPr>
+                <w:rFonts w:ascii="Calibri" w:cs="Calibri" w:eastAsia="Calibri" w:hAnsi="Calibri"/>
+                <w:sz w:val="18"/>
+                <w:szCs w:val="18"/>
+              </w:rPr>
+              <w:t xml:space="preserve">, </w:t>
+            </w:r>
+            <w:r>
+              <w:rPr>
+                <w:rFonts w:ascii="Calibri" w:cs="Calibri" w:eastAsia="Calibri" w:hAnsi="Calibri"/>
+                <w:sz w:val="18"/>
+                <w:szCs w:val="18"/>
+              </w:rPr>
+              <w:t xml:space="preserve">read_at</w:t>
+            </w:r>
+            <w:r>
+              <w:rPr>
+                <w:rFonts w:ascii="Calibri" w:cs="Calibri" w:eastAsia="Calibri" w:hAnsi="Calibri"/>
+                <w:color w:val="52606D"/>
+                <w:sz w:val="16"/>
+                <w:szCs w:val="16"/>
+              </w:rPr>
               <w:t xml:space="preserve"> (optional)</w:t>
             </w:r>
           </w:p>
         </w:tc>
       </w:tr>
     </w:tbl>
-    <w:p>
-      <w:pPr>
-        <w:spacing w:after="60" w:before="160"/>
-      </w:pPr>
-      <w:r>
-        <w:rPr>
-          <w:rFonts w:ascii="Calibri" w:cs="Calibri" w:eastAsia="Calibri" w:hAnsi="Calibri"/>
-          <w:b/>
-          <w:bCs/>
-          <w:sz w:val="20"/>
-          <w:szCs w:val="20"/>
-        </w:rPr>
-        <w:t xml:space="preserve">Why these are entity sets and not attributes</w:t>
-      </w:r>
-    </w:p>
-    <w:p>
-      <w:pPr>
-        <w:pStyle w:val="ListParagraph"/>
-        <w:numPr>
-          <w:ilvl w:val="0"/>
-          <w:numId w:val="2"/>
-        </w:numPr>
-        <w:spacing w:after="60"/>
-      </w:pPr>
-      <w:r>
-        <w:rPr>
-          <w:rFonts w:ascii="Calibri" w:cs="Calibri" w:eastAsia="Calibri" w:hAnsi="Calibri"/>
-          <w:b/>
-          <w:bCs/>
-        </w:rPr>
-        <w:t xml:space="preserve">Customer_Notifications: </w:t>
-      </w:r>
-      <w:r>
-        <w:rPr>
-          <w:rFonts w:ascii="Calibri" w:cs="Calibri" w:eastAsia="Calibri" w:hAnsi="Calibri"/>
-        </w:rPr>
-        <w:t xml:space="preserve">A customer receives many notifications, each with its own read time.</w:t>
-      </w:r>
-    </w:p>
     <w:p>
       <w:pPr>
         <w:pStyle w:val="Heading2"/>
@@ -4211,33 +2219,7 @@
         <w:rPr>
           <w:rFonts w:ascii="Calibri" w:cs="Calibri" w:eastAsia="Calibri" w:hAnsi="Calibri"/>
         </w:rPr>
-        <w:t xml:space="preserve">5.2 Sellers</w:t>
-      </w:r>
-    </w:p>
-    <w:p>
-      <w:pPr>
-        <w:keepNext/>
-        <w:spacing w:after="60" w:before="120"/>
-      </w:pPr>
-      <w:r>
-        <w:rPr>
-          <w:rFonts w:ascii="Calibri" w:cs="Calibri" w:eastAsia="Calibri" w:hAnsi="Calibri"/>
-          <w:b/>
-          <w:bCs/>
-          <w:color w:val="52606D"/>
-          <w:sz w:val="18"/>
-          <w:szCs w:val="18"/>
-        </w:rPr>
-        <w:t xml:space="preserve">Table 4. </w:t>
-      </w:r>
-      <w:r>
-        <w:rPr>
-          <w:rFonts w:ascii="Calibri" w:cs="Calibri" w:eastAsia="Calibri" w:hAnsi="Calibri"/>
-          <w:color w:val="52606D"/>
-          <w:sz w:val="18"/>
-          <w:szCs w:val="18"/>
-        </w:rPr>
-        <w:t xml:space="preserve">Sellers: 6 entity sets.</w:t>
+        <w:t xml:space="preserve">1.2 Sellers</w:t>
       </w:r>
     </w:p>
     <w:tbl>
@@ -5566,33 +3548,7 @@
         <w:rPr>
           <w:rFonts w:ascii="Calibri" w:cs="Calibri" w:eastAsia="Calibri" w:hAnsi="Calibri"/>
         </w:rPr>
-        <w:t xml:space="preserve">5.3 Locations and tax</w:t>
-      </w:r>
-    </w:p>
-    <w:p>
-      <w:pPr>
-        <w:keepNext/>
-        <w:spacing w:after="60" w:before="120"/>
-      </w:pPr>
-      <w:r>
-        <w:rPr>
-          <w:rFonts w:ascii="Calibri" w:cs="Calibri" w:eastAsia="Calibri" w:hAnsi="Calibri"/>
-          <w:b/>
-          <w:bCs/>
-          <w:color w:val="52606D"/>
-          <w:sz w:val="18"/>
-          <w:szCs w:val="18"/>
-        </w:rPr>
-        <w:t xml:space="preserve">Table 5. </w:t>
-      </w:r>
-      <w:r>
-        <w:rPr>
-          <w:rFonts w:ascii="Calibri" w:cs="Calibri" w:eastAsia="Calibri" w:hAnsi="Calibri"/>
-          <w:color w:val="52606D"/>
-          <w:sz w:val="18"/>
-          <w:szCs w:val="18"/>
-        </w:rPr>
-        <w:t xml:space="preserve">Locations and tax: 6 entity sets.</w:t>
+        <w:t xml:space="preserve">1.3 Locations and tax</w:t>
       </w:r>
     </w:p>
     <w:tbl>
@@ -5885,6 +3841,22 @@
               <w:t xml:space="preserve">A country the marketplace operates in, identified by its two-letter ISO code.</w:t>
             </w:r>
           </w:p>
+          <w:p>
+            <w:pPr>
+              <w:spacing w:after="20"/>
+            </w:pPr>
+            <w:r>
+              <w:rPr>
+                <w:rFonts w:ascii="Calibri" w:cs="Calibri" w:eastAsia="Calibri" w:hAnsi="Calibri"/>
+                <w:i/>
+                <w:iCs/>
+                <w:color w:val="52606D"/>
+                <w:sz w:val="16"/>
+                <w:szCs w:val="16"/>
+              </w:rPr>
+              <w:t xml:space="preserve">Cities and tax rates both depend on the country; a separate entity stores the country name once.</w:t>
+            </w:r>
+          </w:p>
         </w:tc>
         <w:tc>
           <w:tcPr>
@@ -6053,6 +4025,22 @@
               <w:t xml:space="preserve">A city inside a country. Addresses, warehouses, delivery zones and pickup points are located in cities.</w:t>
             </w:r>
           </w:p>
+          <w:p>
+            <w:pPr>
+              <w:spacing w:after="20"/>
+            </w:pPr>
+            <w:r>
+              <w:rPr>
+                <w:rFonts w:ascii="Calibri" w:cs="Calibri" w:eastAsia="Calibri" w:hAnsi="Calibri"/>
+                <w:i/>
+                <w:iCs/>
+                <w:color w:val="52606D"/>
+                <w:sz w:val="16"/>
+                <w:szCs w:val="16"/>
+              </w:rPr>
+              <w:t xml:space="preserve">Addresses, warehouses, zones and pickup points all refer to cities, and we want to search by city. As the slide on addresses says, when the structure matters it must be an entity.</w:t>
+            </w:r>
+          </w:p>
         </w:tc>
         <w:tc>
           <w:tcPr>
@@ -6815,69 +4803,6 @@
         </w:tc>
       </w:tr>
     </w:tbl>
-    <w:p>
-      <w:pPr>
-        <w:spacing w:after="60" w:before="160"/>
-      </w:pPr>
-      <w:r>
-        <w:rPr>
-          <w:rFonts w:ascii="Calibri" w:cs="Calibri" w:eastAsia="Calibri" w:hAnsi="Calibri"/>
-          <w:b/>
-          <w:bCs/>
-          <w:sz w:val="20"/>
-          <w:szCs w:val="20"/>
-        </w:rPr>
-        <w:t xml:space="preserve">Why these are entity sets and not attributes</w:t>
-      </w:r>
-    </w:p>
-    <w:p>
-      <w:pPr>
-        <w:pStyle w:val="ListParagraph"/>
-        <w:numPr>
-          <w:ilvl w:val="0"/>
-          <w:numId w:val="2"/>
-        </w:numPr>
-        <w:spacing w:after="60"/>
-      </w:pPr>
-      <w:r>
-        <w:rPr>
-          <w:rFonts w:ascii="Calibri" w:cs="Calibri" w:eastAsia="Calibri" w:hAnsi="Calibri"/>
-          <w:b/>
-          <w:bCs/>
-        </w:rPr>
-        <w:t xml:space="preserve">Countries: </w:t>
-      </w:r>
-      <w:r>
-        <w:rPr>
-          <w:rFonts w:ascii="Calibri" w:cs="Calibri" w:eastAsia="Calibri" w:hAnsi="Calibri"/>
-        </w:rPr>
-        <w:t xml:space="preserve">Cities and tax rates both depend on the country; a separate entity stores the country name once.</w:t>
-      </w:r>
-    </w:p>
-    <w:p>
-      <w:pPr>
-        <w:pStyle w:val="ListParagraph"/>
-        <w:numPr>
-          <w:ilvl w:val="0"/>
-          <w:numId w:val="2"/>
-        </w:numPr>
-        <w:spacing w:after="60"/>
-      </w:pPr>
-      <w:r>
-        <w:rPr>
-          <w:rFonts w:ascii="Calibri" w:cs="Calibri" w:eastAsia="Calibri" w:hAnsi="Calibri"/>
-          <w:b/>
-          <w:bCs/>
-        </w:rPr>
-        <w:t xml:space="preserve">Cities: </w:t>
-      </w:r>
-      <w:r>
-        <w:rPr>
-          <w:rFonts w:ascii="Calibri" w:cs="Calibri" w:eastAsia="Calibri" w:hAnsi="Calibri"/>
-        </w:rPr>
-        <w:t xml:space="preserve">Addresses, warehouses, zones and pickup points all refer to cities, and we want to search by city. As the slide on addresses says, when the structure matters it must be an entity.</w:t>
-      </w:r>
-    </w:p>
     <w:p>
       <w:pPr>
         <w:pStyle w:val="Heading2"/>
@@ -6886,33 +4811,7 @@
         <w:rPr>
           <w:rFonts w:ascii="Calibri" w:cs="Calibri" w:eastAsia="Calibri" w:hAnsi="Calibri"/>
         </w:rPr>
-        <w:t xml:space="preserve">5.4 Catalogue</w:t>
-      </w:r>
-    </w:p>
-    <w:p>
-      <w:pPr>
-        <w:keepNext/>
-        <w:spacing w:after="60" w:before="120"/>
-      </w:pPr>
-      <w:r>
-        <w:rPr>
-          <w:rFonts w:ascii="Calibri" w:cs="Calibri" w:eastAsia="Calibri" w:hAnsi="Calibri"/>
-          <w:b/>
-          <w:bCs/>
-          <w:color w:val="52606D"/>
-          <w:sz w:val="18"/>
-          <w:szCs w:val="18"/>
-        </w:rPr>
-        <w:t xml:space="preserve">Table 6. </w:t>
-      </w:r>
-      <w:r>
-        <w:rPr>
-          <w:rFonts w:ascii="Calibri" w:cs="Calibri" w:eastAsia="Calibri" w:hAnsi="Calibri"/>
-          <w:color w:val="52606D"/>
-          <w:sz w:val="18"/>
-          <w:szCs w:val="18"/>
-        </w:rPr>
-        <w:t xml:space="preserve">Catalogue: 12 entity sets.</w:t>
+        <w:t xml:space="preserve">1.4 Catalogue</w:t>
       </w:r>
     </w:p>
     <w:tbl>
@@ -7898,6 +5797,22 @@
               <w:t xml:space="preserve">A picture of a product with alternative text and a display position.</w:t>
             </w:r>
           </w:p>
+          <w:p>
+            <w:pPr>
+              <w:spacing w:after="20"/>
+            </w:pPr>
+            <w:r>
+              <w:rPr>
+                <w:rFonts w:ascii="Calibri" w:cs="Calibri" w:eastAsia="Calibri" w:hAnsi="Calibri"/>
+                <w:i/>
+                <w:iCs/>
+                <w:color w:val="52606D"/>
+                <w:sz w:val="16"/>
+                <w:szCs w:val="16"/>
+              </w:rPr>
+              <w:t xml:space="preserve">A product has many images, each with its own URL, text and position. Attributes cannot be set-valued, so images are an entity set.</w:t>
+            </w:r>
+          </w:p>
         </w:tc>
         <w:tc>
           <w:tcPr>
@@ -8431,6 +6346,22 @@
               <w:t xml:space="preserve">One recorded price change of a listing: the old price, the new price and when it changed.</w:t>
             </w:r>
           </w:p>
+          <w:p>
+            <w:pPr>
+              <w:spacing w:after="20"/>
+            </w:pPr>
+            <w:r>
+              <w:rPr>
+                <w:rFonts w:ascii="Calibri" w:cs="Calibri" w:eastAsia="Calibri" w:hAnsi="Calibri"/>
+                <w:i/>
+                <w:iCs/>
+                <w:color w:val="52606D"/>
+                <w:sz w:val="16"/>
+                <w:szCs w:val="16"/>
+              </w:rPr>
+              <w:t xml:space="preserve">A listing changes price many times and each change has its own old price, new price and time. Storing only the current price would lose the history.</w:t>
+            </w:r>
+          </w:p>
         </w:tc>
         <w:tc>
           <w:tcPr>
@@ -8970,6 +6901,22 @@
               <w:t xml:space="preserve">A downloadable file for a product, such as a manual or a warranty certificate.</w:t>
             </w:r>
           </w:p>
+          <w:p>
+            <w:pPr>
+              <w:spacing w:after="20"/>
+            </w:pPr>
+            <w:r>
+              <w:rPr>
+                <w:rFonts w:ascii="Calibri" w:cs="Calibri" w:eastAsia="Calibri" w:hAnsi="Calibri"/>
+                <w:i/>
+                <w:iCs/>
+                <w:color w:val="52606D"/>
+                <w:sz w:val="16"/>
+                <w:szCs w:val="16"/>
+              </w:rPr>
+              <w:t xml:space="preserve">A product may have several documents of different types.</w:t>
+            </w:r>
+          </w:p>
         </w:tc>
         <w:tc>
           <w:tcPr>
@@ -9241,93 +7188,6 @@
         </w:tc>
       </w:tr>
     </w:tbl>
-    <w:p>
-      <w:pPr>
-        <w:spacing w:after="60" w:before="160"/>
-      </w:pPr>
-      <w:r>
-        <w:rPr>
-          <w:rFonts w:ascii="Calibri" w:cs="Calibri" w:eastAsia="Calibri" w:hAnsi="Calibri"/>
-          <w:b/>
-          <w:bCs/>
-          <w:sz w:val="20"/>
-          <w:szCs w:val="20"/>
-        </w:rPr>
-        <w:t xml:space="preserve">Why these are entity sets and not attributes</w:t>
-      </w:r>
-    </w:p>
-    <w:p>
-      <w:pPr>
-        <w:pStyle w:val="ListParagraph"/>
-        <w:numPr>
-          <w:ilvl w:val="0"/>
-          <w:numId w:val="2"/>
-        </w:numPr>
-        <w:spacing w:after="60"/>
-      </w:pPr>
-      <w:r>
-        <w:rPr>
-          <w:rFonts w:ascii="Calibri" w:cs="Calibri" w:eastAsia="Calibri" w:hAnsi="Calibri"/>
-          <w:b/>
-          <w:bCs/>
-        </w:rPr>
-        <w:t xml:space="preserve">Product_Images: </w:t>
-      </w:r>
-      <w:r>
-        <w:rPr>
-          <w:rFonts w:ascii="Calibri" w:cs="Calibri" w:eastAsia="Calibri" w:hAnsi="Calibri"/>
-        </w:rPr>
-        <w:t xml:space="preserve">A product has many images, each with its own URL, text and position. Attributes cannot be set-valued, so images are an entity set.</w:t>
-      </w:r>
-    </w:p>
-    <w:p>
-      <w:pPr>
-        <w:pStyle w:val="ListParagraph"/>
-        <w:numPr>
-          <w:ilvl w:val="0"/>
-          <w:numId w:val="2"/>
-        </w:numPr>
-        <w:spacing w:after="60"/>
-      </w:pPr>
-      <w:r>
-        <w:rPr>
-          <w:rFonts w:ascii="Calibri" w:cs="Calibri" w:eastAsia="Calibri" w:hAnsi="Calibri"/>
-          <w:b/>
-          <w:bCs/>
-        </w:rPr>
-        <w:t xml:space="preserve">Price_History: </w:t>
-      </w:r>
-      <w:r>
-        <w:rPr>
-          <w:rFonts w:ascii="Calibri" w:cs="Calibri" w:eastAsia="Calibri" w:hAnsi="Calibri"/>
-        </w:rPr>
-        <w:t xml:space="preserve">A listing changes price many times and each change has its own old price, new price and time. Storing only the current price would lose the history.</w:t>
-      </w:r>
-    </w:p>
-    <w:p>
-      <w:pPr>
-        <w:pStyle w:val="ListParagraph"/>
-        <w:numPr>
-          <w:ilvl w:val="0"/>
-          <w:numId w:val="2"/>
-        </w:numPr>
-        <w:spacing w:after="60"/>
-      </w:pPr>
-      <w:r>
-        <w:rPr>
-          <w:rFonts w:ascii="Calibri" w:cs="Calibri" w:eastAsia="Calibri" w:hAnsi="Calibri"/>
-          <w:b/>
-          <w:bCs/>
-        </w:rPr>
-        <w:t xml:space="preserve">Product_Documents: </w:t>
-      </w:r>
-      <w:r>
-        <w:rPr>
-          <w:rFonts w:ascii="Calibri" w:cs="Calibri" w:eastAsia="Calibri" w:hAnsi="Calibri"/>
-        </w:rPr>
-        <w:t xml:space="preserve">A product may have several documents of different types.</w:t>
-      </w:r>
-    </w:p>
     <w:p>
       <w:pPr>
         <w:pStyle w:val="Heading2"/>
@@ -9336,33 +7196,7 @@
         <w:rPr>
           <w:rFonts w:ascii="Calibri" w:cs="Calibri" w:eastAsia="Calibri" w:hAnsi="Calibri"/>
         </w:rPr>
-        <w:t xml:space="preserve">5.5 Shopping and marketing</w:t>
-      </w:r>
-    </w:p>
-    <w:p>
-      <w:pPr>
-        <w:keepNext/>
-        <w:spacing w:after="60" w:before="120"/>
-      </w:pPr>
-      <w:r>
-        <w:rPr>
-          <w:rFonts w:ascii="Calibri" w:cs="Calibri" w:eastAsia="Calibri" w:hAnsi="Calibri"/>
-          <w:b/>
-          <w:bCs/>
-          <w:color w:val="52606D"/>
-          <w:sz w:val="18"/>
-          <w:szCs w:val="18"/>
-        </w:rPr>
-        <w:t xml:space="preserve">Table 7. </w:t>
-      </w:r>
-      <w:r>
-        <w:rPr>
-          <w:rFonts w:ascii="Calibri" w:cs="Calibri" w:eastAsia="Calibri" w:hAnsi="Calibri"/>
-          <w:color w:val="52606D"/>
-          <w:sz w:val="18"/>
-          <w:szCs w:val="18"/>
-        </w:rPr>
-        <w:t xml:space="preserve">Shopping and marketing: 7 entity sets.</w:t>
+        <w:t xml:space="preserve">1.5 Shopping and marketing</w:t>
       </w:r>
     </w:p>
     <w:tbl>
@@ -10553,6 +8387,22 @@
               <w:t xml:space="preserve">A photo attached to a product review.</w:t>
             </w:r>
           </w:p>
+          <w:p>
+            <w:pPr>
+              <w:spacing w:after="20"/>
+            </w:pPr>
+            <w:r>
+              <w:rPr>
+                <w:rFonts w:ascii="Calibri" w:cs="Calibri" w:eastAsia="Calibri" w:hAnsi="Calibri"/>
+                <w:i/>
+                <w:iCs/>
+                <w:color w:val="52606D"/>
+                <w:sz w:val="16"/>
+                <w:szCs w:val="16"/>
+              </w:rPr>
+              <w:t xml:space="preserve">A review can carry several photos, so the photos cannot be a single-valued attribute of the review.</w:t>
+            </w:r>
+          </w:p>
         </w:tc>
         <w:tc>
           <w:tcPr>
@@ -10814,45 +8664,6 @@
         </w:tc>
       </w:tr>
     </w:tbl>
-    <w:p>
-      <w:pPr>
-        <w:spacing w:after="60" w:before="160"/>
-      </w:pPr>
-      <w:r>
-        <w:rPr>
-          <w:rFonts w:ascii="Calibri" w:cs="Calibri" w:eastAsia="Calibri" w:hAnsi="Calibri"/>
-          <w:b/>
-          <w:bCs/>
-          <w:sz w:val="20"/>
-          <w:szCs w:val="20"/>
-        </w:rPr>
-        <w:t xml:space="preserve">Why these are entity sets and not attributes</w:t>
-      </w:r>
-    </w:p>
-    <w:p>
-      <w:pPr>
-        <w:pStyle w:val="ListParagraph"/>
-        <w:numPr>
-          <w:ilvl w:val="0"/>
-          <w:numId w:val="2"/>
-        </w:numPr>
-        <w:spacing w:after="60"/>
-      </w:pPr>
-      <w:r>
-        <w:rPr>
-          <w:rFonts w:ascii="Calibri" w:cs="Calibri" w:eastAsia="Calibri" w:hAnsi="Calibri"/>
-          <w:b/>
-          <w:bCs/>
-        </w:rPr>
-        <w:t xml:space="preserve">Review_Images: </w:t>
-      </w:r>
-      <w:r>
-        <w:rPr>
-          <w:rFonts w:ascii="Calibri" w:cs="Calibri" w:eastAsia="Calibri" w:hAnsi="Calibri"/>
-        </w:rPr>
-        <w:t xml:space="preserve">A review can carry several photos, so the photos cannot be a single-valued attribute of the review.</w:t>
-      </w:r>
-    </w:p>
     <w:p>
       <w:pPr>
         <w:pStyle w:val="Heading2"/>
@@ -10861,33 +8672,7 @@
         <w:rPr>
           <w:rFonts w:ascii="Calibri" w:cs="Calibri" w:eastAsia="Calibri" w:hAnsi="Calibri"/>
         </w:rPr>
-        <w:t xml:space="preserve">5.6 Inventory and procurement</w:t>
-      </w:r>
-    </w:p>
-    <w:p>
-      <w:pPr>
-        <w:keepNext/>
-        <w:spacing w:after="60" w:before="120"/>
-      </w:pPr>
-      <w:r>
-        <w:rPr>
-          <w:rFonts w:ascii="Calibri" w:cs="Calibri" w:eastAsia="Calibri" w:hAnsi="Calibri"/>
-          <w:b/>
-          <w:bCs/>
-          <w:color w:val="52606D"/>
-          <w:sz w:val="18"/>
-          <w:szCs w:val="18"/>
-        </w:rPr>
-        <w:t xml:space="preserve">Table 8. </w:t>
-      </w:r>
-      <w:r>
-        <w:rPr>
-          <w:rFonts w:ascii="Calibri" w:cs="Calibri" w:eastAsia="Calibri" w:hAnsi="Calibri"/>
-          <w:color w:val="52606D"/>
-          <w:sz w:val="18"/>
-          <w:szCs w:val="18"/>
-        </w:rPr>
-        <w:t xml:space="preserve">Inventory and procurement: 11 entity sets.</w:t>
+        <w:t xml:space="preserve">1.6 Inventory and procurement</w:t>
       </w:r>
     </w:p>
     <w:tbl>
@@ -11830,6 +9615,22 @@
               <w:t xml:space="preserve">A signed change of a batch's quantity with its reason (reservation, damage, count).</w:t>
             </w:r>
           </w:p>
+          <w:p>
+            <w:pPr>
+              <w:spacing w:after="20"/>
+            </w:pPr>
+            <w:r>
+              <w:rPr>
+                <w:rFonts w:ascii="Calibri" w:cs="Calibri" w:eastAsia="Calibri" w:hAnsi="Calibri"/>
+                <w:i/>
+                <w:iCs/>
+                <w:color w:val="52606D"/>
+                <w:sz w:val="16"/>
+                <w:szCs w:val="16"/>
+              </w:rPr>
+              <w:t xml:space="preserve">A batch changes many times and each change must be auditable with its reason and time.</w:t>
+            </w:r>
+          </w:p>
         </w:tc>
         <w:tc>
           <w:tcPr>
@@ -13012,45 +10813,6 @@
         </w:tc>
       </w:tr>
     </w:tbl>
-    <w:p>
-      <w:pPr>
-        <w:spacing w:after="60" w:before="160"/>
-      </w:pPr>
-      <w:r>
-        <w:rPr>
-          <w:rFonts w:ascii="Calibri" w:cs="Calibri" w:eastAsia="Calibri" w:hAnsi="Calibri"/>
-          <w:b/>
-          <w:bCs/>
-          <w:sz w:val="20"/>
-          <w:szCs w:val="20"/>
-        </w:rPr>
-        <w:t xml:space="preserve">Why these are entity sets and not attributes</w:t>
-      </w:r>
-    </w:p>
-    <w:p>
-      <w:pPr>
-        <w:pStyle w:val="ListParagraph"/>
-        <w:numPr>
-          <w:ilvl w:val="0"/>
-          <w:numId w:val="2"/>
-        </w:numPr>
-        <w:spacing w:after="60"/>
-      </w:pPr>
-      <w:r>
-        <w:rPr>
-          <w:rFonts w:ascii="Calibri" w:cs="Calibri" w:eastAsia="Calibri" w:hAnsi="Calibri"/>
-          <w:b/>
-          <w:bCs/>
-        </w:rPr>
-        <w:t xml:space="preserve">Stock_Movements: </w:t>
-      </w:r>
-      <w:r>
-        <w:rPr>
-          <w:rFonts w:ascii="Calibri" w:cs="Calibri" w:eastAsia="Calibri" w:hAnsi="Calibri"/>
-        </w:rPr>
-        <w:t xml:space="preserve">A batch changes many times and each change must be auditable with its reason and time.</w:t>
-      </w:r>
-    </w:p>
     <w:p>
       <w:pPr>
         <w:pStyle w:val="Heading2"/>
@@ -13059,33 +10821,7 @@
         <w:rPr>
           <w:rFonts w:ascii="Calibri" w:cs="Calibri" w:eastAsia="Calibri" w:hAnsi="Calibri"/>
         </w:rPr>
-        <w:t xml:space="preserve">5.7 Orders and payment</w:t>
-      </w:r>
-    </w:p>
-    <w:p>
-      <w:pPr>
-        <w:keepNext/>
-        <w:spacing w:after="60" w:before="120"/>
-      </w:pPr>
-      <w:r>
-        <w:rPr>
-          <w:rFonts w:ascii="Calibri" w:cs="Calibri" w:eastAsia="Calibri" w:hAnsi="Calibri"/>
-          <w:b/>
-          <w:bCs/>
-          <w:color w:val="52606D"/>
-          <w:sz w:val="18"/>
-          <w:szCs w:val="18"/>
-        </w:rPr>
-        <w:t xml:space="preserve">Table 9. </w:t>
-      </w:r>
-      <w:r>
-        <w:rPr>
-          <w:rFonts w:ascii="Calibri" w:cs="Calibri" w:eastAsia="Calibri" w:hAnsi="Calibri"/>
-          <w:color w:val="52606D"/>
-          <w:sz w:val="18"/>
-          <w:szCs w:val="18"/>
-        </w:rPr>
-        <w:t xml:space="preserve">Orders and payment: 8 entity sets.</w:t>
+        <w:t xml:space="preserve">1.7 Orders and payment</w:t>
       </w:r>
     </w:p>
     <w:tbl>
@@ -13784,6 +11520,22 @@
               <w:t xml:space="preserve">One step in an order's history (placed, shipped, delivered) with its time.</w:t>
             </w:r>
           </w:p>
+          <w:p>
+            <w:pPr>
+              <w:spacing w:after="20"/>
+            </w:pPr>
+            <w:r>
+              <w:rPr>
+                <w:rFonts w:ascii="Calibri" w:cs="Calibri" w:eastAsia="Calibri" w:hAnsi="Calibri"/>
+                <w:i/>
+                <w:iCs/>
+                <w:color w:val="52606D"/>
+                <w:sz w:val="16"/>
+                <w:szCs w:val="16"/>
+              </w:rPr>
+              <w:t xml:space="preserve">An order passes through several statuses and we want the time of each. A single status attribute keeps only the latest one.</w:t>
+            </w:r>
+          </w:p>
         </w:tc>
         <w:tc>
           <w:tcPr>
@@ -14333,6 +12085,22 @@
               <w:t xml:space="preserve">One money movement of a payment, such as the capture or a refund.</w:t>
             </w:r>
           </w:p>
+          <w:p>
+            <w:pPr>
+              <w:spacing w:after="20"/>
+            </w:pPr>
+            <w:r>
+              <w:rPr>
+                <w:rFonts w:ascii="Calibri" w:cs="Calibri" w:eastAsia="Calibri" w:hAnsi="Calibri"/>
+                <w:i/>
+                <w:iCs/>
+                <w:color w:val="52606D"/>
+                <w:sz w:val="16"/>
+                <w:szCs w:val="16"/>
+              </w:rPr>
+              <w:t xml:space="preserve">One payment produces several money movements over time (capture, later refunds).</w:t>
+            </w:r>
+          </w:p>
         </w:tc>
         <w:tc>
           <w:tcPr>
@@ -14819,69 +12587,6 @@
         </w:tc>
       </w:tr>
     </w:tbl>
-    <w:p>
-      <w:pPr>
-        <w:spacing w:after="60" w:before="160"/>
-      </w:pPr>
-      <w:r>
-        <w:rPr>
-          <w:rFonts w:ascii="Calibri" w:cs="Calibri" w:eastAsia="Calibri" w:hAnsi="Calibri"/>
-          <w:b/>
-          <w:bCs/>
-          <w:sz w:val="20"/>
-          <w:szCs w:val="20"/>
-        </w:rPr>
-        <w:t xml:space="preserve">Why these are entity sets and not attributes</w:t>
-      </w:r>
-    </w:p>
-    <w:p>
-      <w:pPr>
-        <w:pStyle w:val="ListParagraph"/>
-        <w:numPr>
-          <w:ilvl w:val="0"/>
-          <w:numId w:val="2"/>
-        </w:numPr>
-        <w:spacing w:after="60"/>
-      </w:pPr>
-      <w:r>
-        <w:rPr>
-          <w:rFonts w:ascii="Calibri" w:cs="Calibri" w:eastAsia="Calibri" w:hAnsi="Calibri"/>
-          <w:b/>
-          <w:bCs/>
-        </w:rPr>
-        <w:t xml:space="preserve">Order_Status_Events: </w:t>
-      </w:r>
-      <w:r>
-        <w:rPr>
-          <w:rFonts w:ascii="Calibri" w:cs="Calibri" w:eastAsia="Calibri" w:hAnsi="Calibri"/>
-        </w:rPr>
-        <w:t xml:space="preserve">An order passes through several statuses and we want the time of each. A single status attribute keeps only the latest one.</w:t>
-      </w:r>
-    </w:p>
-    <w:p>
-      <w:pPr>
-        <w:pStyle w:val="ListParagraph"/>
-        <w:numPr>
-          <w:ilvl w:val="0"/>
-          <w:numId w:val="2"/>
-        </w:numPr>
-        <w:spacing w:after="60"/>
-      </w:pPr>
-      <w:r>
-        <w:rPr>
-          <w:rFonts w:ascii="Calibri" w:cs="Calibri" w:eastAsia="Calibri" w:hAnsi="Calibri"/>
-          <w:b/>
-          <w:bCs/>
-        </w:rPr>
-        <w:t xml:space="preserve">Payment_Transactions: </w:t>
-      </w:r>
-      <w:r>
-        <w:rPr>
-          <w:rFonts w:ascii="Calibri" w:cs="Calibri" w:eastAsia="Calibri" w:hAnsi="Calibri"/>
-        </w:rPr>
-        <w:t xml:space="preserve">One payment produces several money movements over time (capture, later refunds).</w:t>
-      </w:r>
-    </w:p>
     <w:p>
       <w:pPr>
         <w:pStyle w:val="Heading2"/>
@@ -14890,33 +12595,7 @@
         <w:rPr>
           <w:rFonts w:ascii="Calibri" w:cs="Calibri" w:eastAsia="Calibri" w:hAnsi="Calibri"/>
         </w:rPr>
-        <w:t xml:space="preserve">5.8 Fulfilment and delivery</w:t>
-      </w:r>
-    </w:p>
-    <w:p>
-      <w:pPr>
-        <w:keepNext/>
-        <w:spacing w:after="60" w:before="120"/>
-      </w:pPr>
-      <w:r>
-        <w:rPr>
-          <w:rFonts w:ascii="Calibri" w:cs="Calibri" w:eastAsia="Calibri" w:hAnsi="Calibri"/>
-          <w:b/>
-          <w:bCs/>
-          <w:color w:val="52606D"/>
-          <w:sz w:val="18"/>
-          <w:szCs w:val="18"/>
-        </w:rPr>
-        <w:t xml:space="preserve">Table 10. </w:t>
-      </w:r>
-      <w:r>
-        <w:rPr>
-          <w:rFonts w:ascii="Calibri" w:cs="Calibri" w:eastAsia="Calibri" w:hAnsi="Calibri"/>
-          <w:color w:val="52606D"/>
-          <w:sz w:val="18"/>
-          <w:szCs w:val="18"/>
-        </w:rPr>
-        <w:t xml:space="preserve">Fulfilment and delivery: 8 entity sets.</w:t>
+        <w:t xml:space="preserve">1.8 Fulfilment and delivery</w:t>
       </w:r>
     </w:p>
     <w:tbl>
@@ -16134,6 +13813,22 @@
               <w:t xml:space="preserve">One scan of a shipment along its route: status, location and time.</w:t>
             </w:r>
           </w:p>
+          <w:p>
+            <w:pPr>
+              <w:spacing w:after="20"/>
+            </w:pPr>
+            <w:r>
+              <w:rPr>
+                <w:rFonts w:ascii="Calibri" w:cs="Calibri" w:eastAsia="Calibri" w:hAnsi="Calibri"/>
+                <w:i/>
+                <w:iCs/>
+                <w:color w:val="52606D"/>
+                <w:sz w:val="16"/>
+                <w:szCs w:val="16"/>
+              </w:rPr>
+              <w:t xml:space="preserve">A shipment is scanned many times, each scan with a location and time.</w:t>
+            </w:r>
+          </w:p>
         </w:tc>
         <w:tc>
           <w:tcPr>
@@ -16524,89 +14219,105 @@
               <w:t xml:space="preserve">The evidence recorded for a successful delivery attempt: who received the parcel and a photo or signature link.</w:t>
             </w:r>
           </w:p>
-        </w:tc>
-        <w:tc>
-          <w:tcPr>
-            <w:tcW w:type="dxa" w:w="1700"/>
-            <w:tcBorders>
-              <w:top w:val="single" w:color="BCC5CF" w:sz="4"/>
-              <w:left w:val="single" w:color="BCC5CF" w:sz="4"/>
-              <w:bottom w:val="single" w:color="BCC5CF" w:sz="4"/>
-              <w:right w:val="single" w:color="BCC5CF" w:sz="4"/>
-            </w:tcBorders>
-            <w:shd w:fill="F4F6F8" w:color="auto" w:val="clear"/>
-            <w:tcMar>
-              <w:top w:type="dxa" w:w="50"/>
-              <w:left w:type="dxa" w:w="90"/>
-              <w:bottom w:type="dxa" w:w="50"/>
-              <w:right w:type="dxa" w:w="90"/>
-            </w:tcMar>
-          </w:tcPr>
-          <w:p>
-            <w:pPr>
-              <w:spacing w:after="20"/>
-            </w:pPr>
-            <w:r>
-              <w:rPr>
-                <w:rFonts w:ascii="Calibri" w:cs="Calibri" w:eastAsia="Calibri" w:hAnsi="Calibri"/>
-                <w:u w:val="single"/>
-              </w:rPr>
-              <w:t xml:space="preserve">proof_id</w:t>
-            </w:r>
-          </w:p>
-        </w:tc>
-        <w:tc>
-          <w:tcPr>
-            <w:tcW w:type="dxa" w:w="2200"/>
-            <w:tcBorders>
-              <w:top w:val="single" w:color="BCC5CF" w:sz="4"/>
-              <w:left w:val="single" w:color="BCC5CF" w:sz="4"/>
-              <w:bottom w:val="single" w:color="BCC5CF" w:sz="4"/>
-              <w:right w:val="single" w:color="BCC5CF" w:sz="4"/>
-            </w:tcBorders>
-            <w:shd w:fill="F4F6F8" w:color="auto" w:val="clear"/>
-            <w:tcMar>
-              <w:top w:type="dxa" w:w="50"/>
-              <w:left w:type="dxa" w:w="90"/>
-              <w:bottom w:type="dxa" w:w="50"/>
-              <w:right w:type="dxa" w:w="90"/>
-            </w:tcMar>
-          </w:tcPr>
-          <w:p>
-            <w:pPr>
-              <w:spacing w:after="20"/>
-            </w:pPr>
-            <w:r>
-              <w:rPr>
-                <w:rFonts w:ascii="Calibri" w:cs="Calibri" w:eastAsia="Calibri" w:hAnsi="Calibri"/>
-                <w:sz w:val="18"/>
-                <w:szCs w:val="18"/>
-              </w:rPr>
-              <w:t xml:space="preserve">recipient_name</w:t>
-            </w:r>
-            <w:r>
-              <w:rPr>
-                <w:rFonts w:ascii="Calibri" w:cs="Calibri" w:eastAsia="Calibri" w:hAnsi="Calibri"/>
-                <w:sz w:val="18"/>
-                <w:szCs w:val="18"/>
-              </w:rPr>
-              <w:t xml:space="preserve">, </w:t>
-            </w:r>
-            <w:r>
-              <w:rPr>
-                <w:rFonts w:ascii="Calibri" w:cs="Calibri" w:eastAsia="Calibri" w:hAnsi="Calibri"/>
-                <w:sz w:val="18"/>
-                <w:szCs w:val="18"/>
-              </w:rPr>
-              <w:t xml:space="preserve">evidence_url</w:t>
-            </w:r>
-            <w:r>
-              <w:rPr>
-                <w:rFonts w:ascii="Calibri" w:cs="Calibri" w:eastAsia="Calibri" w:hAnsi="Calibri"/>
+          <w:p>
+            <w:pPr>
+              <w:spacing w:after="20"/>
+            </w:pPr>
+            <w:r>
+              <w:rPr>
+                <w:rFonts w:ascii="Calibri" w:cs="Calibri" w:eastAsia="Calibri" w:hAnsi="Calibri"/>
+                <w:i/>
+                <w:iCs/>
                 <w:color w:val="52606D"/>
                 <w:sz w:val="16"/>
                 <w:szCs w:val="16"/>
               </w:rPr>
+              <w:t xml:space="preserve">The evidence is recorded only for successful attempts and has its own attributes; keeping it separate avoids empty attribute values on failed attempts.</w:t>
+            </w:r>
+          </w:p>
+        </w:tc>
+        <w:tc>
+          <w:tcPr>
+            <w:tcW w:type="dxa" w:w="1700"/>
+            <w:tcBorders>
+              <w:top w:val="single" w:color="BCC5CF" w:sz="4"/>
+              <w:left w:val="single" w:color="BCC5CF" w:sz="4"/>
+              <w:bottom w:val="single" w:color="BCC5CF" w:sz="4"/>
+              <w:right w:val="single" w:color="BCC5CF" w:sz="4"/>
+            </w:tcBorders>
+            <w:shd w:fill="F4F6F8" w:color="auto" w:val="clear"/>
+            <w:tcMar>
+              <w:top w:type="dxa" w:w="50"/>
+              <w:left w:type="dxa" w:w="90"/>
+              <w:bottom w:type="dxa" w:w="50"/>
+              <w:right w:type="dxa" w:w="90"/>
+            </w:tcMar>
+          </w:tcPr>
+          <w:p>
+            <w:pPr>
+              <w:spacing w:after="20"/>
+            </w:pPr>
+            <w:r>
+              <w:rPr>
+                <w:rFonts w:ascii="Calibri" w:cs="Calibri" w:eastAsia="Calibri" w:hAnsi="Calibri"/>
+                <w:u w:val="single"/>
+              </w:rPr>
+              <w:t xml:space="preserve">proof_id</w:t>
+            </w:r>
+          </w:p>
+        </w:tc>
+        <w:tc>
+          <w:tcPr>
+            <w:tcW w:type="dxa" w:w="2200"/>
+            <w:tcBorders>
+              <w:top w:val="single" w:color="BCC5CF" w:sz="4"/>
+              <w:left w:val="single" w:color="BCC5CF" w:sz="4"/>
+              <w:bottom w:val="single" w:color="BCC5CF" w:sz="4"/>
+              <w:right w:val="single" w:color="BCC5CF" w:sz="4"/>
+            </w:tcBorders>
+            <w:shd w:fill="F4F6F8" w:color="auto" w:val="clear"/>
+            <w:tcMar>
+              <w:top w:type="dxa" w:w="50"/>
+              <w:left w:type="dxa" w:w="90"/>
+              <w:bottom w:type="dxa" w:w="50"/>
+              <w:right w:type="dxa" w:w="90"/>
+            </w:tcMar>
+          </w:tcPr>
+          <w:p>
+            <w:pPr>
+              <w:spacing w:after="20"/>
+            </w:pPr>
+            <w:r>
+              <w:rPr>
+                <w:rFonts w:ascii="Calibri" w:cs="Calibri" w:eastAsia="Calibri" w:hAnsi="Calibri"/>
+                <w:sz w:val="18"/>
+                <w:szCs w:val="18"/>
+              </w:rPr>
+              <w:t xml:space="preserve">recipient_name</w:t>
+            </w:r>
+            <w:r>
+              <w:rPr>
+                <w:rFonts w:ascii="Calibri" w:cs="Calibri" w:eastAsia="Calibri" w:hAnsi="Calibri"/>
+                <w:sz w:val="18"/>
+                <w:szCs w:val="18"/>
+              </w:rPr>
+              <w:t xml:space="preserve">, </w:t>
+            </w:r>
+            <w:r>
+              <w:rPr>
+                <w:rFonts w:ascii="Calibri" w:cs="Calibri" w:eastAsia="Calibri" w:hAnsi="Calibri"/>
+                <w:sz w:val="18"/>
+                <w:szCs w:val="18"/>
+              </w:rPr>
+              <w:t xml:space="preserve">evidence_url</w:t>
+            </w:r>
+            <w:r>
+              <w:rPr>
+                <w:rFonts w:ascii="Calibri" w:cs="Calibri" w:eastAsia="Calibri" w:hAnsi="Calibri"/>
+                <w:color w:val="52606D"/>
+                <w:sz w:val="16"/>
+                <w:szCs w:val="16"/>
+              </w:rPr>
               <w:t xml:space="preserve"> (optional)</w:t>
             </w:r>
             <w:r>
@@ -16629,69 +14340,6 @@
         </w:tc>
       </w:tr>
     </w:tbl>
-    <w:p>
-      <w:pPr>
-        <w:spacing w:after="60" w:before="160"/>
-      </w:pPr>
-      <w:r>
-        <w:rPr>
-          <w:rFonts w:ascii="Calibri" w:cs="Calibri" w:eastAsia="Calibri" w:hAnsi="Calibri"/>
-          <w:b/>
-          <w:bCs/>
-          <w:sz w:val="20"/>
-          <w:szCs w:val="20"/>
-        </w:rPr>
-        <w:t xml:space="preserve">Why these are entity sets and not attributes</w:t>
-      </w:r>
-    </w:p>
-    <w:p>
-      <w:pPr>
-        <w:pStyle w:val="ListParagraph"/>
-        <w:numPr>
-          <w:ilvl w:val="0"/>
-          <w:numId w:val="2"/>
-        </w:numPr>
-        <w:spacing w:after="60"/>
-      </w:pPr>
-      <w:r>
-        <w:rPr>
-          <w:rFonts w:ascii="Calibri" w:cs="Calibri" w:eastAsia="Calibri" w:hAnsi="Calibri"/>
-          <w:b/>
-          <w:bCs/>
-        </w:rPr>
-        <w:t xml:space="preserve">Tracking_Events: </w:t>
-      </w:r>
-      <w:r>
-        <w:rPr>
-          <w:rFonts w:ascii="Calibri" w:cs="Calibri" w:eastAsia="Calibri" w:hAnsi="Calibri"/>
-        </w:rPr>
-        <w:t xml:space="preserve">A shipment is scanned many times, each scan with a location and time.</w:t>
-      </w:r>
-    </w:p>
-    <w:p>
-      <w:pPr>
-        <w:pStyle w:val="ListParagraph"/>
-        <w:numPr>
-          <w:ilvl w:val="0"/>
-          <w:numId w:val="2"/>
-        </w:numPr>
-        <w:spacing w:after="60"/>
-      </w:pPr>
-      <w:r>
-        <w:rPr>
-          <w:rFonts w:ascii="Calibri" w:cs="Calibri" w:eastAsia="Calibri" w:hAnsi="Calibri"/>
-          <w:b/>
-          <w:bCs/>
-        </w:rPr>
-        <w:t xml:space="preserve">Proof_Of_Delivery: </w:t>
-      </w:r>
-      <w:r>
-        <w:rPr>
-          <w:rFonts w:ascii="Calibri" w:cs="Calibri" w:eastAsia="Calibri" w:hAnsi="Calibri"/>
-        </w:rPr>
-        <w:t xml:space="preserve">The evidence is recorded only for successful attempts and has its own attributes; keeping it separate avoids empty attribute values on failed attempts.</w:t>
-      </w:r>
-    </w:p>
     <w:p>
       <w:pPr>
         <w:pStyle w:val="Heading2"/>
@@ -16700,33 +14348,7 @@
         <w:rPr>
           <w:rFonts w:ascii="Calibri" w:cs="Calibri" w:eastAsia="Calibri" w:hAnsi="Calibri"/>
         </w:rPr>
-        <w:t xml:space="preserve">5.9 After-sales and support</w:t>
-      </w:r>
-    </w:p>
-    <w:p>
-      <w:pPr>
-        <w:keepNext/>
-        <w:spacing w:after="60" w:before="120"/>
-      </w:pPr>
-      <w:r>
-        <w:rPr>
-          <w:rFonts w:ascii="Calibri" w:cs="Calibri" w:eastAsia="Calibri" w:hAnsi="Calibri"/>
-          <w:b/>
-          <w:bCs/>
-          <w:color w:val="52606D"/>
-          <w:sz w:val="18"/>
-          <w:szCs w:val="18"/>
-        </w:rPr>
-        <w:t xml:space="preserve">Table 11. </w:t>
-      </w:r>
-      <w:r>
-        <w:rPr>
-          <w:rFonts w:ascii="Calibri" w:cs="Calibri" w:eastAsia="Calibri" w:hAnsi="Calibri"/>
-          <w:color w:val="52606D"/>
-          <w:sz w:val="18"/>
-          <w:szCs w:val="18"/>
-        </w:rPr>
-        <w:t xml:space="preserve">After-sales and support: 5 entity sets.</w:t>
+        <w:t xml:space="preserve">1.9 After-sales and support</w:t>
       </w:r>
     </w:p>
     <w:tbl>
@@ -17749,6 +15371,22 @@
               <w:t xml:space="preserve">One message in a support ticket's conversation, written by an account.</w:t>
             </w:r>
           </w:p>
+          <w:p>
+            <w:pPr>
+              <w:spacing w:after="20"/>
+            </w:pPr>
+            <w:r>
+              <w:rPr>
+                <w:rFonts w:ascii="Calibri" w:cs="Calibri" w:eastAsia="Calibri" w:hAnsi="Calibri"/>
+                <w:i/>
+                <w:iCs/>
+                <w:color w:val="52606D"/>
+                <w:sz w:val="16"/>
+                <w:szCs w:val="16"/>
+              </w:rPr>
+              <w:t xml:space="preserve">A ticket holds a conversation of many messages, each with its own author, which is itself a relationship to Accounts.</w:t>
+            </w:r>
+          </w:p>
         </w:tc>
         <w:tc>
           <w:tcPr>
@@ -17827,45 +15465,6 @@
         </w:tc>
       </w:tr>
     </w:tbl>
-    <w:p>
-      <w:pPr>
-        <w:spacing w:after="60" w:before="160"/>
-      </w:pPr>
-      <w:r>
-        <w:rPr>
-          <w:rFonts w:ascii="Calibri" w:cs="Calibri" w:eastAsia="Calibri" w:hAnsi="Calibri"/>
-          <w:b/>
-          <w:bCs/>
-          <w:sz w:val="20"/>
-          <w:szCs w:val="20"/>
-        </w:rPr>
-        <w:t xml:space="preserve">Why these are entity sets and not attributes</w:t>
-      </w:r>
-    </w:p>
-    <w:p>
-      <w:pPr>
-        <w:pStyle w:val="ListParagraph"/>
-        <w:numPr>
-          <w:ilvl w:val="0"/>
-          <w:numId w:val="2"/>
-        </w:numPr>
-        <w:spacing w:after="60"/>
-      </w:pPr>
-      <w:r>
-        <w:rPr>
-          <w:rFonts w:ascii="Calibri" w:cs="Calibri" w:eastAsia="Calibri" w:hAnsi="Calibri"/>
-          <w:b/>
-          <w:bCs/>
-        </w:rPr>
-        <w:t xml:space="preserve">Ticket_Messages: </w:t>
-      </w:r>
-      <w:r>
-        <w:rPr>
-          <w:rFonts w:ascii="Calibri" w:cs="Calibri" w:eastAsia="Calibri" w:hAnsi="Calibri"/>
-        </w:rPr>
-        <w:t xml:space="preserve">A ticket holds a conversation of many messages, each with its own author, which is itself a relationship to Accounts.</w:t>
-      </w:r>
-    </w:p>
     <w:p>
       <w:r>
         <w:br w:type="page"/>
@@ -17879,7 +15478,7 @@
         <w:rPr>
           <w:rFonts w:ascii="Calibri" w:cs="Calibri" w:eastAsia="Calibri" w:hAnsi="Calibri"/>
         </w:rPr>
-        <w:t xml:space="preserve">6. Part 2 – Relationships</w:t>
+        <w:t xml:space="preserve">Part 2 – Relationships</w:t>
       </w:r>
     </w:p>
     <w:p>
@@ -17890,7 +15489,7 @@
         <w:rPr>
           <w:rFonts w:ascii="Calibri" w:cs="Calibri" w:eastAsia="Calibri" w:hAnsi="Calibri"/>
         </w:rPr>
-        <w:t xml:space="preserve">Each relationship set is listed under the business area it belongs to. The participants column gives, for every participating entity set, how many relationships of this set each of its entities takes part in, using the wording of Table 2. Role names are given where one entity set appears twice.</w:t>
+        <w:t xml:space="preserve">Relationship sets are grouped by the same business areas. For each participating entity set we state in how many relationships of the set each of its entities takes part: exactly one (key constraint and total participation), at most one (key constraint), at least one (total participation) or any number. Identifying relationships of weak entities, the ternary relationship and the relationships that use the aggregation are marked under the relationship name.</w:t>
       </w:r>
     </w:p>
     <w:p>
@@ -17901,7 +15500,7 @@
         <w:rPr>
           <w:rFonts w:ascii="Calibri" w:cs="Calibri" w:eastAsia="Calibri" w:hAnsi="Calibri"/>
         </w:rPr>
-        <w:t xml:space="preserve">6.0 ISA</w:t>
+        <w:t xml:space="preserve">2.0 ISA hierarchy</w:t>
       </w:r>
     </w:p>
     <w:p>
@@ -17912,7 +15511,7 @@
         <w:rPr>
           <w:rFonts w:ascii="Calibri" w:cs="Calibri" w:eastAsia="Calibri" w:hAnsi="Calibri"/>
         </w:rPr>
-        <w:t xml:space="preserve">Accounts ISA Customers, Staff, Couriers. The subclasses inherit the attributes of an account and its key, account_id, and each takes part in its own relationships. Overlap is not allowed, because every account has exactly one role; covering holds, because the role is mandatory.</w:t>
+        <w:t xml:space="preserve">Accounts ISA Customers, Staff, Couriers. The subclasses inherit the attributes of an account and its key, account_id, and each takes part in its own relationships: only customers place orders, only staff members work in departments, and only couriers drive vehicles and attempt deliveries. Overlap is not allowed, because every account has exactly one role; covering holds, because the role is mandatory.</w:t>
       </w:r>
     </w:p>
     <w:p>
@@ -17923,33 +15522,7 @@
         <w:rPr>
           <w:rFonts w:ascii="Calibri" w:cs="Calibri" w:eastAsia="Calibri" w:hAnsi="Calibri"/>
         </w:rPr>
-        <w:t xml:space="preserve">6.1 People and accounts</w:t>
-      </w:r>
-    </w:p>
-    <w:p>
-      <w:pPr>
-        <w:keepNext/>
-        <w:spacing w:after="60" w:before="120"/>
-      </w:pPr>
-      <w:r>
-        <w:rPr>
-          <w:rFonts w:ascii="Calibri" w:cs="Calibri" w:eastAsia="Calibri" w:hAnsi="Calibri"/>
-          <w:b/>
-          <w:bCs/>
-          <w:color w:val="52606D"/>
-          <w:sz w:val="18"/>
-          <w:szCs w:val="18"/>
-        </w:rPr>
-        <w:t xml:space="preserve">Table 12. </w:t>
-      </w:r>
-      <w:r>
-        <w:rPr>
-          <w:rFonts w:ascii="Calibri" w:cs="Calibri" w:eastAsia="Calibri" w:hAnsi="Calibri"/>
-          <w:color w:val="52606D"/>
-          <w:sz w:val="18"/>
-          <w:szCs w:val="18"/>
-        </w:rPr>
-        <w:t xml:space="preserve">People and accounts: 5 relationship sets.</w:t>
+        <w:t xml:space="preserve">2.1 People and accounts</w:t>
       </w:r>
     </w:p>
     <w:tbl>
@@ -18999,33 +16572,7 @@
         <w:rPr>
           <w:rFonts w:ascii="Calibri" w:cs="Calibri" w:eastAsia="Calibri" w:hAnsi="Calibri"/>
         </w:rPr>
-        <w:t xml:space="preserve">6.2 Sellers</w:t>
-      </w:r>
-    </w:p>
-    <w:p>
-      <w:pPr>
-        <w:keepNext/>
-        <w:spacing w:after="60" w:before="120"/>
-      </w:pPr>
-      <w:r>
-        <w:rPr>
-          <w:rFonts w:ascii="Calibri" w:cs="Calibri" w:eastAsia="Calibri" w:hAnsi="Calibri"/>
-          <w:b/>
-          <w:bCs/>
-          <w:color w:val="52606D"/>
-          <w:sz w:val="18"/>
-          <w:szCs w:val="18"/>
-        </w:rPr>
-        <w:t xml:space="preserve">Table 13. </w:t>
-      </w:r>
-      <w:r>
-        <w:rPr>
-          <w:rFonts w:ascii="Calibri" w:cs="Calibri" w:eastAsia="Calibri" w:hAnsi="Calibri"/>
-          <w:color w:val="52606D"/>
-          <w:sz w:val="18"/>
-          <w:szCs w:val="18"/>
-        </w:rPr>
-        <w:t xml:space="preserve">Sellers: 8 relationship sets.</w:t>
+        <w:t xml:space="preserve">2.2 Sellers</w:t>
       </w:r>
     </w:p>
     <w:tbl>
@@ -20628,33 +18175,7 @@
         <w:rPr>
           <w:rFonts w:ascii="Calibri" w:cs="Calibri" w:eastAsia="Calibri" w:hAnsi="Calibri"/>
         </w:rPr>
-        <w:t xml:space="preserve">6.3 Locations and tax</w:t>
-      </w:r>
-    </w:p>
-    <w:p>
-      <w:pPr>
-        <w:keepNext/>
-        <w:spacing w:after="60" w:before="120"/>
-      </w:pPr>
-      <w:r>
-        <w:rPr>
-          <w:rFonts w:ascii="Calibri" w:cs="Calibri" w:eastAsia="Calibri" w:hAnsi="Calibri"/>
-          <w:b/>
-          <w:bCs/>
-          <w:color w:val="52606D"/>
-          <w:sz w:val="18"/>
-          <w:szCs w:val="18"/>
-        </w:rPr>
-        <w:t xml:space="preserve">Table 14. </w:t>
-      </w:r>
-      <w:r>
-        <w:rPr>
-          <w:rFonts w:ascii="Calibri" w:cs="Calibri" w:eastAsia="Calibri" w:hAnsi="Calibri"/>
-          <w:color w:val="52606D"/>
-          <w:sz w:val="18"/>
-          <w:szCs w:val="18"/>
-        </w:rPr>
-        <w:t xml:space="preserve">Locations and tax: 7 relationship sets.</w:t>
+        <w:t xml:space="preserve">2.3 Locations and tax</w:t>
       </w:r>
     </w:p>
     <w:tbl>
@@ -22079,33 +19600,7 @@
         <w:rPr>
           <w:rFonts w:ascii="Calibri" w:cs="Calibri" w:eastAsia="Calibri" w:hAnsi="Calibri"/>
         </w:rPr>
-        <w:t xml:space="preserve">6.4 Catalogue</w:t>
-      </w:r>
-    </w:p>
-    <w:p>
-      <w:pPr>
-        <w:keepNext/>
-        <w:spacing w:after="60" w:before="120"/>
-      </w:pPr>
-      <w:r>
-        <w:rPr>
-          <w:rFonts w:ascii="Calibri" w:cs="Calibri" w:eastAsia="Calibri" w:hAnsi="Calibri"/>
-          <w:b/>
-          <w:bCs/>
-          <w:color w:val="52606D"/>
-          <w:sz w:val="18"/>
-          <w:szCs w:val="18"/>
-        </w:rPr>
-        <w:t xml:space="preserve">Table 15. </w:t>
-      </w:r>
-      <w:r>
-        <w:rPr>
-          <w:rFonts w:ascii="Calibri" w:cs="Calibri" w:eastAsia="Calibri" w:hAnsi="Calibri"/>
-          <w:color w:val="52606D"/>
-          <w:sz w:val="18"/>
-          <w:szCs w:val="18"/>
-        </w:rPr>
-        <w:t xml:space="preserve">Catalogue: 16 relationship sets.</w:t>
+        <w:t xml:space="preserve">2.4 Catalogue</w:t>
       </w:r>
     </w:p>
     <w:tbl>
@@ -25116,33 +22611,7 @@
         <w:rPr>
           <w:rFonts w:ascii="Calibri" w:cs="Calibri" w:eastAsia="Calibri" w:hAnsi="Calibri"/>
         </w:rPr>
-        <w:t xml:space="preserve">6.5 Shopping and marketing</w:t>
-      </w:r>
-    </w:p>
-    <w:p>
-      <w:pPr>
-        <w:keepNext/>
-        <w:spacing w:after="60" w:before="120"/>
-      </w:pPr>
-      <w:r>
-        <w:rPr>
-          <w:rFonts w:ascii="Calibri" w:cs="Calibri" w:eastAsia="Calibri" w:hAnsi="Calibri"/>
-          <w:b/>
-          <w:bCs/>
-          <w:color w:val="52606D"/>
-          <w:sz w:val="18"/>
-          <w:szCs w:val="18"/>
-        </w:rPr>
-        <w:t xml:space="preserve">Table 16. </w:t>
-      </w:r>
-      <w:r>
-        <w:rPr>
-          <w:rFonts w:ascii="Calibri" w:cs="Calibri" w:eastAsia="Calibri" w:hAnsi="Calibri"/>
-          <w:color w:val="52606D"/>
-          <w:sz w:val="18"/>
-          <w:szCs w:val="18"/>
-        </w:rPr>
-        <w:t xml:space="preserve">Shopping and marketing: 12 relationship sets.</w:t>
+        <w:t xml:space="preserve">2.5 Shopping and marketing</w:t>
       </w:r>
     </w:p>
     <w:tbl>
@@ -27495,33 +24964,7 @@
         <w:rPr>
           <w:rFonts w:ascii="Calibri" w:cs="Calibri" w:eastAsia="Calibri" w:hAnsi="Calibri"/>
         </w:rPr>
-        <w:t xml:space="preserve">6.6 Inventory and procurement</w:t>
-      </w:r>
-    </w:p>
-    <w:p>
-      <w:pPr>
-        <w:keepNext/>
-        <w:spacing w:after="60" w:before="120"/>
-      </w:pPr>
-      <w:r>
-        <w:rPr>
-          <w:rFonts w:ascii="Calibri" w:cs="Calibri" w:eastAsia="Calibri" w:hAnsi="Calibri"/>
-          <w:b/>
-          <w:bCs/>
-          <w:color w:val="52606D"/>
-          <w:sz w:val="18"/>
-          <w:szCs w:val="18"/>
-        </w:rPr>
-        <w:t xml:space="preserve">Table 17. </w:t>
-      </w:r>
-      <w:r>
-        <w:rPr>
-          <w:rFonts w:ascii="Calibri" w:cs="Calibri" w:eastAsia="Calibri" w:hAnsi="Calibri"/>
-          <w:color w:val="52606D"/>
-          <w:sz w:val="18"/>
-          <w:szCs w:val="18"/>
-        </w:rPr>
-        <w:t xml:space="preserve">Inventory and procurement: 18 relationship sets.</w:t>
+        <w:t xml:space="preserve">2.6 Inventory and procurement</w:t>
       </w:r>
     </w:p>
     <w:tbl>
@@ -28290,7 +25733,7 @@
                 <w:sz w:val="16"/>
                 <w:szCs w:val="16"/>
               </w:rPr>
-              <w:t xml:space="preserve">uses the aggregation</w:t>
+              <w:t xml:space="preserve">uses the aggregation of Stocks</w:t>
             </w:r>
           </w:p>
         </w:tc>
@@ -30929,33 +28372,7 @@
         <w:rPr>
           <w:rFonts w:ascii="Calibri" w:cs="Calibri" w:eastAsia="Calibri" w:hAnsi="Calibri"/>
         </w:rPr>
-        <w:t xml:space="preserve">6.7 Orders and payment</w:t>
-      </w:r>
-    </w:p>
-    <w:p>
-      <w:pPr>
-        <w:keepNext/>
-        <w:spacing w:after="60" w:before="120"/>
-      </w:pPr>
-      <w:r>
-        <w:rPr>
-          <w:rFonts w:ascii="Calibri" w:cs="Calibri" w:eastAsia="Calibri" w:hAnsi="Calibri"/>
-          <w:b/>
-          <w:bCs/>
-          <w:color w:val="52606D"/>
-          <w:sz w:val="18"/>
-          <w:szCs w:val="18"/>
-        </w:rPr>
-        <w:t xml:space="preserve">Table 18. </w:t>
-      </w:r>
-      <w:r>
-        <w:rPr>
-          <w:rFonts w:ascii="Calibri" w:cs="Calibri" w:eastAsia="Calibri" w:hAnsi="Calibri"/>
-          <w:color w:val="52606D"/>
-          <w:sz w:val="18"/>
-          <w:szCs w:val="18"/>
-        </w:rPr>
-        <w:t xml:space="preserve">Orders and payment: 15 relationship sets.</w:t>
+        <w:t xml:space="preserve">2.7 Orders and payment</w:t>
       </w:r>
     </w:p>
     <w:tbl>
@@ -33660,7 +31077,7 @@
                 <w:sz w:val="16"/>
                 <w:szCs w:val="16"/>
               </w:rPr>
-              <w:t xml:space="preserve">uses the aggregation</w:t>
+              <w:t xml:space="preserve">uses the aggregation of Stocks</w:t>
             </w:r>
           </w:p>
         </w:tc>
@@ -33788,33 +31205,7 @@
         <w:rPr>
           <w:rFonts w:ascii="Calibri" w:cs="Calibri" w:eastAsia="Calibri" w:hAnsi="Calibri"/>
         </w:rPr>
-        <w:t xml:space="preserve">6.8 Fulfilment and delivery</w:t>
-      </w:r>
-    </w:p>
-    <w:p>
-      <w:pPr>
-        <w:keepNext/>
-        <w:spacing w:after="60" w:before="120"/>
-      </w:pPr>
-      <w:r>
-        <w:rPr>
-          <w:rFonts w:ascii="Calibri" w:cs="Calibri" w:eastAsia="Calibri" w:hAnsi="Calibri"/>
-          <w:b/>
-          <w:bCs/>
-          <w:color w:val="52606D"/>
-          <w:sz w:val="18"/>
-          <w:szCs w:val="18"/>
-        </w:rPr>
-        <w:t xml:space="preserve">Table 19. </w:t>
-      </w:r>
-      <w:r>
-        <w:rPr>
-          <w:rFonts w:ascii="Calibri" w:cs="Calibri" w:eastAsia="Calibri" w:hAnsi="Calibri"/>
-          <w:color w:val="52606D"/>
-          <w:sz w:val="18"/>
-          <w:szCs w:val="18"/>
-        </w:rPr>
-        <w:t xml:space="preserve">Fulfilment and delivery: 12 relationship sets.</w:t>
+        <w:t xml:space="preserve">2.8 Fulfilment and delivery</w:t>
       </w:r>
     </w:p>
     <w:tbl>
@@ -36121,33 +33512,7 @@
         <w:rPr>
           <w:rFonts w:ascii="Calibri" w:cs="Calibri" w:eastAsia="Calibri" w:hAnsi="Calibri"/>
         </w:rPr>
-        <w:t xml:space="preserve">6.9 After-sales and support</w:t>
-      </w:r>
-    </w:p>
-    <w:p>
-      <w:pPr>
-        <w:keepNext/>
-        <w:spacing w:after="60" w:before="120"/>
-      </w:pPr>
-      <w:r>
-        <w:rPr>
-          <w:rFonts w:ascii="Calibri" w:cs="Calibri" w:eastAsia="Calibri" w:hAnsi="Calibri"/>
-          <w:b/>
-          <w:bCs/>
-          <w:color w:val="52606D"/>
-          <w:sz w:val="18"/>
-          <w:szCs w:val="18"/>
-        </w:rPr>
-        <w:t xml:space="preserve">Table 20. </w:t>
-      </w:r>
-      <w:r>
-        <w:rPr>
-          <w:rFonts w:ascii="Calibri" w:cs="Calibri" w:eastAsia="Calibri" w:hAnsi="Calibri"/>
-          <w:color w:val="52606D"/>
-          <w:sz w:val="18"/>
-          <w:szCs w:val="18"/>
-        </w:rPr>
-        <w:t xml:space="preserve">After-sales and support: 10 relationship sets.</w:t>
+        <w:t xml:space="preserve">2.9 After-sales and support</w:t>
       </w:r>
     </w:p>
     <w:tbl>
@@ -38094,487 +35459,9 @@
         </w:tc>
       </w:tr>
     </w:tbl>
-    <w:p>
-      <w:r>
-        <w:br w:type="page"/>
-      </w:r>
-    </w:p>
-    <w:p>
-      <w:pPr>
-        <w:pStyle w:val="Heading1"/>
-      </w:pPr>
-      <w:r>
-        <w:rPr>
-          <w:rFonts w:ascii="Calibri" w:cs="Calibri" w:eastAsia="Calibri" w:hAnsi="Calibri"/>
-        </w:rPr>
-        <w:t xml:space="preserve">7. Design decisions</w:t>
-      </w:r>
-    </w:p>
-    <w:p>
-      <w:pPr>
-        <w:pStyle w:val="ListParagraph"/>
-        <w:numPr>
-          <w:ilvl w:val="0"/>
-          <w:numId w:val="2"/>
-        </w:numPr>
-        <w:spacing w:after="60"/>
-      </w:pPr>
-      <w:r>
-        <w:rPr>
-          <w:rFonts w:ascii="Calibri" w:cs="Calibri" w:eastAsia="Calibri" w:hAnsi="Calibri"/>
-          <w:b/>
-          <w:bCs/>
-        </w:rPr>
-        <w:t xml:space="preserve">Entity or attribute. </w:t>
-      </w:r>
-      <w:r>
-        <w:rPr>
-          <w:rFonts w:ascii="Calibri" w:cs="Calibri" w:eastAsia="Calibri" w:hAnsi="Calibri"/>
-        </w:rPr>
-        <w:t xml:space="preserve">Whenever one entity can have several values of something (images, price changes, status changes, tracking scans, messages), that thing is an entity set, because an attribute holds a single value. Cities and countries are entity sets because addresses, warehouses, zones, pickup points and tax rates all depend on them and we search by them.</w:t>
-      </w:r>
-    </w:p>
-    <w:p>
-      <w:pPr>
-        <w:pStyle w:val="ListParagraph"/>
-        <w:numPr>
-          <w:ilvl w:val="0"/>
-          <w:numId w:val="2"/>
-        </w:numPr>
-        <w:spacing w:after="60"/>
-      </w:pPr>
-      <w:r>
-        <w:rPr>
-          <w:rFonts w:ascii="Calibri" w:cs="Calibri" w:eastAsia="Calibri" w:hAnsi="Calibri"/>
-          <w:b/>
-          <w:bCs/>
-        </w:rPr>
-        <w:t xml:space="preserve">No redundant links. </w:t>
-      </w:r>
-      <w:r>
-        <w:rPr>
-          <w:rFonts w:ascii="Calibri" w:cs="Calibri" w:eastAsia="Calibri" w:hAnsi="Calibri"/>
-        </w:rPr>
-        <w:t xml:space="preserve">A coupon redemption and a return request do not point to the customer again; the customer follows from the order. Storing it twice would allow the two to disagree.</w:t>
-      </w:r>
-    </w:p>
-    <w:p>
-      <w:pPr>
-        <w:pStyle w:val="ListParagraph"/>
-        <w:numPr>
-          <w:ilvl w:val="0"/>
-          <w:numId w:val="2"/>
-        </w:numPr>
-        <w:spacing w:after="60"/>
-      </w:pPr>
-      <w:r>
-        <w:rPr>
-          <w:rFonts w:ascii="Calibri" w:cs="Calibri" w:eastAsia="Calibri" w:hAnsi="Calibri"/>
-          <w:b/>
-          <w:bCs/>
-        </w:rPr>
-        <w:t xml:space="preserve">Listing between seller and variant. </w:t>
-      </w:r>
-      <w:r>
-        <w:rPr>
-          <w:rFonts w:ascii="Calibri" w:cs="Calibri" w:eastAsia="Calibri" w:hAnsi="Calibri"/>
-        </w:rPr>
-        <w:t xml:space="preserve">The catalogue (products, variants) is shared, while price and availability belong to a seller's listing. Two sellers can therefore offer the same variant at different prices.</w:t>
-      </w:r>
-    </w:p>
-    <w:p>
-      <w:pPr>
-        <w:pStyle w:val="ListParagraph"/>
-        <w:numPr>
-          <w:ilvl w:val="0"/>
-          <w:numId w:val="2"/>
-        </w:numPr>
-        <w:spacing w:after="60"/>
-      </w:pPr>
-      <w:r>
-        <w:rPr>
-          <w:rFonts w:ascii="Calibri" w:cs="Calibri" w:eastAsia="Calibri" w:hAnsi="Calibri"/>
-          <w:b/>
-          <w:bCs/>
-        </w:rPr>
-        <w:t xml:space="preserve">Price kept on the order line. </w:t>
-      </w:r>
-      <w:r>
-        <w:rPr>
-          <w:rFonts w:ascii="Calibri" w:cs="Calibri" w:eastAsia="Calibri" w:hAnsi="Calibri"/>
-        </w:rPr>
-        <w:t xml:space="preserve">Order_Lines stores the unit price at checkout, so later price changes, which are recorded in Price_History, do not alter past orders or refunds.</w:t>
-      </w:r>
-    </w:p>
-    <w:p>
-      <w:pPr>
-        <w:pStyle w:val="ListParagraph"/>
-        <w:numPr>
-          <w:ilvl w:val="0"/>
-          <w:numId w:val="2"/>
-        </w:numPr>
-        <w:spacing w:after="60"/>
-      </w:pPr>
-      <w:r>
-        <w:rPr>
-          <w:rFonts w:ascii="Calibri" w:cs="Calibri" w:eastAsia="Calibri" w:hAnsi="Calibri"/>
-          <w:b/>
-          <w:bCs/>
-        </w:rPr>
-        <w:t xml:space="preserve">Total participation on the "one" side. </w:t>
-      </w:r>
-      <w:r>
-        <w:rPr>
-          <w:rFonts w:ascii="Calibri" w:cs="Calibri" w:eastAsia="Calibri" w:hAnsi="Calibri"/>
-        </w:rPr>
-        <w:t xml:space="preserve">Some owners must always have at least one related entity. These are business rules of the marketplace:</w:t>
-      </w:r>
-    </w:p>
-    <w:p>
-      <w:pPr>
-        <w:pStyle w:val="ListParagraph"/>
-        <w:numPr>
-          <w:ilvl w:val="1"/>
-          <w:numId w:val="2"/>
-        </w:numPr>
-        <w:spacing w:after="40"/>
-      </w:pPr>
-      <w:r>
-        <w:rPr>
-          <w:rFonts w:ascii="Calibri" w:cs="Calibri" w:eastAsia="Calibri" w:hAnsi="Calibri"/>
-        </w:rPr>
-        <w:t xml:space="preserve">Orders in Contains: checkout always creates at least one order line.</w:t>
-      </w:r>
-    </w:p>
-    <w:p>
-      <w:pPr>
-        <w:pStyle w:val="ListParagraph"/>
-        <w:numPr>
-          <w:ilvl w:val="1"/>
-          <w:numId w:val="2"/>
-        </w:numPr>
-        <w:spacing w:after="40"/>
-      </w:pPr>
-      <w:r>
-        <w:rPr>
-          <w:rFonts w:ascii="Calibri" w:cs="Calibri" w:eastAsia="Calibri" w:hAnsi="Calibri"/>
-        </w:rPr>
-        <w:t xml:space="preserve">Purchase_Orders in PO_Has_Line: a purchase order is created together with its lines.</w:t>
-      </w:r>
-    </w:p>
-    <w:p>
-      <w:pPr>
-        <w:pStyle w:val="ListParagraph"/>
-        <w:numPr>
-          <w:ilvl w:val="1"/>
-          <w:numId w:val="2"/>
-        </w:numPr>
-        <w:spacing w:after="40"/>
-      </w:pPr>
-      <w:r>
-        <w:rPr>
-          <w:rFonts w:ascii="Calibri" w:cs="Calibri" w:eastAsia="Calibri" w:hAnsi="Calibri"/>
-        </w:rPr>
-        <w:t xml:space="preserve">Invoices in Invoice_Has_Line: an invoice is issued with one line per order line.</w:t>
-      </w:r>
-    </w:p>
-    <w:p>
-      <w:pPr>
-        <w:pStyle w:val="ListParagraph"/>
-        <w:numPr>
-          <w:ilvl w:val="1"/>
-          <w:numId w:val="2"/>
-        </w:numPr>
-        <w:spacing w:after="40"/>
-      </w:pPr>
-      <w:r>
-        <w:rPr>
-          <w:rFonts w:ascii="Calibri" w:cs="Calibri" w:eastAsia="Calibri" w:hAnsi="Calibri"/>
-        </w:rPr>
-        <w:t xml:space="preserve">Products in Variant_Of: a product is only published with at least one variant.</w:t>
-      </w:r>
-    </w:p>
-    <w:p>
-      <w:pPr>
-        <w:pStyle w:val="ListParagraph"/>
-        <w:numPr>
-          <w:ilvl w:val="1"/>
-          <w:numId w:val="2"/>
-        </w:numPr>
-        <w:spacing w:after="40"/>
-      </w:pPr>
-      <w:r>
-        <w:rPr>
-          <w:rFonts w:ascii="Calibri" w:cs="Calibri" w:eastAsia="Calibri" w:hAnsi="Calibri"/>
-        </w:rPr>
-        <w:t xml:space="preserve">Carriers in Offers_Service: a carrier is only usable with at least one service.</w:t>
-      </w:r>
-    </w:p>
-    <w:p>
-      <w:pPr>
-        <w:sectPr>
-          <w:footerReference w:type="default" r:id="rId7"/>
-          <w:pgSz w:w="11906" w:h="16838" w:orient="portrait"/>
-          <w:pgMar w:top="1134" w:right="1134" w:bottom="1134" w:left="1134" w:header="708" w:footer="708" w:gutter="0"/>
-          <w:pgNumType/>
-          <w:docGrid w:linePitch="360"/>
-        </w:sectPr>
-      </w:pPr>
-    </w:p>
-    <w:p>
-      <w:pPr>
-        <w:pStyle w:val="Heading1"/>
-      </w:pPr>
-      <w:r>
-        <w:rPr>
-          <w:rFonts w:ascii="Calibri" w:cs="Calibri" w:eastAsia="Calibri" w:hAnsi="Calibri"/>
-        </w:rPr>
-        <w:t xml:space="preserve">Appendix A – ER diagrams</w:t>
-      </w:r>
-    </w:p>
-    <w:p>
-      <w:pPr>
-        <w:spacing w:after="120" w:line="276"/>
-      </w:pPr>
-      <w:r>
-        <w:rPr>
-          <w:rFonts w:ascii="Calibri" w:cs="Calibri" w:eastAsia="Calibri" w:hAnsi="Calibri"/>
-        </w:rPr>
-        <w:t xml:space="preserve">Figure A1 is the complete diagram; it is large and best viewed zoomed in. Figures A2 and A3 enlarge the two central areas, where orders meet stock: they contain the weak entity Order_Lines, the ternary relationship Stocks and its aggregation. Grey dashed boxes stand for entity sets of another area, drawn without attributes.</w:t>
-      </w:r>
-    </w:p>
-    <w:p>
-      <w:pPr>
-        <w:keepNext/>
-        <w:spacing w:after="60" w:before="120"/>
-        <w:jc w:val="center"/>
-      </w:pPr>
-      <w:r>
-        <w:drawing>
-          <wp:inline distT="0" distB="0" distL="0" distR="0">
-            <wp:extent cx="9248775" cy="3390900"/>
-            <wp:effectExtent t="0" r="0" b="0" l="0"/>
-            <wp:docPr id="1" name="" descr="" title=""/>
-            <wp:cNvGraphicFramePr>
-              <a:graphicFrameLocks xmlns:a="http://schemas.openxmlformats.org/drawingml/2006/main" noChangeAspect="1"/>
-            </wp:cNvGraphicFramePr>
-            <a:graphic xmlns:a="http://schemas.openxmlformats.org/drawingml/2006/main">
-              <a:graphicData uri="http://schemas.openxmlformats.org/drawingml/2006/picture">
-                <pic:pic xmlns:pic="http://schemas.openxmlformats.org/drawingml/2006/picture">
-                  <pic:nvPicPr>
-                    <pic:cNvPr id="0" name="" descr=""/>
-                    <pic:cNvPicPr>
-                      <a:picLocks noChangeAspect="1" noChangeArrowheads="1"/>
-                    </pic:cNvPicPr>
-                  </pic:nvPicPr>
-                  <pic:blipFill>
-                    <a:blip r:embed="rId13" cstate="none"/>
-                    <a:srcRect/>
-                    <a:stretch>
-                      <a:fillRect/>
-                    </a:stretch>
-                  </pic:blipFill>
-                  <pic:spPr bwMode="auto">
-                    <a:xfrm>
-                      <a:off x="0" y="0"/>
-                      <a:ext cx="9248775" cy="3390900"/>
-                    </a:xfrm>
-                    <a:prstGeom prst="rect">
-                      <a:avLst/>
-                    </a:prstGeom>
-                  </pic:spPr>
-                </pic:pic>
-              </a:graphicData>
-            </a:graphic>
-          </wp:inline>
-        </w:drawing>
-      </w:r>
-    </w:p>
-    <w:p>
-      <w:pPr>
-        <w:spacing w:after="200"/>
-        <w:jc w:val="center"/>
-      </w:pPr>
-      <w:r>
-        <w:rPr>
-          <w:rFonts w:ascii="Calibri" w:cs="Calibri" w:eastAsia="Calibri" w:hAnsi="Calibri"/>
-          <w:b/>
-          <w:bCs/>
-          <w:color w:val="52606D"/>
-          <w:sz w:val="18"/>
-          <w:szCs w:val="18"/>
-        </w:rPr>
-        <w:t xml:space="preserve">Figure A1. </w:t>
-      </w:r>
-      <w:r>
-        <w:rPr>
-          <w:rFonts w:ascii="Calibri" w:cs="Calibri" w:eastAsia="Calibri" w:hAnsi="Calibri"/>
-          <w:color w:val="52606D"/>
-          <w:sz w:val="18"/>
-          <w:szCs w:val="18"/>
-        </w:rPr>
-        <w:t xml:space="preserve">Complete ER diagram: 71 entity sets and 103 relationship sets in one connected component.</w:t>
-      </w:r>
-    </w:p>
-    <w:p>
-      <w:r>
-        <w:br w:type="page"/>
-      </w:r>
-    </w:p>
-    <w:p>
-      <w:pPr>
-        <w:keepNext/>
-        <w:spacing w:after="60" w:before="120"/>
-        <w:jc w:val="center"/>
-      </w:pPr>
-      <w:r>
-        <w:drawing>
-          <wp:inline distT="0" distB="0" distL="0" distR="0">
-            <wp:extent cx="5600700" cy="5553075"/>
-            <wp:effectExtent t="0" r="0" b="0" l="0"/>
-            <wp:docPr id="1" name="" descr="" title=""/>
-            <wp:cNvGraphicFramePr>
-              <a:graphicFrameLocks xmlns:a="http://schemas.openxmlformats.org/drawingml/2006/main" noChangeAspect="1"/>
-            </wp:cNvGraphicFramePr>
-            <a:graphic xmlns:a="http://schemas.openxmlformats.org/drawingml/2006/main">
-              <a:graphicData uri="http://schemas.openxmlformats.org/drawingml/2006/picture">
-                <pic:pic xmlns:pic="http://schemas.openxmlformats.org/drawingml/2006/picture">
-                  <pic:nvPicPr>
-                    <pic:cNvPr id="0" name="" descr=""/>
-                    <pic:cNvPicPr>
-                      <a:picLocks noChangeAspect="1" noChangeArrowheads="1"/>
-                    </pic:cNvPicPr>
-                  </pic:nvPicPr>
-                  <pic:blipFill>
-                    <a:blip r:embed="rId14" cstate="none"/>
-                    <a:srcRect/>
-                    <a:stretch>
-                      <a:fillRect/>
-                    </a:stretch>
-                  </pic:blipFill>
-                  <pic:spPr bwMode="auto">
-                    <a:xfrm>
-                      <a:off x="0" y="0"/>
-                      <a:ext cx="5600700" cy="5553075"/>
-                    </a:xfrm>
-                    <a:prstGeom prst="rect">
-                      <a:avLst/>
-                    </a:prstGeom>
-                  </pic:spPr>
-                </pic:pic>
-              </a:graphicData>
-            </a:graphic>
-          </wp:inline>
-        </w:drawing>
-      </w:r>
-    </w:p>
-    <w:p>
-      <w:pPr>
-        <w:spacing w:after="200"/>
-        <w:jc w:val="center"/>
-      </w:pPr>
-      <w:r>
-        <w:rPr>
-          <w:rFonts w:ascii="Calibri" w:cs="Calibri" w:eastAsia="Calibri" w:hAnsi="Calibri"/>
-          <w:b/>
-          <w:bCs/>
-          <w:color w:val="52606D"/>
-          <w:sz w:val="18"/>
-          <w:szCs w:val="18"/>
-        </w:rPr>
-        <w:t xml:space="preserve">Figure A2. </w:t>
-      </w:r>
-      <w:r>
-        <w:rPr>
-          <w:rFonts w:ascii="Calibri" w:cs="Calibri" w:eastAsia="Calibri" w:hAnsi="Calibri"/>
-          <w:color w:val="52606D"/>
-          <w:sz w:val="18"/>
-          <w:szCs w:val="18"/>
-        </w:rPr>
-        <w:t xml:space="preserve">Orders and payment.</w:t>
-      </w:r>
-    </w:p>
-    <w:p>
-      <w:r>
-        <w:br w:type="page"/>
-      </w:r>
-    </w:p>
-    <w:p>
-      <w:pPr>
-        <w:keepNext/>
-        <w:spacing w:after="60" w:before="120"/>
-        <w:jc w:val="center"/>
-      </w:pPr>
-      <w:r>
-        <w:drawing>
-          <wp:inline distT="0" distB="0" distL="0" distR="0">
-            <wp:extent cx="7581900" cy="5553075"/>
-            <wp:effectExtent t="0" r="0" b="0" l="0"/>
-            <wp:docPr id="1" name="" descr="" title=""/>
-            <wp:cNvGraphicFramePr>
-              <a:graphicFrameLocks xmlns:a="http://schemas.openxmlformats.org/drawingml/2006/main" noChangeAspect="1"/>
-            </wp:cNvGraphicFramePr>
-            <a:graphic xmlns:a="http://schemas.openxmlformats.org/drawingml/2006/main">
-              <a:graphicData uri="http://schemas.openxmlformats.org/drawingml/2006/picture">
-                <pic:pic xmlns:pic="http://schemas.openxmlformats.org/drawingml/2006/picture">
-                  <pic:nvPicPr>
-                    <pic:cNvPr id="0" name="" descr=""/>
-                    <pic:cNvPicPr>
-                      <a:picLocks noChangeAspect="1" noChangeArrowheads="1"/>
-                    </pic:cNvPicPr>
-                  </pic:nvPicPr>
-                  <pic:blipFill>
-                    <a:blip r:embed="rId15" cstate="none"/>
-                    <a:srcRect/>
-                    <a:stretch>
-                      <a:fillRect/>
-                    </a:stretch>
-                  </pic:blipFill>
-                  <pic:spPr bwMode="auto">
-                    <a:xfrm>
-                      <a:off x="0" y="0"/>
-                      <a:ext cx="7581900" cy="5553075"/>
-                    </a:xfrm>
-                    <a:prstGeom prst="rect">
-                      <a:avLst/>
-                    </a:prstGeom>
-                  </pic:spPr>
-                </pic:pic>
-              </a:graphicData>
-            </a:graphic>
-          </wp:inline>
-        </w:drawing>
-      </w:r>
-    </w:p>
-    <w:p>
-      <w:pPr>
-        <w:spacing w:after="200"/>
-        <w:jc w:val="center"/>
-      </w:pPr>
-      <w:r>
-        <w:rPr>
-          <w:rFonts w:ascii="Calibri" w:cs="Calibri" w:eastAsia="Calibri" w:hAnsi="Calibri"/>
-          <w:b/>
-          <w:bCs/>
-          <w:color w:val="52606D"/>
-          <w:sz w:val="18"/>
-          <w:szCs w:val="18"/>
-        </w:rPr>
-        <w:t xml:space="preserve">Figure A3. </w:t>
-      </w:r>
-      <w:r>
-        <w:rPr>
-          <w:rFonts w:ascii="Calibri" w:cs="Calibri" w:eastAsia="Calibri" w:hAnsi="Calibri"/>
-          <w:color w:val="52606D"/>
-          <w:sz w:val="18"/>
-          <w:szCs w:val="18"/>
-        </w:rPr>
-        <w:t xml:space="preserve">Inventory and procurement.</w:t>
-      </w:r>
-    </w:p>
     <w:sectPr>
-      <w:footerReference w:type="default" r:id="rId8"/>
-      <w:pgSz w:w="16838" w:h="11906" w:orient="landscape"/>
+      <w:footerReference w:type="default" r:id="rId7"/>
+      <w:pgSz w:w="11906" w:h="16838" w:orient="portrait"/>
       <w:pgMar w:top="1134" w:right="1134" w:bottom="1134" w:left="1134" w:header="708" w:footer="708" w:gutter="0"/>
       <w:pgNumType/>
       <w:docGrid w:linePitch="360"/>
@@ -38625,28 +35512,6 @@
 </file>
 
 <file path=word/footer1.xml><?xml version="1.0" encoding="utf-8"?>
-<w:ftr xmlns:wpc="http://schemas.microsoft.com/office/word/2010/wordprocessingCanvas" xmlns:mc="http://schemas.openxmlformats.org/markup-compatibility/2006" xmlns:o="urn:schemas-microsoft-com:office:office" xmlns:r="http://schemas.openxmlformats.org/officeDocument/2006/relationships" xmlns:m="http://schemas.openxmlformats.org/officeDocument/2006/math" xmlns:v="urn:schemas-microsoft-com:vml" xmlns:wp14="http://schemas.microsoft.com/office/word/2010/wordprocessingDrawing" xmlns:wp="http://schemas.openxmlformats.org/drawingml/2006/wordprocessingDrawing" xmlns:w10="urn:schemas-microsoft-com:office:word" xmlns:w="http://schemas.openxmlformats.org/wordprocessingml/2006/main" xmlns:w14="http://schemas.microsoft.com/office/word/2010/wordml" xmlns:w15="http://schemas.microsoft.com/office/word/2012/wordml" xmlns:wpg="http://schemas.microsoft.com/office/word/2010/wordprocessingGroup" xmlns:wpi="http://schemas.microsoft.com/office/word/2010/wordprocessingInk" xmlns:wne="http://schemas.microsoft.com/office/word/2006/wordml" xmlns:wps="http://schemas.microsoft.com/office/word/2010/wordprocessingShape">
-  <w:p>
-    <w:pPr>
-      <w:jc w:val="center"/>
-    </w:pPr>
-    <w:r>
-      <w:rPr>
-        <w:rFonts w:ascii="Calibri" w:cs="Calibri" w:eastAsia="Calibri" w:hAnsi="Calibri"/>
-        <w:color w:val="52606D"/>
-        <w:sz w:val="18"/>
-        <w:szCs w:val="18"/>
-      </w:rPr>
-      <w:fldChar w:fldCharType="begin"/>
-      <w:instrText xml:space="preserve">PAGE</w:instrText>
-      <w:fldChar w:fldCharType="separate"/>
-      <w:fldChar w:fldCharType="end"/>
-    </w:r>
-  </w:p>
-</w:ftr>
-</file>
-
-<file path=word/footer2.xml><?xml version="1.0" encoding="utf-8"?>
 <w:ftr xmlns:wpc="http://schemas.microsoft.com/office/word/2010/wordprocessingCanvas" xmlns:mc="http://schemas.openxmlformats.org/markup-compatibility/2006" xmlns:o="urn:schemas-microsoft-com:office:office" xmlns:r="http://schemas.openxmlformats.org/officeDocument/2006/relationships" xmlns:m="http://schemas.openxmlformats.org/officeDocument/2006/math" xmlns:v="urn:schemas-microsoft-com:vml" xmlns:wp14="http://schemas.microsoft.com/office/word/2010/wordprocessingDrawing" xmlns:wp="http://schemas.openxmlformats.org/drawingml/2006/wordprocessingDrawing" xmlns:w10="urn:schemas-microsoft-com:office:word" xmlns:w="http://schemas.openxmlformats.org/wordprocessingml/2006/main" xmlns:w14="http://schemas.microsoft.com/office/word/2010/wordml" xmlns:w15="http://schemas.microsoft.com/office/word/2012/wordml" xmlns:wpg="http://schemas.microsoft.com/office/word/2010/wordprocessingGroup" xmlns:wpi="http://schemas.microsoft.com/office/word/2010/wordprocessingInk" xmlns:wne="http://schemas.microsoft.com/office/word/2006/wordml" xmlns:wps="http://schemas.microsoft.com/office/word/2010/wordprocessingShape">
   <w:p>
     <w:pPr>
@@ -38814,12 +35679,6 @@
   </w:abstractNum>
   <w:num w:numId="1">
     <w:abstractNumId w:val="1"/>
-    <w:lvlOverride w:ilvl="0">
-      <w:startOverride w:val="1"/>
-    </w:lvlOverride>
-  </w:num>
-  <w:num w:numId="2">
-    <w:abstractNumId w:val="2"/>
     <w:lvlOverride w:ilvl="0">
       <w:startOverride w:val="1"/>
     </w:lvlOverride>

</xml_diff>

<commit_message>
Merge four entity sets after instructor feedback (71 -> 67 entities, 103 -> 99 relationships)
- Inventory_Adjustments -> Stock_Movements: optional staff_id, Authorizes now on movements.
- Refunds -> Payment_Transactions: return_id with CHECK (refund iff return_id set);
  the refund is no longer written twice. Refunded_From removed.
- Proof_Of_Delivery -> Delivery_Attempts: recipient_name and evidence_url,
  CHECK (delivered iff recipient_name set). Proves removed.
- Storage_Zones -> Storage_Bins: zone_code attribute, Located_In to Warehouses;
  composite FK (bin_id, warehouse_id) keeps a batch's bin in its own warehouse.
- Report, diagrams, Word document and ER PDF regenerated.
- docs/NUMBERING_OLD_NEW.md maps the feedback's E/R numbers to the new ones.

Co-Authored-By: Claude Opus 5.5 <noreply@anthropic.com>
</commit_message>
<xml_diff>
--- a/docs/MarketLab_Project_Description.docx
+++ b/docs/MarketLab_Project_Description.docx
@@ -406,7 +406,7 @@
         <w:rPr>
           <w:rFonts w:ascii="Calibri" w:cs="Calibri" w:eastAsia="Calibri" w:hAnsi="Calibri"/>
         </w:rPr>
-        <w:t xml:space="preserve">The design has 71 entity sets and 103 relationship sets, plus one ISA hierarchy, all connected in a single ER diagram (submitted as MarketLab_ER_Diagram.pdf). It includes weak entities, an ISA hierarchy, a ternary relationship and an aggregation. Part 1 defines every entity set and Part 2 every relationship set.</w:t>
+        <w:t xml:space="preserve">The design has 67 entity sets and 99 relationship sets, plus one ISA hierarchy, all connected in a single ER diagram (submitted as MarketLab_ER_Diagram.pdf). It includes weak entities, an ISA hierarchy, a ternary relationship and an aggregation. Part 1 defines every entity set and Part 2 every relationship set.</w:t>
       </w:r>
     </w:p>
     <w:p>
@@ -9090,7 +9090,7 @@
                 <w:sz w:val="18"/>
                 <w:szCs w:val="18"/>
               </w:rPr>
-              <w:t xml:space="preserve">Storage_Zones</w:t>
+              <w:t xml:space="preserve">Storage_Bins</w:t>
             </w:r>
           </w:p>
         </w:tc>
@@ -9121,7 +9121,7 @@
                 <w:sz w:val="18"/>
                 <w:szCs w:val="18"/>
               </w:rPr>
-              <w:t xml:space="preserve">An area of a warehouse (for example zone A), identified by a code within the warehouse.</w:t>
+              <w:t xml:space="preserve">A shelf location in a warehouse where stock batches are placed. Its address is a zone code and a shelf code (for example zone A, shelf A-01), unique within the warehouse.</w:t>
             </w:r>
           </w:p>
         </w:tc>
@@ -9151,7 +9151,7 @@
                 <w:rFonts w:ascii="Calibri" w:cs="Calibri" w:eastAsia="Calibri" w:hAnsi="Calibri"/>
                 <w:u w:val="single"/>
               </w:rPr>
-              <w:t xml:space="preserve">zone_id</w:t>
+              <w:t xml:space="preserve">bin_id</w:t>
             </w:r>
           </w:p>
         </w:tc>
@@ -9176,6 +9176,22 @@
             <w:pPr>
               <w:spacing w:after="20"/>
             </w:pPr>
+            <w:r>
+              <w:rPr>
+                <w:rFonts w:ascii="Calibri" w:cs="Calibri" w:eastAsia="Calibri" w:hAnsi="Calibri"/>
+                <w:sz w:val="18"/>
+                <w:szCs w:val="18"/>
+              </w:rPr>
+              <w:t xml:space="preserve">zone_code</w:t>
+            </w:r>
+            <w:r>
+              <w:rPr>
+                <w:rFonts w:ascii="Calibri" w:cs="Calibri" w:eastAsia="Calibri" w:hAnsi="Calibri"/>
+                <w:sz w:val="18"/>
+                <w:szCs w:val="18"/>
+              </w:rPr>
+              <w:t xml:space="preserve">, </w:t>
+            </w:r>
             <w:r>
               <w:rPr>
                 <w:rFonts w:ascii="Calibri" w:cs="Calibri" w:eastAsia="Calibri" w:hAnsi="Calibri"/>
@@ -9249,7 +9265,7 @@
                 <w:sz w:val="18"/>
                 <w:szCs w:val="18"/>
               </w:rPr>
-              <w:t xml:space="preserve">Storage_Bins</w:t>
+              <w:t xml:space="preserve">Stock_Batches</w:t>
             </w:r>
           </w:p>
         </w:tc>
@@ -9279,7 +9295,7 @@
                 <w:sz w:val="18"/>
                 <w:szCs w:val="18"/>
               </w:rPr>
-              <w:t xml:space="preserve">A shelf location inside a storage zone where stock batches are placed.</w:t>
+              <w:t xml:space="preserve">A physical quantity of one stock position received at one time and stored in one bin. Batches let the system issue the oldest stock first.</w:t>
             </w:r>
           </w:p>
         </w:tc>
@@ -9308,7 +9324,7 @@
                 <w:rFonts w:ascii="Calibri" w:cs="Calibri" w:eastAsia="Calibri" w:hAnsi="Calibri"/>
                 <w:u w:val="single"/>
               </w:rPr>
-              <w:t xml:space="preserve">bin_id</w:t>
+              <w:t xml:space="preserve">batch_id</w:t>
             </w:r>
           </w:p>
         </w:tc>
@@ -9338,7 +9354,23 @@
                 <w:sz w:val="18"/>
                 <w:szCs w:val="18"/>
               </w:rPr>
-              <w:t xml:space="preserve">code</w:t>
+              <w:t xml:space="preserve">received_at</w:t>
+            </w:r>
+            <w:r>
+              <w:rPr>
+                <w:rFonts w:ascii="Calibri" w:cs="Calibri" w:eastAsia="Calibri" w:hAnsi="Calibri"/>
+                <w:sz w:val="18"/>
+                <w:szCs w:val="18"/>
+              </w:rPr>
+              <w:t xml:space="preserve">, </w:t>
+            </w:r>
+            <w:r>
+              <w:rPr>
+                <w:rFonts w:ascii="Calibri" w:cs="Calibri" w:eastAsia="Calibri" w:hAnsi="Calibri"/>
+                <w:sz w:val="18"/>
+                <w:szCs w:val="18"/>
+              </w:rPr>
+              <w:t xml:space="preserve">quantity</w:t>
             </w:r>
           </w:p>
         </w:tc>
@@ -9407,7 +9439,7 @@
                 <w:sz w:val="18"/>
                 <w:szCs w:val="18"/>
               </w:rPr>
-              <w:t xml:space="preserve">Stock_Batches</w:t>
+              <w:t xml:space="preserve">Stock_Movements</w:t>
             </w:r>
           </w:p>
         </w:tc>
@@ -9438,7 +9470,23 @@
                 <w:sz w:val="18"/>
                 <w:szCs w:val="18"/>
               </w:rPr>
-              <w:t xml:space="preserve">A physical quantity of one stock position received at one time and stored in one bin. Batches let the system issue the oldest stock first.</w:t>
+              <w:t xml:space="preserve">A signed change of a batch's quantity with its reason: made by the system (an order reservation) or entered by hand after a count or damage, then authorised by a staff member.</w:t>
+            </w:r>
+          </w:p>
+          <w:p>
+            <w:pPr>
+              <w:spacing w:after="20"/>
+            </w:pPr>
+            <w:r>
+              <w:rPr>
+                <w:rFonts w:ascii="Calibri" w:cs="Calibri" w:eastAsia="Calibri" w:hAnsi="Calibri"/>
+                <w:i/>
+                <w:iCs/>
+                <w:color w:val="52606D"/>
+                <w:sz w:val="16"/>
+                <w:szCs w:val="16"/>
+              </w:rPr>
+              <w:t xml:space="preserve">A batch changes many times and each change must be auditable with its reason and time.</w:t>
             </w:r>
           </w:p>
         </w:tc>
@@ -9468,7 +9516,7 @@
                 <w:rFonts w:ascii="Calibri" w:cs="Calibri" w:eastAsia="Calibri" w:hAnsi="Calibri"/>
                 <w:u w:val="single"/>
               </w:rPr>
-              <w:t xml:space="preserve">batch_id</w:t>
+              <w:t xml:space="preserve">movement_id</w:t>
             </w:r>
           </w:p>
         </w:tc>
@@ -9499,7 +9547,7 @@
                 <w:sz w:val="18"/>
                 <w:szCs w:val="18"/>
               </w:rPr>
-              <w:t xml:space="preserve">received_at</w:t>
+              <w:t xml:space="preserve">quantity_delta</w:t>
             </w:r>
             <w:r>
               <w:rPr>
@@ -9515,7 +9563,23 @@
                 <w:sz w:val="18"/>
                 <w:szCs w:val="18"/>
               </w:rPr>
-              <w:t xml:space="preserve">quantity</w:t>
+              <w:t xml:space="preserve">reason</w:t>
+            </w:r>
+            <w:r>
+              <w:rPr>
+                <w:rFonts w:ascii="Calibri" w:cs="Calibri" w:eastAsia="Calibri" w:hAnsi="Calibri"/>
+                <w:sz w:val="18"/>
+                <w:szCs w:val="18"/>
+              </w:rPr>
+              <w:t xml:space="preserve">, </w:t>
+            </w:r>
+            <w:r>
+              <w:rPr>
+                <w:rFonts w:ascii="Calibri" w:cs="Calibri" w:eastAsia="Calibri" w:hAnsi="Calibri"/>
+                <w:sz w:val="18"/>
+                <w:szCs w:val="18"/>
+              </w:rPr>
+              <w:t xml:space="preserve">moved_at</w:t>
             </w:r>
           </w:p>
         </w:tc>
@@ -9582,7 +9646,7 @@
                 <w:sz w:val="18"/>
                 <w:szCs w:val="18"/>
               </w:rPr>
-              <w:t xml:space="preserve">Stock_Movements</w:t>
+              <w:t xml:space="preserve">Suppliers</w:t>
             </w:r>
           </w:p>
         </w:tc>
@@ -9612,23 +9676,7 @@
                 <w:sz w:val="18"/>
                 <w:szCs w:val="18"/>
               </w:rPr>
-              <w:t xml:space="preserve">A signed change of a batch's quantity with its reason (reservation, damage, count).</w:t>
-            </w:r>
-          </w:p>
-          <w:p>
-            <w:pPr>
-              <w:spacing w:after="20"/>
-            </w:pPr>
-            <w:r>
-              <w:rPr>
-                <w:rFonts w:ascii="Calibri" w:cs="Calibri" w:eastAsia="Calibri" w:hAnsi="Calibri"/>
-                <w:i/>
-                <w:iCs/>
-                <w:color w:val="52606D"/>
-                <w:sz w:val="16"/>
-                <w:szCs w:val="16"/>
-              </w:rPr>
-              <w:t xml:space="preserve">A batch changes many times and each change must be auditable with its reason and time.</w:t>
+              <w:t xml:space="preserve">A wholesaler from which a seller buys goods.</w:t>
             </w:r>
           </w:p>
         </w:tc>
@@ -9657,7 +9705,7 @@
                 <w:rFonts w:ascii="Calibri" w:cs="Calibri" w:eastAsia="Calibri" w:hAnsi="Calibri"/>
                 <w:u w:val="single"/>
               </w:rPr>
-              <w:t xml:space="preserve">movement_id</w:t>
+              <w:t xml:space="preserve">supplier_id</w:t>
             </w:r>
           </w:p>
         </w:tc>
@@ -9687,7 +9735,7 @@
                 <w:sz w:val="18"/>
                 <w:szCs w:val="18"/>
               </w:rPr>
-              <w:t xml:space="preserve">quantity_delta</w:t>
+              <w:t xml:space="preserve">name</w:t>
             </w:r>
             <w:r>
               <w:rPr>
@@ -9703,23 +9751,7 @@
                 <w:sz w:val="18"/>
                 <w:szCs w:val="18"/>
               </w:rPr>
-              <w:t xml:space="preserve">reason</w:t>
-            </w:r>
-            <w:r>
-              <w:rPr>
-                <w:rFonts w:ascii="Calibri" w:cs="Calibri" w:eastAsia="Calibri" w:hAnsi="Calibri"/>
-                <w:sz w:val="18"/>
-                <w:szCs w:val="18"/>
-              </w:rPr>
-              <w:t xml:space="preserve">, </w:t>
-            </w:r>
-            <w:r>
-              <w:rPr>
-                <w:rFonts w:ascii="Calibri" w:cs="Calibri" w:eastAsia="Calibri" w:hAnsi="Calibri"/>
-                <w:sz w:val="18"/>
-                <w:szCs w:val="18"/>
-              </w:rPr>
-              <w:t xml:space="preserve">moved_at</w:t>
+              <w:t xml:space="preserve">contact_email</w:t>
             </w:r>
           </w:p>
         </w:tc>
@@ -9788,7 +9820,7 @@
                 <w:sz w:val="18"/>
                 <w:szCs w:val="18"/>
               </w:rPr>
-              <w:t xml:space="preserve">Suppliers</w:t>
+              <w:t xml:space="preserve">Purchase_Orders</w:t>
             </w:r>
           </w:p>
         </w:tc>
@@ -9819,7 +9851,7 @@
                 <w:sz w:val="18"/>
                 <w:szCs w:val="18"/>
               </w:rPr>
-              <w:t xml:space="preserve">A wholesaler from which a seller buys goods.</w:t>
+              <w:t xml:space="preserve">An order a seller places with a supplier for delivery to one warehouse.</w:t>
             </w:r>
           </w:p>
         </w:tc>
@@ -9849,7 +9881,7 @@
                 <w:rFonts w:ascii="Calibri" w:cs="Calibri" w:eastAsia="Calibri" w:hAnsi="Calibri"/>
                 <w:u w:val="single"/>
               </w:rPr>
-              <w:t xml:space="preserve">supplier_id</w:t>
+              <w:t xml:space="preserve">purchase_order_id</w:t>
             </w:r>
           </w:p>
         </w:tc>
@@ -9880,7 +9912,7 @@
                 <w:sz w:val="18"/>
                 <w:szCs w:val="18"/>
               </w:rPr>
-              <w:t xml:space="preserve">name</w:t>
+              <w:t xml:space="preserve">ordered_at</w:t>
             </w:r>
             <w:r>
               <w:rPr>
@@ -9896,7 +9928,7 @@
                 <w:sz w:val="18"/>
                 <w:szCs w:val="18"/>
               </w:rPr>
-              <w:t xml:space="preserve">contact_email</w:t>
+              <w:t xml:space="preserve">status</w:t>
             </w:r>
           </w:p>
         </w:tc>
@@ -9963,7 +9995,23 @@
                 <w:sz w:val="18"/>
                 <w:szCs w:val="18"/>
               </w:rPr>
-              <w:t xml:space="preserve">Purchase_Orders</w:t>
+              <w:t xml:space="preserve">Purchase_Order_Lines</w:t>
+            </w:r>
+          </w:p>
+          <w:p>
+            <w:pPr>
+              <w:spacing w:after="20"/>
+            </w:pPr>
+            <w:r>
+              <w:rPr>
+                <w:rFonts w:ascii="Calibri" w:cs="Calibri" w:eastAsia="Calibri" w:hAnsi="Calibri"/>
+                <w:i/>
+                <w:iCs/>
+                <w:color w:val="52606D"/>
+                <w:sz w:val="16"/>
+                <w:szCs w:val="16"/>
+              </w:rPr>
+              <w:t xml:space="preserve">weak, owner Purchase_Orders</w:t>
             </w:r>
           </w:p>
         </w:tc>
@@ -9993,7 +10041,7 @@
                 <w:sz w:val="18"/>
                 <w:szCs w:val="18"/>
               </w:rPr>
-              <w:t xml:space="preserve">An order a seller places with a supplier for delivery to one warehouse.</w:t>
+              <w:t xml:space="preserve">One line of a purchase order: which variant, how many and at what unit cost. Numbered within its purchase order.</w:t>
             </w:r>
           </w:p>
         </w:tc>
@@ -10020,10 +10068,35 @@
             <w:r>
               <w:rPr>
                 <w:rFonts w:ascii="Calibri" w:cs="Calibri" w:eastAsia="Calibri" w:hAnsi="Calibri"/>
+                <w:u w:val="dash"/>
+              </w:rPr>
+              <w:t xml:space="preserve">line_no</w:t>
+            </w:r>
+            <w:r>
+              <w:rPr>
+                <w:rFonts w:ascii="Calibri" w:cs="Calibri" w:eastAsia="Calibri" w:hAnsi="Calibri"/>
+                <w:color w:val="52606D"/>
+                <w:sz w:val="18"/>
+                <w:szCs w:val="18"/>
+              </w:rPr>
+              <w:t xml:space="preserve"> (partial) + </w:t>
+            </w:r>
+            <w:r>
+              <w:rPr>
+                <w:rFonts w:ascii="Calibri" w:cs="Calibri" w:eastAsia="Calibri" w:hAnsi="Calibri"/>
                 <w:u w:val="single"/>
               </w:rPr>
               <w:t xml:space="preserve">purchase_order_id</w:t>
             </w:r>
+            <w:r>
+              <w:rPr>
+                <w:rFonts w:ascii="Calibri" w:cs="Calibri" w:eastAsia="Calibri" w:hAnsi="Calibri"/>
+                <w:color w:val="52606D"/>
+                <w:sz w:val="18"/>
+                <w:szCs w:val="18"/>
+              </w:rPr>
+              <w:t xml:space="preserve"> of Purchase_Orders</w:t>
+            </w:r>
           </w:p>
         </w:tc>
         <w:tc>
@@ -10052,7 +10125,7 @@
                 <w:sz w:val="18"/>
                 <w:szCs w:val="18"/>
               </w:rPr>
-              <w:t xml:space="preserve">ordered_at</w:t>
+              <w:t xml:space="preserve">quantity</w:t>
             </w:r>
             <w:r>
               <w:rPr>
@@ -10068,7 +10141,7 @@
                 <w:sz w:val="18"/>
                 <w:szCs w:val="18"/>
               </w:rPr>
-              <w:t xml:space="preserve">status</w:t>
+              <w:t xml:space="preserve">unit_cost_cents</w:t>
             </w:r>
           </w:p>
         </w:tc>
@@ -10137,23 +10210,7 @@
                 <w:sz w:val="18"/>
                 <w:szCs w:val="18"/>
               </w:rPr>
-              <w:t xml:space="preserve">Purchase_Order_Lines</w:t>
-            </w:r>
-          </w:p>
-          <w:p>
-            <w:pPr>
-              <w:spacing w:after="20"/>
-            </w:pPr>
-            <w:r>
-              <w:rPr>
-                <w:rFonts w:ascii="Calibri" w:cs="Calibri" w:eastAsia="Calibri" w:hAnsi="Calibri"/>
-                <w:i/>
-                <w:iCs/>
-                <w:color w:val="52606D"/>
-                <w:sz w:val="16"/>
-                <w:szCs w:val="16"/>
-              </w:rPr>
-              <w:t xml:space="preserve">weak, owner Purchase_Orders</w:t>
+              <w:t xml:space="preserve">Goods_Receipts</w:t>
             </w:r>
           </w:p>
         </w:tc>
@@ -10184,7 +10241,7 @@
                 <w:sz w:val="18"/>
                 <w:szCs w:val="18"/>
               </w:rPr>
-              <w:t xml:space="preserve">One line of a purchase order: which variant, how many and at what unit cost. Numbered within its purchase order.</w:t>
+              <w:t xml:space="preserve">The record of a delivery arriving at the warehouse against a purchase order. One purchase order may arrive in several deliveries.</w:t>
             </w:r>
           </w:p>
         </w:tc>
@@ -10212,34 +10269,9 @@
             <w:r>
               <w:rPr>
                 <w:rFonts w:ascii="Calibri" w:cs="Calibri" w:eastAsia="Calibri" w:hAnsi="Calibri"/>
-                <w:u w:val="dash"/>
-              </w:rPr>
-              <w:t xml:space="preserve">line_no</w:t>
-            </w:r>
-            <w:r>
-              <w:rPr>
-                <w:rFonts w:ascii="Calibri" w:cs="Calibri" w:eastAsia="Calibri" w:hAnsi="Calibri"/>
-                <w:color w:val="52606D"/>
-                <w:sz w:val="18"/>
-                <w:szCs w:val="18"/>
-              </w:rPr>
-              <w:t xml:space="preserve"> (partial) + </w:t>
-            </w:r>
-            <w:r>
-              <w:rPr>
-                <w:rFonts w:ascii="Calibri" w:cs="Calibri" w:eastAsia="Calibri" w:hAnsi="Calibri"/>
                 <w:u w:val="single"/>
               </w:rPr>
-              <w:t xml:space="preserve">purchase_order_id</w:t>
-            </w:r>
-            <w:r>
-              <w:rPr>
-                <w:rFonts w:ascii="Calibri" w:cs="Calibri" w:eastAsia="Calibri" w:hAnsi="Calibri"/>
-                <w:color w:val="52606D"/>
-                <w:sz w:val="18"/>
-                <w:szCs w:val="18"/>
-              </w:rPr>
-              <w:t xml:space="preserve"> of Purchase_Orders</w:t>
+              <w:t xml:space="preserve">receipt_id</w:t>
             </w:r>
           </w:p>
         </w:tc>
@@ -10270,23 +10302,7 @@
                 <w:sz w:val="18"/>
                 <w:szCs w:val="18"/>
               </w:rPr>
-              <w:t xml:space="preserve">quantity</w:t>
-            </w:r>
-            <w:r>
-              <w:rPr>
-                <w:rFonts w:ascii="Calibri" w:cs="Calibri" w:eastAsia="Calibri" w:hAnsi="Calibri"/>
-                <w:sz w:val="18"/>
-                <w:szCs w:val="18"/>
-              </w:rPr>
-              <w:t xml:space="preserve">, </w:t>
-            </w:r>
-            <w:r>
-              <w:rPr>
-                <w:rFonts w:ascii="Calibri" w:cs="Calibri" w:eastAsia="Calibri" w:hAnsi="Calibri"/>
-                <w:sz w:val="18"/>
-                <w:szCs w:val="18"/>
-              </w:rPr>
-              <w:t xml:space="preserve">unit_cost_cents</w:t>
+              <w:t xml:space="preserve">received_at</w:t>
             </w:r>
           </w:p>
         </w:tc>
@@ -10353,7 +10369,7 @@
                 <w:sz w:val="18"/>
                 <w:szCs w:val="18"/>
               </w:rPr>
-              <w:t xml:space="preserve">Goods_Receipts</w:t>
+              <w:t xml:space="preserve">Warehouse_Inspections</w:t>
             </w:r>
           </w:p>
         </w:tc>
@@ -10383,7 +10399,7 @@
                 <w:sz w:val="18"/>
                 <w:szCs w:val="18"/>
               </w:rPr>
-              <w:t xml:space="preserve">The record of a delivery arriving at the warehouse against a purchase order. One purchase order may arrive in several deliveries.</w:t>
+              <w:t xml:space="preserve">A safety or quality inspection of a warehouse performed by a staff member, with its result.</w:t>
             </w:r>
           </w:p>
         </w:tc>
@@ -10412,7 +10428,7 @@
                 <w:rFonts w:ascii="Calibri" w:cs="Calibri" w:eastAsia="Calibri" w:hAnsi="Calibri"/>
                 <w:u w:val="single"/>
               </w:rPr>
-              <w:t xml:space="preserve">receipt_id</w:t>
+              <w:t xml:space="preserve">inspection_id</w:t>
             </w:r>
           </w:p>
         </w:tc>
@@ -10442,167 +10458,6 @@
                 <w:sz w:val="18"/>
                 <w:szCs w:val="18"/>
               </w:rPr>
-              <w:t xml:space="preserve">received_at</w:t>
-            </w:r>
-          </w:p>
-        </w:tc>
-      </w:tr>
-      <w:tr>
-        <w:trPr>
-          <w:cantSplit/>
-        </w:trPr>
-        <w:tc>
-          <w:tcPr>
-            <w:tcW w:type="dxa" w:w="520"/>
-            <w:tcBorders>
-              <w:top w:val="single" w:color="BCC5CF" w:sz="4"/>
-              <w:left w:val="single" w:color="BCC5CF" w:sz="4"/>
-              <w:bottom w:val="single" w:color="BCC5CF" w:sz="4"/>
-              <w:right w:val="single" w:color="BCC5CF" w:sz="4"/>
-            </w:tcBorders>
-            <w:shd w:fill="F4F6F8" w:color="auto" w:val="clear"/>
-            <w:tcMar>
-              <w:top w:type="dxa" w:w="50"/>
-              <w:left w:type="dxa" w:w="90"/>
-              <w:bottom w:type="dxa" w:w="50"/>
-              <w:right w:type="dxa" w:w="90"/>
-            </w:tcMar>
-          </w:tcPr>
-          <w:p>
-            <w:pPr>
-              <w:spacing w:after="20"/>
-            </w:pPr>
-            <w:r>
-              <w:rPr>
-                <w:rFonts w:ascii="Calibri" w:cs="Calibri" w:eastAsia="Calibri" w:hAnsi="Calibri"/>
-                <w:sz w:val="18"/>
-                <w:szCs w:val="18"/>
-              </w:rPr>
-              <w:t xml:space="preserve">E49</w:t>
-            </w:r>
-          </w:p>
-        </w:tc>
-        <w:tc>
-          <w:tcPr>
-            <w:tcW w:type="dxa" w:w="1900"/>
-            <w:tcBorders>
-              <w:top w:val="single" w:color="BCC5CF" w:sz="4"/>
-              <w:left w:val="single" w:color="BCC5CF" w:sz="4"/>
-              <w:bottom w:val="single" w:color="BCC5CF" w:sz="4"/>
-              <w:right w:val="single" w:color="BCC5CF" w:sz="4"/>
-            </w:tcBorders>
-            <w:shd w:fill="F4F6F8" w:color="auto" w:val="clear"/>
-            <w:tcMar>
-              <w:top w:type="dxa" w:w="50"/>
-              <w:left w:type="dxa" w:w="90"/>
-              <w:bottom w:type="dxa" w:w="50"/>
-              <w:right w:type="dxa" w:w="90"/>
-            </w:tcMar>
-          </w:tcPr>
-          <w:p>
-            <w:pPr>
-              <w:spacing w:after="20"/>
-            </w:pPr>
-            <w:r>
-              <w:rPr>
-                <w:rFonts w:ascii="Calibri" w:cs="Calibri" w:eastAsia="Calibri" w:hAnsi="Calibri"/>
-                <w:b/>
-                <w:bCs/>
-                <w:sz w:val="18"/>
-                <w:szCs w:val="18"/>
-              </w:rPr>
-              <w:t xml:space="preserve">Warehouse_Inspections</w:t>
-            </w:r>
-          </w:p>
-        </w:tc>
-        <w:tc>
-          <w:tcPr>
-            <w:tcW w:type="dxa" w:w="3318"/>
-            <w:tcBorders>
-              <w:top w:val="single" w:color="BCC5CF" w:sz="4"/>
-              <w:left w:val="single" w:color="BCC5CF" w:sz="4"/>
-              <w:bottom w:val="single" w:color="BCC5CF" w:sz="4"/>
-              <w:right w:val="single" w:color="BCC5CF" w:sz="4"/>
-            </w:tcBorders>
-            <w:shd w:fill="F4F6F8" w:color="auto" w:val="clear"/>
-            <w:tcMar>
-              <w:top w:type="dxa" w:w="50"/>
-              <w:left w:type="dxa" w:w="90"/>
-              <w:bottom w:type="dxa" w:w="50"/>
-              <w:right w:type="dxa" w:w="90"/>
-            </w:tcMar>
-          </w:tcPr>
-          <w:p>
-            <w:pPr>
-              <w:spacing w:after="20"/>
-            </w:pPr>
-            <w:r>
-              <w:rPr>
-                <w:rFonts w:ascii="Calibri" w:cs="Calibri" w:eastAsia="Calibri" w:hAnsi="Calibri"/>
-                <w:sz w:val="18"/>
-                <w:szCs w:val="18"/>
-              </w:rPr>
-              <w:t xml:space="preserve">A safety or quality inspection of a warehouse performed by a staff member, with its result.</w:t>
-            </w:r>
-          </w:p>
-        </w:tc>
-        <w:tc>
-          <w:tcPr>
-            <w:tcW w:type="dxa" w:w="1700"/>
-            <w:tcBorders>
-              <w:top w:val="single" w:color="BCC5CF" w:sz="4"/>
-              <w:left w:val="single" w:color="BCC5CF" w:sz="4"/>
-              <w:bottom w:val="single" w:color="BCC5CF" w:sz="4"/>
-              <w:right w:val="single" w:color="BCC5CF" w:sz="4"/>
-            </w:tcBorders>
-            <w:shd w:fill="F4F6F8" w:color="auto" w:val="clear"/>
-            <w:tcMar>
-              <w:top w:type="dxa" w:w="50"/>
-              <w:left w:type="dxa" w:w="90"/>
-              <w:bottom w:type="dxa" w:w="50"/>
-              <w:right w:type="dxa" w:w="90"/>
-            </w:tcMar>
-          </w:tcPr>
-          <w:p>
-            <w:pPr>
-              <w:spacing w:after="20"/>
-            </w:pPr>
-            <w:r>
-              <w:rPr>
-                <w:rFonts w:ascii="Calibri" w:cs="Calibri" w:eastAsia="Calibri" w:hAnsi="Calibri"/>
-                <w:u w:val="single"/>
-              </w:rPr>
-              <w:t xml:space="preserve">inspection_id</w:t>
-            </w:r>
-          </w:p>
-        </w:tc>
-        <w:tc>
-          <w:tcPr>
-            <w:tcW w:type="dxa" w:w="2200"/>
-            <w:tcBorders>
-              <w:top w:val="single" w:color="BCC5CF" w:sz="4"/>
-              <w:left w:val="single" w:color="BCC5CF" w:sz="4"/>
-              <w:bottom w:val="single" w:color="BCC5CF" w:sz="4"/>
-              <w:right w:val="single" w:color="BCC5CF" w:sz="4"/>
-            </w:tcBorders>
-            <w:shd w:fill="F4F6F8" w:color="auto" w:val="clear"/>
-            <w:tcMar>
-              <w:top w:type="dxa" w:w="50"/>
-              <w:left w:type="dxa" w:w="90"/>
-              <w:bottom w:type="dxa" w:w="50"/>
-              <w:right w:type="dxa" w:w="90"/>
-            </w:tcMar>
-          </w:tcPr>
-          <w:p>
-            <w:pPr>
-              <w:spacing w:after="20"/>
-            </w:pPr>
-            <w:r>
-              <w:rPr>
-                <w:rFonts w:ascii="Calibri" w:cs="Calibri" w:eastAsia="Calibri" w:hAnsi="Calibri"/>
-                <w:sz w:val="18"/>
-                <w:szCs w:val="18"/>
-              </w:rPr>
               <w:t xml:space="preserve">result</w:t>
             </w:r>
             <w:r>
@@ -10620,194 +10475,6 @@
                 <w:szCs w:val="18"/>
               </w:rPr>
               <w:t xml:space="preserve">inspected_at</w:t>
-            </w:r>
-          </w:p>
-        </w:tc>
-      </w:tr>
-      <w:tr>
-        <w:trPr>
-          <w:cantSplit/>
-        </w:trPr>
-        <w:tc>
-          <w:tcPr>
-            <w:tcW w:type="dxa" w:w="520"/>
-            <w:tcBorders>
-              <w:top w:val="single" w:color="BCC5CF" w:sz="4"/>
-              <w:left w:val="single" w:color="BCC5CF" w:sz="4"/>
-              <w:bottom w:val="single" w:color="BCC5CF" w:sz="4"/>
-              <w:right w:val="single" w:color="BCC5CF" w:sz="4"/>
-            </w:tcBorders>
-            <w:tcMar>
-              <w:top w:type="dxa" w:w="50"/>
-              <w:left w:type="dxa" w:w="90"/>
-              <w:bottom w:type="dxa" w:w="50"/>
-              <w:right w:type="dxa" w:w="90"/>
-            </w:tcMar>
-          </w:tcPr>
-          <w:p>
-            <w:pPr>
-              <w:spacing w:after="20"/>
-            </w:pPr>
-            <w:r>
-              <w:rPr>
-                <w:rFonts w:ascii="Calibri" w:cs="Calibri" w:eastAsia="Calibri" w:hAnsi="Calibri"/>
-                <w:sz w:val="18"/>
-                <w:szCs w:val="18"/>
-              </w:rPr>
-              <w:t xml:space="preserve">E50</w:t>
-            </w:r>
-          </w:p>
-        </w:tc>
-        <w:tc>
-          <w:tcPr>
-            <w:tcW w:type="dxa" w:w="1900"/>
-            <w:tcBorders>
-              <w:top w:val="single" w:color="BCC5CF" w:sz="4"/>
-              <w:left w:val="single" w:color="BCC5CF" w:sz="4"/>
-              <w:bottom w:val="single" w:color="BCC5CF" w:sz="4"/>
-              <w:right w:val="single" w:color="BCC5CF" w:sz="4"/>
-            </w:tcBorders>
-            <w:tcMar>
-              <w:top w:type="dxa" w:w="50"/>
-              <w:left w:type="dxa" w:w="90"/>
-              <w:bottom w:type="dxa" w:w="50"/>
-              <w:right w:type="dxa" w:w="90"/>
-            </w:tcMar>
-          </w:tcPr>
-          <w:p>
-            <w:pPr>
-              <w:spacing w:after="20"/>
-            </w:pPr>
-            <w:r>
-              <w:rPr>
-                <w:rFonts w:ascii="Calibri" w:cs="Calibri" w:eastAsia="Calibri" w:hAnsi="Calibri"/>
-                <w:b/>
-                <w:bCs/>
-                <w:sz w:val="18"/>
-                <w:szCs w:val="18"/>
-              </w:rPr>
-              <w:t xml:space="preserve">Inventory_Adjustments</w:t>
-            </w:r>
-          </w:p>
-        </w:tc>
-        <w:tc>
-          <w:tcPr>
-            <w:tcW w:type="dxa" w:w="3318"/>
-            <w:tcBorders>
-              <w:top w:val="single" w:color="BCC5CF" w:sz="4"/>
-              <w:left w:val="single" w:color="BCC5CF" w:sz="4"/>
-              <w:bottom w:val="single" w:color="BCC5CF" w:sz="4"/>
-              <w:right w:val="single" w:color="BCC5CF" w:sz="4"/>
-            </w:tcBorders>
-            <w:tcMar>
-              <w:top w:type="dxa" w:w="50"/>
-              <w:left w:type="dxa" w:w="90"/>
-              <w:bottom w:type="dxa" w:w="50"/>
-              <w:right w:type="dxa" w:w="90"/>
-            </w:tcMar>
-          </w:tcPr>
-          <w:p>
-            <w:pPr>
-              <w:spacing w:after="20"/>
-            </w:pPr>
-            <w:r>
-              <w:rPr>
-                <w:rFonts w:ascii="Calibri" w:cs="Calibri" w:eastAsia="Calibri" w:hAnsi="Calibri"/>
-                <w:sz w:val="18"/>
-                <w:szCs w:val="18"/>
-              </w:rPr>
-              <w:t xml:space="preserve">A manual correction of a batch's quantity (after a count or damage), authorised by a staff member.</w:t>
-            </w:r>
-          </w:p>
-        </w:tc>
-        <w:tc>
-          <w:tcPr>
-            <w:tcW w:type="dxa" w:w="1700"/>
-            <w:tcBorders>
-              <w:top w:val="single" w:color="BCC5CF" w:sz="4"/>
-              <w:left w:val="single" w:color="BCC5CF" w:sz="4"/>
-              <w:bottom w:val="single" w:color="BCC5CF" w:sz="4"/>
-              <w:right w:val="single" w:color="BCC5CF" w:sz="4"/>
-            </w:tcBorders>
-            <w:tcMar>
-              <w:top w:type="dxa" w:w="50"/>
-              <w:left w:type="dxa" w:w="90"/>
-              <w:bottom w:type="dxa" w:w="50"/>
-              <w:right w:type="dxa" w:w="90"/>
-            </w:tcMar>
-          </w:tcPr>
-          <w:p>
-            <w:pPr>
-              <w:spacing w:after="20"/>
-            </w:pPr>
-            <w:r>
-              <w:rPr>
-                <w:rFonts w:ascii="Calibri" w:cs="Calibri" w:eastAsia="Calibri" w:hAnsi="Calibri"/>
-                <w:u w:val="single"/>
-              </w:rPr>
-              <w:t xml:space="preserve">adjustment_id</w:t>
-            </w:r>
-          </w:p>
-        </w:tc>
-        <w:tc>
-          <w:tcPr>
-            <w:tcW w:type="dxa" w:w="2200"/>
-            <w:tcBorders>
-              <w:top w:val="single" w:color="BCC5CF" w:sz="4"/>
-              <w:left w:val="single" w:color="BCC5CF" w:sz="4"/>
-              <w:bottom w:val="single" w:color="BCC5CF" w:sz="4"/>
-              <w:right w:val="single" w:color="BCC5CF" w:sz="4"/>
-            </w:tcBorders>
-            <w:tcMar>
-              <w:top w:type="dxa" w:w="50"/>
-              <w:left w:type="dxa" w:w="90"/>
-              <w:bottom w:type="dxa" w:w="50"/>
-              <w:right w:type="dxa" w:w="90"/>
-            </w:tcMar>
-          </w:tcPr>
-          <w:p>
-            <w:pPr>
-              <w:spacing w:after="20"/>
-            </w:pPr>
-            <w:r>
-              <w:rPr>
-                <w:rFonts w:ascii="Calibri" w:cs="Calibri" w:eastAsia="Calibri" w:hAnsi="Calibri"/>
-                <w:sz w:val="18"/>
-                <w:szCs w:val="18"/>
-              </w:rPr>
-              <w:t xml:space="preserve">quantity_delta</w:t>
-            </w:r>
-            <w:r>
-              <w:rPr>
-                <w:rFonts w:ascii="Calibri" w:cs="Calibri" w:eastAsia="Calibri" w:hAnsi="Calibri"/>
-                <w:sz w:val="18"/>
-                <w:szCs w:val="18"/>
-              </w:rPr>
-              <w:t xml:space="preserve">, </w:t>
-            </w:r>
-            <w:r>
-              <w:rPr>
-                <w:rFonts w:ascii="Calibri" w:cs="Calibri" w:eastAsia="Calibri" w:hAnsi="Calibri"/>
-                <w:sz w:val="18"/>
-                <w:szCs w:val="18"/>
-              </w:rPr>
-              <w:t xml:space="preserve">reason</w:t>
-            </w:r>
-            <w:r>
-              <w:rPr>
-                <w:rFonts w:ascii="Calibri" w:cs="Calibri" w:eastAsia="Calibri" w:hAnsi="Calibri"/>
-                <w:sz w:val="18"/>
-                <w:szCs w:val="18"/>
-              </w:rPr>
-              <w:t xml:space="preserve">, </w:t>
-            </w:r>
-            <w:r>
-              <w:rPr>
-                <w:rFonts w:ascii="Calibri" w:cs="Calibri" w:eastAsia="Calibri" w:hAnsi="Calibri"/>
-                <w:sz w:val="18"/>
-                <w:szCs w:val="18"/>
-              </w:rPr>
-              <w:t xml:space="preserve">adjusted_at</w:t>
             </w:r>
           </w:p>
         </w:tc>
@@ -11049,7 +10716,7 @@
                 <w:sz w:val="18"/>
                 <w:szCs w:val="18"/>
               </w:rPr>
-              <w:t xml:space="preserve">E51</w:t>
+              <w:t xml:space="preserve">E49</w:t>
             </w:r>
           </w:p>
         </w:tc>
@@ -11238,7 +10905,7 @@
                 <w:sz w:val="18"/>
                 <w:szCs w:val="18"/>
               </w:rPr>
-              <w:t xml:space="preserve">E52</w:t>
+              <w:t xml:space="preserve">E50</w:t>
             </w:r>
           </w:p>
         </w:tc>
@@ -11455,7 +11122,7 @@
                 <w:sz w:val="18"/>
                 <w:szCs w:val="18"/>
               </w:rPr>
-              <w:t xml:space="preserve">E53</w:t>
+              <w:t xml:space="preserve">E51</w:t>
             </w:r>
           </w:p>
         </w:tc>
@@ -11644,7 +11311,7 @@
                 <w:sz w:val="18"/>
                 <w:szCs w:val="18"/>
               </w:rPr>
-              <w:t xml:space="preserve">E54</w:t>
+              <w:t xml:space="preserve">E52</w:t>
             </w:r>
           </w:p>
         </w:tc>
@@ -11845,7 +11512,7 @@
                 <w:sz w:val="18"/>
                 <w:szCs w:val="18"/>
               </w:rPr>
-              <w:t xml:space="preserve">E55</w:t>
+              <w:t xml:space="preserve">E53</w:t>
             </w:r>
           </w:p>
         </w:tc>
@@ -12018,7 +11685,7 @@
                 <w:sz w:val="18"/>
                 <w:szCs w:val="18"/>
               </w:rPr>
-              <w:t xml:space="preserve">E56</w:t>
+              <w:t xml:space="preserve">E54</w:t>
             </w:r>
           </w:p>
         </w:tc>
@@ -12082,7 +11749,7 @@
                 <w:sz w:val="18"/>
                 <w:szCs w:val="18"/>
               </w:rPr>
-              <w:t xml:space="preserve">One money movement of a payment, such as the capture or a refund.</w:t>
+              <w:t xml:space="preserve">One money movement of a payment: the capture, or a refund paid back for an approved return request.</w:t>
             </w:r>
           </w:p>
           <w:p>
@@ -12242,7 +11909,7 @@
                 <w:sz w:val="18"/>
                 <w:szCs w:val="18"/>
               </w:rPr>
-              <w:t xml:space="preserve">E57</w:t>
+              <w:t xml:space="preserve">E55</w:t>
             </w:r>
           </w:p>
         </w:tc>
@@ -12415,7 +12082,7 @@
                 <w:sz w:val="18"/>
                 <w:szCs w:val="18"/>
               </w:rPr>
-              <w:t xml:space="preserve">E58</w:t>
+              <w:t xml:space="preserve">E56</w:t>
             </w:r>
           </w:p>
         </w:tc>
@@ -12823,7 +12490,7 @@
                 <w:sz w:val="18"/>
                 <w:szCs w:val="18"/>
               </w:rPr>
-              <w:t xml:space="preserve">E59</w:t>
+              <w:t xml:space="preserve">E57</w:t>
             </w:r>
           </w:p>
         </w:tc>
@@ -12980,7 +12647,7 @@
                 <w:sz w:val="18"/>
                 <w:szCs w:val="18"/>
               </w:rPr>
-              <w:t xml:space="preserve">E60</w:t>
+              <w:t xml:space="preserve">E58</w:t>
             </w:r>
           </w:p>
         </w:tc>
@@ -13140,7 +12807,7 @@
                 <w:sz w:val="18"/>
                 <w:szCs w:val="18"/>
               </w:rPr>
-              <w:t xml:space="preserve">E61</w:t>
+              <w:t xml:space="preserve">E59</w:t>
             </w:r>
           </w:p>
         </w:tc>
@@ -13306,7 +12973,7 @@
                 <w:sz w:val="18"/>
                 <w:szCs w:val="18"/>
               </w:rPr>
-              <w:t xml:space="preserve">E62</w:t>
+              <w:t xml:space="preserve">E60</w:t>
             </w:r>
           </w:p>
         </w:tc>
@@ -13523,7 +13190,7 @@
                 <w:sz w:val="18"/>
                 <w:szCs w:val="18"/>
               </w:rPr>
-              <w:t xml:space="preserve">E63</w:t>
+              <w:t xml:space="preserve">E61</w:t>
             </w:r>
           </w:p>
         </w:tc>
@@ -13746,7 +13413,7 @@
                 <w:sz w:val="18"/>
                 <w:szCs w:val="18"/>
               </w:rPr>
-              <w:t xml:space="preserve">E64</w:t>
+              <w:t xml:space="preserve">E62</w:t>
             </w:r>
           </w:p>
         </w:tc>
@@ -13954,7 +13621,7 @@
                 <w:sz w:val="18"/>
                 <w:szCs w:val="18"/>
               </w:rPr>
-              <w:t xml:space="preserve">E65</w:t>
+              <w:t xml:space="preserve">E63</w:t>
             </w:r>
           </w:p>
         </w:tc>
@@ -14016,7 +13683,7 @@
                 <w:sz w:val="18"/>
                 <w:szCs w:val="18"/>
               </w:rPr>
-              <w:t xml:space="preserve">One try by a courier to hand over a shipment, with its outcome.</w:t>
+              <w:t xml:space="preserve">One try by a courier to hand over a shipment, with its outcome. A successful attempt also records the proof of delivery: who received the parcel and, optionally, a photo or signature link; these attributes stay empty on failed attempts.</w:t>
             </w:r>
           </w:p>
         </w:tc>
@@ -14107,7 +13774,7 @@
                 <w:sz w:val="18"/>
                 <w:szCs w:val="18"/>
               </w:rPr>
-              <w:t xml:space="preserve">notes</w:t>
+              <w:t xml:space="preserve">recipient_name</w:t>
             </w:r>
             <w:r>
               <w:rPr>
@@ -14118,182 +13785,30 @@
               </w:rPr>
               <w:t xml:space="preserve"> (optional)</w:t>
             </w:r>
-          </w:p>
-        </w:tc>
-      </w:tr>
-      <w:tr>
-        <w:trPr>
-          <w:cantSplit/>
-        </w:trPr>
-        <w:tc>
-          <w:tcPr>
-            <w:tcW w:type="dxa" w:w="520"/>
-            <w:tcBorders>
-              <w:top w:val="single" w:color="BCC5CF" w:sz="4"/>
-              <w:left w:val="single" w:color="BCC5CF" w:sz="4"/>
-              <w:bottom w:val="single" w:color="BCC5CF" w:sz="4"/>
-              <w:right w:val="single" w:color="BCC5CF" w:sz="4"/>
-            </w:tcBorders>
-            <w:shd w:fill="F4F6F8" w:color="auto" w:val="clear"/>
-            <w:tcMar>
-              <w:top w:type="dxa" w:w="50"/>
-              <w:left w:type="dxa" w:w="90"/>
-              <w:bottom w:type="dxa" w:w="50"/>
-              <w:right w:type="dxa" w:w="90"/>
-            </w:tcMar>
-          </w:tcPr>
-          <w:p>
-            <w:pPr>
-              <w:spacing w:after="20"/>
-            </w:pPr>
-            <w:r>
-              <w:rPr>
-                <w:rFonts w:ascii="Calibri" w:cs="Calibri" w:eastAsia="Calibri" w:hAnsi="Calibri"/>
-                <w:sz w:val="18"/>
-                <w:szCs w:val="18"/>
-              </w:rPr>
-              <w:t xml:space="preserve">E66</w:t>
-            </w:r>
-          </w:p>
-        </w:tc>
-        <w:tc>
-          <w:tcPr>
-            <w:tcW w:type="dxa" w:w="1900"/>
-            <w:tcBorders>
-              <w:top w:val="single" w:color="BCC5CF" w:sz="4"/>
-              <w:left w:val="single" w:color="BCC5CF" w:sz="4"/>
-              <w:bottom w:val="single" w:color="BCC5CF" w:sz="4"/>
-              <w:right w:val="single" w:color="BCC5CF" w:sz="4"/>
-            </w:tcBorders>
-            <w:shd w:fill="F4F6F8" w:color="auto" w:val="clear"/>
-            <w:tcMar>
-              <w:top w:type="dxa" w:w="50"/>
-              <w:left w:type="dxa" w:w="90"/>
-              <w:bottom w:type="dxa" w:w="50"/>
-              <w:right w:type="dxa" w:w="90"/>
-            </w:tcMar>
-          </w:tcPr>
-          <w:p>
-            <w:pPr>
-              <w:spacing w:after="20"/>
-            </w:pPr>
-            <w:r>
-              <w:rPr>
-                <w:rFonts w:ascii="Calibri" w:cs="Calibri" w:eastAsia="Calibri" w:hAnsi="Calibri"/>
-                <w:b/>
-                <w:bCs/>
-                <w:sz w:val="18"/>
-                <w:szCs w:val="18"/>
-              </w:rPr>
-              <w:t xml:space="preserve">Proof_Of_Delivery</w:t>
-            </w:r>
-          </w:p>
-        </w:tc>
-        <w:tc>
-          <w:tcPr>
-            <w:tcW w:type="dxa" w:w="3318"/>
-            <w:tcBorders>
-              <w:top w:val="single" w:color="BCC5CF" w:sz="4"/>
-              <w:left w:val="single" w:color="BCC5CF" w:sz="4"/>
-              <w:bottom w:val="single" w:color="BCC5CF" w:sz="4"/>
-              <w:right w:val="single" w:color="BCC5CF" w:sz="4"/>
-            </w:tcBorders>
-            <w:shd w:fill="F4F6F8" w:color="auto" w:val="clear"/>
-            <w:tcMar>
-              <w:top w:type="dxa" w:w="50"/>
-              <w:left w:type="dxa" w:w="90"/>
-              <w:bottom w:type="dxa" w:w="50"/>
-              <w:right w:type="dxa" w:w="90"/>
-            </w:tcMar>
-          </w:tcPr>
-          <w:p>
-            <w:pPr>
-              <w:spacing w:after="20"/>
-            </w:pPr>
-            <w:r>
-              <w:rPr>
-                <w:rFonts w:ascii="Calibri" w:cs="Calibri" w:eastAsia="Calibri" w:hAnsi="Calibri"/>
-                <w:sz w:val="18"/>
-                <w:szCs w:val="18"/>
-              </w:rPr>
-              <w:t xml:space="preserve">The evidence recorded for a successful delivery attempt: who received the parcel and a photo or signature link.</w:t>
-            </w:r>
-          </w:p>
-          <w:p>
-            <w:pPr>
-              <w:spacing w:after="20"/>
-            </w:pPr>
-            <w:r>
-              <w:rPr>
-                <w:rFonts w:ascii="Calibri" w:cs="Calibri" w:eastAsia="Calibri" w:hAnsi="Calibri"/>
-                <w:i/>
-                <w:iCs/>
+            <w:r>
+              <w:rPr>
+                <w:rFonts w:ascii="Calibri" w:cs="Calibri" w:eastAsia="Calibri" w:hAnsi="Calibri"/>
+                <w:sz w:val="18"/>
+                <w:szCs w:val="18"/>
+              </w:rPr>
+              <w:t xml:space="preserve">, </w:t>
+            </w:r>
+            <w:r>
+              <w:rPr>
+                <w:rFonts w:ascii="Calibri" w:cs="Calibri" w:eastAsia="Calibri" w:hAnsi="Calibri"/>
+                <w:sz w:val="18"/>
+                <w:szCs w:val="18"/>
+              </w:rPr>
+              <w:t xml:space="preserve">evidence_url</w:t>
+            </w:r>
+            <w:r>
+              <w:rPr>
+                <w:rFonts w:ascii="Calibri" w:cs="Calibri" w:eastAsia="Calibri" w:hAnsi="Calibri"/>
                 <w:color w:val="52606D"/>
                 <w:sz w:val="16"/>
                 <w:szCs w:val="16"/>
               </w:rPr>
-              <w:t xml:space="preserve">The evidence is recorded only for successful attempts and has its own attributes; keeping it separate avoids empty attribute values on failed attempts.</w:t>
-            </w:r>
-          </w:p>
-        </w:tc>
-        <w:tc>
-          <w:tcPr>
-            <w:tcW w:type="dxa" w:w="1700"/>
-            <w:tcBorders>
-              <w:top w:val="single" w:color="BCC5CF" w:sz="4"/>
-              <w:left w:val="single" w:color="BCC5CF" w:sz="4"/>
-              <w:bottom w:val="single" w:color="BCC5CF" w:sz="4"/>
-              <w:right w:val="single" w:color="BCC5CF" w:sz="4"/>
-            </w:tcBorders>
-            <w:shd w:fill="F4F6F8" w:color="auto" w:val="clear"/>
-            <w:tcMar>
-              <w:top w:type="dxa" w:w="50"/>
-              <w:left w:type="dxa" w:w="90"/>
-              <w:bottom w:type="dxa" w:w="50"/>
-              <w:right w:type="dxa" w:w="90"/>
-            </w:tcMar>
-          </w:tcPr>
-          <w:p>
-            <w:pPr>
-              <w:spacing w:after="20"/>
-            </w:pPr>
-            <w:r>
-              <w:rPr>
-                <w:rFonts w:ascii="Calibri" w:cs="Calibri" w:eastAsia="Calibri" w:hAnsi="Calibri"/>
-                <w:u w:val="single"/>
-              </w:rPr>
-              <w:t xml:space="preserve">proof_id</w:t>
-            </w:r>
-          </w:p>
-        </w:tc>
-        <w:tc>
-          <w:tcPr>
-            <w:tcW w:type="dxa" w:w="2200"/>
-            <w:tcBorders>
-              <w:top w:val="single" w:color="BCC5CF" w:sz="4"/>
-              <w:left w:val="single" w:color="BCC5CF" w:sz="4"/>
-              <w:bottom w:val="single" w:color="BCC5CF" w:sz="4"/>
-              <w:right w:val="single" w:color="BCC5CF" w:sz="4"/>
-            </w:tcBorders>
-            <w:shd w:fill="F4F6F8" w:color="auto" w:val="clear"/>
-            <w:tcMar>
-              <w:top w:type="dxa" w:w="50"/>
-              <w:left w:type="dxa" w:w="90"/>
-              <w:bottom w:type="dxa" w:w="50"/>
-              <w:right w:type="dxa" w:w="90"/>
-            </w:tcMar>
-          </w:tcPr>
-          <w:p>
-            <w:pPr>
-              <w:spacing w:after="20"/>
-            </w:pPr>
-            <w:r>
-              <w:rPr>
-                <w:rFonts w:ascii="Calibri" w:cs="Calibri" w:eastAsia="Calibri" w:hAnsi="Calibri"/>
-                <w:sz w:val="18"/>
-                <w:szCs w:val="18"/>
-              </w:rPr>
-              <w:t xml:space="preserve">recipient_name</w:t>
+              <w:t xml:space="preserve"> (optional)</w:t>
             </w:r>
             <w:r>
               <w:rPr>
@@ -14309,7 +13824,7 @@
                 <w:sz w:val="18"/>
                 <w:szCs w:val="18"/>
               </w:rPr>
-              <w:t xml:space="preserve">evidence_url</w:t>
+              <w:t xml:space="preserve">notes</w:t>
             </w:r>
             <w:r>
               <w:rPr>
@@ -14319,22 +13834,6 @@
                 <w:szCs w:val="16"/>
               </w:rPr>
               <w:t xml:space="preserve"> (optional)</w:t>
-            </w:r>
-            <w:r>
-              <w:rPr>
-                <w:rFonts w:ascii="Calibri" w:cs="Calibri" w:eastAsia="Calibri" w:hAnsi="Calibri"/>
-                <w:sz w:val="18"/>
-                <w:szCs w:val="18"/>
-              </w:rPr>
-              <w:t xml:space="preserve">, </w:t>
-            </w:r>
-            <w:r>
-              <w:rPr>
-                <w:rFonts w:ascii="Calibri" w:cs="Calibri" w:eastAsia="Calibri" w:hAnsi="Calibri"/>
-                <w:sz w:val="18"/>
-                <w:szCs w:val="18"/>
-              </w:rPr>
-              <w:t xml:space="preserve">recorded_at</w:t>
             </w:r>
           </w:p>
         </w:tc>
@@ -14576,7 +14075,7 @@
                 <w:sz w:val="18"/>
                 <w:szCs w:val="18"/>
               </w:rPr>
-              <w:t xml:space="preserve">E67</w:t>
+              <w:t xml:space="preserve">E64</w:t>
             </w:r>
           </w:p>
         </w:tc>
@@ -14765,7 +14264,7 @@
                 <w:sz w:val="18"/>
                 <w:szCs w:val="18"/>
               </w:rPr>
-              <w:t xml:space="preserve">E68</w:t>
+              <w:t xml:space="preserve">E65</w:t>
             </w:r>
           </w:p>
         </w:tc>
@@ -14798,7 +14297,7 @@
                 <w:sz w:val="18"/>
                 <w:szCs w:val="18"/>
               </w:rPr>
-              <w:t xml:space="preserve">Refunds</w:t>
+              <w:t xml:space="preserve">Return_Inspections</w:t>
             </w:r>
           </w:p>
         </w:tc>
@@ -14829,7 +14328,7 @@
                 <w:sz w:val="18"/>
                 <w:szCs w:val="18"/>
               </w:rPr>
-              <w:t xml:space="preserve">Money paid back for an approved return, charged against the order's payment.</w:t>
+              <w:t xml:space="preserve">The check of returned goods by a staff member before they may be restocked.</w:t>
             </w:r>
           </w:p>
         </w:tc>
@@ -14859,7 +14358,7 @@
                 <w:rFonts w:ascii="Calibri" w:cs="Calibri" w:eastAsia="Calibri" w:hAnsi="Calibri"/>
                 <w:u w:val="single"/>
               </w:rPr>
-              <w:t xml:space="preserve">refund_id</w:t>
+              <w:t xml:space="preserve">return_inspection_id</w:t>
             </w:r>
           </w:p>
         </w:tc>
@@ -14890,7 +14389,7 @@
                 <w:sz w:val="18"/>
                 <w:szCs w:val="18"/>
               </w:rPr>
-              <w:t xml:space="preserve">amount_cents</w:t>
+              <w:t xml:space="preserve">condition</w:t>
             </w:r>
             <w:r>
               <w:rPr>
@@ -14906,7 +14405,7 @@
                 <w:sz w:val="18"/>
                 <w:szCs w:val="18"/>
               </w:rPr>
-              <w:t xml:space="preserve">status</w:t>
+              <w:t xml:space="preserve">inspected_at</w:t>
             </w:r>
           </w:p>
         </w:tc>
@@ -14941,7 +14440,7 @@
                 <w:sz w:val="18"/>
                 <w:szCs w:val="18"/>
               </w:rPr>
-              <w:t xml:space="preserve">E69</w:t>
+              <w:t xml:space="preserve">E66</w:t>
             </w:r>
           </w:p>
         </w:tc>
@@ -14973,7 +14472,7 @@
                 <w:sz w:val="18"/>
                 <w:szCs w:val="18"/>
               </w:rPr>
-              <w:t xml:space="preserve">Return_Inspections</w:t>
+              <w:t xml:space="preserve">Support_Tickets</w:t>
             </w:r>
           </w:p>
         </w:tc>
@@ -15003,7 +14502,7 @@
                 <w:sz w:val="18"/>
                 <w:szCs w:val="18"/>
               </w:rPr>
-              <w:t xml:space="preserve">The check of returned goods by a staff member before they may be restocked.</w:t>
+              <w:t xml:space="preserve">A help request opened by a customer, optionally about a specific order.</w:t>
             </w:r>
           </w:p>
         </w:tc>
@@ -15032,7 +14531,7 @@
                 <w:rFonts w:ascii="Calibri" w:cs="Calibri" w:eastAsia="Calibri" w:hAnsi="Calibri"/>
                 <w:u w:val="single"/>
               </w:rPr>
-              <w:t xml:space="preserve">return_inspection_id</w:t>
+              <w:t xml:space="preserve">ticket_id</w:t>
             </w:r>
           </w:p>
         </w:tc>
@@ -15062,7 +14561,7 @@
                 <w:sz w:val="18"/>
                 <w:szCs w:val="18"/>
               </w:rPr>
-              <w:t xml:space="preserve">condition</w:t>
+              <w:t xml:space="preserve">subject</w:t>
             </w:r>
             <w:r>
               <w:rPr>
@@ -15078,7 +14577,23 @@
                 <w:sz w:val="18"/>
                 <w:szCs w:val="18"/>
               </w:rPr>
-              <w:t xml:space="preserve">inspected_at</w:t>
+              <w:t xml:space="preserve">status</w:t>
+            </w:r>
+            <w:r>
+              <w:rPr>
+                <w:rFonts w:ascii="Calibri" w:cs="Calibri" w:eastAsia="Calibri" w:hAnsi="Calibri"/>
+                <w:sz w:val="18"/>
+                <w:szCs w:val="18"/>
+              </w:rPr>
+              <w:t xml:space="preserve">, </w:t>
+            </w:r>
+            <w:r>
+              <w:rPr>
+                <w:rFonts w:ascii="Calibri" w:cs="Calibri" w:eastAsia="Calibri" w:hAnsi="Calibri"/>
+                <w:sz w:val="18"/>
+                <w:szCs w:val="18"/>
+              </w:rPr>
+              <w:t xml:space="preserve">created_at</w:t>
             </w:r>
           </w:p>
         </w:tc>
@@ -15114,7 +14629,7 @@
                 <w:sz w:val="18"/>
                 <w:szCs w:val="18"/>
               </w:rPr>
-              <w:t xml:space="preserve">E70</w:t>
+              <w:t xml:space="preserve">E67</w:t>
             </w:r>
           </w:p>
         </w:tc>
@@ -15147,7 +14662,7 @@
                 <w:sz w:val="18"/>
                 <w:szCs w:val="18"/>
               </w:rPr>
-              <w:t xml:space="preserve">Support_Tickets</w:t>
+              <w:t xml:space="preserve">Ticket_Messages</w:t>
             </w:r>
           </w:p>
         </w:tc>
@@ -15161,196 +14676,6 @@
               <w:right w:val="single" w:color="BCC5CF" w:sz="4"/>
             </w:tcBorders>
             <w:shd w:fill="F4F6F8" w:color="auto" w:val="clear"/>
-            <w:tcMar>
-              <w:top w:type="dxa" w:w="50"/>
-              <w:left w:type="dxa" w:w="90"/>
-              <w:bottom w:type="dxa" w:w="50"/>
-              <w:right w:type="dxa" w:w="90"/>
-            </w:tcMar>
-          </w:tcPr>
-          <w:p>
-            <w:pPr>
-              <w:spacing w:after="20"/>
-            </w:pPr>
-            <w:r>
-              <w:rPr>
-                <w:rFonts w:ascii="Calibri" w:cs="Calibri" w:eastAsia="Calibri" w:hAnsi="Calibri"/>
-                <w:sz w:val="18"/>
-                <w:szCs w:val="18"/>
-              </w:rPr>
-              <w:t xml:space="preserve">A help request opened by a customer, optionally about a specific order.</w:t>
-            </w:r>
-          </w:p>
-        </w:tc>
-        <w:tc>
-          <w:tcPr>
-            <w:tcW w:type="dxa" w:w="1700"/>
-            <w:tcBorders>
-              <w:top w:val="single" w:color="BCC5CF" w:sz="4"/>
-              <w:left w:val="single" w:color="BCC5CF" w:sz="4"/>
-              <w:bottom w:val="single" w:color="BCC5CF" w:sz="4"/>
-              <w:right w:val="single" w:color="BCC5CF" w:sz="4"/>
-            </w:tcBorders>
-            <w:shd w:fill="F4F6F8" w:color="auto" w:val="clear"/>
-            <w:tcMar>
-              <w:top w:type="dxa" w:w="50"/>
-              <w:left w:type="dxa" w:w="90"/>
-              <w:bottom w:type="dxa" w:w="50"/>
-              <w:right w:type="dxa" w:w="90"/>
-            </w:tcMar>
-          </w:tcPr>
-          <w:p>
-            <w:pPr>
-              <w:spacing w:after="20"/>
-            </w:pPr>
-            <w:r>
-              <w:rPr>
-                <w:rFonts w:ascii="Calibri" w:cs="Calibri" w:eastAsia="Calibri" w:hAnsi="Calibri"/>
-                <w:u w:val="single"/>
-              </w:rPr>
-              <w:t xml:space="preserve">ticket_id</w:t>
-            </w:r>
-          </w:p>
-        </w:tc>
-        <w:tc>
-          <w:tcPr>
-            <w:tcW w:type="dxa" w:w="2200"/>
-            <w:tcBorders>
-              <w:top w:val="single" w:color="BCC5CF" w:sz="4"/>
-              <w:left w:val="single" w:color="BCC5CF" w:sz="4"/>
-              <w:bottom w:val="single" w:color="BCC5CF" w:sz="4"/>
-              <w:right w:val="single" w:color="BCC5CF" w:sz="4"/>
-            </w:tcBorders>
-            <w:shd w:fill="F4F6F8" w:color="auto" w:val="clear"/>
-            <w:tcMar>
-              <w:top w:type="dxa" w:w="50"/>
-              <w:left w:type="dxa" w:w="90"/>
-              <w:bottom w:type="dxa" w:w="50"/>
-              <w:right w:type="dxa" w:w="90"/>
-            </w:tcMar>
-          </w:tcPr>
-          <w:p>
-            <w:pPr>
-              <w:spacing w:after="20"/>
-            </w:pPr>
-            <w:r>
-              <w:rPr>
-                <w:rFonts w:ascii="Calibri" w:cs="Calibri" w:eastAsia="Calibri" w:hAnsi="Calibri"/>
-                <w:sz w:val="18"/>
-                <w:szCs w:val="18"/>
-              </w:rPr>
-              <w:t xml:space="preserve">subject</w:t>
-            </w:r>
-            <w:r>
-              <w:rPr>
-                <w:rFonts w:ascii="Calibri" w:cs="Calibri" w:eastAsia="Calibri" w:hAnsi="Calibri"/>
-                <w:sz w:val="18"/>
-                <w:szCs w:val="18"/>
-              </w:rPr>
-              <w:t xml:space="preserve">, </w:t>
-            </w:r>
-            <w:r>
-              <w:rPr>
-                <w:rFonts w:ascii="Calibri" w:cs="Calibri" w:eastAsia="Calibri" w:hAnsi="Calibri"/>
-                <w:sz w:val="18"/>
-                <w:szCs w:val="18"/>
-              </w:rPr>
-              <w:t xml:space="preserve">status</w:t>
-            </w:r>
-            <w:r>
-              <w:rPr>
-                <w:rFonts w:ascii="Calibri" w:cs="Calibri" w:eastAsia="Calibri" w:hAnsi="Calibri"/>
-                <w:sz w:val="18"/>
-                <w:szCs w:val="18"/>
-              </w:rPr>
-              <w:t xml:space="preserve">, </w:t>
-            </w:r>
-            <w:r>
-              <w:rPr>
-                <w:rFonts w:ascii="Calibri" w:cs="Calibri" w:eastAsia="Calibri" w:hAnsi="Calibri"/>
-                <w:sz w:val="18"/>
-                <w:szCs w:val="18"/>
-              </w:rPr>
-              <w:t xml:space="preserve">created_at</w:t>
-            </w:r>
-          </w:p>
-        </w:tc>
-      </w:tr>
-      <w:tr>
-        <w:trPr>
-          <w:cantSplit/>
-        </w:trPr>
-        <w:tc>
-          <w:tcPr>
-            <w:tcW w:type="dxa" w:w="520"/>
-            <w:tcBorders>
-              <w:top w:val="single" w:color="BCC5CF" w:sz="4"/>
-              <w:left w:val="single" w:color="BCC5CF" w:sz="4"/>
-              <w:bottom w:val="single" w:color="BCC5CF" w:sz="4"/>
-              <w:right w:val="single" w:color="BCC5CF" w:sz="4"/>
-            </w:tcBorders>
-            <w:tcMar>
-              <w:top w:type="dxa" w:w="50"/>
-              <w:left w:type="dxa" w:w="90"/>
-              <w:bottom w:type="dxa" w:w="50"/>
-              <w:right w:type="dxa" w:w="90"/>
-            </w:tcMar>
-          </w:tcPr>
-          <w:p>
-            <w:pPr>
-              <w:spacing w:after="20"/>
-            </w:pPr>
-            <w:r>
-              <w:rPr>
-                <w:rFonts w:ascii="Calibri" w:cs="Calibri" w:eastAsia="Calibri" w:hAnsi="Calibri"/>
-                <w:sz w:val="18"/>
-                <w:szCs w:val="18"/>
-              </w:rPr>
-              <w:t xml:space="preserve">E71</w:t>
-            </w:r>
-          </w:p>
-        </w:tc>
-        <w:tc>
-          <w:tcPr>
-            <w:tcW w:type="dxa" w:w="1900"/>
-            <w:tcBorders>
-              <w:top w:val="single" w:color="BCC5CF" w:sz="4"/>
-              <w:left w:val="single" w:color="BCC5CF" w:sz="4"/>
-              <w:bottom w:val="single" w:color="BCC5CF" w:sz="4"/>
-              <w:right w:val="single" w:color="BCC5CF" w:sz="4"/>
-            </w:tcBorders>
-            <w:tcMar>
-              <w:top w:type="dxa" w:w="50"/>
-              <w:left w:type="dxa" w:w="90"/>
-              <w:bottom w:type="dxa" w:w="50"/>
-              <w:right w:type="dxa" w:w="90"/>
-            </w:tcMar>
-          </w:tcPr>
-          <w:p>
-            <w:pPr>
-              <w:spacing w:after="20"/>
-            </w:pPr>
-            <w:r>
-              <w:rPr>
-                <w:rFonts w:ascii="Calibri" w:cs="Calibri" w:eastAsia="Calibri" w:hAnsi="Calibri"/>
-                <w:b/>
-                <w:bCs/>
-                <w:sz w:val="18"/>
-                <w:szCs w:val="18"/>
-              </w:rPr>
-              <w:t xml:space="preserve">Ticket_Messages</w:t>
-            </w:r>
-          </w:p>
-        </w:tc>
-        <w:tc>
-          <w:tcPr>
-            <w:tcW w:type="dxa" w:w="3318"/>
-            <w:tcBorders>
-              <w:top w:val="single" w:color="BCC5CF" w:sz="4"/>
-              <w:left w:val="single" w:color="BCC5CF" w:sz="4"/>
-              <w:bottom w:val="single" w:color="BCC5CF" w:sz="4"/>
-              <w:right w:val="single" w:color="BCC5CF" w:sz="4"/>
-            </w:tcBorders>
             <w:tcMar>
               <w:top w:type="dxa" w:w="50"/>
               <w:left w:type="dxa" w:w="90"/>
@@ -15397,6 +14722,7 @@
               <w:bottom w:val="single" w:color="BCC5CF" w:sz="4"/>
               <w:right w:val="single" w:color="BCC5CF" w:sz="4"/>
             </w:tcBorders>
+            <w:shd w:fill="F4F6F8" w:color="auto" w:val="clear"/>
             <w:tcMar>
               <w:top w:type="dxa" w:w="50"/>
               <w:left w:type="dxa" w:w="90"/>
@@ -15426,6 +14752,7 @@
               <w:bottom w:val="single" w:color="BCC5CF" w:sz="4"/>
               <w:right w:val="single" w:color="BCC5CF" w:sz="4"/>
             </w:tcBorders>
+            <w:shd w:fill="F4F6F8" w:color="auto" w:val="clear"/>
             <w:tcMar>
               <w:top w:type="dxa" w:w="50"/>
               <w:left w:type="dxa" w:w="90"/>
@@ -25365,7 +24692,7 @@
                 <w:sz w:val="18"/>
                 <w:szCs w:val="18"/>
               </w:rPr>
-              <w:t xml:space="preserve">Divided_Into</w:t>
+              <w:t xml:space="preserve">Located_In</w:t>
             </w:r>
           </w:p>
           <w:p>
@@ -25412,7 +24739,7 @@
                 <w:sz w:val="18"/>
                 <w:szCs w:val="18"/>
               </w:rPr>
-              <w:t xml:space="preserve">Storage_Zones</w:t>
+              <w:t xml:space="preserve">Storage_Bins</w:t>
             </w:r>
             <w:r>
               <w:rPr>
@@ -25474,7 +24801,7 @@
                 <w:sz w:val="18"/>
                 <w:szCs w:val="18"/>
               </w:rPr>
-              <w:t xml:space="preserve">Each storage zone belongs to exactly one warehouse; a warehouse is divided into many zones.</w:t>
+              <w:t xml:space="preserve">Each bin is in exactly one warehouse; a warehouse has many bins.</w:t>
             </w:r>
           </w:p>
         </w:tc>
@@ -25541,7 +24868,7 @@
                 <w:sz w:val="18"/>
                 <w:szCs w:val="18"/>
               </w:rPr>
-              <w:t xml:space="preserve">Holds_Bin</w:t>
+              <w:t xml:space="preserve">Stored_In</w:t>
             </w:r>
           </w:p>
           <w:p>
@@ -25587,6 +24914,28 @@
                 <w:sz w:val="18"/>
                 <w:szCs w:val="18"/>
               </w:rPr>
+              <w:t xml:space="preserve">Stock_Batches</w:t>
+            </w:r>
+            <w:r>
+              <w:rPr>
+                <w:rFonts w:ascii="Calibri" w:cs="Calibri" w:eastAsia="Calibri" w:hAnsi="Calibri"/>
+                <w:color w:val="52606D"/>
+                <w:sz w:val="18"/>
+                <w:szCs w:val="18"/>
+              </w:rPr>
+              <w:t xml:space="preserve">: exactly one</w:t>
+            </w:r>
+          </w:p>
+          <w:p>
+            <w:pPr>
+              <w:spacing w:after="20"/>
+            </w:pPr>
+            <w:r>
+              <w:rPr>
+                <w:rFonts w:ascii="Calibri" w:cs="Calibri" w:eastAsia="Calibri" w:hAnsi="Calibri"/>
+                <w:sz w:val="18"/>
+                <w:szCs w:val="18"/>
+              </w:rPr>
               <w:t xml:space="preserve">Storage_Bins</w:t>
             </w:r>
             <w:r>
@@ -25596,28 +24945,6 @@
                 <w:sz w:val="18"/>
                 <w:szCs w:val="18"/>
               </w:rPr>
-              <w:t xml:space="preserve">: exactly one</w:t>
-            </w:r>
-          </w:p>
-          <w:p>
-            <w:pPr>
-              <w:spacing w:after="20"/>
-            </w:pPr>
-            <w:r>
-              <w:rPr>
-                <w:rFonts w:ascii="Calibri" w:cs="Calibri" w:eastAsia="Calibri" w:hAnsi="Calibri"/>
-                <w:sz w:val="18"/>
-                <w:szCs w:val="18"/>
-              </w:rPr>
-              <w:t xml:space="preserve">Storage_Zones</w:t>
-            </w:r>
-            <w:r>
-              <w:rPr>
-                <w:rFonts w:ascii="Calibri" w:cs="Calibri" w:eastAsia="Calibri" w:hAnsi="Calibri"/>
-                <w:color w:val="52606D"/>
-                <w:sz w:val="18"/>
-                <w:szCs w:val="18"/>
-              </w:rPr>
               <w:t xml:space="preserve">: any number</w:t>
             </w:r>
           </w:p>
@@ -25648,7 +24975,7 @@
                 <w:sz w:val="18"/>
                 <w:szCs w:val="18"/>
               </w:rPr>
-              <w:t xml:space="preserve">Each bin is inside exactly one storage zone.</w:t>
+              <w:t xml:space="preserve">Each batch is stored in exactly one bin, and the bin must be in the batch's own warehouse.</w:t>
             </w:r>
           </w:p>
         </w:tc>
@@ -25893,7 +25220,7 @@
                 <w:sz w:val="18"/>
                 <w:szCs w:val="18"/>
               </w:rPr>
-              <w:t xml:space="preserve">Stored_In</w:t>
+              <w:t xml:space="preserve">Authorizes</w:t>
             </w:r>
           </w:p>
           <w:p>
@@ -25939,29 +25266,29 @@
                 <w:sz w:val="18"/>
                 <w:szCs w:val="18"/>
               </w:rPr>
-              <w:t xml:space="preserve">Stock_Batches</w:t>
-            </w:r>
-            <w:r>
-              <w:rPr>
-                <w:rFonts w:ascii="Calibri" w:cs="Calibri" w:eastAsia="Calibri" w:hAnsi="Calibri"/>
-                <w:color w:val="52606D"/>
-                <w:sz w:val="18"/>
-                <w:szCs w:val="18"/>
-              </w:rPr>
-              <w:t xml:space="preserve">: exactly one</w:t>
-            </w:r>
-          </w:p>
-          <w:p>
-            <w:pPr>
-              <w:spacing w:after="20"/>
-            </w:pPr>
-            <w:r>
-              <w:rPr>
-                <w:rFonts w:ascii="Calibri" w:cs="Calibri" w:eastAsia="Calibri" w:hAnsi="Calibri"/>
-                <w:sz w:val="18"/>
-                <w:szCs w:val="18"/>
-              </w:rPr>
-              <w:t xml:space="preserve">Storage_Bins</w:t>
+              <w:t xml:space="preserve">Stock_Movements</w:t>
+            </w:r>
+            <w:r>
+              <w:rPr>
+                <w:rFonts w:ascii="Calibri" w:cs="Calibri" w:eastAsia="Calibri" w:hAnsi="Calibri"/>
+                <w:color w:val="52606D"/>
+                <w:sz w:val="18"/>
+                <w:szCs w:val="18"/>
+              </w:rPr>
+              <w:t xml:space="preserve">: at most one</w:t>
+            </w:r>
+          </w:p>
+          <w:p>
+            <w:pPr>
+              <w:spacing w:after="20"/>
+            </w:pPr>
+            <w:r>
+              <w:rPr>
+                <w:rFonts w:ascii="Calibri" w:cs="Calibri" w:eastAsia="Calibri" w:hAnsi="Calibri"/>
+                <w:sz w:val="18"/>
+                <w:szCs w:val="18"/>
+              </w:rPr>
+              <w:t xml:space="preserve">Staff</w:t>
             </w:r>
             <w:r>
               <w:rPr>
@@ -26000,7 +25327,7 @@
                 <w:sz w:val="18"/>
                 <w:szCs w:val="18"/>
               </w:rPr>
-              <w:t xml:space="preserve">Each batch is stored in exactly one bin.</w:t>
+              <w:t xml:space="preserve">A manual movement (a count correction or damage) is authorised by one staff member; movements made by the system, such as order reservations, have none.</w:t>
             </w:r>
           </w:p>
         </w:tc>
@@ -27653,7 +26980,7 @@
                 <w:sz w:val="18"/>
                 <w:szCs w:val="18"/>
               </w:rPr>
-              <w:t xml:space="preserve">Authorizes</w:t>
+              <w:t xml:space="preserve">Stocks</w:t>
             </w:r>
           </w:p>
           <w:p>
@@ -27669,7 +26996,7 @@
                 <w:sz w:val="16"/>
                 <w:szCs w:val="16"/>
               </w:rPr>
-              <w:t xml:space="preserve">many-to-one</w:t>
+              <w:t xml:space="preserve">ternary</w:t>
             </w:r>
           </w:p>
         </w:tc>
@@ -27699,29 +27026,7 @@
                 <w:sz w:val="18"/>
                 <w:szCs w:val="18"/>
               </w:rPr>
-              <w:t xml:space="preserve">Inventory_Adjustments</w:t>
-            </w:r>
-            <w:r>
-              <w:rPr>
-                <w:rFonts w:ascii="Calibri" w:cs="Calibri" w:eastAsia="Calibri" w:hAnsi="Calibri"/>
-                <w:color w:val="52606D"/>
-                <w:sz w:val="18"/>
-                <w:szCs w:val="18"/>
-              </w:rPr>
-              <w:t xml:space="preserve">: exactly one</w:t>
-            </w:r>
-          </w:p>
-          <w:p>
-            <w:pPr>
-              <w:spacing w:after="20"/>
-            </w:pPr>
-            <w:r>
-              <w:rPr>
-                <w:rFonts w:ascii="Calibri" w:cs="Calibri" w:eastAsia="Calibri" w:hAnsi="Calibri"/>
-                <w:sz w:val="18"/>
-                <w:szCs w:val="18"/>
-              </w:rPr>
-              <w:t xml:space="preserve">Staff</w:t>
+              <w:t xml:space="preserve">Seller_Organizations</w:t>
             </w:r>
             <w:r>
               <w:rPr>
@@ -27733,6 +27038,50 @@
               <w:t xml:space="preserve">: any number</w:t>
             </w:r>
           </w:p>
+          <w:p>
+            <w:pPr>
+              <w:spacing w:after="20"/>
+            </w:pPr>
+            <w:r>
+              <w:rPr>
+                <w:rFonts w:ascii="Calibri" w:cs="Calibri" w:eastAsia="Calibri" w:hAnsi="Calibri"/>
+                <w:sz w:val="18"/>
+                <w:szCs w:val="18"/>
+              </w:rPr>
+              <w:t xml:space="preserve">Variants</w:t>
+            </w:r>
+            <w:r>
+              <w:rPr>
+                <w:rFonts w:ascii="Calibri" w:cs="Calibri" w:eastAsia="Calibri" w:hAnsi="Calibri"/>
+                <w:color w:val="52606D"/>
+                <w:sz w:val="18"/>
+                <w:szCs w:val="18"/>
+              </w:rPr>
+              <w:t xml:space="preserve">: any number</w:t>
+            </w:r>
+          </w:p>
+          <w:p>
+            <w:pPr>
+              <w:spacing w:after="20"/>
+            </w:pPr>
+            <w:r>
+              <w:rPr>
+                <w:rFonts w:ascii="Calibri" w:cs="Calibri" w:eastAsia="Calibri" w:hAnsi="Calibri"/>
+                <w:sz w:val="18"/>
+                <w:szCs w:val="18"/>
+              </w:rPr>
+              <w:t xml:space="preserve">Warehouses</w:t>
+            </w:r>
+            <w:r>
+              <w:rPr>
+                <w:rFonts w:ascii="Calibri" w:cs="Calibri" w:eastAsia="Calibri" w:hAnsi="Calibri"/>
+                <w:color w:val="52606D"/>
+                <w:sz w:val="18"/>
+                <w:szCs w:val="18"/>
+              </w:rPr>
+              <w:t xml:space="preserve">: any number</w:t>
+            </w:r>
+          </w:p>
         </w:tc>
         <w:tc>
           <w:tcPr>
@@ -27760,7 +27109,30 @@
                 <w:sz w:val="18"/>
                 <w:szCs w:val="18"/>
               </w:rPr>
-              <w:t xml:space="preserve">Each adjustment is authorised by exactly one staff member.</w:t>
+              <w:t xml:space="preserve">A seller stocks a variant in a warehouse, with the available quantity and a reorder point. The quantity belongs to the triple: knowing that a seller sells a variant, that the seller uses a warehouse and that the warehouse holds the variant does not tell how many units of that seller's variant are in that warehouse (the Contracts argument on the Binary vs. Ternary slide).</w:t>
+            </w:r>
+          </w:p>
+          <w:p>
+            <w:pPr>
+              <w:spacing w:after="20"/>
+            </w:pPr>
+            <w:r>
+              <w:rPr>
+                <w:rFonts w:ascii="Calibri" w:cs="Calibri" w:eastAsia="Calibri" w:hAnsi="Calibri"/>
+                <w:b/>
+                <w:bCs/>
+                <w:sz w:val="18"/>
+                <w:szCs w:val="18"/>
+              </w:rPr>
+              <w:t xml:space="preserve">Attributes: </w:t>
+            </w:r>
+            <w:r>
+              <w:rPr>
+                <w:rFonts w:ascii="Calibri" w:cs="Calibri" w:eastAsia="Calibri" w:hAnsi="Calibri"/>
+                <w:sz w:val="18"/>
+                <w:szCs w:val="18"/>
+              </w:rPr>
+              <w:t xml:space="preserve">available_qty, reorder_point</w:t>
             </w:r>
           </w:p>
         </w:tc>
@@ -27797,403 +27169,6 @@
                 <w:szCs w:val="18"/>
               </w:rPr>
               <w:t xml:space="preserve">R64</w:t>
-            </w:r>
-          </w:p>
-        </w:tc>
-        <w:tc>
-          <w:tcPr>
-            <w:tcW w:type="dxa" w:w="1900"/>
-            <w:tcBorders>
-              <w:top w:val="single" w:color="BCC5CF" w:sz="4"/>
-              <w:left w:val="single" w:color="BCC5CF" w:sz="4"/>
-              <w:bottom w:val="single" w:color="BCC5CF" w:sz="4"/>
-              <w:right w:val="single" w:color="BCC5CF" w:sz="4"/>
-            </w:tcBorders>
-            <w:shd w:fill="F4F6F8" w:color="auto" w:val="clear"/>
-            <w:tcMar>
-              <w:top w:type="dxa" w:w="50"/>
-              <w:left w:type="dxa" w:w="90"/>
-              <w:bottom w:type="dxa" w:w="50"/>
-              <w:right w:type="dxa" w:w="90"/>
-            </w:tcMar>
-          </w:tcPr>
-          <w:p>
-            <w:pPr>
-              <w:spacing w:after="20"/>
-            </w:pPr>
-            <w:r>
-              <w:rPr>
-                <w:rFonts w:ascii="Calibri" w:cs="Calibri" w:eastAsia="Calibri" w:hAnsi="Calibri"/>
-                <w:b/>
-                <w:bCs/>
-                <w:sz w:val="18"/>
-                <w:szCs w:val="18"/>
-              </w:rPr>
-              <w:t xml:space="preserve">Adjusts</w:t>
-            </w:r>
-          </w:p>
-          <w:p>
-            <w:pPr>
-              <w:spacing w:after="20"/>
-            </w:pPr>
-            <w:r>
-              <w:rPr>
-                <w:rFonts w:ascii="Calibri" w:cs="Calibri" w:eastAsia="Calibri" w:hAnsi="Calibri"/>
-                <w:i/>
-                <w:iCs/>
-                <w:color w:val="52606D"/>
-                <w:sz w:val="16"/>
-                <w:szCs w:val="16"/>
-              </w:rPr>
-              <w:t xml:space="preserve">many-to-one</w:t>
-            </w:r>
-          </w:p>
-        </w:tc>
-        <w:tc>
-          <w:tcPr>
-            <w:tcW w:type="dxa" w:w="2600"/>
-            <w:tcBorders>
-              <w:top w:val="single" w:color="BCC5CF" w:sz="4"/>
-              <w:left w:val="single" w:color="BCC5CF" w:sz="4"/>
-              <w:bottom w:val="single" w:color="BCC5CF" w:sz="4"/>
-              <w:right w:val="single" w:color="BCC5CF" w:sz="4"/>
-            </w:tcBorders>
-            <w:shd w:fill="F4F6F8" w:color="auto" w:val="clear"/>
-            <w:tcMar>
-              <w:top w:type="dxa" w:w="50"/>
-              <w:left w:type="dxa" w:w="90"/>
-              <w:bottom w:type="dxa" w:w="50"/>
-              <w:right w:type="dxa" w:w="90"/>
-            </w:tcMar>
-          </w:tcPr>
-          <w:p>
-            <w:pPr>
-              <w:spacing w:after="20"/>
-            </w:pPr>
-            <w:r>
-              <w:rPr>
-                <w:rFonts w:ascii="Calibri" w:cs="Calibri" w:eastAsia="Calibri" w:hAnsi="Calibri"/>
-                <w:sz w:val="18"/>
-                <w:szCs w:val="18"/>
-              </w:rPr>
-              <w:t xml:space="preserve">Inventory_Adjustments</w:t>
-            </w:r>
-            <w:r>
-              <w:rPr>
-                <w:rFonts w:ascii="Calibri" w:cs="Calibri" w:eastAsia="Calibri" w:hAnsi="Calibri"/>
-                <w:color w:val="52606D"/>
-                <w:sz w:val="18"/>
-                <w:szCs w:val="18"/>
-              </w:rPr>
-              <w:t xml:space="preserve">: exactly one</w:t>
-            </w:r>
-          </w:p>
-          <w:p>
-            <w:pPr>
-              <w:spacing w:after="20"/>
-            </w:pPr>
-            <w:r>
-              <w:rPr>
-                <w:rFonts w:ascii="Calibri" w:cs="Calibri" w:eastAsia="Calibri" w:hAnsi="Calibri"/>
-                <w:sz w:val="18"/>
-                <w:szCs w:val="18"/>
-              </w:rPr>
-              <w:t xml:space="preserve">Stock_Batches</w:t>
-            </w:r>
-            <w:r>
-              <w:rPr>
-                <w:rFonts w:ascii="Calibri" w:cs="Calibri" w:eastAsia="Calibri" w:hAnsi="Calibri"/>
-                <w:color w:val="52606D"/>
-                <w:sz w:val="18"/>
-                <w:szCs w:val="18"/>
-              </w:rPr>
-              <w:t xml:space="preserve">: any number</w:t>
-            </w:r>
-          </w:p>
-        </w:tc>
-        <w:tc>
-          <w:tcPr>
-            <w:tcW w:type="dxa" w:w="4578"/>
-            <w:tcBorders>
-              <w:top w:val="single" w:color="BCC5CF" w:sz="4"/>
-              <w:left w:val="single" w:color="BCC5CF" w:sz="4"/>
-              <w:bottom w:val="single" w:color="BCC5CF" w:sz="4"/>
-              <w:right w:val="single" w:color="BCC5CF" w:sz="4"/>
-            </w:tcBorders>
-            <w:shd w:fill="F4F6F8" w:color="auto" w:val="clear"/>
-            <w:tcMar>
-              <w:top w:type="dxa" w:w="50"/>
-              <w:left w:type="dxa" w:w="90"/>
-              <w:bottom w:type="dxa" w:w="50"/>
-              <w:right w:type="dxa" w:w="90"/>
-            </w:tcMar>
-          </w:tcPr>
-          <w:p>
-            <w:pPr>
-              <w:spacing w:after="20"/>
-            </w:pPr>
-            <w:r>
-              <w:rPr>
-                <w:rFonts w:ascii="Calibri" w:cs="Calibri" w:eastAsia="Calibri" w:hAnsi="Calibri"/>
-                <w:sz w:val="18"/>
-                <w:szCs w:val="18"/>
-              </w:rPr>
-              <w:t xml:space="preserve">Each adjustment corrects exactly one batch.</w:t>
-            </w:r>
-          </w:p>
-        </w:tc>
-      </w:tr>
-      <w:tr>
-        <w:trPr>
-          <w:cantSplit/>
-        </w:trPr>
-        <w:tc>
-          <w:tcPr>
-            <w:tcW w:type="dxa" w:w="560"/>
-            <w:tcBorders>
-              <w:top w:val="single" w:color="BCC5CF" w:sz="4"/>
-              <w:left w:val="single" w:color="BCC5CF" w:sz="4"/>
-              <w:bottom w:val="single" w:color="BCC5CF" w:sz="4"/>
-              <w:right w:val="single" w:color="BCC5CF" w:sz="4"/>
-            </w:tcBorders>
-            <w:tcMar>
-              <w:top w:type="dxa" w:w="50"/>
-              <w:left w:type="dxa" w:w="90"/>
-              <w:bottom w:type="dxa" w:w="50"/>
-              <w:right w:type="dxa" w:w="90"/>
-            </w:tcMar>
-          </w:tcPr>
-          <w:p>
-            <w:pPr>
-              <w:spacing w:after="20"/>
-            </w:pPr>
-            <w:r>
-              <w:rPr>
-                <w:rFonts w:ascii="Calibri" w:cs="Calibri" w:eastAsia="Calibri" w:hAnsi="Calibri"/>
-                <w:sz w:val="18"/>
-                <w:szCs w:val="18"/>
-              </w:rPr>
-              <w:t xml:space="preserve">R65</w:t>
-            </w:r>
-          </w:p>
-        </w:tc>
-        <w:tc>
-          <w:tcPr>
-            <w:tcW w:type="dxa" w:w="1900"/>
-            <w:tcBorders>
-              <w:top w:val="single" w:color="BCC5CF" w:sz="4"/>
-              <w:left w:val="single" w:color="BCC5CF" w:sz="4"/>
-              <w:bottom w:val="single" w:color="BCC5CF" w:sz="4"/>
-              <w:right w:val="single" w:color="BCC5CF" w:sz="4"/>
-            </w:tcBorders>
-            <w:tcMar>
-              <w:top w:type="dxa" w:w="50"/>
-              <w:left w:type="dxa" w:w="90"/>
-              <w:bottom w:type="dxa" w:w="50"/>
-              <w:right w:type="dxa" w:w="90"/>
-            </w:tcMar>
-          </w:tcPr>
-          <w:p>
-            <w:pPr>
-              <w:spacing w:after="20"/>
-            </w:pPr>
-            <w:r>
-              <w:rPr>
-                <w:rFonts w:ascii="Calibri" w:cs="Calibri" w:eastAsia="Calibri" w:hAnsi="Calibri"/>
-                <w:b/>
-                <w:bCs/>
-                <w:sz w:val="18"/>
-                <w:szCs w:val="18"/>
-              </w:rPr>
-              <w:t xml:space="preserve">Stocks</w:t>
-            </w:r>
-          </w:p>
-          <w:p>
-            <w:pPr>
-              <w:spacing w:after="20"/>
-            </w:pPr>
-            <w:r>
-              <w:rPr>
-                <w:rFonts w:ascii="Calibri" w:cs="Calibri" w:eastAsia="Calibri" w:hAnsi="Calibri"/>
-                <w:i/>
-                <w:iCs/>
-                <w:color w:val="52606D"/>
-                <w:sz w:val="16"/>
-                <w:szCs w:val="16"/>
-              </w:rPr>
-              <w:t xml:space="preserve">ternary</w:t>
-            </w:r>
-          </w:p>
-        </w:tc>
-        <w:tc>
-          <w:tcPr>
-            <w:tcW w:type="dxa" w:w="2600"/>
-            <w:tcBorders>
-              <w:top w:val="single" w:color="BCC5CF" w:sz="4"/>
-              <w:left w:val="single" w:color="BCC5CF" w:sz="4"/>
-              <w:bottom w:val="single" w:color="BCC5CF" w:sz="4"/>
-              <w:right w:val="single" w:color="BCC5CF" w:sz="4"/>
-            </w:tcBorders>
-            <w:tcMar>
-              <w:top w:type="dxa" w:w="50"/>
-              <w:left w:type="dxa" w:w="90"/>
-              <w:bottom w:type="dxa" w:w="50"/>
-              <w:right w:type="dxa" w:w="90"/>
-            </w:tcMar>
-          </w:tcPr>
-          <w:p>
-            <w:pPr>
-              <w:spacing w:after="20"/>
-            </w:pPr>
-            <w:r>
-              <w:rPr>
-                <w:rFonts w:ascii="Calibri" w:cs="Calibri" w:eastAsia="Calibri" w:hAnsi="Calibri"/>
-                <w:sz w:val="18"/>
-                <w:szCs w:val="18"/>
-              </w:rPr>
-              <w:t xml:space="preserve">Seller_Organizations</w:t>
-            </w:r>
-            <w:r>
-              <w:rPr>
-                <w:rFonts w:ascii="Calibri" w:cs="Calibri" w:eastAsia="Calibri" w:hAnsi="Calibri"/>
-                <w:color w:val="52606D"/>
-                <w:sz w:val="18"/>
-                <w:szCs w:val="18"/>
-              </w:rPr>
-              <w:t xml:space="preserve">: any number</w:t>
-            </w:r>
-          </w:p>
-          <w:p>
-            <w:pPr>
-              <w:spacing w:after="20"/>
-            </w:pPr>
-            <w:r>
-              <w:rPr>
-                <w:rFonts w:ascii="Calibri" w:cs="Calibri" w:eastAsia="Calibri" w:hAnsi="Calibri"/>
-                <w:sz w:val="18"/>
-                <w:szCs w:val="18"/>
-              </w:rPr>
-              <w:t xml:space="preserve">Variants</w:t>
-            </w:r>
-            <w:r>
-              <w:rPr>
-                <w:rFonts w:ascii="Calibri" w:cs="Calibri" w:eastAsia="Calibri" w:hAnsi="Calibri"/>
-                <w:color w:val="52606D"/>
-                <w:sz w:val="18"/>
-                <w:szCs w:val="18"/>
-              </w:rPr>
-              <w:t xml:space="preserve">: any number</w:t>
-            </w:r>
-          </w:p>
-          <w:p>
-            <w:pPr>
-              <w:spacing w:after="20"/>
-            </w:pPr>
-            <w:r>
-              <w:rPr>
-                <w:rFonts w:ascii="Calibri" w:cs="Calibri" w:eastAsia="Calibri" w:hAnsi="Calibri"/>
-                <w:sz w:val="18"/>
-                <w:szCs w:val="18"/>
-              </w:rPr>
-              <w:t xml:space="preserve">Warehouses</w:t>
-            </w:r>
-            <w:r>
-              <w:rPr>
-                <w:rFonts w:ascii="Calibri" w:cs="Calibri" w:eastAsia="Calibri" w:hAnsi="Calibri"/>
-                <w:color w:val="52606D"/>
-                <w:sz w:val="18"/>
-                <w:szCs w:val="18"/>
-              </w:rPr>
-              <w:t xml:space="preserve">: any number</w:t>
-            </w:r>
-          </w:p>
-        </w:tc>
-        <w:tc>
-          <w:tcPr>
-            <w:tcW w:type="dxa" w:w="4578"/>
-            <w:tcBorders>
-              <w:top w:val="single" w:color="BCC5CF" w:sz="4"/>
-              <w:left w:val="single" w:color="BCC5CF" w:sz="4"/>
-              <w:bottom w:val="single" w:color="BCC5CF" w:sz="4"/>
-              <w:right w:val="single" w:color="BCC5CF" w:sz="4"/>
-            </w:tcBorders>
-            <w:tcMar>
-              <w:top w:type="dxa" w:w="50"/>
-              <w:left w:type="dxa" w:w="90"/>
-              <w:bottom w:type="dxa" w:w="50"/>
-              <w:right w:type="dxa" w:w="90"/>
-            </w:tcMar>
-          </w:tcPr>
-          <w:p>
-            <w:pPr>
-              <w:spacing w:after="20"/>
-            </w:pPr>
-            <w:r>
-              <w:rPr>
-                <w:rFonts w:ascii="Calibri" w:cs="Calibri" w:eastAsia="Calibri" w:hAnsi="Calibri"/>
-                <w:sz w:val="18"/>
-                <w:szCs w:val="18"/>
-              </w:rPr>
-              <w:t xml:space="preserve">A seller stocks a variant in a warehouse, with the available quantity and a reorder point. The quantity belongs to the triple: knowing that a seller sells a variant, that the seller uses a warehouse and that the warehouse holds the variant does not tell how many units of that seller's variant are in that warehouse (the Contracts argument on the Binary vs. Ternary slide).</w:t>
-            </w:r>
-          </w:p>
-          <w:p>
-            <w:pPr>
-              <w:spacing w:after="20"/>
-            </w:pPr>
-            <w:r>
-              <w:rPr>
-                <w:rFonts w:ascii="Calibri" w:cs="Calibri" w:eastAsia="Calibri" w:hAnsi="Calibri"/>
-                <w:b/>
-                <w:bCs/>
-                <w:sz w:val="18"/>
-                <w:szCs w:val="18"/>
-              </w:rPr>
-              <w:t xml:space="preserve">Attributes: </w:t>
-            </w:r>
-            <w:r>
-              <w:rPr>
-                <w:rFonts w:ascii="Calibri" w:cs="Calibri" w:eastAsia="Calibri" w:hAnsi="Calibri"/>
-                <w:sz w:val="18"/>
-                <w:szCs w:val="18"/>
-              </w:rPr>
-              <w:t xml:space="preserve">available_qty, reorder_point</w:t>
-            </w:r>
-          </w:p>
-        </w:tc>
-      </w:tr>
-      <w:tr>
-        <w:trPr>
-          <w:cantSplit/>
-        </w:trPr>
-        <w:tc>
-          <w:tcPr>
-            <w:tcW w:type="dxa" w:w="560"/>
-            <w:tcBorders>
-              <w:top w:val="single" w:color="BCC5CF" w:sz="4"/>
-              <w:left w:val="single" w:color="BCC5CF" w:sz="4"/>
-              <w:bottom w:val="single" w:color="BCC5CF" w:sz="4"/>
-              <w:right w:val="single" w:color="BCC5CF" w:sz="4"/>
-            </w:tcBorders>
-            <w:shd w:fill="F4F6F8" w:color="auto" w:val="clear"/>
-            <w:tcMar>
-              <w:top w:type="dxa" w:w="50"/>
-              <w:left w:type="dxa" w:w="90"/>
-              <w:bottom w:type="dxa" w:w="50"/>
-              <w:right w:type="dxa" w:w="90"/>
-            </w:tcMar>
-          </w:tcPr>
-          <w:p>
-            <w:pPr>
-              <w:spacing w:after="20"/>
-            </w:pPr>
-            <w:r>
-              <w:rPr>
-                <w:rFonts w:ascii="Calibri" w:cs="Calibri" w:eastAsia="Calibri" w:hAnsi="Calibri"/>
-                <w:sz w:val="18"/>
-                <w:szCs w:val="18"/>
-              </w:rPr>
-              <w:t xml:space="preserve">R66</w:t>
             </w:r>
           </w:p>
         </w:tc>
@@ -28565,7 +27540,7 @@
                 <w:sz w:val="18"/>
                 <w:szCs w:val="18"/>
               </w:rPr>
-              <w:t xml:space="preserve">R67</w:t>
+              <w:t xml:space="preserve">R65</w:t>
             </w:r>
           </w:p>
         </w:tc>
@@ -28740,7 +27715,7 @@
                 <w:sz w:val="18"/>
                 <w:szCs w:val="18"/>
               </w:rPr>
-              <w:t xml:space="preserve">R68</w:t>
+              <w:t xml:space="preserve">R66</w:t>
             </w:r>
           </w:p>
         </w:tc>
@@ -28917,7 +27892,7 @@
                 <w:sz w:val="18"/>
                 <w:szCs w:val="18"/>
               </w:rPr>
-              <w:t xml:space="preserve">R69</w:t>
+              <w:t xml:space="preserve">R67</w:t>
             </w:r>
           </w:p>
         </w:tc>
@@ -29092,7 +28067,7 @@
                 <w:sz w:val="18"/>
                 <w:szCs w:val="18"/>
               </w:rPr>
-              <w:t xml:space="preserve">R70</w:t>
+              <w:t xml:space="preserve">R68</w:t>
             </w:r>
           </w:p>
         </w:tc>
@@ -29269,7 +28244,7 @@
                 <w:sz w:val="18"/>
                 <w:szCs w:val="18"/>
               </w:rPr>
-              <w:t xml:space="preserve">R71</w:t>
+              <w:t xml:space="preserve">R69</w:t>
             </w:r>
           </w:p>
         </w:tc>
@@ -29444,7 +28419,7 @@
                 <w:sz w:val="18"/>
                 <w:szCs w:val="18"/>
               </w:rPr>
-              <w:t xml:space="preserve">R72</w:t>
+              <w:t xml:space="preserve">R70</w:t>
             </w:r>
           </w:p>
         </w:tc>
@@ -29621,7 +28596,7 @@
                 <w:sz w:val="18"/>
                 <w:szCs w:val="18"/>
               </w:rPr>
-              <w:t xml:space="preserve">R73</w:t>
+              <w:t xml:space="preserve">R71</w:t>
             </w:r>
           </w:p>
         </w:tc>
@@ -29796,7 +28771,7 @@
                 <w:sz w:val="18"/>
                 <w:szCs w:val="18"/>
               </w:rPr>
-              <w:t xml:space="preserve">R74</w:t>
+              <w:t xml:space="preserve">R72</w:t>
             </w:r>
           </w:p>
         </w:tc>
@@ -29973,7 +28948,7 @@
                 <w:sz w:val="18"/>
                 <w:szCs w:val="18"/>
               </w:rPr>
-              <w:t xml:space="preserve">R75</w:t>
+              <w:t xml:space="preserve">R73</w:t>
             </w:r>
           </w:p>
         </w:tc>
@@ -30148,7 +29123,7 @@
                 <w:sz w:val="18"/>
                 <w:szCs w:val="18"/>
               </w:rPr>
-              <w:t xml:space="preserve">R76</w:t>
+              <w:t xml:space="preserve">R74</w:t>
             </w:r>
           </w:p>
         </w:tc>
@@ -30181,7 +29156,7 @@
                 <w:sz w:val="18"/>
                 <w:szCs w:val="18"/>
               </w:rPr>
-              <w:t xml:space="preserve">Transaction_Of</w:t>
+              <w:t xml:space="preserve">Refund_For</w:t>
             </w:r>
           </w:p>
           <w:p>
@@ -30237,20 +29212,20 @@
                 <w:sz w:val="18"/>
                 <w:szCs w:val="18"/>
               </w:rPr>
-              <w:t xml:space="preserve">: exactly one</w:t>
-            </w:r>
-          </w:p>
-          <w:p>
-            <w:pPr>
-              <w:spacing w:after="20"/>
-            </w:pPr>
-            <w:r>
-              <w:rPr>
-                <w:rFonts w:ascii="Calibri" w:cs="Calibri" w:eastAsia="Calibri" w:hAnsi="Calibri"/>
-                <w:sz w:val="18"/>
-                <w:szCs w:val="18"/>
-              </w:rPr>
-              <w:t xml:space="preserve">Payments</w:t>
+              <w:t xml:space="preserve">: at most one</w:t>
+            </w:r>
+          </w:p>
+          <w:p>
+            <w:pPr>
+              <w:spacing w:after="20"/>
+            </w:pPr>
+            <w:r>
+              <w:rPr>
+                <w:rFonts w:ascii="Calibri" w:cs="Calibri" w:eastAsia="Calibri" w:hAnsi="Calibri"/>
+                <w:sz w:val="18"/>
+                <w:szCs w:val="18"/>
+              </w:rPr>
+              <w:t xml:space="preserve">Return_Requests</w:t>
             </w:r>
             <w:r>
               <w:rPr>
@@ -30290,7 +29265,7 @@
                 <w:sz w:val="18"/>
                 <w:szCs w:val="18"/>
               </w:rPr>
-              <w:t xml:space="preserve">Each transaction belongs to exactly one payment.</w:t>
+              <w:t xml:space="preserve">A refund transaction pays back exactly one return request; capture transactions belong to no return.</w:t>
             </w:r>
           </w:p>
         </w:tc>
@@ -30325,7 +29300,7 @@
                 <w:sz w:val="18"/>
                 <w:szCs w:val="18"/>
               </w:rPr>
-              <w:t xml:space="preserve">R77</w:t>
+              <w:t xml:space="preserve">R75</w:t>
             </w:r>
           </w:p>
         </w:tc>
@@ -30357,7 +29332,7 @@
                 <w:sz w:val="18"/>
                 <w:szCs w:val="18"/>
               </w:rPr>
-              <w:t xml:space="preserve">Invoiced_As</w:t>
+              <w:t xml:space="preserve">Transaction_Of</w:t>
             </w:r>
           </w:p>
           <w:p>
@@ -30373,7 +29348,7 @@
                 <w:sz w:val="16"/>
                 <w:szCs w:val="16"/>
               </w:rPr>
-              <w:t xml:space="preserve">one-to-one</w:t>
+              <w:t xml:space="preserve">many-to-one</w:t>
             </w:r>
           </w:p>
         </w:tc>
@@ -30403,7 +29378,7 @@
                 <w:sz w:val="18"/>
                 <w:szCs w:val="18"/>
               </w:rPr>
-              <w:t xml:space="preserve">Invoices</w:t>
+              <w:t xml:space="preserve">Payment_Transactions</w:t>
             </w:r>
             <w:r>
               <w:rPr>
@@ -30425,16 +29400,16 @@
                 <w:sz w:val="18"/>
                 <w:szCs w:val="18"/>
               </w:rPr>
-              <w:t xml:space="preserve">Orders</w:t>
-            </w:r>
-            <w:r>
-              <w:rPr>
-                <w:rFonts w:ascii="Calibri" w:cs="Calibri" w:eastAsia="Calibri" w:hAnsi="Calibri"/>
-                <w:color w:val="52606D"/>
-                <w:sz w:val="18"/>
-                <w:szCs w:val="18"/>
-              </w:rPr>
-              <w:t xml:space="preserve">: at most one</w:t>
+              <w:t xml:space="preserve">Payments</w:t>
+            </w:r>
+            <w:r>
+              <w:rPr>
+                <w:rFonts w:ascii="Calibri" w:cs="Calibri" w:eastAsia="Calibri" w:hAnsi="Calibri"/>
+                <w:color w:val="52606D"/>
+                <w:sz w:val="18"/>
+                <w:szCs w:val="18"/>
+              </w:rPr>
+              <w:t xml:space="preserve">: any number</w:t>
             </w:r>
           </w:p>
         </w:tc>
@@ -30464,7 +29439,7 @@
                 <w:sz w:val="18"/>
                 <w:szCs w:val="18"/>
               </w:rPr>
-              <w:t xml:space="preserve">One-to-one: every invoice is for exactly one order and an order has at most one invoice.</w:t>
+              <w:t xml:space="preserve">Each transaction belongs to exactly one payment.</w:t>
             </w:r>
           </w:p>
         </w:tc>
@@ -30500,7 +29475,7 @@
                 <w:sz w:val="18"/>
                 <w:szCs w:val="18"/>
               </w:rPr>
-              <w:t xml:space="preserve">R78</w:t>
+              <w:t xml:space="preserve">R76</w:t>
             </w:r>
           </w:p>
         </w:tc>
@@ -30533,7 +29508,7 @@
                 <w:sz w:val="18"/>
                 <w:szCs w:val="18"/>
               </w:rPr>
-              <w:t xml:space="preserve">Bills</w:t>
+              <w:t xml:space="preserve">Invoiced_As</w:t>
             </w:r>
           </w:p>
           <w:p>
@@ -30549,7 +29524,7 @@
                 <w:sz w:val="16"/>
                 <w:szCs w:val="16"/>
               </w:rPr>
-              <w:t xml:space="preserve">many-to-one</w:t>
+              <w:t xml:space="preserve">one-to-one</w:t>
             </w:r>
           </w:p>
         </w:tc>
@@ -30580,7 +29555,7 @@
                 <w:sz w:val="18"/>
                 <w:szCs w:val="18"/>
               </w:rPr>
-              <w:t xml:space="preserve">Invoice_Lines</w:t>
+              <w:t xml:space="preserve">Invoices</w:t>
             </w:r>
             <w:r>
               <w:rPr>
@@ -30602,16 +29577,16 @@
                 <w:sz w:val="18"/>
                 <w:szCs w:val="18"/>
               </w:rPr>
-              <w:t xml:space="preserve">Order_Lines</w:t>
-            </w:r>
-            <w:r>
-              <w:rPr>
-                <w:rFonts w:ascii="Calibri" w:cs="Calibri" w:eastAsia="Calibri" w:hAnsi="Calibri"/>
-                <w:color w:val="52606D"/>
-                <w:sz w:val="18"/>
-                <w:szCs w:val="18"/>
-              </w:rPr>
-              <w:t xml:space="preserve">: any number</w:t>
+              <w:t xml:space="preserve">Orders</w:t>
+            </w:r>
+            <w:r>
+              <w:rPr>
+                <w:rFonts w:ascii="Calibri" w:cs="Calibri" w:eastAsia="Calibri" w:hAnsi="Calibri"/>
+                <w:color w:val="52606D"/>
+                <w:sz w:val="18"/>
+                <w:szCs w:val="18"/>
+              </w:rPr>
+              <w:t xml:space="preserve">: at most one</w:t>
             </w:r>
           </w:p>
         </w:tc>
@@ -30642,7 +29617,7 @@
                 <w:sz w:val="18"/>
                 <w:szCs w:val="18"/>
               </w:rPr>
-              <w:t xml:space="preserve">Each invoice line bills exactly one order line.</w:t>
+              <w:t xml:space="preserve">One-to-one: every invoice is for exactly one order and an order has at most one invoice.</w:t>
             </w:r>
           </w:p>
         </w:tc>
@@ -30677,7 +29652,7 @@
                 <w:sz w:val="18"/>
                 <w:szCs w:val="18"/>
               </w:rPr>
-              <w:t xml:space="preserve">R79</w:t>
+              <w:t xml:space="preserve">R77</w:t>
             </w:r>
           </w:p>
         </w:tc>
@@ -30709,7 +29684,7 @@
                 <w:sz w:val="18"/>
                 <w:szCs w:val="18"/>
               </w:rPr>
-              <w:t xml:space="preserve">Taxed_At</w:t>
+              <w:t xml:space="preserve">Bills</w:t>
             </w:r>
           </w:p>
           <w:p>
@@ -30764,20 +29739,20 @@
                 <w:sz w:val="18"/>
                 <w:szCs w:val="18"/>
               </w:rPr>
-              <w:t xml:space="preserve">: at most one</w:t>
-            </w:r>
-          </w:p>
-          <w:p>
-            <w:pPr>
-              <w:spacing w:after="20"/>
-            </w:pPr>
-            <w:r>
-              <w:rPr>
-                <w:rFonts w:ascii="Calibri" w:cs="Calibri" w:eastAsia="Calibri" w:hAnsi="Calibri"/>
-                <w:sz w:val="18"/>
-                <w:szCs w:val="18"/>
-              </w:rPr>
-              <w:t xml:space="preserve">Tax_Rates</w:t>
+              <w:t xml:space="preserve">: exactly one</w:t>
+            </w:r>
+          </w:p>
+          <w:p>
+            <w:pPr>
+              <w:spacing w:after="20"/>
+            </w:pPr>
+            <w:r>
+              <w:rPr>
+                <w:rFonts w:ascii="Calibri" w:cs="Calibri" w:eastAsia="Calibri" w:hAnsi="Calibri"/>
+                <w:sz w:val="18"/>
+                <w:szCs w:val="18"/>
+              </w:rPr>
+              <w:t xml:space="preserve">Order_Lines</w:t>
             </w:r>
             <w:r>
               <w:rPr>
@@ -30816,7 +29791,7 @@
                 <w:sz w:val="18"/>
                 <w:szCs w:val="18"/>
               </w:rPr>
-              <w:t xml:space="preserve">An invoice line is taxed at most at one tax rate (none for tax-exempt lines).</w:t>
+              <w:t xml:space="preserve">Each invoice line bills exactly one order line.</w:t>
             </w:r>
           </w:p>
         </w:tc>
@@ -30852,7 +29827,7 @@
                 <w:sz w:val="18"/>
                 <w:szCs w:val="18"/>
               </w:rPr>
-              <w:t xml:space="preserve">R80</w:t>
+              <w:t xml:space="preserve">R78</w:t>
             </w:r>
           </w:p>
         </w:tc>
@@ -30885,7 +29860,7 @@
                 <w:sz w:val="18"/>
                 <w:szCs w:val="18"/>
               </w:rPr>
-              <w:t xml:space="preserve">Invoice_Has_Line</w:t>
+              <w:t xml:space="preserve">Taxed_At</w:t>
             </w:r>
           </w:p>
           <w:p>
@@ -30901,7 +29876,7 @@
                 <w:sz w:val="16"/>
                 <w:szCs w:val="16"/>
               </w:rPr>
-              <w:t xml:space="preserve">identifying (weak entity)</w:t>
+              <w:t xml:space="preserve">many-to-one</w:t>
             </w:r>
           </w:p>
         </w:tc>
@@ -30941,29 +29916,29 @@
                 <w:sz w:val="18"/>
                 <w:szCs w:val="18"/>
               </w:rPr>
-              <w:t xml:space="preserve">: exactly one</w:t>
-            </w:r>
-          </w:p>
-          <w:p>
-            <w:pPr>
-              <w:spacing w:after="20"/>
-            </w:pPr>
-            <w:r>
-              <w:rPr>
-                <w:rFonts w:ascii="Calibri" w:cs="Calibri" w:eastAsia="Calibri" w:hAnsi="Calibri"/>
-                <w:sz w:val="18"/>
-                <w:szCs w:val="18"/>
-              </w:rPr>
-              <w:t xml:space="preserve">Invoices</w:t>
-            </w:r>
-            <w:r>
-              <w:rPr>
-                <w:rFonts w:ascii="Calibri" w:cs="Calibri" w:eastAsia="Calibri" w:hAnsi="Calibri"/>
-                <w:color w:val="52606D"/>
-                <w:sz w:val="18"/>
-                <w:szCs w:val="18"/>
-              </w:rPr>
-              <w:t xml:space="preserve">: at least one</w:t>
+              <w:t xml:space="preserve">: at most one</w:t>
+            </w:r>
+          </w:p>
+          <w:p>
+            <w:pPr>
+              <w:spacing w:after="20"/>
+            </w:pPr>
+            <w:r>
+              <w:rPr>
+                <w:rFonts w:ascii="Calibri" w:cs="Calibri" w:eastAsia="Calibri" w:hAnsi="Calibri"/>
+                <w:sz w:val="18"/>
+                <w:szCs w:val="18"/>
+              </w:rPr>
+              <w:t xml:space="preserve">Tax_Rates</w:t>
+            </w:r>
+            <w:r>
+              <w:rPr>
+                <w:rFonts w:ascii="Calibri" w:cs="Calibri" w:eastAsia="Calibri" w:hAnsi="Calibri"/>
+                <w:color w:val="52606D"/>
+                <w:sz w:val="18"/>
+                <w:szCs w:val="18"/>
+              </w:rPr>
+              <w:t xml:space="preserve">: any number</w:t>
             </w:r>
           </w:p>
         </w:tc>
@@ -30994,7 +29969,7 @@
                 <w:sz w:val="18"/>
                 <w:szCs w:val="18"/>
               </w:rPr>
-              <w:t xml:space="preserve">An invoice line exists only inside its invoice and is numbered within it.</w:t>
+              <w:t xml:space="preserve">An invoice line is taxed at most at one tax rate (none for tax-exempt lines).</w:t>
             </w:r>
           </w:p>
         </w:tc>
@@ -31029,7 +30004,7 @@
                 <w:sz w:val="18"/>
                 <w:szCs w:val="18"/>
               </w:rPr>
-              <w:t xml:space="preserve">R81</w:t>
+              <w:t xml:space="preserve">R79</w:t>
             </w:r>
           </w:p>
         </w:tc>
@@ -31061,7 +30036,7 @@
                 <w:sz w:val="18"/>
                 <w:szCs w:val="18"/>
               </w:rPr>
-              <w:t xml:space="preserve">Reserves</w:t>
+              <w:t xml:space="preserve">Invoice_Has_Line</w:t>
             </w:r>
           </w:p>
           <w:p>
@@ -31077,6 +30052,182 @@
                 <w:sz w:val="16"/>
                 <w:szCs w:val="16"/>
               </w:rPr>
+              <w:t xml:space="preserve">identifying (weak entity)</w:t>
+            </w:r>
+          </w:p>
+        </w:tc>
+        <w:tc>
+          <w:tcPr>
+            <w:tcW w:type="dxa" w:w="2600"/>
+            <w:tcBorders>
+              <w:top w:val="single" w:color="BCC5CF" w:sz="4"/>
+              <w:left w:val="single" w:color="BCC5CF" w:sz="4"/>
+              <w:bottom w:val="single" w:color="BCC5CF" w:sz="4"/>
+              <w:right w:val="single" w:color="BCC5CF" w:sz="4"/>
+            </w:tcBorders>
+            <w:tcMar>
+              <w:top w:type="dxa" w:w="50"/>
+              <w:left w:type="dxa" w:w="90"/>
+              <w:bottom w:type="dxa" w:w="50"/>
+              <w:right w:type="dxa" w:w="90"/>
+            </w:tcMar>
+          </w:tcPr>
+          <w:p>
+            <w:pPr>
+              <w:spacing w:after="20"/>
+            </w:pPr>
+            <w:r>
+              <w:rPr>
+                <w:rFonts w:ascii="Calibri" w:cs="Calibri" w:eastAsia="Calibri" w:hAnsi="Calibri"/>
+                <w:sz w:val="18"/>
+                <w:szCs w:val="18"/>
+              </w:rPr>
+              <w:t xml:space="preserve">Invoice_Lines</w:t>
+            </w:r>
+            <w:r>
+              <w:rPr>
+                <w:rFonts w:ascii="Calibri" w:cs="Calibri" w:eastAsia="Calibri" w:hAnsi="Calibri"/>
+                <w:color w:val="52606D"/>
+                <w:sz w:val="18"/>
+                <w:szCs w:val="18"/>
+              </w:rPr>
+              <w:t xml:space="preserve">: exactly one</w:t>
+            </w:r>
+          </w:p>
+          <w:p>
+            <w:pPr>
+              <w:spacing w:after="20"/>
+            </w:pPr>
+            <w:r>
+              <w:rPr>
+                <w:rFonts w:ascii="Calibri" w:cs="Calibri" w:eastAsia="Calibri" w:hAnsi="Calibri"/>
+                <w:sz w:val="18"/>
+                <w:szCs w:val="18"/>
+              </w:rPr>
+              <w:t xml:space="preserve">Invoices</w:t>
+            </w:r>
+            <w:r>
+              <w:rPr>
+                <w:rFonts w:ascii="Calibri" w:cs="Calibri" w:eastAsia="Calibri" w:hAnsi="Calibri"/>
+                <w:color w:val="52606D"/>
+                <w:sz w:val="18"/>
+                <w:szCs w:val="18"/>
+              </w:rPr>
+              <w:t xml:space="preserve">: at least one</w:t>
+            </w:r>
+          </w:p>
+        </w:tc>
+        <w:tc>
+          <w:tcPr>
+            <w:tcW w:type="dxa" w:w="4578"/>
+            <w:tcBorders>
+              <w:top w:val="single" w:color="BCC5CF" w:sz="4"/>
+              <w:left w:val="single" w:color="BCC5CF" w:sz="4"/>
+              <w:bottom w:val="single" w:color="BCC5CF" w:sz="4"/>
+              <w:right w:val="single" w:color="BCC5CF" w:sz="4"/>
+            </w:tcBorders>
+            <w:tcMar>
+              <w:top w:type="dxa" w:w="50"/>
+              <w:left w:type="dxa" w:w="90"/>
+              <w:bottom w:type="dxa" w:w="50"/>
+              <w:right w:type="dxa" w:w="90"/>
+            </w:tcMar>
+          </w:tcPr>
+          <w:p>
+            <w:pPr>
+              <w:spacing w:after="20"/>
+            </w:pPr>
+            <w:r>
+              <w:rPr>
+                <w:rFonts w:ascii="Calibri" w:cs="Calibri" w:eastAsia="Calibri" w:hAnsi="Calibri"/>
+                <w:sz w:val="18"/>
+                <w:szCs w:val="18"/>
+              </w:rPr>
+              <w:t xml:space="preserve">An invoice line exists only inside its invoice and is numbered within it.</w:t>
+            </w:r>
+          </w:p>
+        </w:tc>
+      </w:tr>
+      <w:tr>
+        <w:trPr>
+          <w:cantSplit/>
+        </w:trPr>
+        <w:tc>
+          <w:tcPr>
+            <w:tcW w:type="dxa" w:w="560"/>
+            <w:tcBorders>
+              <w:top w:val="single" w:color="BCC5CF" w:sz="4"/>
+              <w:left w:val="single" w:color="BCC5CF" w:sz="4"/>
+              <w:bottom w:val="single" w:color="BCC5CF" w:sz="4"/>
+              <w:right w:val="single" w:color="BCC5CF" w:sz="4"/>
+            </w:tcBorders>
+            <w:shd w:fill="F4F6F8" w:color="auto" w:val="clear"/>
+            <w:tcMar>
+              <w:top w:type="dxa" w:w="50"/>
+              <w:left w:type="dxa" w:w="90"/>
+              <w:bottom w:type="dxa" w:w="50"/>
+              <w:right w:type="dxa" w:w="90"/>
+            </w:tcMar>
+          </w:tcPr>
+          <w:p>
+            <w:pPr>
+              <w:spacing w:after="20"/>
+            </w:pPr>
+            <w:r>
+              <w:rPr>
+                <w:rFonts w:ascii="Calibri" w:cs="Calibri" w:eastAsia="Calibri" w:hAnsi="Calibri"/>
+                <w:sz w:val="18"/>
+                <w:szCs w:val="18"/>
+              </w:rPr>
+              <w:t xml:space="preserve">R80</w:t>
+            </w:r>
+          </w:p>
+        </w:tc>
+        <w:tc>
+          <w:tcPr>
+            <w:tcW w:type="dxa" w:w="1900"/>
+            <w:tcBorders>
+              <w:top w:val="single" w:color="BCC5CF" w:sz="4"/>
+              <w:left w:val="single" w:color="BCC5CF" w:sz="4"/>
+              <w:bottom w:val="single" w:color="BCC5CF" w:sz="4"/>
+              <w:right w:val="single" w:color="BCC5CF" w:sz="4"/>
+            </w:tcBorders>
+            <w:shd w:fill="F4F6F8" w:color="auto" w:val="clear"/>
+            <w:tcMar>
+              <w:top w:type="dxa" w:w="50"/>
+              <w:left w:type="dxa" w:w="90"/>
+              <w:bottom w:type="dxa" w:w="50"/>
+              <w:right w:type="dxa" w:w="90"/>
+            </w:tcMar>
+          </w:tcPr>
+          <w:p>
+            <w:pPr>
+              <w:spacing w:after="20"/>
+            </w:pPr>
+            <w:r>
+              <w:rPr>
+                <w:rFonts w:ascii="Calibri" w:cs="Calibri" w:eastAsia="Calibri" w:hAnsi="Calibri"/>
+                <w:b/>
+                <w:bCs/>
+                <w:sz w:val="18"/>
+                <w:szCs w:val="18"/>
+              </w:rPr>
+              <w:t xml:space="preserve">Reserves</w:t>
+            </w:r>
+          </w:p>
+          <w:p>
+            <w:pPr>
+              <w:spacing w:after="20"/>
+            </w:pPr>
+            <w:r>
+              <w:rPr>
+                <w:rFonts w:ascii="Calibri" w:cs="Calibri" w:eastAsia="Calibri" w:hAnsi="Calibri"/>
+                <w:i/>
+                <w:iCs/>
+                <w:color w:val="52606D"/>
+                <w:sz w:val="16"/>
+                <w:szCs w:val="16"/>
+              </w:rPr>
               <w:t xml:space="preserve">uses the aggregation of Stocks</w:t>
             </w:r>
           </w:p>
@@ -31090,6 +30241,7 @@
               <w:bottom w:val="single" w:color="BCC5CF" w:sz="4"/>
               <w:right w:val="single" w:color="BCC5CF" w:sz="4"/>
             </w:tcBorders>
+            <w:shd w:fill="F4F6F8" w:color="auto" w:val="clear"/>
             <w:tcMar>
               <w:top w:type="dxa" w:w="50"/>
               <w:left w:type="dxa" w:w="90"/>
@@ -31151,6 +30303,7 @@
               <w:bottom w:val="single" w:color="BCC5CF" w:sz="4"/>
               <w:right w:val="single" w:color="BCC5CF" w:sz="4"/>
             </w:tcBorders>
+            <w:shd w:fill="F4F6F8" w:color="auto" w:val="clear"/>
             <w:tcMar>
               <w:top w:type="dxa" w:w="50"/>
               <w:left w:type="dxa" w:w="90"/>
@@ -31398,7 +30551,7 @@
                 <w:sz w:val="18"/>
                 <w:szCs w:val="18"/>
               </w:rPr>
-              <w:t xml:space="preserve">R82</w:t>
+              <w:t xml:space="preserve">R81</w:t>
             </w:r>
           </w:p>
         </w:tc>
@@ -31573,7 +30726,7 @@
                 <w:sz w:val="18"/>
                 <w:szCs w:val="18"/>
               </w:rPr>
-              <w:t xml:space="preserve">R83</w:t>
+              <w:t xml:space="preserve">R82</w:t>
             </w:r>
           </w:p>
         </w:tc>
@@ -31750,7 +30903,7 @@
                 <w:sz w:val="18"/>
                 <w:szCs w:val="18"/>
               </w:rPr>
-              <w:t xml:space="preserve">R84</w:t>
+              <w:t xml:space="preserve">R83</w:t>
             </w:r>
           </w:p>
         </w:tc>
@@ -31925,7 +31078,7 @@
                 <w:sz w:val="18"/>
                 <w:szCs w:val="18"/>
               </w:rPr>
-              <w:t xml:space="preserve">R85</w:t>
+              <w:t xml:space="preserve">R84</w:t>
             </w:r>
           </w:p>
         </w:tc>
@@ -32102,7 +31255,7 @@
                 <w:sz w:val="18"/>
                 <w:szCs w:val="18"/>
               </w:rPr>
-              <w:t xml:space="preserve">R86</w:t>
+              <w:t xml:space="preserve">R85</w:t>
             </w:r>
           </w:p>
         </w:tc>
@@ -32277,7 +31430,7 @@
                 <w:sz w:val="18"/>
                 <w:szCs w:val="18"/>
               </w:rPr>
-              <w:t xml:space="preserve">R87</w:t>
+              <w:t xml:space="preserve">R86</w:t>
             </w:r>
           </w:p>
         </w:tc>
@@ -32454,7 +31607,7 @@
                 <w:sz w:val="18"/>
                 <w:szCs w:val="18"/>
               </w:rPr>
-              <w:t xml:space="preserve">R88</w:t>
+              <w:t xml:space="preserve">R87</w:t>
             </w:r>
           </w:p>
         </w:tc>
@@ -32629,7 +31782,7 @@
                 <w:sz w:val="18"/>
                 <w:szCs w:val="18"/>
               </w:rPr>
-              <w:t xml:space="preserve">R89</w:t>
+              <w:t xml:space="preserve">R88</w:t>
             </w:r>
           </w:p>
         </w:tc>
@@ -32806,7 +31959,7 @@
                 <w:sz w:val="18"/>
                 <w:szCs w:val="18"/>
               </w:rPr>
-              <w:t xml:space="preserve">R90</w:t>
+              <w:t xml:space="preserve">R89</w:t>
             </w:r>
           </w:p>
         </w:tc>
@@ -32981,7 +32134,7 @@
                 <w:sz w:val="18"/>
                 <w:szCs w:val="18"/>
               </w:rPr>
-              <w:t xml:space="preserve">R91</w:t>
+              <w:t xml:space="preserve">R90</w:t>
             </w:r>
           </w:p>
         </w:tc>
@@ -33158,7 +32311,7 @@
                 <w:sz w:val="18"/>
                 <w:szCs w:val="18"/>
               </w:rPr>
-              <w:t xml:space="preserve">R92</w:t>
+              <w:t xml:space="preserve">R91</w:t>
             </w:r>
           </w:p>
         </w:tc>
@@ -33190,7 +32343,7 @@
                 <w:sz w:val="18"/>
                 <w:szCs w:val="18"/>
               </w:rPr>
-              <w:t xml:space="preserve">Proves</w:t>
+              <w:t xml:space="preserve">Includes</w:t>
             </w:r>
           </w:p>
           <w:p>
@@ -33206,7 +32359,7 @@
                 <w:sz w:val="16"/>
                 <w:szCs w:val="16"/>
               </w:rPr>
-              <w:t xml:space="preserve">one-to-one</w:t>
+              <w:t xml:space="preserve">many-to-many</w:t>
             </w:r>
           </w:p>
         </w:tc>
@@ -33236,38 +32389,38 @@
                 <w:sz w:val="18"/>
                 <w:szCs w:val="18"/>
               </w:rPr>
-              <w:t xml:space="preserve">Proof_Of_Delivery</w:t>
-            </w:r>
-            <w:r>
-              <w:rPr>
-                <w:rFonts w:ascii="Calibri" w:cs="Calibri" w:eastAsia="Calibri" w:hAnsi="Calibri"/>
-                <w:color w:val="52606D"/>
-                <w:sz w:val="18"/>
-                <w:szCs w:val="18"/>
-              </w:rPr>
-              <w:t xml:space="preserve">: exactly one</w:t>
-            </w:r>
-          </w:p>
-          <w:p>
-            <w:pPr>
-              <w:spacing w:after="20"/>
-            </w:pPr>
-            <w:r>
-              <w:rPr>
-                <w:rFonts w:ascii="Calibri" w:cs="Calibri" w:eastAsia="Calibri" w:hAnsi="Calibri"/>
-                <w:sz w:val="18"/>
-                <w:szCs w:val="18"/>
-              </w:rPr>
-              <w:t xml:space="preserve">Delivery_Attempts</w:t>
-            </w:r>
-            <w:r>
-              <w:rPr>
-                <w:rFonts w:ascii="Calibri" w:cs="Calibri" w:eastAsia="Calibri" w:hAnsi="Calibri"/>
-                <w:color w:val="52606D"/>
-                <w:sz w:val="18"/>
-                <w:szCs w:val="18"/>
-              </w:rPr>
-              <w:t xml:space="preserve">: at most one</w:t>
+              <w:t xml:space="preserve">Fulfillments</w:t>
+            </w:r>
+            <w:r>
+              <w:rPr>
+                <w:rFonts w:ascii="Calibri" w:cs="Calibri" w:eastAsia="Calibri" w:hAnsi="Calibri"/>
+                <w:color w:val="52606D"/>
+                <w:sz w:val="18"/>
+                <w:szCs w:val="18"/>
+              </w:rPr>
+              <w:t xml:space="preserve">: any number</w:t>
+            </w:r>
+          </w:p>
+          <w:p>
+            <w:pPr>
+              <w:spacing w:after="20"/>
+            </w:pPr>
+            <w:r>
+              <w:rPr>
+                <w:rFonts w:ascii="Calibri" w:cs="Calibri" w:eastAsia="Calibri" w:hAnsi="Calibri"/>
+                <w:sz w:val="18"/>
+                <w:szCs w:val="18"/>
+              </w:rPr>
+              <w:t xml:space="preserve">Order_Lines</w:t>
+            </w:r>
+            <w:r>
+              <w:rPr>
+                <w:rFonts w:ascii="Calibri" w:cs="Calibri" w:eastAsia="Calibri" w:hAnsi="Calibri"/>
+                <w:color w:val="52606D"/>
+                <w:sz w:val="18"/>
+                <w:szCs w:val="18"/>
+              </w:rPr>
+              <w:t xml:space="preserve">: any number</w:t>
             </w:r>
           </w:p>
         </w:tc>
@@ -33280,184 +32433,6 @@
               <w:bottom w:val="single" w:color="BCC5CF" w:sz="4"/>
               <w:right w:val="single" w:color="BCC5CF" w:sz="4"/>
             </w:tcBorders>
-            <w:tcMar>
-              <w:top w:type="dxa" w:w="50"/>
-              <w:left w:type="dxa" w:w="90"/>
-              <w:bottom w:type="dxa" w:w="50"/>
-              <w:right w:type="dxa" w:w="90"/>
-            </w:tcMar>
-          </w:tcPr>
-          <w:p>
-            <w:pPr>
-              <w:spacing w:after="20"/>
-            </w:pPr>
-            <w:r>
-              <w:rPr>
-                <w:rFonts w:ascii="Calibri" w:cs="Calibri" w:eastAsia="Calibri" w:hAnsi="Calibri"/>
-                <w:sz w:val="18"/>
-                <w:szCs w:val="18"/>
-              </w:rPr>
-              <w:t xml:space="preserve">One-to-one: a proof belongs to exactly one attempt and an attempt has at most one proof.</w:t>
-            </w:r>
-          </w:p>
-        </w:tc>
-      </w:tr>
-      <w:tr>
-        <w:trPr>
-          <w:cantSplit/>
-        </w:trPr>
-        <w:tc>
-          <w:tcPr>
-            <w:tcW w:type="dxa" w:w="560"/>
-            <w:tcBorders>
-              <w:top w:val="single" w:color="BCC5CF" w:sz="4"/>
-              <w:left w:val="single" w:color="BCC5CF" w:sz="4"/>
-              <w:bottom w:val="single" w:color="BCC5CF" w:sz="4"/>
-              <w:right w:val="single" w:color="BCC5CF" w:sz="4"/>
-            </w:tcBorders>
-            <w:shd w:fill="F4F6F8" w:color="auto" w:val="clear"/>
-            <w:tcMar>
-              <w:top w:type="dxa" w:w="50"/>
-              <w:left w:type="dxa" w:w="90"/>
-              <w:bottom w:type="dxa" w:w="50"/>
-              <w:right w:type="dxa" w:w="90"/>
-            </w:tcMar>
-          </w:tcPr>
-          <w:p>
-            <w:pPr>
-              <w:spacing w:after="20"/>
-            </w:pPr>
-            <w:r>
-              <w:rPr>
-                <w:rFonts w:ascii="Calibri" w:cs="Calibri" w:eastAsia="Calibri" w:hAnsi="Calibri"/>
-                <w:sz w:val="18"/>
-                <w:szCs w:val="18"/>
-              </w:rPr>
-              <w:t xml:space="preserve">R93</w:t>
-            </w:r>
-          </w:p>
-        </w:tc>
-        <w:tc>
-          <w:tcPr>
-            <w:tcW w:type="dxa" w:w="1900"/>
-            <w:tcBorders>
-              <w:top w:val="single" w:color="BCC5CF" w:sz="4"/>
-              <w:left w:val="single" w:color="BCC5CF" w:sz="4"/>
-              <w:bottom w:val="single" w:color="BCC5CF" w:sz="4"/>
-              <w:right w:val="single" w:color="BCC5CF" w:sz="4"/>
-            </w:tcBorders>
-            <w:shd w:fill="F4F6F8" w:color="auto" w:val="clear"/>
-            <w:tcMar>
-              <w:top w:type="dxa" w:w="50"/>
-              <w:left w:type="dxa" w:w="90"/>
-              <w:bottom w:type="dxa" w:w="50"/>
-              <w:right w:type="dxa" w:w="90"/>
-            </w:tcMar>
-          </w:tcPr>
-          <w:p>
-            <w:pPr>
-              <w:spacing w:after="20"/>
-            </w:pPr>
-            <w:r>
-              <w:rPr>
-                <w:rFonts w:ascii="Calibri" w:cs="Calibri" w:eastAsia="Calibri" w:hAnsi="Calibri"/>
-                <w:b/>
-                <w:bCs/>
-                <w:sz w:val="18"/>
-                <w:szCs w:val="18"/>
-              </w:rPr>
-              <w:t xml:space="preserve">Includes</w:t>
-            </w:r>
-          </w:p>
-          <w:p>
-            <w:pPr>
-              <w:spacing w:after="20"/>
-            </w:pPr>
-            <w:r>
-              <w:rPr>
-                <w:rFonts w:ascii="Calibri" w:cs="Calibri" w:eastAsia="Calibri" w:hAnsi="Calibri"/>
-                <w:i/>
-                <w:iCs/>
-                <w:color w:val="52606D"/>
-                <w:sz w:val="16"/>
-                <w:szCs w:val="16"/>
-              </w:rPr>
-              <w:t xml:space="preserve">many-to-many</w:t>
-            </w:r>
-          </w:p>
-        </w:tc>
-        <w:tc>
-          <w:tcPr>
-            <w:tcW w:type="dxa" w:w="2600"/>
-            <w:tcBorders>
-              <w:top w:val="single" w:color="BCC5CF" w:sz="4"/>
-              <w:left w:val="single" w:color="BCC5CF" w:sz="4"/>
-              <w:bottom w:val="single" w:color="BCC5CF" w:sz="4"/>
-              <w:right w:val="single" w:color="BCC5CF" w:sz="4"/>
-            </w:tcBorders>
-            <w:shd w:fill="F4F6F8" w:color="auto" w:val="clear"/>
-            <w:tcMar>
-              <w:top w:type="dxa" w:w="50"/>
-              <w:left w:type="dxa" w:w="90"/>
-              <w:bottom w:type="dxa" w:w="50"/>
-              <w:right w:type="dxa" w:w="90"/>
-            </w:tcMar>
-          </w:tcPr>
-          <w:p>
-            <w:pPr>
-              <w:spacing w:after="20"/>
-            </w:pPr>
-            <w:r>
-              <w:rPr>
-                <w:rFonts w:ascii="Calibri" w:cs="Calibri" w:eastAsia="Calibri" w:hAnsi="Calibri"/>
-                <w:sz w:val="18"/>
-                <w:szCs w:val="18"/>
-              </w:rPr>
-              <w:t xml:space="preserve">Fulfillments</w:t>
-            </w:r>
-            <w:r>
-              <w:rPr>
-                <w:rFonts w:ascii="Calibri" w:cs="Calibri" w:eastAsia="Calibri" w:hAnsi="Calibri"/>
-                <w:color w:val="52606D"/>
-                <w:sz w:val="18"/>
-                <w:szCs w:val="18"/>
-              </w:rPr>
-              <w:t xml:space="preserve">: any number</w:t>
-            </w:r>
-          </w:p>
-          <w:p>
-            <w:pPr>
-              <w:spacing w:after="20"/>
-            </w:pPr>
-            <w:r>
-              <w:rPr>
-                <w:rFonts w:ascii="Calibri" w:cs="Calibri" w:eastAsia="Calibri" w:hAnsi="Calibri"/>
-                <w:sz w:val="18"/>
-                <w:szCs w:val="18"/>
-              </w:rPr>
-              <w:t xml:space="preserve">Order_Lines</w:t>
-            </w:r>
-            <w:r>
-              <w:rPr>
-                <w:rFonts w:ascii="Calibri" w:cs="Calibri" w:eastAsia="Calibri" w:hAnsi="Calibri"/>
-                <w:color w:val="52606D"/>
-                <w:sz w:val="18"/>
-                <w:szCs w:val="18"/>
-              </w:rPr>
-              <w:t xml:space="preserve">: any number</w:t>
-            </w:r>
-          </w:p>
-        </w:tc>
-        <w:tc>
-          <w:tcPr>
-            <w:tcW w:type="dxa" w:w="4578"/>
-            <w:tcBorders>
-              <w:top w:val="single" w:color="BCC5CF" w:sz="4"/>
-              <w:left w:val="single" w:color="BCC5CF" w:sz="4"/>
-              <w:bottom w:val="single" w:color="BCC5CF" w:sz="4"/>
-              <w:right w:val="single" w:color="BCC5CF" w:sz="4"/>
-            </w:tcBorders>
-            <w:shd w:fill="F4F6F8" w:color="auto" w:val="clear"/>
             <w:tcMar>
               <w:top w:type="dxa" w:w="50"/>
               <w:left w:type="dxa" w:w="90"/>
@@ -33705,7 +32680,7 @@
                 <w:sz w:val="18"/>
                 <w:szCs w:val="18"/>
               </w:rPr>
-              <w:t xml:space="preserve">R94</w:t>
+              <w:t xml:space="preserve">R92</w:t>
             </w:r>
           </w:p>
         </w:tc>
@@ -33880,7 +32855,7 @@
                 <w:sz w:val="18"/>
                 <w:szCs w:val="18"/>
               </w:rPr>
-              <w:t xml:space="preserve">R95</w:t>
+              <w:t xml:space="preserve">R93</w:t>
             </w:r>
           </w:p>
         </w:tc>
@@ -33913,7 +32888,7 @@
                 <w:sz w:val="18"/>
                 <w:szCs w:val="18"/>
               </w:rPr>
-              <w:t xml:space="preserve">Refunded_From</w:t>
+              <w:t xml:space="preserve">Inspects_Return</w:t>
             </w:r>
           </w:p>
           <w:p>
@@ -33960,7 +32935,7 @@
                 <w:sz w:val="18"/>
                 <w:szCs w:val="18"/>
               </w:rPr>
-              <w:t xml:space="preserve">Refunds</w:t>
+              <w:t xml:space="preserve">Return_Inspections</w:t>
             </w:r>
             <w:r>
               <w:rPr>
@@ -33982,7 +32957,7 @@
                 <w:sz w:val="18"/>
                 <w:szCs w:val="18"/>
               </w:rPr>
-              <w:t xml:space="preserve">Payments</w:t>
+              <w:t xml:space="preserve">Staff</w:t>
             </w:r>
             <w:r>
               <w:rPr>
@@ -34022,7 +32997,7 @@
                 <w:sz w:val="18"/>
                 <w:szCs w:val="18"/>
               </w:rPr>
-              <w:t xml:space="preserve">Each refund is paid back against exactly one payment.</w:t>
+              <w:t xml:space="preserve">Each return inspection is done by exactly one staff member.</w:t>
             </w:r>
           </w:p>
         </w:tc>
@@ -34057,7 +33032,7 @@
                 <w:sz w:val="18"/>
                 <w:szCs w:val="18"/>
               </w:rPr>
-              <w:t xml:space="preserve">R96</w:t>
+              <w:t xml:space="preserve">R94</w:t>
             </w:r>
           </w:p>
         </w:tc>
@@ -34089,7 +33064,7 @@
                 <w:sz w:val="18"/>
                 <w:szCs w:val="18"/>
               </w:rPr>
-              <w:t xml:space="preserve">Refund_For</w:t>
+              <w:t xml:space="preserve">Inspection_Of</w:t>
             </w:r>
           </w:p>
           <w:p>
@@ -34135,7 +33110,7 @@
                 <w:sz w:val="18"/>
                 <w:szCs w:val="18"/>
               </w:rPr>
-              <w:t xml:space="preserve">Refunds</w:t>
+              <w:t xml:space="preserve">Return_Inspections</w:t>
             </w:r>
             <w:r>
               <w:rPr>
@@ -34196,7 +33171,7 @@
                 <w:sz w:val="18"/>
                 <w:szCs w:val="18"/>
               </w:rPr>
-              <w:t xml:space="preserve">Each refund is for exactly one return request.</w:t>
+              <w:t xml:space="preserve">Each inspection checks exactly one return request.</w:t>
             </w:r>
           </w:p>
         </w:tc>
@@ -34232,7 +33207,7 @@
                 <w:sz w:val="18"/>
                 <w:szCs w:val="18"/>
               </w:rPr>
-              <w:t xml:space="preserve">R97</w:t>
+              <w:t xml:space="preserve">R95</w:t>
             </w:r>
           </w:p>
         </w:tc>
@@ -34265,7 +33240,7 @@
                 <w:sz w:val="18"/>
                 <w:szCs w:val="18"/>
               </w:rPr>
-              <w:t xml:space="preserve">Inspects_Return</w:t>
+              <w:t xml:space="preserve">About_Order</w:t>
             </w:r>
           </w:p>
           <w:p>
@@ -34312,29 +33287,29 @@
                 <w:sz w:val="18"/>
                 <w:szCs w:val="18"/>
               </w:rPr>
-              <w:t xml:space="preserve">Return_Inspections</w:t>
-            </w:r>
-            <w:r>
-              <w:rPr>
-                <w:rFonts w:ascii="Calibri" w:cs="Calibri" w:eastAsia="Calibri" w:hAnsi="Calibri"/>
-                <w:color w:val="52606D"/>
-                <w:sz w:val="18"/>
-                <w:szCs w:val="18"/>
-              </w:rPr>
-              <w:t xml:space="preserve">: exactly one</w:t>
-            </w:r>
-          </w:p>
-          <w:p>
-            <w:pPr>
-              <w:spacing w:after="20"/>
-            </w:pPr>
-            <w:r>
-              <w:rPr>
-                <w:rFonts w:ascii="Calibri" w:cs="Calibri" w:eastAsia="Calibri" w:hAnsi="Calibri"/>
-                <w:sz w:val="18"/>
-                <w:szCs w:val="18"/>
-              </w:rPr>
-              <w:t xml:space="preserve">Staff</w:t>
+              <w:t xml:space="preserve">Support_Tickets</w:t>
+            </w:r>
+            <w:r>
+              <w:rPr>
+                <w:rFonts w:ascii="Calibri" w:cs="Calibri" w:eastAsia="Calibri" w:hAnsi="Calibri"/>
+                <w:color w:val="52606D"/>
+                <w:sz w:val="18"/>
+                <w:szCs w:val="18"/>
+              </w:rPr>
+              <w:t xml:space="preserve">: at most one</w:t>
+            </w:r>
+          </w:p>
+          <w:p>
+            <w:pPr>
+              <w:spacing w:after="20"/>
+            </w:pPr>
+            <w:r>
+              <w:rPr>
+                <w:rFonts w:ascii="Calibri" w:cs="Calibri" w:eastAsia="Calibri" w:hAnsi="Calibri"/>
+                <w:sz w:val="18"/>
+                <w:szCs w:val="18"/>
+              </w:rPr>
+              <w:t xml:space="preserve">Orders</w:t>
             </w:r>
             <w:r>
               <w:rPr>
@@ -34374,7 +33349,7 @@
                 <w:sz w:val="18"/>
                 <w:szCs w:val="18"/>
               </w:rPr>
-              <w:t xml:space="preserve">Each return inspection is done by exactly one staff member.</w:t>
+              <w:t xml:space="preserve">A ticket may be about one order.</w:t>
             </w:r>
           </w:p>
         </w:tc>
@@ -34409,7 +33384,7 @@
                 <w:sz w:val="18"/>
                 <w:szCs w:val="18"/>
               </w:rPr>
-              <w:t xml:space="preserve">R98</w:t>
+              <w:t xml:space="preserve">R96</w:t>
             </w:r>
           </w:p>
         </w:tc>
@@ -34441,7 +33416,7 @@
                 <w:sz w:val="18"/>
                 <w:szCs w:val="18"/>
               </w:rPr>
-              <w:t xml:space="preserve">Inspection_Of</w:t>
+              <w:t xml:space="preserve">Opens</w:t>
             </w:r>
           </w:p>
           <w:p>
@@ -34487,7 +33462,7 @@
                 <w:sz w:val="18"/>
                 <w:szCs w:val="18"/>
               </w:rPr>
-              <w:t xml:space="preserve">Return_Inspections</w:t>
+              <w:t xml:space="preserve">Support_Tickets</w:t>
             </w:r>
             <w:r>
               <w:rPr>
@@ -34509,7 +33484,7 @@
                 <w:sz w:val="18"/>
                 <w:szCs w:val="18"/>
               </w:rPr>
-              <w:t xml:space="preserve">Return_Requests</w:t>
+              <w:t xml:space="preserve">Customers</w:t>
             </w:r>
             <w:r>
               <w:rPr>
@@ -34548,7 +33523,7 @@
                 <w:sz w:val="18"/>
                 <w:szCs w:val="18"/>
               </w:rPr>
-              <w:t xml:space="preserve">Each inspection checks exactly one return request.</w:t>
+              <w:t xml:space="preserve">Each ticket is opened by exactly one customer.</w:t>
             </w:r>
           </w:p>
         </w:tc>
@@ -34584,7 +33559,7 @@
                 <w:sz w:val="18"/>
                 <w:szCs w:val="18"/>
               </w:rPr>
-              <w:t xml:space="preserve">R99</w:t>
+              <w:t xml:space="preserve">R97</w:t>
             </w:r>
           </w:p>
         </w:tc>
@@ -34617,7 +33592,7 @@
                 <w:sz w:val="18"/>
                 <w:szCs w:val="18"/>
               </w:rPr>
-              <w:t xml:space="preserve">About_Order</w:t>
+              <w:t xml:space="preserve">Writes_Message</w:t>
             </w:r>
           </w:p>
           <w:p>
@@ -34664,29 +33639,29 @@
                 <w:sz w:val="18"/>
                 <w:szCs w:val="18"/>
               </w:rPr>
-              <w:t xml:space="preserve">Support_Tickets</w:t>
-            </w:r>
-            <w:r>
-              <w:rPr>
-                <w:rFonts w:ascii="Calibri" w:cs="Calibri" w:eastAsia="Calibri" w:hAnsi="Calibri"/>
-                <w:color w:val="52606D"/>
-                <w:sz w:val="18"/>
-                <w:szCs w:val="18"/>
-              </w:rPr>
-              <w:t xml:space="preserve">: at most one</w:t>
-            </w:r>
-          </w:p>
-          <w:p>
-            <w:pPr>
-              <w:spacing w:after="20"/>
-            </w:pPr>
-            <w:r>
-              <w:rPr>
-                <w:rFonts w:ascii="Calibri" w:cs="Calibri" w:eastAsia="Calibri" w:hAnsi="Calibri"/>
-                <w:sz w:val="18"/>
-                <w:szCs w:val="18"/>
-              </w:rPr>
-              <w:t xml:space="preserve">Orders</w:t>
+              <w:t xml:space="preserve">Ticket_Messages</w:t>
+            </w:r>
+            <w:r>
+              <w:rPr>
+                <w:rFonts w:ascii="Calibri" w:cs="Calibri" w:eastAsia="Calibri" w:hAnsi="Calibri"/>
+                <w:color w:val="52606D"/>
+                <w:sz w:val="18"/>
+                <w:szCs w:val="18"/>
+              </w:rPr>
+              <w:t xml:space="preserve">: exactly one</w:t>
+            </w:r>
+          </w:p>
+          <w:p>
+            <w:pPr>
+              <w:spacing w:after="20"/>
+            </w:pPr>
+            <w:r>
+              <w:rPr>
+                <w:rFonts w:ascii="Calibri" w:cs="Calibri" w:eastAsia="Calibri" w:hAnsi="Calibri"/>
+                <w:sz w:val="18"/>
+                <w:szCs w:val="18"/>
+              </w:rPr>
+              <w:t xml:space="preserve">Accounts</w:t>
             </w:r>
             <w:r>
               <w:rPr>
@@ -34726,7 +33701,7 @@
                 <w:sz w:val="18"/>
                 <w:szCs w:val="18"/>
               </w:rPr>
-              <w:t xml:space="preserve">A ticket may be about one order.</w:t>
+              <w:t xml:space="preserve">Each message is written by exactly one account (customer or staff).</w:t>
             </w:r>
           </w:p>
         </w:tc>
@@ -34761,7 +33736,7 @@
                 <w:sz w:val="18"/>
                 <w:szCs w:val="18"/>
               </w:rPr>
-              <w:t xml:space="preserve">R100</w:t>
+              <w:t xml:space="preserve">R98</w:t>
             </w:r>
           </w:p>
         </w:tc>
@@ -34793,7 +33768,7 @@
                 <w:sz w:val="18"/>
                 <w:szCs w:val="18"/>
               </w:rPr>
-              <w:t xml:space="preserve">Opens</w:t>
+              <w:t xml:space="preserve">Message_In</w:t>
             </w:r>
           </w:p>
           <w:p>
@@ -34839,6 +33814,28 @@
                 <w:sz w:val="18"/>
                 <w:szCs w:val="18"/>
               </w:rPr>
+              <w:t xml:space="preserve">Ticket_Messages</w:t>
+            </w:r>
+            <w:r>
+              <w:rPr>
+                <w:rFonts w:ascii="Calibri" w:cs="Calibri" w:eastAsia="Calibri" w:hAnsi="Calibri"/>
+                <w:color w:val="52606D"/>
+                <w:sz w:val="18"/>
+                <w:szCs w:val="18"/>
+              </w:rPr>
+              <w:t xml:space="preserve">: exactly one</w:t>
+            </w:r>
+          </w:p>
+          <w:p>
+            <w:pPr>
+              <w:spacing w:after="20"/>
+            </w:pPr>
+            <w:r>
+              <w:rPr>
+                <w:rFonts w:ascii="Calibri" w:cs="Calibri" w:eastAsia="Calibri" w:hAnsi="Calibri"/>
+                <w:sz w:val="18"/>
+                <w:szCs w:val="18"/>
+              </w:rPr>
               <w:t xml:space="preserve">Support_Tickets</w:t>
             </w:r>
             <w:r>
@@ -34848,28 +33845,6 @@
                 <w:sz w:val="18"/>
                 <w:szCs w:val="18"/>
               </w:rPr>
-              <w:t xml:space="preserve">: exactly one</w:t>
-            </w:r>
-          </w:p>
-          <w:p>
-            <w:pPr>
-              <w:spacing w:after="20"/>
-            </w:pPr>
-            <w:r>
-              <w:rPr>
-                <w:rFonts w:ascii="Calibri" w:cs="Calibri" w:eastAsia="Calibri" w:hAnsi="Calibri"/>
-                <w:sz w:val="18"/>
-                <w:szCs w:val="18"/>
-              </w:rPr>
-              <w:t xml:space="preserve">Customers</w:t>
-            </w:r>
-            <w:r>
-              <w:rPr>
-                <w:rFonts w:ascii="Calibri" w:cs="Calibri" w:eastAsia="Calibri" w:hAnsi="Calibri"/>
-                <w:color w:val="52606D"/>
-                <w:sz w:val="18"/>
-                <w:szCs w:val="18"/>
-              </w:rPr>
               <w:t xml:space="preserve">: any number</w:t>
             </w:r>
           </w:p>
@@ -34900,7 +33875,7 @@
                 <w:sz w:val="18"/>
                 <w:szCs w:val="18"/>
               </w:rPr>
-              <w:t xml:space="preserve">Each ticket is opened by exactly one customer.</w:t>
+              <w:t xml:space="preserve">Each message belongs to exactly one ticket.</w:t>
             </w:r>
           </w:p>
         </w:tc>
@@ -34936,359 +33911,7 @@
                 <w:sz w:val="18"/>
                 <w:szCs w:val="18"/>
               </w:rPr>
-              <w:t xml:space="preserve">R101</w:t>
-            </w:r>
-          </w:p>
-        </w:tc>
-        <w:tc>
-          <w:tcPr>
-            <w:tcW w:type="dxa" w:w="1900"/>
-            <w:tcBorders>
-              <w:top w:val="single" w:color="BCC5CF" w:sz="4"/>
-              <w:left w:val="single" w:color="BCC5CF" w:sz="4"/>
-              <w:bottom w:val="single" w:color="BCC5CF" w:sz="4"/>
-              <w:right w:val="single" w:color="BCC5CF" w:sz="4"/>
-            </w:tcBorders>
-            <w:shd w:fill="F4F6F8" w:color="auto" w:val="clear"/>
-            <w:tcMar>
-              <w:top w:type="dxa" w:w="50"/>
-              <w:left w:type="dxa" w:w="90"/>
-              <w:bottom w:type="dxa" w:w="50"/>
-              <w:right w:type="dxa" w:w="90"/>
-            </w:tcMar>
-          </w:tcPr>
-          <w:p>
-            <w:pPr>
-              <w:spacing w:after="20"/>
-            </w:pPr>
-            <w:r>
-              <w:rPr>
-                <w:rFonts w:ascii="Calibri" w:cs="Calibri" w:eastAsia="Calibri" w:hAnsi="Calibri"/>
-                <w:b/>
-                <w:bCs/>
-                <w:sz w:val="18"/>
-                <w:szCs w:val="18"/>
-              </w:rPr>
-              <w:t xml:space="preserve">Writes_Message</w:t>
-            </w:r>
-          </w:p>
-          <w:p>
-            <w:pPr>
-              <w:spacing w:after="20"/>
-            </w:pPr>
-            <w:r>
-              <w:rPr>
-                <w:rFonts w:ascii="Calibri" w:cs="Calibri" w:eastAsia="Calibri" w:hAnsi="Calibri"/>
-                <w:i/>
-                <w:iCs/>
-                <w:color w:val="52606D"/>
-                <w:sz w:val="16"/>
-                <w:szCs w:val="16"/>
-              </w:rPr>
-              <w:t xml:space="preserve">many-to-one</w:t>
-            </w:r>
-          </w:p>
-        </w:tc>
-        <w:tc>
-          <w:tcPr>
-            <w:tcW w:type="dxa" w:w="2600"/>
-            <w:tcBorders>
-              <w:top w:val="single" w:color="BCC5CF" w:sz="4"/>
-              <w:left w:val="single" w:color="BCC5CF" w:sz="4"/>
-              <w:bottom w:val="single" w:color="BCC5CF" w:sz="4"/>
-              <w:right w:val="single" w:color="BCC5CF" w:sz="4"/>
-            </w:tcBorders>
-            <w:shd w:fill="F4F6F8" w:color="auto" w:val="clear"/>
-            <w:tcMar>
-              <w:top w:type="dxa" w:w="50"/>
-              <w:left w:type="dxa" w:w="90"/>
-              <w:bottom w:type="dxa" w:w="50"/>
-              <w:right w:type="dxa" w:w="90"/>
-            </w:tcMar>
-          </w:tcPr>
-          <w:p>
-            <w:pPr>
-              <w:spacing w:after="20"/>
-            </w:pPr>
-            <w:r>
-              <w:rPr>
-                <w:rFonts w:ascii="Calibri" w:cs="Calibri" w:eastAsia="Calibri" w:hAnsi="Calibri"/>
-                <w:sz w:val="18"/>
-                <w:szCs w:val="18"/>
-              </w:rPr>
-              <w:t xml:space="preserve">Ticket_Messages</w:t>
-            </w:r>
-            <w:r>
-              <w:rPr>
-                <w:rFonts w:ascii="Calibri" w:cs="Calibri" w:eastAsia="Calibri" w:hAnsi="Calibri"/>
-                <w:color w:val="52606D"/>
-                <w:sz w:val="18"/>
-                <w:szCs w:val="18"/>
-              </w:rPr>
-              <w:t xml:space="preserve">: exactly one</w:t>
-            </w:r>
-          </w:p>
-          <w:p>
-            <w:pPr>
-              <w:spacing w:after="20"/>
-            </w:pPr>
-            <w:r>
-              <w:rPr>
-                <w:rFonts w:ascii="Calibri" w:cs="Calibri" w:eastAsia="Calibri" w:hAnsi="Calibri"/>
-                <w:sz w:val="18"/>
-                <w:szCs w:val="18"/>
-              </w:rPr>
-              <w:t xml:space="preserve">Accounts</w:t>
-            </w:r>
-            <w:r>
-              <w:rPr>
-                <w:rFonts w:ascii="Calibri" w:cs="Calibri" w:eastAsia="Calibri" w:hAnsi="Calibri"/>
-                <w:color w:val="52606D"/>
-                <w:sz w:val="18"/>
-                <w:szCs w:val="18"/>
-              </w:rPr>
-              <w:t xml:space="preserve">: any number</w:t>
-            </w:r>
-          </w:p>
-        </w:tc>
-        <w:tc>
-          <w:tcPr>
-            <w:tcW w:type="dxa" w:w="4578"/>
-            <w:tcBorders>
-              <w:top w:val="single" w:color="BCC5CF" w:sz="4"/>
-              <w:left w:val="single" w:color="BCC5CF" w:sz="4"/>
-              <w:bottom w:val="single" w:color="BCC5CF" w:sz="4"/>
-              <w:right w:val="single" w:color="BCC5CF" w:sz="4"/>
-            </w:tcBorders>
-            <w:shd w:fill="F4F6F8" w:color="auto" w:val="clear"/>
-            <w:tcMar>
-              <w:top w:type="dxa" w:w="50"/>
-              <w:left w:type="dxa" w:w="90"/>
-              <w:bottom w:type="dxa" w:w="50"/>
-              <w:right w:type="dxa" w:w="90"/>
-            </w:tcMar>
-          </w:tcPr>
-          <w:p>
-            <w:pPr>
-              <w:spacing w:after="20"/>
-            </w:pPr>
-            <w:r>
-              <w:rPr>
-                <w:rFonts w:ascii="Calibri" w:cs="Calibri" w:eastAsia="Calibri" w:hAnsi="Calibri"/>
-                <w:sz w:val="18"/>
-                <w:szCs w:val="18"/>
-              </w:rPr>
-              <w:t xml:space="preserve">Each message is written by exactly one account (customer or staff).</w:t>
-            </w:r>
-          </w:p>
-        </w:tc>
-      </w:tr>
-      <w:tr>
-        <w:trPr>
-          <w:cantSplit/>
-        </w:trPr>
-        <w:tc>
-          <w:tcPr>
-            <w:tcW w:type="dxa" w:w="560"/>
-            <w:tcBorders>
-              <w:top w:val="single" w:color="BCC5CF" w:sz="4"/>
-              <w:left w:val="single" w:color="BCC5CF" w:sz="4"/>
-              <w:bottom w:val="single" w:color="BCC5CF" w:sz="4"/>
-              <w:right w:val="single" w:color="BCC5CF" w:sz="4"/>
-            </w:tcBorders>
-            <w:tcMar>
-              <w:top w:type="dxa" w:w="50"/>
-              <w:left w:type="dxa" w:w="90"/>
-              <w:bottom w:type="dxa" w:w="50"/>
-              <w:right w:type="dxa" w:w="90"/>
-            </w:tcMar>
-          </w:tcPr>
-          <w:p>
-            <w:pPr>
-              <w:spacing w:after="20"/>
-            </w:pPr>
-            <w:r>
-              <w:rPr>
-                <w:rFonts w:ascii="Calibri" w:cs="Calibri" w:eastAsia="Calibri" w:hAnsi="Calibri"/>
-                <w:sz w:val="18"/>
-                <w:szCs w:val="18"/>
-              </w:rPr>
-              <w:t xml:space="preserve">R102</w:t>
-            </w:r>
-          </w:p>
-        </w:tc>
-        <w:tc>
-          <w:tcPr>
-            <w:tcW w:type="dxa" w:w="1900"/>
-            <w:tcBorders>
-              <w:top w:val="single" w:color="BCC5CF" w:sz="4"/>
-              <w:left w:val="single" w:color="BCC5CF" w:sz="4"/>
-              <w:bottom w:val="single" w:color="BCC5CF" w:sz="4"/>
-              <w:right w:val="single" w:color="BCC5CF" w:sz="4"/>
-            </w:tcBorders>
-            <w:tcMar>
-              <w:top w:type="dxa" w:w="50"/>
-              <w:left w:type="dxa" w:w="90"/>
-              <w:bottom w:type="dxa" w:w="50"/>
-              <w:right w:type="dxa" w:w="90"/>
-            </w:tcMar>
-          </w:tcPr>
-          <w:p>
-            <w:pPr>
-              <w:spacing w:after="20"/>
-            </w:pPr>
-            <w:r>
-              <w:rPr>
-                <w:rFonts w:ascii="Calibri" w:cs="Calibri" w:eastAsia="Calibri" w:hAnsi="Calibri"/>
-                <w:b/>
-                <w:bCs/>
-                <w:sz w:val="18"/>
-                <w:szCs w:val="18"/>
-              </w:rPr>
-              <w:t xml:space="preserve">Message_In</w:t>
-            </w:r>
-          </w:p>
-          <w:p>
-            <w:pPr>
-              <w:spacing w:after="20"/>
-            </w:pPr>
-            <w:r>
-              <w:rPr>
-                <w:rFonts w:ascii="Calibri" w:cs="Calibri" w:eastAsia="Calibri" w:hAnsi="Calibri"/>
-                <w:i/>
-                <w:iCs/>
-                <w:color w:val="52606D"/>
-                <w:sz w:val="16"/>
-                <w:szCs w:val="16"/>
-              </w:rPr>
-              <w:t xml:space="preserve">many-to-one</w:t>
-            </w:r>
-          </w:p>
-        </w:tc>
-        <w:tc>
-          <w:tcPr>
-            <w:tcW w:type="dxa" w:w="2600"/>
-            <w:tcBorders>
-              <w:top w:val="single" w:color="BCC5CF" w:sz="4"/>
-              <w:left w:val="single" w:color="BCC5CF" w:sz="4"/>
-              <w:bottom w:val="single" w:color="BCC5CF" w:sz="4"/>
-              <w:right w:val="single" w:color="BCC5CF" w:sz="4"/>
-            </w:tcBorders>
-            <w:tcMar>
-              <w:top w:type="dxa" w:w="50"/>
-              <w:left w:type="dxa" w:w="90"/>
-              <w:bottom w:type="dxa" w:w="50"/>
-              <w:right w:type="dxa" w:w="90"/>
-            </w:tcMar>
-          </w:tcPr>
-          <w:p>
-            <w:pPr>
-              <w:spacing w:after="20"/>
-            </w:pPr>
-            <w:r>
-              <w:rPr>
-                <w:rFonts w:ascii="Calibri" w:cs="Calibri" w:eastAsia="Calibri" w:hAnsi="Calibri"/>
-                <w:sz w:val="18"/>
-                <w:szCs w:val="18"/>
-              </w:rPr>
-              <w:t xml:space="preserve">Ticket_Messages</w:t>
-            </w:r>
-            <w:r>
-              <w:rPr>
-                <w:rFonts w:ascii="Calibri" w:cs="Calibri" w:eastAsia="Calibri" w:hAnsi="Calibri"/>
-                <w:color w:val="52606D"/>
-                <w:sz w:val="18"/>
-                <w:szCs w:val="18"/>
-              </w:rPr>
-              <w:t xml:space="preserve">: exactly one</w:t>
-            </w:r>
-          </w:p>
-          <w:p>
-            <w:pPr>
-              <w:spacing w:after="20"/>
-            </w:pPr>
-            <w:r>
-              <w:rPr>
-                <w:rFonts w:ascii="Calibri" w:cs="Calibri" w:eastAsia="Calibri" w:hAnsi="Calibri"/>
-                <w:sz w:val="18"/>
-                <w:szCs w:val="18"/>
-              </w:rPr>
-              <w:t xml:space="preserve">Support_Tickets</w:t>
-            </w:r>
-            <w:r>
-              <w:rPr>
-                <w:rFonts w:ascii="Calibri" w:cs="Calibri" w:eastAsia="Calibri" w:hAnsi="Calibri"/>
-                <w:color w:val="52606D"/>
-                <w:sz w:val="18"/>
-                <w:szCs w:val="18"/>
-              </w:rPr>
-              <w:t xml:space="preserve">: any number</w:t>
-            </w:r>
-          </w:p>
-        </w:tc>
-        <w:tc>
-          <w:tcPr>
-            <w:tcW w:type="dxa" w:w="4578"/>
-            <w:tcBorders>
-              <w:top w:val="single" w:color="BCC5CF" w:sz="4"/>
-              <w:left w:val="single" w:color="BCC5CF" w:sz="4"/>
-              <w:bottom w:val="single" w:color="BCC5CF" w:sz="4"/>
-              <w:right w:val="single" w:color="BCC5CF" w:sz="4"/>
-            </w:tcBorders>
-            <w:tcMar>
-              <w:top w:type="dxa" w:w="50"/>
-              <w:left w:type="dxa" w:w="90"/>
-              <w:bottom w:type="dxa" w:w="50"/>
-              <w:right w:type="dxa" w:w="90"/>
-            </w:tcMar>
-          </w:tcPr>
-          <w:p>
-            <w:pPr>
-              <w:spacing w:after="20"/>
-            </w:pPr>
-            <w:r>
-              <w:rPr>
-                <w:rFonts w:ascii="Calibri" w:cs="Calibri" w:eastAsia="Calibri" w:hAnsi="Calibri"/>
-                <w:sz w:val="18"/>
-                <w:szCs w:val="18"/>
-              </w:rPr>
-              <w:t xml:space="preserve">Each message belongs to exactly one ticket.</w:t>
-            </w:r>
-          </w:p>
-        </w:tc>
-      </w:tr>
-      <w:tr>
-        <w:trPr>
-          <w:cantSplit/>
-        </w:trPr>
-        <w:tc>
-          <w:tcPr>
-            <w:tcW w:type="dxa" w:w="560"/>
-            <w:tcBorders>
-              <w:top w:val="single" w:color="BCC5CF" w:sz="4"/>
-              <w:left w:val="single" w:color="BCC5CF" w:sz="4"/>
-              <w:bottom w:val="single" w:color="BCC5CF" w:sz="4"/>
-              <w:right w:val="single" w:color="BCC5CF" w:sz="4"/>
-            </w:tcBorders>
-            <w:shd w:fill="F4F6F8" w:color="auto" w:val="clear"/>
-            <w:tcMar>
-              <w:top w:type="dxa" w:w="50"/>
-              <w:left w:type="dxa" w:w="90"/>
-              <w:bottom w:type="dxa" w:w="50"/>
-              <w:right w:type="dxa" w:w="90"/>
-            </w:tcMar>
-          </w:tcPr>
-          <w:p>
-            <w:pPr>
-              <w:spacing w:after="20"/>
-            </w:pPr>
-            <w:r>
-              <w:rPr>
-                <w:rFonts w:ascii="Calibri" w:cs="Calibri" w:eastAsia="Calibri" w:hAnsi="Calibri"/>
-                <w:sz w:val="18"/>
-                <w:szCs w:val="18"/>
-              </w:rPr>
-              <w:t xml:space="preserve">R103</w:t>
+              <w:t xml:space="preserve">R99</w:t>
             </w:r>
           </w:p>
         </w:tc>

</xml_diff>

<commit_message>
Enforce cross-relationship consistency with composite foreign keys
Fixes the three major items of the instructor feedback:
- goods_receipt_lines: (receipt_id, purchase_order_id) references goods_receipts,
  so a receipt only receives lines of its own purchase order.
- return_lines: (return_id, order_id) references return_requests,
  so a return only covers lines of its own order.
- payment_transactions: new order_id; (payment_id, order_id) references payments and
  (return_id, order_id) references return_requests, so a refund is paid back from
  the payment of the returned order.
The report lists these rules (and the batch/bin rule) under Design choices and
under each relationship involved, in REPORT.md and the Word document.

Co-Authored-By: Claude Opus 5.5 <noreply@anthropic.com>
</commit_message>
<xml_diff>
--- a/docs/MarketLab_Project_Description.docx
+++ b/docs/MarketLab_Project_Description.docx
@@ -24978,6 +24978,29 @@
               <w:t xml:space="preserve">Each batch is stored in exactly one bin, and the bin must be in the batch's own warehouse.</w:t>
             </w:r>
           </w:p>
+          <w:p>
+            <w:pPr>
+              <w:spacing w:after="20"/>
+            </w:pPr>
+            <w:r>
+              <w:rPr>
+                <w:rFonts w:ascii="Calibri" w:cs="Calibri" w:eastAsia="Calibri" w:hAnsi="Calibri"/>
+                <w:b/>
+                <w:bCs/>
+                <w:sz w:val="18"/>
+                <w:szCs w:val="18"/>
+              </w:rPr>
+              <w:t xml:space="preserve">Consistency: </w:t>
+            </w:r>
+            <w:r>
+              <w:rPr>
+                <w:rFonts w:ascii="Calibri" w:cs="Calibri" w:eastAsia="Calibri" w:hAnsi="Calibri"/>
+                <w:sz w:val="18"/>
+                <w:szCs w:val="18"/>
+              </w:rPr>
+              <w:t xml:space="preserve">A stock batch is stored in a bin of its own warehouse (together with Batch_Of); the schema enforces it with a composite foreign key.</w:t>
+            </w:r>
+          </w:p>
         </w:tc>
       </w:tr>
       <w:tr>
@@ -25156,6 +25179,29 @@
               <w:t xml:space="preserve">Each batch belongs to exactly one stock position, that is, to one Stocks relationship (aggregation). A stock position consists of many batches.</w:t>
             </w:r>
           </w:p>
+          <w:p>
+            <w:pPr>
+              <w:spacing w:after="20"/>
+            </w:pPr>
+            <w:r>
+              <w:rPr>
+                <w:rFonts w:ascii="Calibri" w:cs="Calibri" w:eastAsia="Calibri" w:hAnsi="Calibri"/>
+                <w:b/>
+                <w:bCs/>
+                <w:sz w:val="18"/>
+                <w:szCs w:val="18"/>
+              </w:rPr>
+              <w:t xml:space="preserve">Consistency: </w:t>
+            </w:r>
+            <w:r>
+              <w:rPr>
+                <w:rFonts w:ascii="Calibri" w:cs="Calibri" w:eastAsia="Calibri" w:hAnsi="Calibri"/>
+                <w:sz w:val="18"/>
+                <w:szCs w:val="18"/>
+              </w:rPr>
+              <w:t xml:space="preserve">A stock batch is stored in a bin of its own warehouse (together with Stored_In); the schema enforces it with a composite foreign key.</w:t>
+            </w:r>
+          </w:p>
         </w:tc>
       </w:tr>
       <w:tr>
@@ -26564,6 +26610,29 @@
               <w:t xml:space="preserve">Each goods receipt is for exactly one purchase order.</w:t>
             </w:r>
           </w:p>
+          <w:p>
+            <w:pPr>
+              <w:spacing w:after="20"/>
+            </w:pPr>
+            <w:r>
+              <w:rPr>
+                <w:rFonts w:ascii="Calibri" w:cs="Calibri" w:eastAsia="Calibri" w:hAnsi="Calibri"/>
+                <w:b/>
+                <w:bCs/>
+                <w:sz w:val="18"/>
+                <w:szCs w:val="18"/>
+              </w:rPr>
+              <w:t xml:space="preserve">Consistency: </w:t>
+            </w:r>
+            <w:r>
+              <w:rPr>
+                <w:rFonts w:ascii="Calibri" w:cs="Calibri" w:eastAsia="Calibri" w:hAnsi="Calibri"/>
+                <w:sz w:val="18"/>
+                <w:szCs w:val="18"/>
+              </w:rPr>
+              <w:t xml:space="preserve">A goods receipt only receives lines of its own purchase order (together with Receives); the schema enforces it with a composite foreign key.</w:t>
+            </w:r>
+          </w:p>
         </w:tc>
       </w:tr>
       <w:tr>
@@ -27334,6 +27403,29 @@
                 <w:szCs w:val="18"/>
               </w:rPr>
               <w:t xml:space="preserve">received_qty</w:t>
+            </w:r>
+          </w:p>
+          <w:p>
+            <w:pPr>
+              <w:spacing w:after="20"/>
+            </w:pPr>
+            <w:r>
+              <w:rPr>
+                <w:rFonts w:ascii="Calibri" w:cs="Calibri" w:eastAsia="Calibri" w:hAnsi="Calibri"/>
+                <w:b/>
+                <w:bCs/>
+                <w:sz w:val="18"/>
+                <w:szCs w:val="18"/>
+              </w:rPr>
+              <w:t xml:space="preserve">Consistency: </w:t>
+            </w:r>
+            <w:r>
+              <w:rPr>
+                <w:rFonts w:ascii="Calibri" w:cs="Calibri" w:eastAsia="Calibri" w:hAnsi="Calibri"/>
+                <w:sz w:val="18"/>
+                <w:szCs w:val="18"/>
+              </w:rPr>
+              <w:t xml:space="preserve">A goods receipt only receives lines of its own purchase order (together with Receipt_For); the schema enforces it with a composite foreign key.</w:t>
             </w:r>
           </w:p>
         </w:tc>
@@ -29268,6 +29360,29 @@
               <w:t xml:space="preserve">A refund transaction pays back exactly one return request; capture transactions belong to no return.</w:t>
             </w:r>
           </w:p>
+          <w:p>
+            <w:pPr>
+              <w:spacing w:after="20"/>
+            </w:pPr>
+            <w:r>
+              <w:rPr>
+                <w:rFonts w:ascii="Calibri" w:cs="Calibri" w:eastAsia="Calibri" w:hAnsi="Calibri"/>
+                <w:b/>
+                <w:bCs/>
+                <w:sz w:val="18"/>
+                <w:szCs w:val="18"/>
+              </w:rPr>
+              <w:t xml:space="preserve">Consistency: </w:t>
+            </w:r>
+            <w:r>
+              <w:rPr>
+                <w:rFonts w:ascii="Calibri" w:cs="Calibri" w:eastAsia="Calibri" w:hAnsi="Calibri"/>
+                <w:sz w:val="18"/>
+                <w:szCs w:val="18"/>
+              </w:rPr>
+              <w:t xml:space="preserve">A refund is paid back from the payment of the order that was returned (together with Transaction_Of); the schema enforces it with a composite foreign key.</w:t>
+            </w:r>
+          </w:p>
         </w:tc>
       </w:tr>
       <w:tr>
@@ -29440,6 +29555,29 @@
                 <w:szCs w:val="18"/>
               </w:rPr>
               <w:t xml:space="preserve">Each transaction belongs to exactly one payment.</w:t>
+            </w:r>
+          </w:p>
+          <w:p>
+            <w:pPr>
+              <w:spacing w:after="20"/>
+            </w:pPr>
+            <w:r>
+              <w:rPr>
+                <w:rFonts w:ascii="Calibri" w:cs="Calibri" w:eastAsia="Calibri" w:hAnsi="Calibri"/>
+                <w:b/>
+                <w:bCs/>
+                <w:sz w:val="18"/>
+                <w:szCs w:val="18"/>
+              </w:rPr>
+              <w:t xml:space="preserve">Consistency: </w:t>
+            </w:r>
+            <w:r>
+              <w:rPr>
+                <w:rFonts w:ascii="Calibri" w:cs="Calibri" w:eastAsia="Calibri" w:hAnsi="Calibri"/>
+                <w:sz w:val="18"/>
+                <w:szCs w:val="18"/>
+              </w:rPr>
+              <w:t xml:space="preserve">A refund is paid back from the payment of the order that was returned (together with Refund_For); the schema enforces it with a composite foreign key.</w:t>
             </w:r>
           </w:p>
         </w:tc>
@@ -32822,6 +32960,29 @@
               <w:t xml:space="preserve">Each return request is for exactly one order. The customer is reached through the order.</w:t>
             </w:r>
           </w:p>
+          <w:p>
+            <w:pPr>
+              <w:spacing w:after="20"/>
+            </w:pPr>
+            <w:r>
+              <w:rPr>
+                <w:rFonts w:ascii="Calibri" w:cs="Calibri" w:eastAsia="Calibri" w:hAnsi="Calibri"/>
+                <w:b/>
+                <w:bCs/>
+                <w:sz w:val="18"/>
+                <w:szCs w:val="18"/>
+              </w:rPr>
+              <w:t xml:space="preserve">Consistency: </w:t>
+            </w:r>
+            <w:r>
+              <w:rPr>
+                <w:rFonts w:ascii="Calibri" w:cs="Calibri" w:eastAsia="Calibri" w:hAnsi="Calibri"/>
+                <w:sz w:val="18"/>
+                <w:szCs w:val="18"/>
+              </w:rPr>
+              <w:t xml:space="preserve">A return request only returns lines of its own order (together with Returns); the schema enforces it with a composite foreign key.</w:t>
+            </w:r>
+          </w:p>
         </w:tc>
       </w:tr>
       <w:tr>
@@ -34077,6 +34238,29 @@
                 <w:szCs w:val="18"/>
               </w:rPr>
               <w:t xml:space="preserve">quantity</w:t>
+            </w:r>
+          </w:p>
+          <w:p>
+            <w:pPr>
+              <w:spacing w:after="20"/>
+            </w:pPr>
+            <w:r>
+              <w:rPr>
+                <w:rFonts w:ascii="Calibri" w:cs="Calibri" w:eastAsia="Calibri" w:hAnsi="Calibri"/>
+                <w:b/>
+                <w:bCs/>
+                <w:sz w:val="18"/>
+                <w:szCs w:val="18"/>
+              </w:rPr>
+              <w:t xml:space="preserve">Consistency: </w:t>
+            </w:r>
+            <w:r>
+              <w:rPr>
+                <w:rFonts w:ascii="Calibri" w:cs="Calibri" w:eastAsia="Calibri" w:hAnsi="Calibri"/>
+                <w:sz w:val="18"/>
+                <w:szCs w:val="18"/>
+              </w:rPr>
+              <w:t xml:space="preserve">A return request only returns lines of its own order (together with Return_Of); the schema enforces it with a composite foreign key.</w:t>
             </w:r>
           </w:p>
         </w:tc>

</xml_diff>

<commit_message>
Minor feedback items: total participation and Billed_To
- Total participation (guaranteed by the application, listed in the report):
  Couriers in Serves, Order_Lines in Reserves, Fulfillments in Includes,
  Return_Requests in Returns.
- Reserves: the reserved quantities of a line add up to its ordered quantity.
- Ships_To renamed Billed_To: the order's address is its billing address and
  sets the VAT rate; pickup orders are collected at their pickup point.
- Report, diagrams, Word document and ER PDF regenerated.

Co-Authored-By: Claude Opus 5.5 <noreply@anthropic.com>
</commit_message>
<xml_diff>
--- a/docs/MarketLab_Project_Description.docx
+++ b/docs/MarketLab_Project_Description.docx
@@ -18838,7 +18838,7 @@
                 <w:sz w:val="18"/>
                 <w:szCs w:val="18"/>
               </w:rPr>
-              <w:t xml:space="preserve">: any number</w:t>
+              <w:t xml:space="preserve">: at least one</w:t>
             </w:r>
           </w:p>
           <w:p>
@@ -27771,7 +27771,7 @@
                 <w:sz w:val="18"/>
                 <w:szCs w:val="18"/>
               </w:rPr>
-              <w:t xml:space="preserve">An order may be collected at one pickup point instead of being delivered home.</w:t>
+              <w:t xml:space="preserve">An order may be collected at one pickup point instead of being delivered to its address.</w:t>
             </w:r>
           </w:p>
         </w:tc>
@@ -27840,7 +27840,7 @@
                 <w:sz w:val="18"/>
                 <w:szCs w:val="18"/>
               </w:rPr>
-              <w:t xml:space="preserve">Ships_To</w:t>
+              <w:t xml:space="preserve">Billed_To</w:t>
             </w:r>
           </w:p>
           <w:p>
@@ -27949,7 +27949,7 @@
                 <w:sz w:val="18"/>
                 <w:szCs w:val="18"/>
               </w:rPr>
-              <w:t xml:space="preserve">Every order has exactly one delivery or billing address.</w:t>
+              <w:t xml:space="preserve">Every order has exactly one billing address, and the VAT rate comes from its country. A home-delivery order is also shipped to this address; a pickup order is collected at its pickup point (Collect_At).</w:t>
             </w:r>
           </w:p>
         </w:tc>
@@ -30406,31 +30406,31 @@
                 <w:sz w:val="18"/>
                 <w:szCs w:val="18"/>
               </w:rPr>
+              <w:t xml:space="preserve">: at least one</w:t>
+            </w:r>
+          </w:p>
+          <w:p>
+            <w:pPr>
+              <w:spacing w:after="20"/>
+            </w:pPr>
+            <w:r>
+              <w:rPr>
+                <w:rFonts w:ascii="Calibri" w:cs="Calibri" w:eastAsia="Calibri" w:hAnsi="Calibri"/>
+                <w:sz w:val="18"/>
+                <w:szCs w:val="18"/>
+              </w:rPr>
+              <w:t xml:space="preserve">Stocks (aggregation)</w:t>
+            </w:r>
+            <w:r>
+              <w:rPr>
+                <w:rFonts w:ascii="Calibri" w:cs="Calibri" w:eastAsia="Calibri" w:hAnsi="Calibri"/>
+                <w:color w:val="52606D"/>
+                <w:sz w:val="18"/>
+                <w:szCs w:val="18"/>
+              </w:rPr>
               <w:t xml:space="preserve">: any number</w:t>
             </w:r>
           </w:p>
-          <w:p>
-            <w:pPr>
-              <w:spacing w:after="20"/>
-            </w:pPr>
-            <w:r>
-              <w:rPr>
-                <w:rFonts w:ascii="Calibri" w:cs="Calibri" w:eastAsia="Calibri" w:hAnsi="Calibri"/>
-                <w:sz w:val="18"/>
-                <w:szCs w:val="18"/>
-              </w:rPr>
-              <w:t xml:space="preserve">Stocks (aggregation)</w:t>
-            </w:r>
-            <w:r>
-              <w:rPr>
-                <w:rFonts w:ascii="Calibri" w:cs="Calibri" w:eastAsia="Calibri" w:hAnsi="Calibri"/>
-                <w:color w:val="52606D"/>
-                <w:sz w:val="18"/>
-                <w:szCs w:val="18"/>
-              </w:rPr>
-              <w:t xml:space="preserve">: any number</w:t>
-            </w:r>
-          </w:p>
         </w:tc>
         <w:tc>
           <w:tcPr>
@@ -30459,7 +30459,7 @@
                 <w:sz w:val="18"/>
                 <w:szCs w:val="18"/>
               </w:rPr>
-              <w:t xml:space="preserve">An order line reserves a quantity from a stock position, that is, from a Stocks relationship (seller, variant, warehouse) treated as one object. One line may be served from several warehouses.</w:t>
+              <w:t xml:space="preserve">An order line reserves a quantity from a stock position, that is, from a Stocks relationship (seller, variant, warehouse) treated as one object. One line may be served from several warehouses; the reserved quantities of a line add up to its ordered quantity.</w:t>
             </w:r>
           </w:p>
           <w:p>
@@ -32536,7 +32536,7 @@
                 <w:sz w:val="18"/>
                 <w:szCs w:val="18"/>
               </w:rPr>
-              <w:t xml:space="preserve">: any number</w:t>
+              <w:t xml:space="preserve">: at least one</w:t>
             </w:r>
           </w:p>
           <w:p>
@@ -34161,7 +34161,7 @@
                 <w:sz w:val="18"/>
                 <w:szCs w:val="18"/>
               </w:rPr>
-              <w:t xml:space="preserve">: any number</w:t>
+              <w:t xml:space="preserve">: at least one</w:t>
             </w:r>
           </w:p>
           <w:p>

</xml_diff>

<commit_message>
Fix review findings: seed table count, delivery attempt rules, report identity
- seed.py: the expected table count is read from schema.sql (was a fixed 83;
  the schema now has 79, so reopening an existing database raised RuntimeError).
- delivery_attempts: evidence_url only on delivered attempts; a partial unique
  index allows at most one delivered attempt per shipment. build_er.py ignores
  partial unique indexes, which are no key constraint.
- app.deliver records a delivered attempt per shipment (courier serving the
  order's city, the customer as recipient); the workflow test checks it.
- Word report: student names and IDs filled in; document author set to the team.
- README: 79 tables; 12 entity-vs-attribute candidates, 55 would remain.

Co-Authored-By: Claude Opus 5.5 <noreply@anthropic.com>
</commit_message>
<xml_diff>
--- a/docs/MarketLab_Project_Description.docx
+++ b/docs/MarketLab_Project_Description.docx
@@ -233,10 +233,8 @@
                 <w:rFonts w:ascii="Calibri" w:cs="Calibri" w:eastAsia="Calibri" w:hAnsi="Calibri"/>
                 <w:sz w:val="18"/>
                 <w:szCs w:val="18"/>
-                <w:highlight w:val="yellow"/>
-                <w:highlightCs w:val="yellow"/>
-              </w:rPr>
-              <w:t xml:space="preserve">[ENTER FULL NAME]</w:t>
+              </w:rPr>
+              <w:t xml:space="preserve">Barlas Şen</w:t>
             </w:r>
           </w:p>
         </w:tc>
@@ -265,10 +263,8 @@
                 <w:rFonts w:ascii="Calibri" w:cs="Calibri" w:eastAsia="Calibri" w:hAnsi="Calibri"/>
                 <w:sz w:val="18"/>
                 <w:szCs w:val="18"/>
-                <w:highlight w:val="yellow"/>
-                <w:highlightCs w:val="yellow"/>
-              </w:rPr>
-              <w:t xml:space="preserve">[ENTER STUDENT ID]</w:t>
+              </w:rPr>
+              <w:t xml:space="preserve">S033303</w:t>
             </w:r>
           </w:p>
         </w:tc>
@@ -334,10 +330,8 @@
                 <w:rFonts w:ascii="Calibri" w:cs="Calibri" w:eastAsia="Calibri" w:hAnsi="Calibri"/>
                 <w:sz w:val="18"/>
                 <w:szCs w:val="18"/>
-                <w:highlight w:val="yellow"/>
-                <w:highlightCs w:val="yellow"/>
-              </w:rPr>
-              <w:t xml:space="preserve">[ENTER FULL NAME]</w:t>
+              </w:rPr>
+              <w:t xml:space="preserve">Uygar Ege Kocakır</w:t>
             </w:r>
           </w:p>
         </w:tc>
@@ -367,10 +361,8 @@
                 <w:rFonts w:ascii="Calibri" w:cs="Calibri" w:eastAsia="Calibri" w:hAnsi="Calibri"/>
                 <w:sz w:val="18"/>
                 <w:szCs w:val="18"/>
-                <w:highlight w:val="yellow"/>
-                <w:highlightCs w:val="yellow"/>
-              </w:rPr>
-              <w:t xml:space="preserve">[ENTER STUDENT ID]</w:t>
+              </w:rPr>
+              <w:t xml:space="preserve">S045910</w:t>
             </w:r>
           </w:p>
         </w:tc>
@@ -13683,7 +13675,7 @@
                 <w:sz w:val="18"/>
                 <w:szCs w:val="18"/>
               </w:rPr>
-              <w:t xml:space="preserve">One try by a courier to hand over a shipment, with its outcome. A successful attempt also records the proof of delivery: who received the parcel and, optionally, a photo or signature link; these attributes stay empty on failed attempts.</w:t>
+              <w:t xml:space="preserve">One try by a courier to hand over a shipment, with its outcome. A successful attempt also records the proof of delivery: who received the parcel and, optionally, a photo or signature link; these attributes stay empty on failed attempts. A shipment can fail several times but is delivered at most once.</w:t>
             </w:r>
           </w:p>
         </w:tc>

</xml_diff>

<commit_message>
Final check: five more cross-relationship rules, stale note, Word lock file
Composite foreign keys, the same method as the instructor's three major items:
- orders(address_id, customer_id) -> addresses: billing address of the order's own customer.
- payments: customer_id ties (order_id, customer_id) -> orders and
  (payment_method_id, customer_id) -> payment_methods.
- invoice_lines(invoice_id, order_id) -> invoices.
- fulfillment_lines(fulfillment_id, order_id) -> fulfillments.
- support_tickets(order_id, customer_id) -> orders.
The rules are listed in the report under Design choices and each relationship.
build_er.py treats a foreign key as unique when a unique column set lies inside it,
so Paid_By stays one-to-one. Foreign keys are declared in the old order, so the
diagram and the E/R numbering are unchanged.

Also: DERS_UYUMU note on unenforced rules updated; Word lock file removed and ignored.

Co-Authored-By: Claude Opus 5.5 <noreply@anthropic.com>
</commit_message>
<xml_diff>
--- a/docs/MarketLab_Project_Description.docx
+++ b/docs/MarketLab_Project_Description.docx
@@ -18181,6 +18181,29 @@
               <w:t xml:space="preserve">Each address is saved by exactly one account; an account can save many addresses.</w:t>
             </w:r>
           </w:p>
+          <w:p>
+            <w:pPr>
+              <w:spacing w:after="20"/>
+            </w:pPr>
+            <w:r>
+              <w:rPr>
+                <w:rFonts w:ascii="Calibri" w:cs="Calibri" w:eastAsia="Calibri" w:hAnsi="Calibri"/>
+                <w:b/>
+                <w:bCs/>
+                <w:sz w:val="18"/>
+                <w:szCs w:val="18"/>
+              </w:rPr>
+              <w:t xml:space="preserve">Consistency: </w:t>
+            </w:r>
+            <w:r>
+              <w:rPr>
+                <w:rFonts w:ascii="Calibri" w:cs="Calibri" w:eastAsia="Calibri" w:hAnsi="Calibri"/>
+                <w:sz w:val="18"/>
+                <w:szCs w:val="18"/>
+              </w:rPr>
+              <w:t xml:space="preserve">An order is billed to an address that its own customer saved (together with Places and Billed_To); the schema enforces it with a composite foreign key.</w:t>
+            </w:r>
+          </w:p>
         </w:tc>
       </w:tr>
       <w:tr>
@@ -27944,6 +27967,29 @@
               <w:t xml:space="preserve">Every order has exactly one billing address, and the VAT rate comes from its country. A home-delivery order is also shipped to this address; a pickup order is collected at its pickup point (Collect_At).</w:t>
             </w:r>
           </w:p>
+          <w:p>
+            <w:pPr>
+              <w:spacing w:after="20"/>
+            </w:pPr>
+            <w:r>
+              <w:rPr>
+                <w:rFonts w:ascii="Calibri" w:cs="Calibri" w:eastAsia="Calibri" w:hAnsi="Calibri"/>
+                <w:b/>
+                <w:bCs/>
+                <w:sz w:val="18"/>
+                <w:szCs w:val="18"/>
+              </w:rPr>
+              <w:t xml:space="preserve">Consistency: </w:t>
+            </w:r>
+            <w:r>
+              <w:rPr>
+                <w:rFonts w:ascii="Calibri" w:cs="Calibri" w:eastAsia="Calibri" w:hAnsi="Calibri"/>
+                <w:sz w:val="18"/>
+                <w:szCs w:val="18"/>
+              </w:rPr>
+              <w:t xml:space="preserve">An order is billed to an address that its own customer saved (together with Places and Saves_Address); the schema enforces it with a composite foreign key.</w:t>
+            </w:r>
+          </w:p>
         </w:tc>
       </w:tr>
       <w:tr>
@@ -28118,6 +28164,52 @@
               <w:t xml:space="preserve">Every order is placed by exactly one customer.</w:t>
             </w:r>
           </w:p>
+          <w:p>
+            <w:pPr>
+              <w:spacing w:after="20"/>
+            </w:pPr>
+            <w:r>
+              <w:rPr>
+                <w:rFonts w:ascii="Calibri" w:cs="Calibri" w:eastAsia="Calibri" w:hAnsi="Calibri"/>
+                <w:b/>
+                <w:bCs/>
+                <w:sz w:val="18"/>
+                <w:szCs w:val="18"/>
+              </w:rPr>
+              <w:t xml:space="preserve">Consistency: </w:t>
+            </w:r>
+            <w:r>
+              <w:rPr>
+                <w:rFonts w:ascii="Calibri" w:cs="Calibri" w:eastAsia="Calibri" w:hAnsi="Calibri"/>
+                <w:sz w:val="18"/>
+                <w:szCs w:val="18"/>
+              </w:rPr>
+              <w:t xml:space="preserve">An order is billed to an address that its own customer saved (together with Billed_To and Saves_Address); the schema enforces it with a composite foreign key.</w:t>
+            </w:r>
+          </w:p>
+          <w:p>
+            <w:pPr>
+              <w:spacing w:after="20"/>
+            </w:pPr>
+            <w:r>
+              <w:rPr>
+                <w:rFonts w:ascii="Calibri" w:cs="Calibri" w:eastAsia="Calibri" w:hAnsi="Calibri"/>
+                <w:b/>
+                <w:bCs/>
+                <w:sz w:val="18"/>
+                <w:szCs w:val="18"/>
+              </w:rPr>
+              <w:t xml:space="preserve">Consistency: </w:t>
+            </w:r>
+            <w:r>
+              <w:rPr>
+                <w:rFonts w:ascii="Calibri" w:cs="Calibri" w:eastAsia="Calibri" w:hAnsi="Calibri"/>
+                <w:sz w:val="18"/>
+                <w:szCs w:val="18"/>
+              </w:rPr>
+              <w:t xml:space="preserve">A support ticket can only be about an order of the customer who opened it (together with Opens and About_Order); the schema enforces it with a composite foreign key.</w:t>
+            </w:r>
+          </w:p>
         </w:tc>
       </w:tr>
       <w:tr>
@@ -28822,6 +28914,29 @@
               <w:t xml:space="preserve">Each payment method is saved by exactly one customer.</w:t>
             </w:r>
           </w:p>
+          <w:p>
+            <w:pPr>
+              <w:spacing w:after="20"/>
+            </w:pPr>
+            <w:r>
+              <w:rPr>
+                <w:rFonts w:ascii="Calibri" w:cs="Calibri" w:eastAsia="Calibri" w:hAnsi="Calibri"/>
+                <w:b/>
+                <w:bCs/>
+                <w:sz w:val="18"/>
+                <w:szCs w:val="18"/>
+              </w:rPr>
+              <w:t xml:space="preserve">Consistency: </w:t>
+            </w:r>
+            <w:r>
+              <w:rPr>
+                <w:rFonts w:ascii="Calibri" w:cs="Calibri" w:eastAsia="Calibri" w:hAnsi="Calibri"/>
+                <w:sz w:val="18"/>
+                <w:szCs w:val="18"/>
+              </w:rPr>
+              <w:t xml:space="preserve">An order is paid with a payment method that its own customer saved (together with Paid_By and Uses_Method); the schema enforces it with a composite foreign key.</w:t>
+            </w:r>
+          </w:p>
         </w:tc>
       </w:tr>
       <w:tr>
@@ -29000,6 +29115,29 @@
               <w:t xml:space="preserve">Every payment uses exactly one saved payment method.</w:t>
             </w:r>
           </w:p>
+          <w:p>
+            <w:pPr>
+              <w:spacing w:after="20"/>
+            </w:pPr>
+            <w:r>
+              <w:rPr>
+                <w:rFonts w:ascii="Calibri" w:cs="Calibri" w:eastAsia="Calibri" w:hAnsi="Calibri"/>
+                <w:b/>
+                <w:bCs/>
+                <w:sz w:val="18"/>
+                <w:szCs w:val="18"/>
+              </w:rPr>
+              <w:t xml:space="preserve">Consistency: </w:t>
+            </w:r>
+            <w:r>
+              <w:rPr>
+                <w:rFonts w:ascii="Calibri" w:cs="Calibri" w:eastAsia="Calibri" w:hAnsi="Calibri"/>
+                <w:sz w:val="18"/>
+                <w:szCs w:val="18"/>
+              </w:rPr>
+              <w:t xml:space="preserve">An order is paid with a payment method that its own customer saved (together with Paid_By and Saves_Method); the schema enforces it with a composite foreign key.</w:t>
+            </w:r>
+          </w:p>
         </w:tc>
       </w:tr>
       <w:tr>
@@ -29174,6 +29312,29 @@
               <w:t xml:space="preserve">One-to-one: every payment is for exactly one order and an order has at most one payment.</w:t>
             </w:r>
           </w:p>
+          <w:p>
+            <w:pPr>
+              <w:spacing w:after="20"/>
+            </w:pPr>
+            <w:r>
+              <w:rPr>
+                <w:rFonts w:ascii="Calibri" w:cs="Calibri" w:eastAsia="Calibri" w:hAnsi="Calibri"/>
+                <w:b/>
+                <w:bCs/>
+                <w:sz w:val="18"/>
+                <w:szCs w:val="18"/>
+              </w:rPr>
+              <w:t xml:space="preserve">Consistency: </w:t>
+            </w:r>
+            <w:r>
+              <w:rPr>
+                <w:rFonts w:ascii="Calibri" w:cs="Calibri" w:eastAsia="Calibri" w:hAnsi="Calibri"/>
+                <w:sz w:val="18"/>
+                <w:szCs w:val="18"/>
+              </w:rPr>
+              <w:t xml:space="preserve">An order is paid with a payment method that its own customer saved (together with Uses_Method and Saves_Method); the schema enforces it with a composite foreign key.</w:t>
+            </w:r>
+          </w:p>
         </w:tc>
       </w:tr>
       <w:tr>
@@ -29750,6 +29911,29 @@
               <w:t xml:space="preserve">One-to-one: every invoice is for exactly one order and an order has at most one invoice.</w:t>
             </w:r>
           </w:p>
+          <w:p>
+            <w:pPr>
+              <w:spacing w:after="20"/>
+            </w:pPr>
+            <w:r>
+              <w:rPr>
+                <w:rFonts w:ascii="Calibri" w:cs="Calibri" w:eastAsia="Calibri" w:hAnsi="Calibri"/>
+                <w:b/>
+                <w:bCs/>
+                <w:sz w:val="18"/>
+                <w:szCs w:val="18"/>
+              </w:rPr>
+              <w:t xml:space="preserve">Consistency: </w:t>
+            </w:r>
+            <w:r>
+              <w:rPr>
+                <w:rFonts w:ascii="Calibri" w:cs="Calibri" w:eastAsia="Calibri" w:hAnsi="Calibri"/>
+                <w:sz w:val="18"/>
+                <w:szCs w:val="18"/>
+              </w:rPr>
+              <w:t xml:space="preserve">An invoice only bills lines of its own order (together with Invoice_Has_Line and Bills); the schema enforces it with a composite foreign key.</w:t>
+            </w:r>
+          </w:p>
         </w:tc>
       </w:tr>
       <w:tr>
@@ -29924,6 +30108,29 @@
               <w:t xml:space="preserve">Each invoice line bills exactly one order line.</w:t>
             </w:r>
           </w:p>
+          <w:p>
+            <w:pPr>
+              <w:spacing w:after="20"/>
+            </w:pPr>
+            <w:r>
+              <w:rPr>
+                <w:rFonts w:ascii="Calibri" w:cs="Calibri" w:eastAsia="Calibri" w:hAnsi="Calibri"/>
+                <w:b/>
+                <w:bCs/>
+                <w:sz w:val="18"/>
+                <w:szCs w:val="18"/>
+              </w:rPr>
+              <w:t xml:space="preserve">Consistency: </w:t>
+            </w:r>
+            <w:r>
+              <w:rPr>
+                <w:rFonts w:ascii="Calibri" w:cs="Calibri" w:eastAsia="Calibri" w:hAnsi="Calibri"/>
+                <w:sz w:val="18"/>
+                <w:szCs w:val="18"/>
+              </w:rPr>
+              <w:t xml:space="preserve">An invoice only bills lines of its own order (together with Invoiced_As and Invoice_Has_Line); the schema enforces it with a composite foreign key.</w:t>
+            </w:r>
+          </w:p>
         </w:tc>
       </w:tr>
       <w:tr>
@@ -30274,6 +30481,29 @@
                 <w:szCs w:val="18"/>
               </w:rPr>
               <w:t xml:space="preserve">An invoice line exists only inside its invoice and is numbered within it.</w:t>
+            </w:r>
+          </w:p>
+          <w:p>
+            <w:pPr>
+              <w:spacing w:after="20"/>
+            </w:pPr>
+            <w:r>
+              <w:rPr>
+                <w:rFonts w:ascii="Calibri" w:cs="Calibri" w:eastAsia="Calibri" w:hAnsi="Calibri"/>
+                <w:b/>
+                <w:bCs/>
+                <w:sz w:val="18"/>
+                <w:szCs w:val="18"/>
+              </w:rPr>
+              <w:t xml:space="preserve">Consistency: </w:t>
+            </w:r>
+            <w:r>
+              <w:rPr>
+                <w:rFonts w:ascii="Calibri" w:cs="Calibri" w:eastAsia="Calibri" w:hAnsi="Calibri"/>
+                <w:sz w:val="18"/>
+                <w:szCs w:val="18"/>
+              </w:rPr>
+              <w:t xml:space="preserve">An invoice only bills lines of its own order (together with Invoiced_As and Bills); the schema enforces it with a composite foreign key.</w:t>
             </w:r>
           </w:p>
         </w:tc>
@@ -31175,6 +31405,29 @@
               <w:t xml:space="preserve">Each fulfilment fulfils exactly one order.</w:t>
             </w:r>
           </w:p>
+          <w:p>
+            <w:pPr>
+              <w:spacing w:after="20"/>
+            </w:pPr>
+            <w:r>
+              <w:rPr>
+                <w:rFonts w:ascii="Calibri" w:cs="Calibri" w:eastAsia="Calibri" w:hAnsi="Calibri"/>
+                <w:b/>
+                <w:bCs/>
+                <w:sz w:val="18"/>
+                <w:szCs w:val="18"/>
+              </w:rPr>
+              <w:t xml:space="preserve">Consistency: </w:t>
+            </w:r>
+            <w:r>
+              <w:rPr>
+                <w:rFonts w:ascii="Calibri" w:cs="Calibri" w:eastAsia="Calibri" w:hAnsi="Calibri"/>
+                <w:sz w:val="18"/>
+                <w:szCs w:val="18"/>
+              </w:rPr>
+              <w:t xml:space="preserve">A fulfilment only includes lines of its own order (together with Includes); the schema enforces it with a composite foreign key.</w:t>
+            </w:r>
+          </w:p>
         </w:tc>
       </w:tr>
       <w:tr>
@@ -32604,6 +32857,29 @@
                 <w:szCs w:val="18"/>
               </w:rPr>
               <w:t xml:space="preserve">quantity</w:t>
+            </w:r>
+          </w:p>
+          <w:p>
+            <w:pPr>
+              <w:spacing w:after="20"/>
+            </w:pPr>
+            <w:r>
+              <w:rPr>
+                <w:rFonts w:ascii="Calibri" w:cs="Calibri" w:eastAsia="Calibri" w:hAnsi="Calibri"/>
+                <w:b/>
+                <w:bCs/>
+                <w:sz w:val="18"/>
+                <w:szCs w:val="18"/>
+              </w:rPr>
+              <w:t xml:space="preserve">Consistency: </w:t>
+            </w:r>
+            <w:r>
+              <w:rPr>
+                <w:rFonts w:ascii="Calibri" w:cs="Calibri" w:eastAsia="Calibri" w:hAnsi="Calibri"/>
+                <w:sz w:val="18"/>
+                <w:szCs w:val="18"/>
+              </w:rPr>
+              <w:t xml:space="preserve">A fulfilment only includes lines of its own order (together with Fulfills); the schema enforces it with a composite foreign key.</w:t>
             </w:r>
           </w:p>
         </w:tc>
@@ -33505,6 +33781,29 @@
               <w:t xml:space="preserve">A ticket may be about one order.</w:t>
             </w:r>
           </w:p>
+          <w:p>
+            <w:pPr>
+              <w:spacing w:after="20"/>
+            </w:pPr>
+            <w:r>
+              <w:rPr>
+                <w:rFonts w:ascii="Calibri" w:cs="Calibri" w:eastAsia="Calibri" w:hAnsi="Calibri"/>
+                <w:b/>
+                <w:bCs/>
+                <w:sz w:val="18"/>
+                <w:szCs w:val="18"/>
+              </w:rPr>
+              <w:t xml:space="preserve">Consistency: </w:t>
+            </w:r>
+            <w:r>
+              <w:rPr>
+                <w:rFonts w:ascii="Calibri" w:cs="Calibri" w:eastAsia="Calibri" w:hAnsi="Calibri"/>
+                <w:sz w:val="18"/>
+                <w:szCs w:val="18"/>
+              </w:rPr>
+              <w:t xml:space="preserve">A support ticket can only be about an order of the customer who opened it (together with Opens and Places); the schema enforces it with a composite foreign key.</w:t>
+            </w:r>
+          </w:p>
         </w:tc>
       </w:tr>
       <w:tr>
@@ -33677,6 +33976,29 @@
                 <w:szCs w:val="18"/>
               </w:rPr>
               <w:t xml:space="preserve">Each ticket is opened by exactly one customer.</w:t>
+            </w:r>
+          </w:p>
+          <w:p>
+            <w:pPr>
+              <w:spacing w:after="20"/>
+            </w:pPr>
+            <w:r>
+              <w:rPr>
+                <w:rFonts w:ascii="Calibri" w:cs="Calibri" w:eastAsia="Calibri" w:hAnsi="Calibri"/>
+                <w:b/>
+                <w:bCs/>
+                <w:sz w:val="18"/>
+                <w:szCs w:val="18"/>
+              </w:rPr>
+              <w:t xml:space="preserve">Consistency: </w:t>
+            </w:r>
+            <w:r>
+              <w:rPr>
+                <w:rFonts w:ascii="Calibri" w:cs="Calibri" w:eastAsia="Calibri" w:hAnsi="Calibri"/>
+                <w:sz w:val="18"/>
+                <w:szCs w:val="18"/>
+              </w:rPr>
+              <w:t xml:space="preserve">A support ticket can only be about an order of the customer who opened it (together with About_Order and Places); the schema enforces it with a composite foreign key.</w:t>
             </w:r>
           </w:p>
         </w:tc>

</xml_diff>

<commit_message>
Word report: short Design choices section
A closing section after Part 2 summarises the reasons behind the model, since the
ER submission also grades design choices: entity vs. attribute, the ternary Stocks
and its aggregation, avoiding redundancy (including the four merges after review),
total participation guaranteed by the application, and the nine consistency rules
enforced with composite foreign keys. build_er.py exports the rules to model.json.

Co-Authored-By: Claude Opus 5.5 <noreply@anthropic.com>
</commit_message>
<xml_diff>
--- a/docs/MarketLab_Project_Description.docx
+++ b/docs/MarketLab_Project_Description.docx
@@ -398,7 +398,7 @@
         <w:rPr>
           <w:rFonts w:ascii="Calibri" w:cs="Calibri" w:eastAsia="Calibri" w:hAnsi="Calibri"/>
         </w:rPr>
-        <w:t xml:space="preserve">The design has 67 entity sets and 99 relationship sets, plus one ISA hierarchy, all connected in a single ER diagram (submitted as MarketLab_ER_Diagram.pdf). It includes weak entities, an ISA hierarchy, a ternary relationship and an aggregation. Part 1 defines every entity set and Part 2 every relationship set.</w:t>
+        <w:t xml:space="preserve">The design has 67 entity sets and 99 relationship sets, plus one ISA hierarchy, all connected in a single ER diagram (submitted as MarketLab_ER_Diagram.pdf). It includes weak entities, an ISA hierarchy, a ternary relationship and an aggregation. Part 1 defines every entity set and Part 2 every relationship set; a short final section explains the main design choices.</w:t>
       </w:r>
     </w:p>
     <w:p>
@@ -34575,6 +34575,1493 @@
                 <w:szCs w:val="18"/>
               </w:rPr>
               <w:t xml:space="preserve">A return request only returns lines of its own order (together with Return_Of); the schema enforces it with a composite foreign key.</w:t>
+            </w:r>
+          </w:p>
+        </w:tc>
+      </w:tr>
+    </w:tbl>
+    <w:p>
+      <w:pPr>
+        <w:pStyle w:val="Heading1"/>
+      </w:pPr>
+      <w:r>
+        <w:rPr>
+          <w:rFonts w:ascii="Calibri" w:cs="Calibri" w:eastAsia="Calibri" w:hAnsi="Calibri"/>
+        </w:rPr>
+        <w:t xml:space="preserve">Design choices</w:t>
+      </w:r>
+    </w:p>
+    <w:p>
+      <w:pPr>
+        <w:spacing w:after="120" w:line="276"/>
+      </w:pPr>
+      <w:r>
+        <w:rPr>
+          <w:rFonts w:ascii="Calibri" w:cs="Calibri" w:eastAsia="Calibri" w:hAnsi="Calibri"/>
+          <w:b/>
+          <w:bCs/>
+        </w:rPr>
+        <w:t xml:space="preserve">Entity vs. attribute. </w:t>
+      </w:r>
+      <w:r>
+        <w:rPr>
+          <w:rFonts w:ascii="Calibri" w:cs="Calibri" w:eastAsia="Calibri" w:hAnsi="Calibri"/>
+        </w:rPr>
+        <w:t xml:space="preserve">An attribute holds one value, so a concept that an entity can have several of, or whose structure matters, is an entity set: Customer_Notifications, Countries, Cities, Product_Images, Price_History, Product_Documents, Review_Images, Stock_Movements, Order_Status_Events, Payment_Transactions, Tracking_Events, Ticket_Messages. The reason for each is given under it in Part 1.</w:t>
+      </w:r>
+    </w:p>
+    <w:p>
+      <w:pPr>
+        <w:spacing w:after="120" w:line="276"/>
+      </w:pPr>
+      <w:r>
+        <w:rPr>
+          <w:rFonts w:ascii="Calibri" w:cs="Calibri" w:eastAsia="Calibri" w:hAnsi="Calibri"/>
+          <w:b/>
+          <w:bCs/>
+        </w:rPr>
+        <w:t xml:space="preserve">Ternary relationship and aggregation. </w:t>
+      </w:r>
+      <w:r>
+        <w:rPr>
+          <w:rFonts w:ascii="Calibri" w:cs="Calibri" w:eastAsia="Calibri" w:hAnsi="Calibri"/>
+        </w:rPr>
+        <w:t xml:space="preserve">The available quantity belongs to a seller, a variant and a warehouse together: the three binary relationships between them cannot tell how many units of one seller's variant are in one warehouse, so Stocks is ternary. Order lines reserve stock from, and stock batches belong to, one such stock position, so Stocks is aggregated and Reserves and Batch_Of connect to the aggregation.</w:t>
+      </w:r>
+    </w:p>
+    <w:p>
+      <w:pPr>
+        <w:spacing w:after="120" w:line="276"/>
+      </w:pPr>
+      <w:r>
+        <w:rPr>
+          <w:rFonts w:ascii="Calibri" w:cs="Calibri" w:eastAsia="Calibri" w:hAnsi="Calibri"/>
+          <w:b/>
+          <w:bCs/>
+        </w:rPr>
+        <w:t xml:space="preserve">Avoiding redundancy. </w:t>
+      </w:r>
+      <w:r>
+        <w:rPr>
+          <w:rFonts w:ascii="Calibri" w:cs="Calibri" w:eastAsia="Calibri" w:hAnsi="Calibri"/>
+        </w:rPr>
+        <w:t xml:space="preserve">A fact is stored once. A return request or a coupon redemption does not store the customer again, because the order already determines it. After the instructor's review, four entity sets that repeated information were merged: Inventory_Adjustments into Stock_Movements, Refunds into Payment_Transactions, Proof_Of_Delivery into Delivery_Attempts and Storage_Zones into Storage_Bins.</w:t>
+      </w:r>
+    </w:p>
+    <w:p>
+      <w:pPr>
+        <w:keepNext/>
+        <w:spacing w:after="120" w:line="276"/>
+      </w:pPr>
+      <w:r>
+        <w:rPr>
+          <w:rFonts w:ascii="Calibri" w:cs="Calibri" w:eastAsia="Calibri" w:hAnsi="Calibri"/>
+          <w:b/>
+          <w:bCs/>
+        </w:rPr>
+        <w:t xml:space="preserve">Total participation that a foreign key cannot express. </w:t>
+      </w:r>
+      <w:r>
+        <w:rPr>
+          <w:rFonts w:ascii="Calibri" w:cs="Calibri" w:eastAsia="Calibri" w:hAnsi="Calibri"/>
+        </w:rPr>
+        <w:t xml:space="preserve">When the "one" side of a relationship must take part at least once, a foreign key cannot require it; the application creates the rows together:</w:t>
+      </w:r>
+    </w:p>
+    <w:tbl>
+      <w:tblPr>
+        <w:tblW w:type="dxa" w:w="9638"/>
+        <w:tblBorders>
+          <w:top w:val="single" w:color="auto" w:sz="4"/>
+          <w:left w:val="single" w:color="auto" w:sz="4"/>
+          <w:bottom w:val="single" w:color="auto" w:sz="4"/>
+          <w:right w:val="single" w:color="auto" w:sz="4"/>
+          <w:insideH w:val="single" w:color="auto" w:sz="4"/>
+          <w:insideV w:val="single" w:color="auto" w:sz="4"/>
+        </w:tblBorders>
+      </w:tblPr>
+      <w:tblGrid>
+        <w:gridCol w:w="3300"/>
+        <w:gridCol w:w="6338"/>
+      </w:tblGrid>
+      <w:tr>
+        <w:trPr>
+          <w:cantSplit/>
+          <w:tblHeader/>
+        </w:trPr>
+        <w:tc>
+          <w:tcPr>
+            <w:tcW w:type="dxa" w:w="3300"/>
+            <w:tcBorders>
+              <w:top w:val="single" w:color="BCC5CF" w:sz="4"/>
+              <w:left w:val="single" w:color="BCC5CF" w:sz="4"/>
+              <w:bottom w:val="single" w:color="BCC5CF" w:sz="4"/>
+              <w:right w:val="single" w:color="BCC5CF" w:sz="4"/>
+            </w:tcBorders>
+            <w:shd w:fill="2F4A6D" w:color="auto" w:val="clear"/>
+            <w:tcMar>
+              <w:top w:type="dxa" w:w="50"/>
+              <w:left w:type="dxa" w:w="90"/>
+              <w:bottom w:type="dxa" w:w="50"/>
+              <w:right w:type="dxa" w:w="90"/>
+            </w:tcMar>
+          </w:tcPr>
+          <w:p>
+            <w:pPr>
+              <w:spacing w:after="20"/>
+            </w:pPr>
+            <w:r>
+              <w:rPr>
+                <w:rFonts w:ascii="Calibri" w:cs="Calibri" w:eastAsia="Calibri" w:hAnsi="Calibri"/>
+                <w:b/>
+                <w:bCs/>
+                <w:color w:val="FFFFFF"/>
+                <w:sz w:val="18"/>
+                <w:szCs w:val="18"/>
+              </w:rPr>
+              <w:t xml:space="preserve">Entity set in relationship</w:t>
+            </w:r>
+          </w:p>
+        </w:tc>
+        <w:tc>
+          <w:tcPr>
+            <w:tcW w:type="dxa" w:w="6338"/>
+            <w:tcBorders>
+              <w:top w:val="single" w:color="BCC5CF" w:sz="4"/>
+              <w:left w:val="single" w:color="BCC5CF" w:sz="4"/>
+              <w:bottom w:val="single" w:color="BCC5CF" w:sz="4"/>
+              <w:right w:val="single" w:color="BCC5CF" w:sz="4"/>
+            </w:tcBorders>
+            <w:shd w:fill="2F4A6D" w:color="auto" w:val="clear"/>
+            <w:tcMar>
+              <w:top w:type="dxa" w:w="50"/>
+              <w:left w:type="dxa" w:w="90"/>
+              <w:bottom w:type="dxa" w:w="50"/>
+              <w:right w:type="dxa" w:w="90"/>
+            </w:tcMar>
+          </w:tcPr>
+          <w:p>
+            <w:pPr>
+              <w:spacing w:after="20"/>
+            </w:pPr>
+            <w:r>
+              <w:rPr>
+                <w:rFonts w:ascii="Calibri" w:cs="Calibri" w:eastAsia="Calibri" w:hAnsi="Calibri"/>
+                <w:b/>
+                <w:bCs/>
+                <w:color w:val="FFFFFF"/>
+                <w:sz w:val="18"/>
+                <w:szCs w:val="18"/>
+              </w:rPr>
+              <w:t xml:space="preserve">Guaranteed because</w:t>
+            </w:r>
+          </w:p>
+        </w:tc>
+      </w:tr>
+      <w:tr>
+        <w:trPr>
+          <w:cantSplit/>
+        </w:trPr>
+        <w:tc>
+          <w:tcPr>
+            <w:tcW w:type="dxa" w:w="3300"/>
+            <w:tcBorders>
+              <w:top w:val="single" w:color="BCC5CF" w:sz="4"/>
+              <w:left w:val="single" w:color="BCC5CF" w:sz="4"/>
+              <w:bottom w:val="single" w:color="BCC5CF" w:sz="4"/>
+              <w:right w:val="single" w:color="BCC5CF" w:sz="4"/>
+            </w:tcBorders>
+            <w:tcMar>
+              <w:top w:type="dxa" w:w="50"/>
+              <w:left w:type="dxa" w:w="90"/>
+              <w:bottom w:type="dxa" w:w="50"/>
+              <w:right w:type="dxa" w:w="90"/>
+            </w:tcMar>
+          </w:tcPr>
+          <w:p>
+            <w:pPr>
+              <w:spacing w:after="20"/>
+            </w:pPr>
+            <w:r>
+              <w:rPr>
+                <w:rFonts w:ascii="Calibri" w:cs="Calibri" w:eastAsia="Calibri" w:hAnsi="Calibri"/>
+                <w:sz w:val="18"/>
+                <w:szCs w:val="18"/>
+              </w:rPr>
+              <w:t xml:space="preserve">Orders in Contains</w:t>
+            </w:r>
+          </w:p>
+        </w:tc>
+        <w:tc>
+          <w:tcPr>
+            <w:tcW w:type="dxa" w:w="6338"/>
+            <w:tcBorders>
+              <w:top w:val="single" w:color="BCC5CF" w:sz="4"/>
+              <w:left w:val="single" w:color="BCC5CF" w:sz="4"/>
+              <w:bottom w:val="single" w:color="BCC5CF" w:sz="4"/>
+              <w:right w:val="single" w:color="BCC5CF" w:sz="4"/>
+            </w:tcBorders>
+            <w:tcMar>
+              <w:top w:type="dxa" w:w="50"/>
+              <w:left w:type="dxa" w:w="90"/>
+              <w:bottom w:type="dxa" w:w="50"/>
+              <w:right w:type="dxa" w:w="90"/>
+            </w:tcMar>
+          </w:tcPr>
+          <w:p>
+            <w:pPr>
+              <w:spacing w:after="20"/>
+            </w:pPr>
+            <w:r>
+              <w:rPr>
+                <w:rFonts w:ascii="Calibri" w:cs="Calibri" w:eastAsia="Calibri" w:hAnsi="Calibri"/>
+                <w:sz w:val="18"/>
+                <w:szCs w:val="18"/>
+              </w:rPr>
+              <w:t xml:space="preserve">Checkout always creates at least one order line.</w:t>
+            </w:r>
+          </w:p>
+        </w:tc>
+      </w:tr>
+      <w:tr>
+        <w:trPr>
+          <w:cantSplit/>
+        </w:trPr>
+        <w:tc>
+          <w:tcPr>
+            <w:tcW w:type="dxa" w:w="3300"/>
+            <w:tcBorders>
+              <w:top w:val="single" w:color="BCC5CF" w:sz="4"/>
+              <w:left w:val="single" w:color="BCC5CF" w:sz="4"/>
+              <w:bottom w:val="single" w:color="BCC5CF" w:sz="4"/>
+              <w:right w:val="single" w:color="BCC5CF" w:sz="4"/>
+            </w:tcBorders>
+            <w:shd w:fill="F4F6F8" w:color="auto" w:val="clear"/>
+            <w:tcMar>
+              <w:top w:type="dxa" w:w="50"/>
+              <w:left w:type="dxa" w:w="90"/>
+              <w:bottom w:type="dxa" w:w="50"/>
+              <w:right w:type="dxa" w:w="90"/>
+            </w:tcMar>
+          </w:tcPr>
+          <w:p>
+            <w:pPr>
+              <w:spacing w:after="20"/>
+            </w:pPr>
+            <w:r>
+              <w:rPr>
+                <w:rFonts w:ascii="Calibri" w:cs="Calibri" w:eastAsia="Calibri" w:hAnsi="Calibri"/>
+                <w:sz w:val="18"/>
+                <w:szCs w:val="18"/>
+              </w:rPr>
+              <w:t xml:space="preserve">Purchase_Orders in PO_Has_Line</w:t>
+            </w:r>
+          </w:p>
+        </w:tc>
+        <w:tc>
+          <w:tcPr>
+            <w:tcW w:type="dxa" w:w="6338"/>
+            <w:tcBorders>
+              <w:top w:val="single" w:color="BCC5CF" w:sz="4"/>
+              <w:left w:val="single" w:color="BCC5CF" w:sz="4"/>
+              <w:bottom w:val="single" w:color="BCC5CF" w:sz="4"/>
+              <w:right w:val="single" w:color="BCC5CF" w:sz="4"/>
+            </w:tcBorders>
+            <w:shd w:fill="F4F6F8" w:color="auto" w:val="clear"/>
+            <w:tcMar>
+              <w:top w:type="dxa" w:w="50"/>
+              <w:left w:type="dxa" w:w="90"/>
+              <w:bottom w:type="dxa" w:w="50"/>
+              <w:right w:type="dxa" w:w="90"/>
+            </w:tcMar>
+          </w:tcPr>
+          <w:p>
+            <w:pPr>
+              <w:spacing w:after="20"/>
+            </w:pPr>
+            <w:r>
+              <w:rPr>
+                <w:rFonts w:ascii="Calibri" w:cs="Calibri" w:eastAsia="Calibri" w:hAnsi="Calibri"/>
+                <w:sz w:val="18"/>
+                <w:szCs w:val="18"/>
+              </w:rPr>
+              <w:t xml:space="preserve">A purchase order is created together with its lines.</w:t>
+            </w:r>
+          </w:p>
+        </w:tc>
+      </w:tr>
+      <w:tr>
+        <w:trPr>
+          <w:cantSplit/>
+        </w:trPr>
+        <w:tc>
+          <w:tcPr>
+            <w:tcW w:type="dxa" w:w="3300"/>
+            <w:tcBorders>
+              <w:top w:val="single" w:color="BCC5CF" w:sz="4"/>
+              <w:left w:val="single" w:color="BCC5CF" w:sz="4"/>
+              <w:bottom w:val="single" w:color="BCC5CF" w:sz="4"/>
+              <w:right w:val="single" w:color="BCC5CF" w:sz="4"/>
+            </w:tcBorders>
+            <w:tcMar>
+              <w:top w:type="dxa" w:w="50"/>
+              <w:left w:type="dxa" w:w="90"/>
+              <w:bottom w:type="dxa" w:w="50"/>
+              <w:right w:type="dxa" w:w="90"/>
+            </w:tcMar>
+          </w:tcPr>
+          <w:p>
+            <w:pPr>
+              <w:spacing w:after="20"/>
+            </w:pPr>
+            <w:r>
+              <w:rPr>
+                <w:rFonts w:ascii="Calibri" w:cs="Calibri" w:eastAsia="Calibri" w:hAnsi="Calibri"/>
+                <w:sz w:val="18"/>
+                <w:szCs w:val="18"/>
+              </w:rPr>
+              <w:t xml:space="preserve">Invoices in Invoice_Has_Line</w:t>
+            </w:r>
+          </w:p>
+        </w:tc>
+        <w:tc>
+          <w:tcPr>
+            <w:tcW w:type="dxa" w:w="6338"/>
+            <w:tcBorders>
+              <w:top w:val="single" w:color="BCC5CF" w:sz="4"/>
+              <w:left w:val="single" w:color="BCC5CF" w:sz="4"/>
+              <w:bottom w:val="single" w:color="BCC5CF" w:sz="4"/>
+              <w:right w:val="single" w:color="BCC5CF" w:sz="4"/>
+            </w:tcBorders>
+            <w:tcMar>
+              <w:top w:type="dxa" w:w="50"/>
+              <w:left w:type="dxa" w:w="90"/>
+              <w:bottom w:type="dxa" w:w="50"/>
+              <w:right w:type="dxa" w:w="90"/>
+            </w:tcMar>
+          </w:tcPr>
+          <w:p>
+            <w:pPr>
+              <w:spacing w:after="20"/>
+            </w:pPr>
+            <w:r>
+              <w:rPr>
+                <w:rFonts w:ascii="Calibri" w:cs="Calibri" w:eastAsia="Calibri" w:hAnsi="Calibri"/>
+                <w:sz w:val="18"/>
+                <w:szCs w:val="18"/>
+              </w:rPr>
+              <w:t xml:space="preserve">An invoice is issued with one line per order line.</w:t>
+            </w:r>
+          </w:p>
+        </w:tc>
+      </w:tr>
+      <w:tr>
+        <w:trPr>
+          <w:cantSplit/>
+        </w:trPr>
+        <w:tc>
+          <w:tcPr>
+            <w:tcW w:type="dxa" w:w="3300"/>
+            <w:tcBorders>
+              <w:top w:val="single" w:color="BCC5CF" w:sz="4"/>
+              <w:left w:val="single" w:color="BCC5CF" w:sz="4"/>
+              <w:bottom w:val="single" w:color="BCC5CF" w:sz="4"/>
+              <w:right w:val="single" w:color="BCC5CF" w:sz="4"/>
+            </w:tcBorders>
+            <w:shd w:fill="F4F6F8" w:color="auto" w:val="clear"/>
+            <w:tcMar>
+              <w:top w:type="dxa" w:w="50"/>
+              <w:left w:type="dxa" w:w="90"/>
+              <w:bottom w:type="dxa" w:w="50"/>
+              <w:right w:type="dxa" w:w="90"/>
+            </w:tcMar>
+          </w:tcPr>
+          <w:p>
+            <w:pPr>
+              <w:spacing w:after="20"/>
+            </w:pPr>
+            <w:r>
+              <w:rPr>
+                <w:rFonts w:ascii="Calibri" w:cs="Calibri" w:eastAsia="Calibri" w:hAnsi="Calibri"/>
+                <w:sz w:val="18"/>
+                <w:szCs w:val="18"/>
+              </w:rPr>
+              <w:t xml:space="preserve">Products in Variant_Of</w:t>
+            </w:r>
+          </w:p>
+        </w:tc>
+        <w:tc>
+          <w:tcPr>
+            <w:tcW w:type="dxa" w:w="6338"/>
+            <w:tcBorders>
+              <w:top w:val="single" w:color="BCC5CF" w:sz="4"/>
+              <w:left w:val="single" w:color="BCC5CF" w:sz="4"/>
+              <w:bottom w:val="single" w:color="BCC5CF" w:sz="4"/>
+              <w:right w:val="single" w:color="BCC5CF" w:sz="4"/>
+            </w:tcBorders>
+            <w:shd w:fill="F4F6F8" w:color="auto" w:val="clear"/>
+            <w:tcMar>
+              <w:top w:type="dxa" w:w="50"/>
+              <w:left w:type="dxa" w:w="90"/>
+              <w:bottom w:type="dxa" w:w="50"/>
+              <w:right w:type="dxa" w:w="90"/>
+            </w:tcMar>
+          </w:tcPr>
+          <w:p>
+            <w:pPr>
+              <w:spacing w:after="20"/>
+            </w:pPr>
+            <w:r>
+              <w:rPr>
+                <w:rFonts w:ascii="Calibri" w:cs="Calibri" w:eastAsia="Calibri" w:hAnsi="Calibri"/>
+                <w:sz w:val="18"/>
+                <w:szCs w:val="18"/>
+              </w:rPr>
+              <w:t xml:space="preserve">A product is only published with at least one variant.</w:t>
+            </w:r>
+          </w:p>
+        </w:tc>
+      </w:tr>
+      <w:tr>
+        <w:trPr>
+          <w:cantSplit/>
+        </w:trPr>
+        <w:tc>
+          <w:tcPr>
+            <w:tcW w:type="dxa" w:w="3300"/>
+            <w:tcBorders>
+              <w:top w:val="single" w:color="BCC5CF" w:sz="4"/>
+              <w:left w:val="single" w:color="BCC5CF" w:sz="4"/>
+              <w:bottom w:val="single" w:color="BCC5CF" w:sz="4"/>
+              <w:right w:val="single" w:color="BCC5CF" w:sz="4"/>
+            </w:tcBorders>
+            <w:tcMar>
+              <w:top w:type="dxa" w:w="50"/>
+              <w:left w:type="dxa" w:w="90"/>
+              <w:bottom w:type="dxa" w:w="50"/>
+              <w:right w:type="dxa" w:w="90"/>
+            </w:tcMar>
+          </w:tcPr>
+          <w:p>
+            <w:pPr>
+              <w:spacing w:after="20"/>
+            </w:pPr>
+            <w:r>
+              <w:rPr>
+                <w:rFonts w:ascii="Calibri" w:cs="Calibri" w:eastAsia="Calibri" w:hAnsi="Calibri"/>
+                <w:sz w:val="18"/>
+                <w:szCs w:val="18"/>
+              </w:rPr>
+              <w:t xml:space="preserve">Carriers in Offers_Service</w:t>
+            </w:r>
+          </w:p>
+        </w:tc>
+        <w:tc>
+          <w:tcPr>
+            <w:tcW w:type="dxa" w:w="6338"/>
+            <w:tcBorders>
+              <w:top w:val="single" w:color="BCC5CF" w:sz="4"/>
+              <w:left w:val="single" w:color="BCC5CF" w:sz="4"/>
+              <w:bottom w:val="single" w:color="BCC5CF" w:sz="4"/>
+              <w:right w:val="single" w:color="BCC5CF" w:sz="4"/>
+            </w:tcBorders>
+            <w:tcMar>
+              <w:top w:type="dxa" w:w="50"/>
+              <w:left w:type="dxa" w:w="90"/>
+              <w:bottom w:type="dxa" w:w="50"/>
+              <w:right w:type="dxa" w:w="90"/>
+            </w:tcMar>
+          </w:tcPr>
+          <w:p>
+            <w:pPr>
+              <w:spacing w:after="20"/>
+            </w:pPr>
+            <w:r>
+              <w:rPr>
+                <w:rFonts w:ascii="Calibri" w:cs="Calibri" w:eastAsia="Calibri" w:hAnsi="Calibri"/>
+                <w:sz w:val="18"/>
+                <w:szCs w:val="18"/>
+              </w:rPr>
+              <w:t xml:space="preserve">A carrier is only usable with at least one service.</w:t>
+            </w:r>
+          </w:p>
+        </w:tc>
+      </w:tr>
+      <w:tr>
+        <w:trPr>
+          <w:cantSplit/>
+        </w:trPr>
+        <w:tc>
+          <w:tcPr>
+            <w:tcW w:type="dxa" w:w="3300"/>
+            <w:tcBorders>
+              <w:top w:val="single" w:color="BCC5CF" w:sz="4"/>
+              <w:left w:val="single" w:color="BCC5CF" w:sz="4"/>
+              <w:bottom w:val="single" w:color="BCC5CF" w:sz="4"/>
+              <w:right w:val="single" w:color="BCC5CF" w:sz="4"/>
+            </w:tcBorders>
+            <w:shd w:fill="F4F6F8" w:color="auto" w:val="clear"/>
+            <w:tcMar>
+              <w:top w:type="dxa" w:w="50"/>
+              <w:left w:type="dxa" w:w="90"/>
+              <w:bottom w:type="dxa" w:w="50"/>
+              <w:right w:type="dxa" w:w="90"/>
+            </w:tcMar>
+          </w:tcPr>
+          <w:p>
+            <w:pPr>
+              <w:spacing w:after="20"/>
+            </w:pPr>
+            <w:r>
+              <w:rPr>
+                <w:rFonts w:ascii="Calibri" w:cs="Calibri" w:eastAsia="Calibri" w:hAnsi="Calibri"/>
+                <w:sz w:val="18"/>
+                <w:szCs w:val="18"/>
+              </w:rPr>
+              <w:t xml:space="preserve">Couriers in Serves</w:t>
+            </w:r>
+          </w:p>
+        </w:tc>
+        <w:tc>
+          <w:tcPr>
+            <w:tcW w:type="dxa" w:w="6338"/>
+            <w:tcBorders>
+              <w:top w:val="single" w:color="BCC5CF" w:sz="4"/>
+              <w:left w:val="single" w:color="BCC5CF" w:sz="4"/>
+              <w:bottom w:val="single" w:color="BCC5CF" w:sz="4"/>
+              <w:right w:val="single" w:color="BCC5CF" w:sz="4"/>
+            </w:tcBorders>
+            <w:shd w:fill="F4F6F8" w:color="auto" w:val="clear"/>
+            <w:tcMar>
+              <w:top w:type="dxa" w:w="50"/>
+              <w:left w:type="dxa" w:w="90"/>
+              <w:bottom w:type="dxa" w:w="50"/>
+              <w:right w:type="dxa" w:w="90"/>
+            </w:tcMar>
+          </w:tcPr>
+          <w:p>
+            <w:pPr>
+              <w:spacing w:after="20"/>
+            </w:pPr>
+            <w:r>
+              <w:rPr>
+                <w:rFonts w:ascii="Calibri" w:cs="Calibri" w:eastAsia="Calibri" w:hAnsi="Calibri"/>
+                <w:sz w:val="18"/>
+                <w:szCs w:val="18"/>
+              </w:rPr>
+              <w:t xml:space="preserve">A courier is registered together with at least one delivery zone.</w:t>
+            </w:r>
+          </w:p>
+        </w:tc>
+      </w:tr>
+      <w:tr>
+        <w:trPr>
+          <w:cantSplit/>
+        </w:trPr>
+        <w:tc>
+          <w:tcPr>
+            <w:tcW w:type="dxa" w:w="3300"/>
+            <w:tcBorders>
+              <w:top w:val="single" w:color="BCC5CF" w:sz="4"/>
+              <w:left w:val="single" w:color="BCC5CF" w:sz="4"/>
+              <w:bottom w:val="single" w:color="BCC5CF" w:sz="4"/>
+              <w:right w:val="single" w:color="BCC5CF" w:sz="4"/>
+            </w:tcBorders>
+            <w:tcMar>
+              <w:top w:type="dxa" w:w="50"/>
+              <w:left w:type="dxa" w:w="90"/>
+              <w:bottom w:type="dxa" w:w="50"/>
+              <w:right w:type="dxa" w:w="90"/>
+            </w:tcMar>
+          </w:tcPr>
+          <w:p>
+            <w:pPr>
+              <w:spacing w:after="20"/>
+            </w:pPr>
+            <w:r>
+              <w:rPr>
+                <w:rFonts w:ascii="Calibri" w:cs="Calibri" w:eastAsia="Calibri" w:hAnsi="Calibri"/>
+                <w:sz w:val="18"/>
+                <w:szCs w:val="18"/>
+              </w:rPr>
+              <w:t xml:space="preserve">Order_Lines in Reserves</w:t>
+            </w:r>
+          </w:p>
+        </w:tc>
+        <w:tc>
+          <w:tcPr>
+            <w:tcW w:type="dxa" w:w="6338"/>
+            <w:tcBorders>
+              <w:top w:val="single" w:color="BCC5CF" w:sz="4"/>
+              <w:left w:val="single" w:color="BCC5CF" w:sz="4"/>
+              <w:bottom w:val="single" w:color="BCC5CF" w:sz="4"/>
+              <w:right w:val="single" w:color="BCC5CF" w:sz="4"/>
+            </w:tcBorders>
+            <w:tcMar>
+              <w:top w:type="dxa" w:w="50"/>
+              <w:left w:type="dxa" w:w="90"/>
+              <w:bottom w:type="dxa" w:w="50"/>
+              <w:right w:type="dxa" w:w="90"/>
+            </w:tcMar>
+          </w:tcPr>
+          <w:p>
+            <w:pPr>
+              <w:spacing w:after="20"/>
+            </w:pPr>
+            <w:r>
+              <w:rPr>
+                <w:rFonts w:ascii="Calibri" w:cs="Calibri" w:eastAsia="Calibri" w:hAnsi="Calibri"/>
+                <w:sz w:val="18"/>
+                <w:szCs w:val="18"/>
+              </w:rPr>
+              <w:t xml:space="preserve">Checkout reserves stock for every order line and creates no order when stock is short.</w:t>
+            </w:r>
+          </w:p>
+        </w:tc>
+      </w:tr>
+      <w:tr>
+        <w:trPr>
+          <w:cantSplit/>
+        </w:trPr>
+        <w:tc>
+          <w:tcPr>
+            <w:tcW w:type="dxa" w:w="3300"/>
+            <w:tcBorders>
+              <w:top w:val="single" w:color="BCC5CF" w:sz="4"/>
+              <w:left w:val="single" w:color="BCC5CF" w:sz="4"/>
+              <w:bottom w:val="single" w:color="BCC5CF" w:sz="4"/>
+              <w:right w:val="single" w:color="BCC5CF" w:sz="4"/>
+            </w:tcBorders>
+            <w:shd w:fill="F4F6F8" w:color="auto" w:val="clear"/>
+            <w:tcMar>
+              <w:top w:type="dxa" w:w="50"/>
+              <w:left w:type="dxa" w:w="90"/>
+              <w:bottom w:type="dxa" w:w="50"/>
+              <w:right w:type="dxa" w:w="90"/>
+            </w:tcMar>
+          </w:tcPr>
+          <w:p>
+            <w:pPr>
+              <w:spacing w:after="20"/>
+            </w:pPr>
+            <w:r>
+              <w:rPr>
+                <w:rFonts w:ascii="Calibri" w:cs="Calibri" w:eastAsia="Calibri" w:hAnsi="Calibri"/>
+                <w:sz w:val="18"/>
+                <w:szCs w:val="18"/>
+              </w:rPr>
+              <w:t xml:space="preserve">Fulfillments in Includes</w:t>
+            </w:r>
+          </w:p>
+        </w:tc>
+        <w:tc>
+          <w:tcPr>
+            <w:tcW w:type="dxa" w:w="6338"/>
+            <w:tcBorders>
+              <w:top w:val="single" w:color="BCC5CF" w:sz="4"/>
+              <w:left w:val="single" w:color="BCC5CF" w:sz="4"/>
+              <w:bottom w:val="single" w:color="BCC5CF" w:sz="4"/>
+              <w:right w:val="single" w:color="BCC5CF" w:sz="4"/>
+            </w:tcBorders>
+            <w:shd w:fill="F4F6F8" w:color="auto" w:val="clear"/>
+            <w:tcMar>
+              <w:top w:type="dxa" w:w="50"/>
+              <w:left w:type="dxa" w:w="90"/>
+              <w:bottom w:type="dxa" w:w="50"/>
+              <w:right w:type="dxa" w:w="90"/>
+            </w:tcMar>
+          </w:tcPr>
+          <w:p>
+            <w:pPr>
+              <w:spacing w:after="20"/>
+            </w:pPr>
+            <w:r>
+              <w:rPr>
+                <w:rFonts w:ascii="Calibri" w:cs="Calibri" w:eastAsia="Calibri" w:hAnsi="Calibri"/>
+                <w:sz w:val="18"/>
+                <w:szCs w:val="18"/>
+              </w:rPr>
+              <w:t xml:space="preserve">A fulfilment is created together with the order lines it ships.</w:t>
+            </w:r>
+          </w:p>
+        </w:tc>
+      </w:tr>
+      <w:tr>
+        <w:trPr>
+          <w:cantSplit/>
+        </w:trPr>
+        <w:tc>
+          <w:tcPr>
+            <w:tcW w:type="dxa" w:w="3300"/>
+            <w:tcBorders>
+              <w:top w:val="single" w:color="BCC5CF" w:sz="4"/>
+              <w:left w:val="single" w:color="BCC5CF" w:sz="4"/>
+              <w:bottom w:val="single" w:color="BCC5CF" w:sz="4"/>
+              <w:right w:val="single" w:color="BCC5CF" w:sz="4"/>
+            </w:tcBorders>
+            <w:tcMar>
+              <w:top w:type="dxa" w:w="50"/>
+              <w:left w:type="dxa" w:w="90"/>
+              <w:bottom w:type="dxa" w:w="50"/>
+              <w:right w:type="dxa" w:w="90"/>
+            </w:tcMar>
+          </w:tcPr>
+          <w:p>
+            <w:pPr>
+              <w:spacing w:after="20"/>
+            </w:pPr>
+            <w:r>
+              <w:rPr>
+                <w:rFonts w:ascii="Calibri" w:cs="Calibri" w:eastAsia="Calibri" w:hAnsi="Calibri"/>
+                <w:sz w:val="18"/>
+                <w:szCs w:val="18"/>
+              </w:rPr>
+              <w:t xml:space="preserve">Return_Requests in Returns</w:t>
+            </w:r>
+          </w:p>
+        </w:tc>
+        <w:tc>
+          <w:tcPr>
+            <w:tcW w:type="dxa" w:w="6338"/>
+            <w:tcBorders>
+              <w:top w:val="single" w:color="BCC5CF" w:sz="4"/>
+              <w:left w:val="single" w:color="BCC5CF" w:sz="4"/>
+              <w:bottom w:val="single" w:color="BCC5CF" w:sz="4"/>
+              <w:right w:val="single" w:color="BCC5CF" w:sz="4"/>
+            </w:tcBorders>
+            <w:tcMar>
+              <w:top w:type="dxa" w:w="50"/>
+              <w:left w:type="dxa" w:w="90"/>
+              <w:bottom w:type="dxa" w:w="50"/>
+              <w:right w:type="dxa" w:w="90"/>
+            </w:tcMar>
+          </w:tcPr>
+          <w:p>
+            <w:pPr>
+              <w:spacing w:after="20"/>
+            </w:pPr>
+            <w:r>
+              <w:rPr>
+                <w:rFonts w:ascii="Calibri" w:cs="Calibri" w:eastAsia="Calibri" w:hAnsi="Calibri"/>
+                <w:sz w:val="18"/>
+                <w:szCs w:val="18"/>
+              </w:rPr>
+              <w:t xml:space="preserve">A return request is created together with the order lines it returns.</w:t>
+            </w:r>
+          </w:p>
+        </w:tc>
+      </w:tr>
+    </w:tbl>
+    <w:p>
+      <w:pPr>
+        <w:spacing w:after="120"/>
+      </w:pPr>
+      <w:r>
+        <w:rPr>
+          <w:rFonts w:ascii="Calibri" w:cs="Calibri" w:eastAsia="Calibri" w:hAnsi="Calibri"/>
+        </w:rPr>
+        <w:t xml:space="preserve"/>
+      </w:r>
+    </w:p>
+    <w:p>
+      <w:pPr>
+        <w:keepNext/>
+        <w:spacing w:after="120" w:line="276"/>
+      </w:pPr>
+      <w:r>
+        <w:rPr>
+          <w:rFonts w:ascii="Calibri" w:cs="Calibri" w:eastAsia="Calibri" w:hAnsi="Calibri"/>
+          <w:b/>
+          <w:bCs/>
+        </w:rPr>
+        <w:t xml:space="preserve">Consistency across relationships. </w:t>
+      </w:r>
+      <w:r>
+        <w:rPr>
+          <w:rFonts w:ascii="Calibri" w:cs="Calibri" w:eastAsia="Calibri" w:hAnsi="Calibri"/>
+        </w:rPr>
+        <w:t xml:space="preserve">Some rules need two relationships to reach the same entity. For example, a return request belongs to one order (Return_Of), and each returned line is an order line (Returns); both must name the same order. An ER diagram draws every relationship on its own, so it cannot show such a rule. The schema enforces each one with a composite foreign key through the shared column, e.g. return_lines(return_id, order_id) references return_requests(return_id, order_id). These rules are also noted under each relationship in Part 2.</w:t>
+      </w:r>
+    </w:p>
+    <w:tbl>
+      <w:tblPr>
+        <w:tblW w:type="dxa" w:w="9638"/>
+        <w:tblBorders>
+          <w:top w:val="single" w:color="auto" w:sz="4"/>
+          <w:left w:val="single" w:color="auto" w:sz="4"/>
+          <w:bottom w:val="single" w:color="auto" w:sz="4"/>
+          <w:right w:val="single" w:color="auto" w:sz="4"/>
+          <w:insideH w:val="single" w:color="auto" w:sz="4"/>
+          <w:insideV w:val="single" w:color="auto" w:sz="4"/>
+        </w:tblBorders>
+      </w:tblPr>
+      <w:tblGrid>
+        <w:gridCol w:w="6338"/>
+        <w:gridCol w:w="3300"/>
+      </w:tblGrid>
+      <w:tr>
+        <w:trPr>
+          <w:cantSplit/>
+          <w:tblHeader/>
+        </w:trPr>
+        <w:tc>
+          <w:tcPr>
+            <w:tcW w:type="dxa" w:w="6338"/>
+            <w:tcBorders>
+              <w:top w:val="single" w:color="BCC5CF" w:sz="4"/>
+              <w:left w:val="single" w:color="BCC5CF" w:sz="4"/>
+              <w:bottom w:val="single" w:color="BCC5CF" w:sz="4"/>
+              <w:right w:val="single" w:color="BCC5CF" w:sz="4"/>
+            </w:tcBorders>
+            <w:shd w:fill="2F4A6D" w:color="auto" w:val="clear"/>
+            <w:tcMar>
+              <w:top w:type="dxa" w:w="50"/>
+              <w:left w:type="dxa" w:w="90"/>
+              <w:bottom w:type="dxa" w:w="50"/>
+              <w:right w:type="dxa" w:w="90"/>
+            </w:tcMar>
+          </w:tcPr>
+          <w:p>
+            <w:pPr>
+              <w:spacing w:after="20"/>
+            </w:pPr>
+            <w:r>
+              <w:rPr>
+                <w:rFonts w:ascii="Calibri" w:cs="Calibri" w:eastAsia="Calibri" w:hAnsi="Calibri"/>
+                <w:b/>
+                <w:bCs/>
+                <w:color w:val="FFFFFF"/>
+                <w:sz w:val="18"/>
+                <w:szCs w:val="18"/>
+              </w:rPr>
+              <w:t xml:space="preserve">Rule</w:t>
+            </w:r>
+          </w:p>
+        </w:tc>
+        <w:tc>
+          <w:tcPr>
+            <w:tcW w:type="dxa" w:w="3300"/>
+            <w:tcBorders>
+              <w:top w:val="single" w:color="BCC5CF" w:sz="4"/>
+              <w:left w:val="single" w:color="BCC5CF" w:sz="4"/>
+              <w:bottom w:val="single" w:color="BCC5CF" w:sz="4"/>
+              <w:right w:val="single" w:color="BCC5CF" w:sz="4"/>
+            </w:tcBorders>
+            <w:shd w:fill="2F4A6D" w:color="auto" w:val="clear"/>
+            <w:tcMar>
+              <w:top w:type="dxa" w:w="50"/>
+              <w:left w:type="dxa" w:w="90"/>
+              <w:bottom w:type="dxa" w:w="50"/>
+              <w:right w:type="dxa" w:w="90"/>
+            </w:tcMar>
+          </w:tcPr>
+          <w:p>
+            <w:pPr>
+              <w:spacing w:after="20"/>
+            </w:pPr>
+            <w:r>
+              <w:rPr>
+                <w:rFonts w:ascii="Calibri" w:cs="Calibri" w:eastAsia="Calibri" w:hAnsi="Calibri"/>
+                <w:b/>
+                <w:bCs/>
+                <w:color w:val="FFFFFF"/>
+                <w:sz w:val="18"/>
+                <w:szCs w:val="18"/>
+              </w:rPr>
+              <w:t xml:space="preserve">Relationships</w:t>
+            </w:r>
+          </w:p>
+        </w:tc>
+      </w:tr>
+      <w:tr>
+        <w:trPr>
+          <w:cantSplit/>
+        </w:trPr>
+        <w:tc>
+          <w:tcPr>
+            <w:tcW w:type="dxa" w:w="6338"/>
+            <w:tcBorders>
+              <w:top w:val="single" w:color="BCC5CF" w:sz="4"/>
+              <w:left w:val="single" w:color="BCC5CF" w:sz="4"/>
+              <w:bottom w:val="single" w:color="BCC5CF" w:sz="4"/>
+              <w:right w:val="single" w:color="BCC5CF" w:sz="4"/>
+            </w:tcBorders>
+            <w:tcMar>
+              <w:top w:type="dxa" w:w="50"/>
+              <w:left w:type="dxa" w:w="90"/>
+              <w:bottom w:type="dxa" w:w="50"/>
+              <w:right w:type="dxa" w:w="90"/>
+            </w:tcMar>
+          </w:tcPr>
+          <w:p>
+            <w:pPr>
+              <w:spacing w:after="20"/>
+            </w:pPr>
+            <w:r>
+              <w:rPr>
+                <w:rFonts w:ascii="Calibri" w:cs="Calibri" w:eastAsia="Calibri" w:hAnsi="Calibri"/>
+                <w:sz w:val="18"/>
+                <w:szCs w:val="18"/>
+              </w:rPr>
+              <w:t xml:space="preserve">A goods receipt only receives lines of its own purchase order.</w:t>
+            </w:r>
+          </w:p>
+        </w:tc>
+        <w:tc>
+          <w:tcPr>
+            <w:tcW w:type="dxa" w:w="3300"/>
+            <w:tcBorders>
+              <w:top w:val="single" w:color="BCC5CF" w:sz="4"/>
+              <w:left w:val="single" w:color="BCC5CF" w:sz="4"/>
+              <w:bottom w:val="single" w:color="BCC5CF" w:sz="4"/>
+              <w:right w:val="single" w:color="BCC5CF" w:sz="4"/>
+            </w:tcBorders>
+            <w:tcMar>
+              <w:top w:type="dxa" w:w="50"/>
+              <w:left w:type="dxa" w:w="90"/>
+              <w:bottom w:type="dxa" w:w="50"/>
+              <w:right w:type="dxa" w:w="90"/>
+            </w:tcMar>
+          </w:tcPr>
+          <w:p>
+            <w:pPr>
+              <w:spacing w:after="20"/>
+            </w:pPr>
+            <w:r>
+              <w:rPr>
+                <w:rFonts w:ascii="Calibri" w:cs="Calibri" w:eastAsia="Calibri" w:hAnsi="Calibri"/>
+                <w:sz w:val="18"/>
+                <w:szCs w:val="18"/>
+              </w:rPr>
+              <w:t xml:space="preserve">Receipt_For, Receives</w:t>
+            </w:r>
+          </w:p>
+        </w:tc>
+      </w:tr>
+      <w:tr>
+        <w:trPr>
+          <w:cantSplit/>
+        </w:trPr>
+        <w:tc>
+          <w:tcPr>
+            <w:tcW w:type="dxa" w:w="6338"/>
+            <w:tcBorders>
+              <w:top w:val="single" w:color="BCC5CF" w:sz="4"/>
+              <w:left w:val="single" w:color="BCC5CF" w:sz="4"/>
+              <w:bottom w:val="single" w:color="BCC5CF" w:sz="4"/>
+              <w:right w:val="single" w:color="BCC5CF" w:sz="4"/>
+            </w:tcBorders>
+            <w:shd w:fill="F4F6F8" w:color="auto" w:val="clear"/>
+            <w:tcMar>
+              <w:top w:type="dxa" w:w="50"/>
+              <w:left w:type="dxa" w:w="90"/>
+              <w:bottom w:type="dxa" w:w="50"/>
+              <w:right w:type="dxa" w:w="90"/>
+            </w:tcMar>
+          </w:tcPr>
+          <w:p>
+            <w:pPr>
+              <w:spacing w:after="20"/>
+            </w:pPr>
+            <w:r>
+              <w:rPr>
+                <w:rFonts w:ascii="Calibri" w:cs="Calibri" w:eastAsia="Calibri" w:hAnsi="Calibri"/>
+                <w:sz w:val="18"/>
+                <w:szCs w:val="18"/>
+              </w:rPr>
+              <w:t xml:space="preserve">A return request only returns lines of its own order.</w:t>
+            </w:r>
+          </w:p>
+        </w:tc>
+        <w:tc>
+          <w:tcPr>
+            <w:tcW w:type="dxa" w:w="3300"/>
+            <w:tcBorders>
+              <w:top w:val="single" w:color="BCC5CF" w:sz="4"/>
+              <w:left w:val="single" w:color="BCC5CF" w:sz="4"/>
+              <w:bottom w:val="single" w:color="BCC5CF" w:sz="4"/>
+              <w:right w:val="single" w:color="BCC5CF" w:sz="4"/>
+            </w:tcBorders>
+            <w:shd w:fill="F4F6F8" w:color="auto" w:val="clear"/>
+            <w:tcMar>
+              <w:top w:type="dxa" w:w="50"/>
+              <w:left w:type="dxa" w:w="90"/>
+              <w:bottom w:type="dxa" w:w="50"/>
+              <w:right w:type="dxa" w:w="90"/>
+            </w:tcMar>
+          </w:tcPr>
+          <w:p>
+            <w:pPr>
+              <w:spacing w:after="20"/>
+            </w:pPr>
+            <w:r>
+              <w:rPr>
+                <w:rFonts w:ascii="Calibri" w:cs="Calibri" w:eastAsia="Calibri" w:hAnsi="Calibri"/>
+                <w:sz w:val="18"/>
+                <w:szCs w:val="18"/>
+              </w:rPr>
+              <w:t xml:space="preserve">Return_Of, Returns</w:t>
+            </w:r>
+          </w:p>
+        </w:tc>
+      </w:tr>
+      <w:tr>
+        <w:trPr>
+          <w:cantSplit/>
+        </w:trPr>
+        <w:tc>
+          <w:tcPr>
+            <w:tcW w:type="dxa" w:w="6338"/>
+            <w:tcBorders>
+              <w:top w:val="single" w:color="BCC5CF" w:sz="4"/>
+              <w:left w:val="single" w:color="BCC5CF" w:sz="4"/>
+              <w:bottom w:val="single" w:color="BCC5CF" w:sz="4"/>
+              <w:right w:val="single" w:color="BCC5CF" w:sz="4"/>
+            </w:tcBorders>
+            <w:tcMar>
+              <w:top w:type="dxa" w:w="50"/>
+              <w:left w:type="dxa" w:w="90"/>
+              <w:bottom w:type="dxa" w:w="50"/>
+              <w:right w:type="dxa" w:w="90"/>
+            </w:tcMar>
+          </w:tcPr>
+          <w:p>
+            <w:pPr>
+              <w:spacing w:after="20"/>
+            </w:pPr>
+            <w:r>
+              <w:rPr>
+                <w:rFonts w:ascii="Calibri" w:cs="Calibri" w:eastAsia="Calibri" w:hAnsi="Calibri"/>
+                <w:sz w:val="18"/>
+                <w:szCs w:val="18"/>
+              </w:rPr>
+              <w:t xml:space="preserve">A refund is paid back from the payment of the order that was returned.</w:t>
+            </w:r>
+          </w:p>
+        </w:tc>
+        <w:tc>
+          <w:tcPr>
+            <w:tcW w:type="dxa" w:w="3300"/>
+            <w:tcBorders>
+              <w:top w:val="single" w:color="BCC5CF" w:sz="4"/>
+              <w:left w:val="single" w:color="BCC5CF" w:sz="4"/>
+              <w:bottom w:val="single" w:color="BCC5CF" w:sz="4"/>
+              <w:right w:val="single" w:color="BCC5CF" w:sz="4"/>
+            </w:tcBorders>
+            <w:tcMar>
+              <w:top w:type="dxa" w:w="50"/>
+              <w:left w:type="dxa" w:w="90"/>
+              <w:bottom w:type="dxa" w:w="50"/>
+              <w:right w:type="dxa" w:w="90"/>
+            </w:tcMar>
+          </w:tcPr>
+          <w:p>
+            <w:pPr>
+              <w:spacing w:after="20"/>
+            </w:pPr>
+            <w:r>
+              <w:rPr>
+                <w:rFonts w:ascii="Calibri" w:cs="Calibri" w:eastAsia="Calibri" w:hAnsi="Calibri"/>
+                <w:sz w:val="18"/>
+                <w:szCs w:val="18"/>
+              </w:rPr>
+              <w:t xml:space="preserve">Transaction_Of, Refund_For</w:t>
+            </w:r>
+          </w:p>
+        </w:tc>
+      </w:tr>
+      <w:tr>
+        <w:trPr>
+          <w:cantSplit/>
+        </w:trPr>
+        <w:tc>
+          <w:tcPr>
+            <w:tcW w:type="dxa" w:w="6338"/>
+            <w:tcBorders>
+              <w:top w:val="single" w:color="BCC5CF" w:sz="4"/>
+              <w:left w:val="single" w:color="BCC5CF" w:sz="4"/>
+              <w:bottom w:val="single" w:color="BCC5CF" w:sz="4"/>
+              <w:right w:val="single" w:color="BCC5CF" w:sz="4"/>
+            </w:tcBorders>
+            <w:shd w:fill="F4F6F8" w:color="auto" w:val="clear"/>
+            <w:tcMar>
+              <w:top w:type="dxa" w:w="50"/>
+              <w:left w:type="dxa" w:w="90"/>
+              <w:bottom w:type="dxa" w:w="50"/>
+              <w:right w:type="dxa" w:w="90"/>
+            </w:tcMar>
+          </w:tcPr>
+          <w:p>
+            <w:pPr>
+              <w:spacing w:after="20"/>
+            </w:pPr>
+            <w:r>
+              <w:rPr>
+                <w:rFonts w:ascii="Calibri" w:cs="Calibri" w:eastAsia="Calibri" w:hAnsi="Calibri"/>
+                <w:sz w:val="18"/>
+                <w:szCs w:val="18"/>
+              </w:rPr>
+              <w:t xml:space="preserve">An order is billed to an address that its own customer saved.</w:t>
+            </w:r>
+          </w:p>
+        </w:tc>
+        <w:tc>
+          <w:tcPr>
+            <w:tcW w:type="dxa" w:w="3300"/>
+            <w:tcBorders>
+              <w:top w:val="single" w:color="BCC5CF" w:sz="4"/>
+              <w:left w:val="single" w:color="BCC5CF" w:sz="4"/>
+              <w:bottom w:val="single" w:color="BCC5CF" w:sz="4"/>
+              <w:right w:val="single" w:color="BCC5CF" w:sz="4"/>
+            </w:tcBorders>
+            <w:shd w:fill="F4F6F8" w:color="auto" w:val="clear"/>
+            <w:tcMar>
+              <w:top w:type="dxa" w:w="50"/>
+              <w:left w:type="dxa" w:w="90"/>
+              <w:bottom w:type="dxa" w:w="50"/>
+              <w:right w:type="dxa" w:w="90"/>
+            </w:tcMar>
+          </w:tcPr>
+          <w:p>
+            <w:pPr>
+              <w:spacing w:after="20"/>
+            </w:pPr>
+            <w:r>
+              <w:rPr>
+                <w:rFonts w:ascii="Calibri" w:cs="Calibri" w:eastAsia="Calibri" w:hAnsi="Calibri"/>
+                <w:sz w:val="18"/>
+                <w:szCs w:val="18"/>
+              </w:rPr>
+              <w:t xml:space="preserve">Places, Billed_To, Saves_Address</w:t>
+            </w:r>
+          </w:p>
+        </w:tc>
+      </w:tr>
+      <w:tr>
+        <w:trPr>
+          <w:cantSplit/>
+        </w:trPr>
+        <w:tc>
+          <w:tcPr>
+            <w:tcW w:type="dxa" w:w="6338"/>
+            <w:tcBorders>
+              <w:top w:val="single" w:color="BCC5CF" w:sz="4"/>
+              <w:left w:val="single" w:color="BCC5CF" w:sz="4"/>
+              <w:bottom w:val="single" w:color="BCC5CF" w:sz="4"/>
+              <w:right w:val="single" w:color="BCC5CF" w:sz="4"/>
+            </w:tcBorders>
+            <w:tcMar>
+              <w:top w:type="dxa" w:w="50"/>
+              <w:left w:type="dxa" w:w="90"/>
+              <w:bottom w:type="dxa" w:w="50"/>
+              <w:right w:type="dxa" w:w="90"/>
+            </w:tcMar>
+          </w:tcPr>
+          <w:p>
+            <w:pPr>
+              <w:spacing w:after="20"/>
+            </w:pPr>
+            <w:r>
+              <w:rPr>
+                <w:rFonts w:ascii="Calibri" w:cs="Calibri" w:eastAsia="Calibri" w:hAnsi="Calibri"/>
+                <w:sz w:val="18"/>
+                <w:szCs w:val="18"/>
+              </w:rPr>
+              <w:t xml:space="preserve">An order is paid with a payment method that its own customer saved.</w:t>
+            </w:r>
+          </w:p>
+        </w:tc>
+        <w:tc>
+          <w:tcPr>
+            <w:tcW w:type="dxa" w:w="3300"/>
+            <w:tcBorders>
+              <w:top w:val="single" w:color="BCC5CF" w:sz="4"/>
+              <w:left w:val="single" w:color="BCC5CF" w:sz="4"/>
+              <w:bottom w:val="single" w:color="BCC5CF" w:sz="4"/>
+              <w:right w:val="single" w:color="BCC5CF" w:sz="4"/>
+            </w:tcBorders>
+            <w:tcMar>
+              <w:top w:type="dxa" w:w="50"/>
+              <w:left w:type="dxa" w:w="90"/>
+              <w:bottom w:type="dxa" w:w="50"/>
+              <w:right w:type="dxa" w:w="90"/>
+            </w:tcMar>
+          </w:tcPr>
+          <w:p>
+            <w:pPr>
+              <w:spacing w:after="20"/>
+            </w:pPr>
+            <w:r>
+              <w:rPr>
+                <w:rFonts w:ascii="Calibri" w:cs="Calibri" w:eastAsia="Calibri" w:hAnsi="Calibri"/>
+                <w:sz w:val="18"/>
+                <w:szCs w:val="18"/>
+              </w:rPr>
+              <w:t xml:space="preserve">Paid_By, Uses_Method, Saves_Method</w:t>
+            </w:r>
+          </w:p>
+        </w:tc>
+      </w:tr>
+      <w:tr>
+        <w:trPr>
+          <w:cantSplit/>
+        </w:trPr>
+        <w:tc>
+          <w:tcPr>
+            <w:tcW w:type="dxa" w:w="6338"/>
+            <w:tcBorders>
+              <w:top w:val="single" w:color="BCC5CF" w:sz="4"/>
+              <w:left w:val="single" w:color="BCC5CF" w:sz="4"/>
+              <w:bottom w:val="single" w:color="BCC5CF" w:sz="4"/>
+              <w:right w:val="single" w:color="BCC5CF" w:sz="4"/>
+            </w:tcBorders>
+            <w:shd w:fill="F4F6F8" w:color="auto" w:val="clear"/>
+            <w:tcMar>
+              <w:top w:type="dxa" w:w="50"/>
+              <w:left w:type="dxa" w:w="90"/>
+              <w:bottom w:type="dxa" w:w="50"/>
+              <w:right w:type="dxa" w:w="90"/>
+            </w:tcMar>
+          </w:tcPr>
+          <w:p>
+            <w:pPr>
+              <w:spacing w:after="20"/>
+            </w:pPr>
+            <w:r>
+              <w:rPr>
+                <w:rFonts w:ascii="Calibri" w:cs="Calibri" w:eastAsia="Calibri" w:hAnsi="Calibri"/>
+                <w:sz w:val="18"/>
+                <w:szCs w:val="18"/>
+              </w:rPr>
+              <w:t xml:space="preserve">An invoice only bills lines of its own order.</w:t>
+            </w:r>
+          </w:p>
+        </w:tc>
+        <w:tc>
+          <w:tcPr>
+            <w:tcW w:type="dxa" w:w="3300"/>
+            <w:tcBorders>
+              <w:top w:val="single" w:color="BCC5CF" w:sz="4"/>
+              <w:left w:val="single" w:color="BCC5CF" w:sz="4"/>
+              <w:bottom w:val="single" w:color="BCC5CF" w:sz="4"/>
+              <w:right w:val="single" w:color="BCC5CF" w:sz="4"/>
+            </w:tcBorders>
+            <w:shd w:fill="F4F6F8" w:color="auto" w:val="clear"/>
+            <w:tcMar>
+              <w:top w:type="dxa" w:w="50"/>
+              <w:left w:type="dxa" w:w="90"/>
+              <w:bottom w:type="dxa" w:w="50"/>
+              <w:right w:type="dxa" w:w="90"/>
+            </w:tcMar>
+          </w:tcPr>
+          <w:p>
+            <w:pPr>
+              <w:spacing w:after="20"/>
+            </w:pPr>
+            <w:r>
+              <w:rPr>
+                <w:rFonts w:ascii="Calibri" w:cs="Calibri" w:eastAsia="Calibri" w:hAnsi="Calibri"/>
+                <w:sz w:val="18"/>
+                <w:szCs w:val="18"/>
+              </w:rPr>
+              <w:t xml:space="preserve">Invoiced_As, Invoice_Has_Line, Bills</w:t>
+            </w:r>
+          </w:p>
+        </w:tc>
+      </w:tr>
+      <w:tr>
+        <w:trPr>
+          <w:cantSplit/>
+        </w:trPr>
+        <w:tc>
+          <w:tcPr>
+            <w:tcW w:type="dxa" w:w="6338"/>
+            <w:tcBorders>
+              <w:top w:val="single" w:color="BCC5CF" w:sz="4"/>
+              <w:left w:val="single" w:color="BCC5CF" w:sz="4"/>
+              <w:bottom w:val="single" w:color="BCC5CF" w:sz="4"/>
+              <w:right w:val="single" w:color="BCC5CF" w:sz="4"/>
+            </w:tcBorders>
+            <w:tcMar>
+              <w:top w:type="dxa" w:w="50"/>
+              <w:left w:type="dxa" w:w="90"/>
+              <w:bottom w:type="dxa" w:w="50"/>
+              <w:right w:type="dxa" w:w="90"/>
+            </w:tcMar>
+          </w:tcPr>
+          <w:p>
+            <w:pPr>
+              <w:spacing w:after="20"/>
+            </w:pPr>
+            <w:r>
+              <w:rPr>
+                <w:rFonts w:ascii="Calibri" w:cs="Calibri" w:eastAsia="Calibri" w:hAnsi="Calibri"/>
+                <w:sz w:val="18"/>
+                <w:szCs w:val="18"/>
+              </w:rPr>
+              <w:t xml:space="preserve">A fulfilment only includes lines of its own order.</w:t>
+            </w:r>
+          </w:p>
+        </w:tc>
+        <w:tc>
+          <w:tcPr>
+            <w:tcW w:type="dxa" w:w="3300"/>
+            <w:tcBorders>
+              <w:top w:val="single" w:color="BCC5CF" w:sz="4"/>
+              <w:left w:val="single" w:color="BCC5CF" w:sz="4"/>
+              <w:bottom w:val="single" w:color="BCC5CF" w:sz="4"/>
+              <w:right w:val="single" w:color="BCC5CF" w:sz="4"/>
+            </w:tcBorders>
+            <w:tcMar>
+              <w:top w:type="dxa" w:w="50"/>
+              <w:left w:type="dxa" w:w="90"/>
+              <w:bottom w:type="dxa" w:w="50"/>
+              <w:right w:type="dxa" w:w="90"/>
+            </w:tcMar>
+          </w:tcPr>
+          <w:p>
+            <w:pPr>
+              <w:spacing w:after="20"/>
+            </w:pPr>
+            <w:r>
+              <w:rPr>
+                <w:rFonts w:ascii="Calibri" w:cs="Calibri" w:eastAsia="Calibri" w:hAnsi="Calibri"/>
+                <w:sz w:val="18"/>
+                <w:szCs w:val="18"/>
+              </w:rPr>
+              <w:t xml:space="preserve">Fulfills, Includes</w:t>
+            </w:r>
+          </w:p>
+        </w:tc>
+      </w:tr>
+      <w:tr>
+        <w:trPr>
+          <w:cantSplit/>
+        </w:trPr>
+        <w:tc>
+          <w:tcPr>
+            <w:tcW w:type="dxa" w:w="6338"/>
+            <w:tcBorders>
+              <w:top w:val="single" w:color="BCC5CF" w:sz="4"/>
+              <w:left w:val="single" w:color="BCC5CF" w:sz="4"/>
+              <w:bottom w:val="single" w:color="BCC5CF" w:sz="4"/>
+              <w:right w:val="single" w:color="BCC5CF" w:sz="4"/>
+            </w:tcBorders>
+            <w:shd w:fill="F4F6F8" w:color="auto" w:val="clear"/>
+            <w:tcMar>
+              <w:top w:type="dxa" w:w="50"/>
+              <w:left w:type="dxa" w:w="90"/>
+              <w:bottom w:type="dxa" w:w="50"/>
+              <w:right w:type="dxa" w:w="90"/>
+            </w:tcMar>
+          </w:tcPr>
+          <w:p>
+            <w:pPr>
+              <w:spacing w:after="20"/>
+            </w:pPr>
+            <w:r>
+              <w:rPr>
+                <w:rFonts w:ascii="Calibri" w:cs="Calibri" w:eastAsia="Calibri" w:hAnsi="Calibri"/>
+                <w:sz w:val="18"/>
+                <w:szCs w:val="18"/>
+              </w:rPr>
+              <w:t xml:space="preserve">A support ticket can only be about an order of the customer who opened it.</w:t>
+            </w:r>
+          </w:p>
+        </w:tc>
+        <w:tc>
+          <w:tcPr>
+            <w:tcW w:type="dxa" w:w="3300"/>
+            <w:tcBorders>
+              <w:top w:val="single" w:color="BCC5CF" w:sz="4"/>
+              <w:left w:val="single" w:color="BCC5CF" w:sz="4"/>
+              <w:bottom w:val="single" w:color="BCC5CF" w:sz="4"/>
+              <w:right w:val="single" w:color="BCC5CF" w:sz="4"/>
+            </w:tcBorders>
+            <w:shd w:fill="F4F6F8" w:color="auto" w:val="clear"/>
+            <w:tcMar>
+              <w:top w:type="dxa" w:w="50"/>
+              <w:left w:type="dxa" w:w="90"/>
+              <w:bottom w:type="dxa" w:w="50"/>
+              <w:right w:type="dxa" w:w="90"/>
+            </w:tcMar>
+          </w:tcPr>
+          <w:p>
+            <w:pPr>
+              <w:spacing w:after="20"/>
+            </w:pPr>
+            <w:r>
+              <w:rPr>
+                <w:rFonts w:ascii="Calibri" w:cs="Calibri" w:eastAsia="Calibri" w:hAnsi="Calibri"/>
+                <w:sz w:val="18"/>
+                <w:szCs w:val="18"/>
+              </w:rPr>
+              <w:t xml:space="preserve">Opens, About_Order, Places</w:t>
+            </w:r>
+          </w:p>
+        </w:tc>
+      </w:tr>
+      <w:tr>
+        <w:trPr>
+          <w:cantSplit/>
+        </w:trPr>
+        <w:tc>
+          <w:tcPr>
+            <w:tcW w:type="dxa" w:w="6338"/>
+            <w:tcBorders>
+              <w:top w:val="single" w:color="BCC5CF" w:sz="4"/>
+              <w:left w:val="single" w:color="BCC5CF" w:sz="4"/>
+              <w:bottom w:val="single" w:color="BCC5CF" w:sz="4"/>
+              <w:right w:val="single" w:color="BCC5CF" w:sz="4"/>
+            </w:tcBorders>
+            <w:tcMar>
+              <w:top w:type="dxa" w:w="50"/>
+              <w:left w:type="dxa" w:w="90"/>
+              <w:bottom w:type="dxa" w:w="50"/>
+              <w:right w:type="dxa" w:w="90"/>
+            </w:tcMar>
+          </w:tcPr>
+          <w:p>
+            <w:pPr>
+              <w:spacing w:after="20"/>
+            </w:pPr>
+            <w:r>
+              <w:rPr>
+                <w:rFonts w:ascii="Calibri" w:cs="Calibri" w:eastAsia="Calibri" w:hAnsi="Calibri"/>
+                <w:sz w:val="18"/>
+                <w:szCs w:val="18"/>
+              </w:rPr>
+              <w:t xml:space="preserve">A stock batch is stored in a bin of its own warehouse.</w:t>
+            </w:r>
+          </w:p>
+        </w:tc>
+        <w:tc>
+          <w:tcPr>
+            <w:tcW w:type="dxa" w:w="3300"/>
+            <w:tcBorders>
+              <w:top w:val="single" w:color="BCC5CF" w:sz="4"/>
+              <w:left w:val="single" w:color="BCC5CF" w:sz="4"/>
+              <w:bottom w:val="single" w:color="BCC5CF" w:sz="4"/>
+              <w:right w:val="single" w:color="BCC5CF" w:sz="4"/>
+            </w:tcBorders>
+            <w:tcMar>
+              <w:top w:type="dxa" w:w="50"/>
+              <w:left w:type="dxa" w:w="90"/>
+              <w:bottom w:type="dxa" w:w="50"/>
+              <w:right w:type="dxa" w:w="90"/>
+            </w:tcMar>
+          </w:tcPr>
+          <w:p>
+            <w:pPr>
+              <w:spacing w:after="20"/>
+            </w:pPr>
+            <w:r>
+              <w:rPr>
+                <w:rFonts w:ascii="Calibri" w:cs="Calibri" w:eastAsia="Calibri" w:hAnsi="Calibri"/>
+                <w:sz w:val="18"/>
+                <w:szCs w:val="18"/>
+              </w:rPr>
+              <w:t xml:space="preserve">Batch_Of, Stored_In</w:t>
             </w:r>
           </w:p>
         </w:tc>

</xml_diff>

<commit_message>
ISA: enforce overlap with triggers; state covering honestly
Review finding: the report said overlap and covering were enforced, but an account's
role could change after its subtype row existed (so one account could be in both
Customers and Staff), and an account could exist without any subtype row.
- Overlap is now fully enforced: subtype rows cannot move to an account of another
  role, and an account cannot change its role once it has a subtype row.
- Covering cannot be required in SQL (the account row must exist first). The model,
  report, Word document, schema comment and README now say that the application
  creates every account together with its subtype row.
Also: demo recipient-name simplification noted; 13 -> 12 candidates in the Turkish
notes; stale "fill in the names" and "no trigger yet" sentences removed.

Co-Authored-By: Claude Opus 5.5 <noreply@anthropic.com>
</commit_message>
<xml_diff>
--- a/docs/MarketLab_Project_Description.docx
+++ b/docs/MarketLab_Project_Description.docx
@@ -14830,7 +14830,7 @@
         <w:rPr>
           <w:rFonts w:ascii="Calibri" w:cs="Calibri" w:eastAsia="Calibri" w:hAnsi="Calibri"/>
         </w:rPr>
-        <w:t xml:space="preserve">Accounts ISA Customers, Staff, Couriers. The subclasses inherit the attributes of an account and its key, account_id, and each takes part in its own relationships: only customers place orders, only staff members work in departments, and only couriers drive vehicles and attempt deliveries. Overlap is not allowed, because every account has exactly one role; covering holds, because the role is mandatory.</w:t>
+        <w:t xml:space="preserve">Accounts ISA Customers, Staff, Couriers. The subclasses inherit the attributes of an account and its key, account_id, and each takes part in its own relationships: only customers place orders, only staff members work in departments, and only couriers drive vehicles and attempt deliveries. Overlap is not allowed: every account has exactly one role, triggers reject a subtype row whose account has another role, and an account cannot change its role once it has a subtype row. Covering holds: every account is one of the three. SQL cannot require the subtype row, because the account row must exist first, so the application creates both together.</w:t>
       </w:r>
     </w:p>
     <w:p>
@@ -34665,7 +34665,7 @@
         <w:rPr>
           <w:rFonts w:ascii="Calibri" w:cs="Calibri" w:eastAsia="Calibri" w:hAnsi="Calibri"/>
         </w:rPr>
-        <w:t xml:space="preserve">When the "one" side of a relationship must take part at least once, a foreign key cannot require it; the application creates the rows together:</w:t>
+        <w:t xml:space="preserve">When the "one" side of a relationship must take part at least once, a foreign key cannot require it; the application creates the rows together. The covering ISA hierarchy is the same case: every account is created together with its Customers, Staff or Couriers row.</w:t>
       </w:r>
     </w:p>
     <w:tbl>

</xml_diff>

<commit_message>
ER diagram: legend under the complete diagram; order and invoice totals as derived attributes
The submitted PDF now explains its notation, as the problem-session diagrams do.
Orders.total_cents and Invoices.total_cents are sums over their lines, so they
are drawn as dashed ovals (derived) and explained in Design choices. No entity,
relationship or numbering changed (67 entities, 99 relationships).

Co-Authored-By: Claude Opus 5.5 <noreply@anthropic.com>
</commit_message>
<xml_diff>
--- a/docs/MarketLab_Project_Description.docx
+++ b/docs/MarketLab_Project_Description.docx
@@ -420,7 +420,7 @@
         <w:rPr>
           <w:rFonts w:ascii="Calibri" w:cs="Calibri" w:eastAsia="Calibri" w:hAnsi="Calibri"/>
         </w:rPr>
-        <w:t xml:space="preserve">Entity sets are grouped by business area. For each one we give its meaning, its key and its own attributes. The key is underlined. A weak entity is identified by its partial key (dashed underline) together with the key of its owner, and the subclasses of Accounts inherit the Accounts key. Attributes that point to another entity are not listed, because such links are relationships (Part 2).</w:t>
+        <w:t xml:space="preserve">Entity sets are grouped by business area. For each one we give its meaning, its key and its own attributes. The key is underlined. A weak entity is identified by its partial key (dashed underline) together with the key of its owner, and the subclasses of Accounts inherit the Accounts key. Attributes that point to another entity are not listed, because such links are relationships (Part 2). A derived attribute, whose value is computed from other data, is drawn as a dashed oval.</w:t>
       </w:r>
     </w:p>
     <w:p>
@@ -10863,6 +10863,15 @@
               </w:rPr>
               <w:t xml:space="preserve">total_cents</w:t>
             </w:r>
+            <w:r>
+              <w:rPr>
+                <w:rFonts w:ascii="Calibri" w:cs="Calibri" w:eastAsia="Calibri" w:hAnsi="Calibri"/>
+                <w:color w:val="52606D"/>
+                <w:sz w:val="16"/>
+                <w:szCs w:val="16"/>
+              </w:rPr>
+              <w:t xml:space="preserve"> (derived)</w:t>
+            </w:r>
           </w:p>
         </w:tc>
       </w:tr>
@@ -12039,6 +12048,15 @@
                 <w:szCs w:val="18"/>
               </w:rPr>
               <w:t xml:space="preserve">total_cents</w:t>
+            </w:r>
+            <w:r>
+              <w:rPr>
+                <w:rFonts w:ascii="Calibri" w:cs="Calibri" w:eastAsia="Calibri" w:hAnsi="Calibri"/>
+                <w:color w:val="52606D"/>
+                <w:sz w:val="16"/>
+                <w:szCs w:val="16"/>
+              </w:rPr>
+              <w:t xml:space="preserve"> (derived)</w:t>
             </w:r>
           </w:p>
         </w:tc>
@@ -34646,6 +34664,25 @@
           <w:rFonts w:ascii="Calibri" w:cs="Calibri" w:eastAsia="Calibri" w:hAnsi="Calibri"/>
         </w:rPr>
         <w:t xml:space="preserve">A fact is stored once. A return request or a coupon redemption does not store the customer again, because the order already determines it. After the instructor's review, four entity sets that repeated information were merged: Inventory_Adjustments into Stock_Movements, Refunds into Payment_Transactions, Proof_Of_Delivery into Delivery_Attempts and Storage_Zones into Storage_Bins.</w:t>
+      </w:r>
+    </w:p>
+    <w:p>
+      <w:pPr>
+        <w:spacing w:after="120" w:line="276"/>
+      </w:pPr>
+      <w:r>
+        <w:rPr>
+          <w:rFonts w:ascii="Calibri" w:cs="Calibri" w:eastAsia="Calibri" w:hAnsi="Calibri"/>
+          <w:b/>
+          <w:bCs/>
+        </w:rPr>
+        <w:t xml:space="preserve">Derived attributes. </w:t>
+      </w:r>
+      <w:r>
+        <w:rPr>
+          <w:rFonts w:ascii="Calibri" w:cs="Calibri" w:eastAsia="Calibri" w:hAnsi="Calibri"/>
+        </w:rPr>
+        <w:t xml:space="preserve">Orders.total_cents is the sum of quantity × unit_price_cents over the order's lines; Invoices.total_cents is the sum of amount_cents over the invoice's lines. They are drawn as dashed ovals because they are not independent facts. The schema keeps the value so that order lists need not add up the lines; the application writes it once at checkout, from the same lines, and never changes it.</w:t>
       </w:r>
     </w:p>
     <w:p>

</xml_diff>